<commit_message>
add section 4 to the report
</commit_message>
<xml_diff>
--- a/docs/deliverables/3.2/Deliverable 3-2 Implementation - Submission.docx
+++ b/docs/deliverables/3.2/Deliverable 3-2 Implementation - Submission.docx
@@ -120,13 +120,8 @@
       <w:pPr>
         <w:jc w:val="center"/>
       </w:pPr>
-      <w:proofErr w:type="spellStart"/>
-      <w:r>
-        <w:t>SmartBudget</w:t>
-      </w:r>
-      <w:proofErr w:type="spellEnd"/>
-      <w:r>
-        <w:t xml:space="preserve"> – Personal Finance Tracker</w:t>
+      <w:r>
+        <w:t>SmartBudget – Personal Finance Tracker</w:t>
       </w:r>
     </w:p>
     <w:p>
@@ -202,13 +197,8 @@
         <w:jc w:val="center"/>
       </w:pPr>
       <w:r>
-        <w:t>Mohsen Pasdar, Muhammed Ahmed, Alia Hagi-</w:t>
-      </w:r>
-      <w:proofErr w:type="spellStart"/>
-      <w:r>
-        <w:t>Dhaffe</w:t>
-      </w:r>
-      <w:proofErr w:type="spellEnd"/>
+        <w:t>Mohsen Pasdar, Muhammed Ahmed, Alia Hagi-Dhaffe</w:t>
+      </w:r>
     </w:p>
     <w:p>
       <w:pPr>
@@ -237,16 +227,7 @@
         <w:jc w:val="center"/>
       </w:pPr>
       <w:r>
-        <w:t>March</w:t>
-      </w:r>
-      <w:r>
-        <w:t xml:space="preserve"> </w:t>
-      </w:r>
-      <w:r>
-        <w:t>08</w:t>
-      </w:r>
-      <w:r>
-        <w:t>, 2026</w:t>
+        <w:t>March 08, 2026</w:t>
       </w:r>
     </w:p>
     <w:p>
@@ -746,34 +727,13 @@
     <w:p>
       <w:bookmarkStart w:id="1" w:name="_heading=h.eh2mv956rqcp" w:colFirst="0" w:colLast="0"/>
       <w:bookmarkEnd w:id="1"/>
-      <w:proofErr w:type="spellStart"/>
-      <w:r>
-        <w:t>SmartBudget</w:t>
-      </w:r>
-      <w:proofErr w:type="spellEnd"/>
-      <w:r>
-        <w:t xml:space="preserve"> is a personal finance application that helps users record daily transactions, set monthly budgets by category, and view summary reports to better understand their spending habits. The main goal of the system is to make personal budgeting simple and practical by giving users a clear view of their income and expenses, while also helping them manage spending through budget tracking, alerts, and summary reports. Across the earlier deliverables, our team developed the project step by step, beginning with requirements, use cases, and testing documentation, and then moving into software design, GUI development, and the initial implementation of the system. </w:t>
-      </w:r>
-    </w:p>
-    <w:p>
-      <w:r>
-        <w:t xml:space="preserve">This document represents Deliverable 3.2 for the </w:t>
-      </w:r>
-      <w:proofErr w:type="spellStart"/>
-      <w:r>
-        <w:t>SmartBudget</w:t>
-      </w:r>
-      <w:proofErr w:type="spellEnd"/>
-      <w:r>
-        <w:t xml:space="preserve"> project. The main purpose of this iteration is to complete and strengthen the implementation by refactoring the existing codebase, finishing important backlog items from Deliverable 3.1, and carrying out more complete testing and validation. </w:t>
-      </w:r>
-      <w:proofErr w:type="gramStart"/>
-      <w:r>
-        <w:t>In particular, this</w:t>
-      </w:r>
-      <w:proofErr w:type="gramEnd"/>
-      <w:r>
-        <w:t xml:space="preserve"> report focuses on codebase improvements for better structure and maintainability, the addition of remaining features such as persistence and loading saved data on startup, and the testing work needed to confirm that the system functions correctly after integration. These areas match the main requirements of the Deliverable 3.2 handout, which emphasizes refactoring, final implementation of core features, and full testing and validation. </w:t>
+      <w:r>
+        <w:t xml:space="preserve">SmartBudget is a personal finance application that helps users record daily transactions, set monthly budgets by category, and view summary reports to better understand their spending habits. The main goal of the system is to make personal budgeting simple and practical by giving users a clear view of their income and expenses, while also helping them manage spending through budget tracking, alerts, and summary reports. Across the earlier deliverables, our team developed the project step by step, beginning with requirements, use cases, and testing documentation, and then moving into software design, GUI development, and the initial implementation of the system. </w:t>
+      </w:r>
+    </w:p>
+    <w:p>
+      <w:r>
+        <w:t xml:space="preserve">This document represents Deliverable 3.2 for the SmartBudget project. The main purpose of this iteration is to complete and strengthen the implementation by refactoring the existing codebase, finishing important backlog items from Deliverable 3.1, and carrying out more complete testing and validation. In particular, this report focuses on codebase improvements for better structure and maintainability, the addition of remaining features such as persistence and loading saved data on startup, and the testing work needed to confirm that the system functions correctly after integration. These areas match the main requirements of the Deliverable 3.2, which emphasizes refactoring, final implementation of core features, and full testing and validation. </w:t>
       </w:r>
     </w:p>
     <w:p>
@@ -805,41 +765,17 @@
     </w:p>
     <w:p>
       <w:r>
-        <w:t xml:space="preserve">Deliverable 3.2 builds directly on the work completed in Deliverable 3.1, where the </w:t>
-      </w:r>
-      <w:proofErr w:type="spellStart"/>
-      <w:r>
-        <w:t>SmartBudget</w:t>
-      </w:r>
-      <w:proofErr w:type="spellEnd"/>
-      <w:r>
-        <w:t xml:space="preserve"> project moved from earlier planning and prototype work into a functional implementation stage. In Deliverable 3.1, the team completed the main software design documentation, including the layered architecture overview, UML class diagrams, sequence diagrams, and activity diagrams for the system’s key workflows. At the same time, the project reached an important development milestone because the main modules of the application were already implemented and connected to the JavaFX interface. These modules included transaction management, transaction viewing and filtering, monthly budgets, overspending alerts, summary reports, and navigation across the main pages of the system. </w:t>
-      </w:r>
-    </w:p>
-    <w:p>
-      <w:r>
-        <w:t xml:space="preserve">By the end of Deliverable 3.1, </w:t>
-      </w:r>
-      <w:proofErr w:type="spellStart"/>
-      <w:r>
-        <w:t>SmartBudget</w:t>
-      </w:r>
-      <w:proofErr w:type="spellEnd"/>
-      <w:r>
-        <w:t xml:space="preserve"> was able to demonstrate the main user workflows during an active session and already reflected the core requirements defined earlier in Deliverable 2.2. This showed that the project had moved beyond the design and prototype stage and into a working desktop application with a clear layered structure separating the UI, business logic, domain model, and persistence concerns. In other words, the starting point for Deliverable 3.2 was not an incomplete design, but a working system that already supported the main features at a functional level. </w:t>
-      </w:r>
-    </w:p>
-    <w:p>
-      <w:r>
-        <w:t xml:space="preserve">At the same time, Deliverable 3.1 clearly identified the main work that </w:t>
-      </w:r>
-      <w:proofErr w:type="gramStart"/>
-      <w:r>
-        <w:t>still remained</w:t>
-      </w:r>
-      <w:proofErr w:type="gramEnd"/>
-      <w:r>
-        <w:t xml:space="preserve"> for the next cycle. The most important limitation was that data persistence had not yet been finalized, which meant that transactions and budgets were not saved after the application closed. The preliminary testing and coverage review also showed that some important areas still needed stronger automated testing, especially alert logic, report generation, and the persistence-related workflows planned for the next stage. In addition, a few small GUI refinements were still listed in the backlog. </w:t>
+        <w:t xml:space="preserve">Deliverable 3.2 builds directly on the work completed in Deliverable 3.1, where the SmartBudget project moved from earlier planning and prototype work into a functional implementation stage. In Deliverable 3.1, the team completed the main software design documentation, including the layered architecture overview, UML class diagrams, sequence diagrams, and activity diagrams for the system’s key workflows. At the same time, the project reached an important development milestone because the main modules of the application were already implemented and connected to the JavaFX interface. These modules included transaction management, transaction viewing and filtering, monthly budgets, overspending alerts, summary reports, and navigation across the main pages of the system. </w:t>
+      </w:r>
+    </w:p>
+    <w:p>
+      <w:r>
+        <w:t xml:space="preserve">By the end of Deliverable 3.1, SmartBudget was able to demonstrate the main user workflows during an active session and already reflected the core requirements defined earlier in Deliverable 2.2. This showed that the project had moved beyond the design and prototype stage and into a working desktop application with a clear layered structure separating the UI, business logic, domain model, and persistence concerns. In other words, the starting point for Deliverable 3.2 was not an incomplete design, but a working system that already supported the main features at a functional level. </w:t>
+      </w:r>
+    </w:p>
+    <w:p>
+      <w:r>
+        <w:t xml:space="preserve">At the same time, Deliverable 3.1 clearly identified the main work that still remained for the next cycle. The most important limitation was that data persistence had not yet been finalized, which meant that transactions and budgets were not saved after the application closed. The preliminary testing and coverage review also showed that some important areas still needed stronger automated testing, especially alert logic, report generation, and the persistence-related workflows planned for the next stage. In addition, a few small GUI refinements were still listed in the backlog. </w:t>
       </w:r>
     </w:p>
     <w:p>
@@ -865,23 +801,7 @@
     </w:p>
     <w:p>
       <w:r>
-        <w:t xml:space="preserve">In Deliverable 3.2, our </w:t>
-      </w:r>
-      <w:proofErr w:type="gramStart"/>
-      <w:r>
-        <w:t>main focus</w:t>
-      </w:r>
-      <w:proofErr w:type="gramEnd"/>
-      <w:r>
-        <w:t xml:space="preserve"> was to strengthen the existing </w:t>
-      </w:r>
-      <w:proofErr w:type="spellStart"/>
-      <w:r>
-        <w:t>SmartBudget</w:t>
-      </w:r>
-      <w:proofErr w:type="spellEnd"/>
-      <w:r>
-        <w:t xml:space="preserve"> implementation by improving code quality and long-term maintainability. Since the core workflows and main classes were already implemented in Deliverable 3.1, this iteration did not require a complete redesign. Instead, the refactoring work focused on targeted improvements that make the system easier to understand, test, and extend. This approach matches the purpose of Deliverable 3.2, which emphasizes refactoring, codebase improvements, and system-level validation rather than new design work.</w:t>
+        <w:t>In Deliverable 3.2, our main focus was to strengthen the existing SmartBudget implementation by improving code quality and long-term maintainability. Since the core workflows and main classes were already implemented in Deliverable 3.1, this iteration did not require a complete redesign. Instead, the refactoring work focused on targeted improvements that make the system easier to understand, test, and extend. This approach matches the purpose of Deliverable 3.2, which emphasizes refactoring, codebase improvements, and system-level validation rather than new design work.</w:t>
       </w:r>
     </w:p>
     <w:p>
@@ -1004,7 +924,31 @@
         <w:rPr>
           <w:lang w:val="en-CA"/>
         </w:rPr>
-        <w:t>Overall, the goal of these changes was to improve maintainability and reduce the risk of bugs during the final integration work, which is aligned with the deliverable handout.</w:t>
+        <w:t xml:space="preserve">Overall, the goal of these changes was to improve maintainability and reduce the risk of bugs during the final integration work, which is aligned with the </w:t>
+      </w:r>
+      <w:r>
+        <w:rPr>
+          <w:lang w:val="en-CA"/>
+        </w:rPr>
+        <w:t>D</w:t>
+      </w:r>
+      <w:r>
+        <w:rPr>
+          <w:lang w:val="en-CA"/>
+        </w:rPr>
+        <w:t xml:space="preserve">eliverable </w:t>
+      </w:r>
+      <w:r>
+        <w:rPr>
+          <w:lang w:val="en-CA"/>
+        </w:rPr>
+        <w:t>3.2</w:t>
+      </w:r>
+      <w:r>
+        <w:rPr>
+          <w:lang w:val="en-CA"/>
+        </w:rPr>
+        <w:t>.</w:t>
       </w:r>
     </w:p>
     <w:p>
@@ -1021,15 +965,7 @@
     </w:p>
     <w:p>
       <w:r>
-        <w:t xml:space="preserve">During this iteration, the team applied small-to-medium refactoring changes rather than large structural changes. The main actions were </w:t>
-      </w:r>
-      <w:proofErr w:type="spellStart"/>
-      <w:r>
-        <w:t>centered</w:t>
-      </w:r>
-      <w:proofErr w:type="spellEnd"/>
-      <w:r>
-        <w:t xml:space="preserve"> on cleaning up existing implementation code and making it easier to integrate persistence and testing.</w:t>
+        <w:t>During this iteration, the team applied small-to-medium refactoring changes rather than large structural changes. The main actions were centered on cleaning up existing implementation code and making it easier to integrate persistence and testing.</w:t>
       </w:r>
     </w:p>
     <w:p>
@@ -1260,7 +1196,114 @@
         <w:t>Final Implementation of Core Features</w:t>
       </w:r>
     </w:p>
-    <w:p/>
+    <w:p>
+      <w:r>
+        <w:t>Deliverable 3.2 focuses on completing SmartBudget as a fully functional and integrated application. Since the core features and main workflows were already implemented in Deliverable 3.1, this iteration did not require building the system from scratch. Instead, the goal was to finalize the remaining essential features from the project backlog and ensure that the implementation matches the requirements and design that were documented earlier. This aligns directly with the Deliverable 3.2, which emphasizes feature completeness, integration across modules, and a system that is ready for final testing.</w:t>
+      </w:r>
+    </w:p>
+    <w:p>
+      <w:pPr>
+        <w:pStyle w:val="Heading2"/>
+        <w:numPr>
+          <w:ilvl w:val="1"/>
+          <w:numId w:val="1"/>
+        </w:numPr>
+      </w:pPr>
+      <w:r>
+        <w:t>Core functionality already completed in Deliverable 3.1</w:t>
+      </w:r>
+    </w:p>
+    <w:p>
+      <w:r>
+        <w:t>By the end of Deliverable 3.1, SmartBudget already supported the main user workflows through the JavaFX interface. The system included working modules for recording, editing, deleting, and filtering transactions, managing monthly budgets, triggering overspending alerts, generating summary reports, and navigating between the Transactions, Budgets, and Reports pages. The project also included JavaFX modals and confirmations to make user actions clearer and reduce mistakes, along with initial unit testing and manual GUI smoke testing for the main workflows.</w:t>
+      </w:r>
+    </w:p>
+    <w:p>
+      <w:r>
+        <w:t>Even though the system was functional during an active session, Deliverable 3.1 clearly documented one major limitation: data persistence was not yet implemented, meaning that transactions and budgets would not be saved after the application closed. The report also stated that this would be addressed in the next deliverable.</w:t>
+      </w:r>
+    </w:p>
+    <w:p>
+      <w:pPr>
+        <w:pStyle w:val="Heading2"/>
+        <w:numPr>
+          <w:ilvl w:val="1"/>
+          <w:numId w:val="1"/>
+        </w:numPr>
+      </w:pPr>
+      <w:r>
+        <w:t>Key core features completed in Deliverable 3.2</w:t>
+      </w:r>
+    </w:p>
+    <w:p>
+      <w:r>
+        <w:t>The main implementation focus in Deliverable 3.2 was to finish the remaining “must-have” items from the project backlog that were required to make SmartBudget usable across multiple sessions. Based on the backlog status from Deliverable 3.1, the most important items planned for Iteration 3.2 were:</w:t>
+      </w:r>
+    </w:p>
+    <w:p>
+      <w:pPr>
+        <w:pStyle w:val="ListParagraph"/>
+        <w:numPr>
+          <w:ilvl w:val="0"/>
+          <w:numId w:val="32"/>
+        </w:numPr>
+      </w:pPr>
+      <w:r>
+        <w:lastRenderedPageBreak/>
+        <w:t>implementing the persistence layer (Storage abstraction + JSON save/load integration),</w:t>
+      </w:r>
+    </w:p>
+    <w:p>
+      <w:pPr>
+        <w:pStyle w:val="ListParagraph"/>
+        <w:numPr>
+          <w:ilvl w:val="0"/>
+          <w:numId w:val="32"/>
+        </w:numPr>
+      </w:pPr>
+      <w:r>
+        <w:t>loading saved data automatically on startup,</w:t>
+      </w:r>
+    </w:p>
+    <w:p>
+      <w:pPr>
+        <w:pStyle w:val="ListParagraph"/>
+        <w:numPr>
+          <w:ilvl w:val="0"/>
+          <w:numId w:val="32"/>
+        </w:numPr>
+      </w:pPr>
+      <w:r>
+        <w:t xml:space="preserve">adding tests to confirm persistence behavior stays correct and does not break existing workflows. </w:t>
+      </w:r>
+    </w:p>
+    <w:p>
+      <w:r>
+        <w:t xml:space="preserve">These changes complete an essential part of the system’s original functional requirements, since persistence was always expected to be part of SmartBudget so that users can keep their transaction and budget history over time. </w:t>
+      </w:r>
+    </w:p>
+    <w:p>
+      <w:r>
+        <w:t>In addition to persistence and startup loading, Deliverable 3.2 also aims to finalize any incomplete functionality from the previous iteration and ensure that all modules work together consistently. This includes confirming that the Transactions, Budgets/Alerts, and Reports modules interact correctly after persistence is added, and that the GUI continues to behave correctly with saved and restored data. This is important because adding persistence affects the full data flow of the application and can expose integration issues if modules do not handle saved state properly.</w:t>
+      </w:r>
+    </w:p>
+    <w:p>
+      <w:pPr>
+        <w:pStyle w:val="Heading2"/>
+        <w:numPr>
+          <w:ilvl w:val="1"/>
+          <w:numId w:val="1"/>
+        </w:numPr>
+      </w:pPr>
+      <w:r>
+        <w:t>Integration and consistency across the system</w:t>
+      </w:r>
+    </w:p>
+    <w:p>
+      <w:r>
+        <w:t>After implementing persistence and startup loading, the system is treated as a single integrated application rather than separate features that only work in isolation. For Deliverable 3.2, the emphasis is on ensuring that the entire workflow remains correct end-to-end. For example, once data is loaded at startup, users should be able to view existing transactions, filter them, edit or delete them, generate summary reports for a chosen date range, and still have budgets and overspending alerts behave correctly based on the restored data. This supports the deliverable requirement that all features are fully developed, integrated, and ready for final testing and validation.</w:t>
+      </w:r>
+    </w:p>
     <w:p>
       <w:pPr>
         <w:pStyle w:val="Heading1"/>
@@ -1284,33 +1327,20 @@
         <w:rPr>
           <w:color w:val="EE0000"/>
         </w:rPr>
-        <w:t xml:space="preserve">This section presents the updated backlog for </w:t>
-      </w:r>
-      <w:proofErr w:type="spellStart"/>
-      <w:r>
+        <w:t>This section presents the updated backlog for SmartBudget for Iteration 3.1 and the upcoming development cycle. The backlog is based on the project’s core user stories defined earlier (Deliverable 2.2), and it has been refined into more specific design and implementation stories that reflect the current system architecture (UI → Services → Domain → Persistence) and the work completed so far.</w:t>
+      </w:r>
+    </w:p>
+    <w:p>
+      <w:pPr>
         <w:rPr>
           <w:color w:val="EE0000"/>
         </w:rPr>
-        <w:t>SmartBudget</w:t>
-      </w:r>
-      <w:proofErr w:type="spellEnd"/>
+      </w:pPr>
       <w:r>
         <w:rPr>
           <w:color w:val="EE0000"/>
         </w:rPr>
-        <w:t xml:space="preserve"> for Iteration 3.1 and the upcoming development cycle. The backlog is based on the project’s core user stories defined earlier (Deliverable 2.2), and it has been refined into more specific design and implementation stories that reflect the current system architecture (UI → Services → Domain → Persistence) and the work completed so far.</w:t>
-      </w:r>
-    </w:p>
-    <w:p>
-      <w:pPr>
-        <w:rPr>
-          <w:color w:val="EE0000"/>
-        </w:rPr>
-      </w:pPr>
-      <w:r>
-        <w:rPr>
-          <w:color w:val="EE0000"/>
-        </w:rPr>
+        <w:lastRenderedPageBreak/>
         <w:t>Because most core features are now functional, this backlog is split into:</w:t>
       </w:r>
     </w:p>
@@ -1448,21 +1478,7 @@
         <w:rPr>
           <w:color w:val="EE0000"/>
         </w:rPr>
-        <w:t xml:space="preserve"> (features that affect correct app </w:t>
-      </w:r>
-      <w:proofErr w:type="spellStart"/>
-      <w:r>
-        <w:rPr>
-          <w:color w:val="EE0000"/>
-        </w:rPr>
-        <w:t>behavior</w:t>
-      </w:r>
-      <w:proofErr w:type="spellEnd"/>
-      <w:r>
-        <w:rPr>
-          <w:color w:val="EE0000"/>
-        </w:rPr>
-        <w:t xml:space="preserve"> are highest priority),</w:t>
+        <w:t xml:space="preserve"> (features that affect correct app behavior are highest priority),</w:t>
       </w:r>
     </w:p>
     <w:p>
@@ -1858,16 +1874,7 @@
                 <w:sz w:val="20"/>
                 <w:szCs w:val="20"/>
               </w:rPr>
-              <w:t xml:space="preserve">As a developer, I have a layered architecture design (UI, Services, Domain, </w:t>
-            </w:r>
-            <w:r>
-              <w:rPr>
-                <w:color w:val="EE0000"/>
-                <w:sz w:val="20"/>
-                <w:szCs w:val="20"/>
-              </w:rPr>
-              <w:lastRenderedPageBreak/>
-              <w:t>Persistence) so that responsibilities are separated and the system is easier to maintain and test.</w:t>
+              <w:t>As a developer, I have a layered architecture design (UI, Services, Domain, Persistence) so that responsibilities are separated and the system is easier to maintain and test.</w:t>
             </w:r>
           </w:p>
         </w:tc>
@@ -1891,7 +1898,6 @@
                 <w:sz w:val="20"/>
                 <w:szCs w:val="20"/>
               </w:rPr>
-              <w:lastRenderedPageBreak/>
               <w:t>All</w:t>
             </w:r>
           </w:p>
@@ -2580,25 +2586,7 @@
                 <w:sz w:val="20"/>
                 <w:szCs w:val="20"/>
               </w:rPr>
-              <w:t xml:space="preserve">transaction workflows so that the system can detect when spending exceeds a budget and </w:t>
-            </w:r>
-            <w:proofErr w:type="gramStart"/>
-            <w:r>
-              <w:rPr>
-                <w:color w:val="EE0000"/>
-                <w:sz w:val="20"/>
-                <w:szCs w:val="20"/>
-              </w:rPr>
-              <w:t>notify</w:t>
-            </w:r>
-            <w:proofErr w:type="gramEnd"/>
-            <w:r>
-              <w:rPr>
-                <w:color w:val="EE0000"/>
-                <w:sz w:val="20"/>
-                <w:szCs w:val="20"/>
-              </w:rPr>
-              <w:t xml:space="preserve"> the UI when needed.</w:t>
+              <w:t>transaction workflows so that the system can detect when spending exceeds a budget and notify the UI when needed.</w:t>
             </w:r>
           </w:p>
         </w:tc>
@@ -2768,7 +2756,16 @@
                 <w:sz w:val="20"/>
                 <w:szCs w:val="20"/>
               </w:rPr>
-              <w:t>As a developer, I have implemented summary report generation for a selected period so that users can view totals and category breakdowns for a custom date range.</w:t>
+              <w:t xml:space="preserve">As a developer, I have implemented summary report generation for a selected period so that users can view totals and </w:t>
+            </w:r>
+            <w:r>
+              <w:rPr>
+                <w:color w:val="EE0000"/>
+                <w:sz w:val="20"/>
+                <w:szCs w:val="20"/>
+              </w:rPr>
+              <w:lastRenderedPageBreak/>
+              <w:t>category breakdowns for a custom date range.</w:t>
             </w:r>
           </w:p>
         </w:tc>
@@ -2792,6 +2789,7 @@
                 <w:sz w:val="20"/>
                 <w:szCs w:val="20"/>
               </w:rPr>
+              <w:lastRenderedPageBreak/>
               <w:t>US-6</w:t>
             </w:r>
           </w:p>
@@ -3108,25 +3106,7 @@
                 <w:sz w:val="20"/>
                 <w:szCs w:val="20"/>
               </w:rPr>
-              <w:t xml:space="preserve">As a developer, I have implemented JavaFX modals and confirmations for transactions and </w:t>
-            </w:r>
-            <w:proofErr w:type="gramStart"/>
-            <w:r>
-              <w:rPr>
-                <w:color w:val="EE0000"/>
-                <w:sz w:val="20"/>
-                <w:szCs w:val="20"/>
-              </w:rPr>
-              <w:t>budgets</w:t>
-            </w:r>
-            <w:proofErr w:type="gramEnd"/>
-            <w:r>
-              <w:rPr>
-                <w:color w:val="EE0000"/>
-                <w:sz w:val="20"/>
-                <w:szCs w:val="20"/>
-              </w:rPr>
-              <w:t xml:space="preserve"> so that create</w:t>
+              <w:t>As a developer, I have implemented JavaFX modals and confirmations for transactions and budgets so that create</w:t>
             </w:r>
             <w:r>
               <w:rPr>
@@ -3530,25 +3510,7 @@
                 <w:sz w:val="20"/>
                 <w:szCs w:val="20"/>
               </w:rPr>
-              <w:t xml:space="preserve">As a developer, I have generated a </w:t>
-            </w:r>
-            <w:proofErr w:type="spellStart"/>
-            <w:r>
-              <w:rPr>
-                <w:color w:val="EE0000"/>
-                <w:sz w:val="20"/>
-                <w:szCs w:val="20"/>
-              </w:rPr>
-              <w:t>JaCoCo</w:t>
-            </w:r>
-            <w:proofErr w:type="spellEnd"/>
-            <w:r>
-              <w:rPr>
-                <w:color w:val="EE0000"/>
-                <w:sz w:val="20"/>
-                <w:szCs w:val="20"/>
-              </w:rPr>
-              <w:t xml:space="preserve"> coverage report so that we can measure test execution coverage and identify untested modules for the next cycle.</w:t>
+              <w:t>As a developer, I have generated a JaCoCo coverage report so that we can measure test execution coverage and identify untested modules for the next cycle.</w:t>
             </w:r>
           </w:p>
         </w:tc>
@@ -4058,26 +4020,7 @@
                 <w:sz w:val="20"/>
                 <w:szCs w:val="20"/>
               </w:rPr>
-              <w:t xml:space="preserve">As a developer, I have written unit tests for persistence (save/load correctness + restart regression tests) so that persistence </w:t>
-            </w:r>
-            <w:proofErr w:type="spellStart"/>
-            <w:r>
-              <w:rPr>
-                <w:color w:val="EE0000"/>
-                <w:sz w:val="20"/>
-                <w:szCs w:val="20"/>
-              </w:rPr>
-              <w:lastRenderedPageBreak/>
-              <w:t>behavior</w:t>
-            </w:r>
-            <w:proofErr w:type="spellEnd"/>
-            <w:r>
-              <w:rPr>
-                <w:color w:val="EE0000"/>
-                <w:sz w:val="20"/>
-                <w:szCs w:val="20"/>
-              </w:rPr>
-              <w:t xml:space="preserve"> is reliable and does not break existing features.</w:t>
+              <w:t>As a developer, I have written unit tests for persistence (save/load correctness + restart regression tests) so that persistence behavior is reliable and does not break existing features.</w:t>
             </w:r>
           </w:p>
         </w:tc>
@@ -4101,7 +4044,6 @@
                 <w:sz w:val="20"/>
                 <w:szCs w:val="20"/>
               </w:rPr>
-              <w:lastRenderedPageBreak/>
               <w:t>US-8</w:t>
             </w:r>
           </w:p>
@@ -4248,25 +4190,7 @@
                 <w:sz w:val="20"/>
                 <w:szCs w:val="20"/>
               </w:rPr>
-              <w:t xml:space="preserve">As a developer, I have added unit tests for </w:t>
-            </w:r>
-            <w:proofErr w:type="spellStart"/>
-            <w:r>
-              <w:rPr>
-                <w:color w:val="EE0000"/>
-                <w:sz w:val="20"/>
-                <w:szCs w:val="20"/>
-              </w:rPr>
-              <w:t>AlertService</w:t>
-            </w:r>
-            <w:proofErr w:type="spellEnd"/>
-            <w:r>
-              <w:rPr>
-                <w:color w:val="EE0000"/>
-                <w:sz w:val="20"/>
-                <w:szCs w:val="20"/>
-              </w:rPr>
-              <w:t xml:space="preserve"> so that overspending alert rules (including boundary cases) are verified and UC-6 is validated.</w:t>
+              <w:t>As a developer, I have added unit tests for AlertService so that overspending alert rules (including boundary cases) are verified and UC-6 is validated.</w:t>
             </w:r>
           </w:p>
         </w:tc>
@@ -4436,61 +4360,7 @@
                 <w:sz w:val="20"/>
                 <w:szCs w:val="20"/>
               </w:rPr>
-              <w:t xml:space="preserve">As a developer, I have added unit tests for </w:t>
-            </w:r>
-            <w:proofErr w:type="spellStart"/>
-            <w:r>
-              <w:rPr>
-                <w:color w:val="EE0000"/>
-                <w:sz w:val="20"/>
-                <w:szCs w:val="20"/>
-              </w:rPr>
-              <w:t>ReportService</w:t>
-            </w:r>
-            <w:proofErr w:type="spellEnd"/>
-            <w:r>
-              <w:rPr>
-                <w:color w:val="EE0000"/>
-                <w:sz w:val="20"/>
-                <w:szCs w:val="20"/>
-              </w:rPr>
-              <w:t xml:space="preserve"> and </w:t>
-            </w:r>
-            <w:proofErr w:type="spellStart"/>
-            <w:r>
-              <w:rPr>
-                <w:color w:val="EE0000"/>
-                <w:sz w:val="20"/>
-                <w:szCs w:val="20"/>
-              </w:rPr>
-              <w:t>PeriodRange</w:t>
-            </w:r>
-            <w:proofErr w:type="spellEnd"/>
-            <w:r>
-              <w:rPr>
-                <w:color w:val="EE0000"/>
-                <w:sz w:val="20"/>
-                <w:szCs w:val="20"/>
-              </w:rPr>
-              <w:t xml:space="preserve"> so that report calculations, date range validation, and empty-result </w:t>
-            </w:r>
-            <w:proofErr w:type="spellStart"/>
-            <w:r>
-              <w:rPr>
-                <w:color w:val="EE0000"/>
-                <w:sz w:val="20"/>
-                <w:szCs w:val="20"/>
-              </w:rPr>
-              <w:t>behavior</w:t>
-            </w:r>
-            <w:proofErr w:type="spellEnd"/>
-            <w:r>
-              <w:rPr>
-                <w:color w:val="EE0000"/>
-                <w:sz w:val="20"/>
-                <w:szCs w:val="20"/>
-              </w:rPr>
-              <w:t xml:space="preserve"> are correct and UC-5 is validated.</w:t>
+              <w:t>As a developer, I have added unit tests for ReportService and PeriodRange so that report calculations, date range validation, and empty-result behavior are correct and UC-5 is validated.</w:t>
             </w:r>
           </w:p>
         </w:tc>
@@ -4810,6 +4680,7 @@
         <w:rPr>
           <w:color w:val="EE0000"/>
         </w:rPr>
+        <w:lastRenderedPageBreak/>
         <w:t>Notes on Current Progress (Iteration 3.1)</w:t>
       </w:r>
       <w:bookmarkEnd w:id="5"/>
@@ -4829,21 +4700,7 @@
         <w:rPr>
           <w:color w:val="EE0000"/>
         </w:rPr>
-        <w:t xml:space="preserve">The backlog shows that </w:t>
-      </w:r>
-      <w:proofErr w:type="spellStart"/>
-      <w:r>
-        <w:rPr>
-          <w:color w:val="EE0000"/>
-        </w:rPr>
-        <w:t>SmartBudget</w:t>
-      </w:r>
-      <w:proofErr w:type="spellEnd"/>
-      <w:r>
-        <w:rPr>
-          <w:color w:val="EE0000"/>
-        </w:rPr>
-        <w:t xml:space="preserve"> has reached a strong implementation state: core transaction, budget, and report workflows are functional, supported by design documentation and initial testing.</w:t>
+        <w:t>The backlog shows that SmartBudget has reached a strong implementation state: core transaction, budget, and report workflows are functional, supported by design documentation and initial testing.</w:t>
       </w:r>
     </w:p>
     <w:p>
@@ -4901,15 +4758,7 @@
     </w:p>
     <w:p>
       <w:r>
-        <w:t xml:space="preserve">The </w:t>
-      </w:r>
-      <w:proofErr w:type="spellStart"/>
-      <w:r>
-        <w:t>SmartBudget</w:t>
-      </w:r>
-      <w:proofErr w:type="spellEnd"/>
-      <w:r>
-        <w:t xml:space="preserve"> project is hosted on GitHub, and all project deliverables, documents, and source files are stored and updated there throughout each iteration.</w:t>
+        <w:t>The SmartBudget project is hosted on GitHub, and all project deliverables, documents, and source files are stored and updated there throughout each iteration.</w:t>
       </w:r>
     </w:p>
     <w:p>
@@ -6345,6 +6194,119 @@
     </w:lvl>
   </w:abstractNum>
   <w:abstractNum w:abstractNumId="10" w15:restartNumberingAfterBreak="0">
+    <w:nsid w:val="40E3060E"/>
+    <w:multiLevelType w:val="hybridMultilevel"/>
+    <w:tmpl w:val="D39EDEB8"/>
+    <w:lvl w:ilvl="0" w:tplc="10090001">
+      <w:start w:val="1"/>
+      <w:numFmt w:val="bullet"/>
+      <w:lvlText w:val=""/>
+      <w:lvlJc w:val="left"/>
+      <w:pPr>
+        <w:ind w:left="1287" w:hanging="360"/>
+      </w:pPr>
+      <w:rPr>
+        <w:rFonts w:ascii="Symbol" w:hAnsi="Symbol" w:hint="default"/>
+      </w:rPr>
+    </w:lvl>
+    <w:lvl w:ilvl="1" w:tplc="10090003" w:tentative="1">
+      <w:start w:val="1"/>
+      <w:numFmt w:val="bullet"/>
+      <w:lvlText w:val="o"/>
+      <w:lvlJc w:val="left"/>
+      <w:pPr>
+        <w:ind w:left="2007" w:hanging="360"/>
+      </w:pPr>
+      <w:rPr>
+        <w:rFonts w:ascii="Courier New" w:hAnsi="Courier New" w:cs="Courier New" w:hint="default"/>
+      </w:rPr>
+    </w:lvl>
+    <w:lvl w:ilvl="2" w:tplc="10090005" w:tentative="1">
+      <w:start w:val="1"/>
+      <w:numFmt w:val="bullet"/>
+      <w:lvlText w:val=""/>
+      <w:lvlJc w:val="left"/>
+      <w:pPr>
+        <w:ind w:left="2727" w:hanging="360"/>
+      </w:pPr>
+      <w:rPr>
+        <w:rFonts w:ascii="Wingdings" w:hAnsi="Wingdings" w:hint="default"/>
+      </w:rPr>
+    </w:lvl>
+    <w:lvl w:ilvl="3" w:tplc="10090001" w:tentative="1">
+      <w:start w:val="1"/>
+      <w:numFmt w:val="bullet"/>
+      <w:lvlText w:val=""/>
+      <w:lvlJc w:val="left"/>
+      <w:pPr>
+        <w:ind w:left="3447" w:hanging="360"/>
+      </w:pPr>
+      <w:rPr>
+        <w:rFonts w:ascii="Symbol" w:hAnsi="Symbol" w:hint="default"/>
+      </w:rPr>
+    </w:lvl>
+    <w:lvl w:ilvl="4" w:tplc="10090003" w:tentative="1">
+      <w:start w:val="1"/>
+      <w:numFmt w:val="bullet"/>
+      <w:lvlText w:val="o"/>
+      <w:lvlJc w:val="left"/>
+      <w:pPr>
+        <w:ind w:left="4167" w:hanging="360"/>
+      </w:pPr>
+      <w:rPr>
+        <w:rFonts w:ascii="Courier New" w:hAnsi="Courier New" w:cs="Courier New" w:hint="default"/>
+      </w:rPr>
+    </w:lvl>
+    <w:lvl w:ilvl="5" w:tplc="10090005" w:tentative="1">
+      <w:start w:val="1"/>
+      <w:numFmt w:val="bullet"/>
+      <w:lvlText w:val=""/>
+      <w:lvlJc w:val="left"/>
+      <w:pPr>
+        <w:ind w:left="4887" w:hanging="360"/>
+      </w:pPr>
+      <w:rPr>
+        <w:rFonts w:ascii="Wingdings" w:hAnsi="Wingdings" w:hint="default"/>
+      </w:rPr>
+    </w:lvl>
+    <w:lvl w:ilvl="6" w:tplc="10090001" w:tentative="1">
+      <w:start w:val="1"/>
+      <w:numFmt w:val="bullet"/>
+      <w:lvlText w:val=""/>
+      <w:lvlJc w:val="left"/>
+      <w:pPr>
+        <w:ind w:left="5607" w:hanging="360"/>
+      </w:pPr>
+      <w:rPr>
+        <w:rFonts w:ascii="Symbol" w:hAnsi="Symbol" w:hint="default"/>
+      </w:rPr>
+    </w:lvl>
+    <w:lvl w:ilvl="7" w:tplc="10090003" w:tentative="1">
+      <w:start w:val="1"/>
+      <w:numFmt w:val="bullet"/>
+      <w:lvlText w:val="o"/>
+      <w:lvlJc w:val="left"/>
+      <w:pPr>
+        <w:ind w:left="6327" w:hanging="360"/>
+      </w:pPr>
+      <w:rPr>
+        <w:rFonts w:ascii="Courier New" w:hAnsi="Courier New" w:cs="Courier New" w:hint="default"/>
+      </w:rPr>
+    </w:lvl>
+    <w:lvl w:ilvl="8" w:tplc="10090005" w:tentative="1">
+      <w:start w:val="1"/>
+      <w:numFmt w:val="bullet"/>
+      <w:lvlText w:val=""/>
+      <w:lvlJc w:val="left"/>
+      <w:pPr>
+        <w:ind w:left="7047" w:hanging="360"/>
+      </w:pPr>
+      <w:rPr>
+        <w:rFonts w:ascii="Wingdings" w:hAnsi="Wingdings" w:hint="default"/>
+      </w:rPr>
+    </w:lvl>
+  </w:abstractNum>
+  <w:abstractNum w:abstractNumId="11" w15:restartNumberingAfterBreak="0">
     <w:nsid w:val="41063FAF"/>
     <w:multiLevelType w:val="hybridMultilevel"/>
     <w:tmpl w:val="E08008FA"/>
@@ -6457,7 +6419,7 @@
       </w:rPr>
     </w:lvl>
   </w:abstractNum>
-  <w:abstractNum w:abstractNumId="11" w15:restartNumberingAfterBreak="0">
+  <w:abstractNum w:abstractNumId="12" w15:restartNumberingAfterBreak="0">
     <w:nsid w:val="427F439A"/>
     <w:multiLevelType w:val="multilevel"/>
     <w:tmpl w:val="617AF518"/>
@@ -6588,7 +6550,7 @@
       </w:rPr>
     </w:lvl>
   </w:abstractNum>
-  <w:abstractNum w:abstractNumId="12" w15:restartNumberingAfterBreak="0">
+  <w:abstractNum w:abstractNumId="13" w15:restartNumberingAfterBreak="0">
     <w:nsid w:val="4F3D2FEC"/>
     <w:multiLevelType w:val="multilevel"/>
     <w:tmpl w:val="6102F482"/>
@@ -6719,7 +6681,7 @@
       </w:rPr>
     </w:lvl>
   </w:abstractNum>
-  <w:abstractNum w:abstractNumId="13" w15:restartNumberingAfterBreak="0">
+  <w:abstractNum w:abstractNumId="14" w15:restartNumberingAfterBreak="0">
     <w:nsid w:val="608E6A09"/>
     <w:multiLevelType w:val="multilevel"/>
     <w:tmpl w:val="630417F6"/>
@@ -6868,7 +6830,7 @@
       </w:rPr>
     </w:lvl>
   </w:abstractNum>
-  <w:abstractNum w:abstractNumId="14" w15:restartNumberingAfterBreak="0">
+  <w:abstractNum w:abstractNumId="15" w15:restartNumberingAfterBreak="0">
     <w:nsid w:val="6123375C"/>
     <w:multiLevelType w:val="multilevel"/>
     <w:tmpl w:val="2880F8C0"/>
@@ -6999,7 +6961,7 @@
       </w:rPr>
     </w:lvl>
   </w:abstractNum>
-  <w:abstractNum w:abstractNumId="15" w15:restartNumberingAfterBreak="0">
+  <w:abstractNum w:abstractNumId="16" w15:restartNumberingAfterBreak="0">
     <w:nsid w:val="634A4715"/>
     <w:multiLevelType w:val="multilevel"/>
     <w:tmpl w:val="55F2927C"/>
@@ -7113,7 +7075,7 @@
       </w:rPr>
     </w:lvl>
   </w:abstractNum>
-  <w:abstractNum w:abstractNumId="16" w15:restartNumberingAfterBreak="0">
+  <w:abstractNum w:abstractNumId="17" w15:restartNumberingAfterBreak="0">
     <w:nsid w:val="651479FD"/>
     <w:multiLevelType w:val="multilevel"/>
     <w:tmpl w:val="BADE4A1C"/>
@@ -7227,7 +7189,7 @@
       </w:rPr>
     </w:lvl>
   </w:abstractNum>
-  <w:abstractNum w:abstractNumId="17" w15:restartNumberingAfterBreak="0">
+  <w:abstractNum w:abstractNumId="18" w15:restartNumberingAfterBreak="0">
     <w:nsid w:val="68445857"/>
     <w:multiLevelType w:val="multilevel"/>
     <w:tmpl w:val="A4607B1C"/>
@@ -7358,7 +7320,7 @@
       </w:rPr>
     </w:lvl>
   </w:abstractNum>
-  <w:abstractNum w:abstractNumId="18" w15:restartNumberingAfterBreak="0">
+  <w:abstractNum w:abstractNumId="19" w15:restartNumberingAfterBreak="0">
     <w:nsid w:val="68EC6A07"/>
     <w:multiLevelType w:val="hybridMultilevel"/>
     <w:tmpl w:val="D758CA6E"/>
@@ -7471,7 +7433,7 @@
       </w:rPr>
     </w:lvl>
   </w:abstractNum>
-  <w:abstractNum w:abstractNumId="19" w15:restartNumberingAfterBreak="0">
+  <w:abstractNum w:abstractNumId="20" w15:restartNumberingAfterBreak="0">
     <w:nsid w:val="69A116B1"/>
     <w:multiLevelType w:val="multilevel"/>
     <w:tmpl w:val="CAB05F3A"/>
@@ -7560,7 +7522,7 @@
       </w:pPr>
     </w:lvl>
   </w:abstractNum>
-  <w:abstractNum w:abstractNumId="20" w15:restartNumberingAfterBreak="0">
+  <w:abstractNum w:abstractNumId="21" w15:restartNumberingAfterBreak="0">
     <w:nsid w:val="770430B5"/>
     <w:multiLevelType w:val="hybridMultilevel"/>
     <w:tmpl w:val="AAF4D5D0"/>
@@ -7673,7 +7635,7 @@
       </w:rPr>
     </w:lvl>
   </w:abstractNum>
-  <w:abstractNum w:abstractNumId="21" w15:restartNumberingAfterBreak="0">
+  <w:abstractNum w:abstractNumId="22" w15:restartNumberingAfterBreak="0">
     <w:nsid w:val="7B303AC4"/>
     <w:multiLevelType w:val="multilevel"/>
     <w:tmpl w:val="6186C6E0"/>
@@ -7805,10 +7767,10 @@
     </w:lvl>
   </w:abstractNum>
   <w:num w:numId="1" w16cid:durableId="636689723">
-    <w:abstractNumId w:val="19"/>
+    <w:abstractNumId w:val="20"/>
   </w:num>
   <w:num w:numId="2" w16cid:durableId="2067365523">
-    <w:abstractNumId w:val="15"/>
+    <w:abstractNumId w:val="16"/>
   </w:num>
   <w:num w:numId="3" w16cid:durableId="1150168574">
     <w:abstractNumId w:val="4"/>
@@ -7820,19 +7782,19 @@
     <w:abstractNumId w:val="2"/>
   </w:num>
   <w:num w:numId="6" w16cid:durableId="1421293766">
-    <w:abstractNumId w:val="21"/>
+    <w:abstractNumId w:val="22"/>
   </w:num>
   <w:num w:numId="7" w16cid:durableId="1200707560">
-    <w:abstractNumId w:val="14"/>
+    <w:abstractNumId w:val="15"/>
   </w:num>
   <w:num w:numId="8" w16cid:durableId="177038596">
-    <w:abstractNumId w:val="11"/>
+    <w:abstractNumId w:val="12"/>
   </w:num>
   <w:num w:numId="9" w16cid:durableId="1887334189">
-    <w:abstractNumId w:val="17"/>
+    <w:abstractNumId w:val="18"/>
   </w:num>
   <w:num w:numId="10" w16cid:durableId="1248155252">
-    <w:abstractNumId w:val="12"/>
+    <w:abstractNumId w:val="13"/>
   </w:num>
   <w:num w:numId="11" w16cid:durableId="20866556">
     <w:abstractNumId w:val="8"/>
@@ -7841,7 +7803,7 @@
     <w:abstractNumId w:val="3"/>
   </w:num>
   <w:num w:numId="13" w16cid:durableId="1531915552">
-    <w:abstractNumId w:val="18"/>
+    <w:abstractNumId w:val="19"/>
   </w:num>
   <w:num w:numId="14" w16cid:durableId="45835494">
     <w:abstractNumId w:val="5"/>
@@ -7856,22 +7818,22 @@
     <w:abstractNumId w:val="1"/>
   </w:num>
   <w:num w:numId="18" w16cid:durableId="1860000853">
-    <w:abstractNumId w:val="20"/>
+    <w:abstractNumId w:val="21"/>
   </w:num>
   <w:num w:numId="19" w16cid:durableId="1208956972">
     <w:abstractNumId w:val="9"/>
   </w:num>
   <w:num w:numId="20" w16cid:durableId="796680837">
-    <w:abstractNumId w:val="10"/>
+    <w:abstractNumId w:val="11"/>
   </w:num>
   <w:num w:numId="21" w16cid:durableId="1329209884">
-    <w:abstractNumId w:val="13"/>
+    <w:abstractNumId w:val="14"/>
   </w:num>
   <w:num w:numId="22" w16cid:durableId="1103844102">
-    <w:abstractNumId w:val="16"/>
+    <w:abstractNumId w:val="17"/>
   </w:num>
   <w:num w:numId="23" w16cid:durableId="155732580">
-    <w:abstractNumId w:val="16"/>
+    <w:abstractNumId w:val="17"/>
     <w:lvlOverride w:ilvl="0">
       <w:lvl w:ilvl="0">
         <w:start w:val="1"/>
@@ -8001,28 +7963,31 @@
     </w:lvlOverride>
   </w:num>
   <w:num w:numId="24" w16cid:durableId="1611429283">
-    <w:abstractNumId w:val="16"/>
+    <w:abstractNumId w:val="17"/>
   </w:num>
   <w:num w:numId="25" w16cid:durableId="918754324">
-    <w:abstractNumId w:val="16"/>
+    <w:abstractNumId w:val="17"/>
   </w:num>
   <w:num w:numId="26" w16cid:durableId="631328741">
-    <w:abstractNumId w:val="16"/>
+    <w:abstractNumId w:val="17"/>
   </w:num>
   <w:num w:numId="27" w16cid:durableId="928343797">
-    <w:abstractNumId w:val="16"/>
+    <w:abstractNumId w:val="17"/>
   </w:num>
   <w:num w:numId="28" w16cid:durableId="1972862496">
-    <w:abstractNumId w:val="16"/>
+    <w:abstractNumId w:val="17"/>
   </w:num>
   <w:num w:numId="29" w16cid:durableId="53283506">
-    <w:abstractNumId w:val="16"/>
+    <w:abstractNumId w:val="17"/>
   </w:num>
   <w:num w:numId="30" w16cid:durableId="919025089">
-    <w:abstractNumId w:val="16"/>
+    <w:abstractNumId w:val="17"/>
   </w:num>
   <w:num w:numId="31" w16cid:durableId="363795691">
-    <w:abstractNumId w:val="16"/>
+    <w:abstractNumId w:val="17"/>
+  </w:num>
+  <w:num w:numId="32" w16cid:durableId="1863088587">
+    <w:abstractNumId w:val="10"/>
   </w:num>
 </w:numbering>
 </file>
@@ -8645,6 +8610,7 @@
   <w:style w:type="character" w:default="1" w:styleId="DefaultParagraphFont">
     <w:name w:val="Default Paragraph Font"/>
     <w:uiPriority w:val="1"/>
+    <w:semiHidden/>
     <w:unhideWhenUsed/>
   </w:style>
   <w:style w:type="table" w:default="1" w:styleId="TableNormal">
@@ -10036,28 +10002,28 @@
 </file>
 
 <file path=customXml/item1.xml><?xml version="1.0" encoding="utf-8"?>
+<b:Sources xmlns:b="http://schemas.openxmlformats.org/officeDocument/2006/bibliography" xmlns="http://schemas.openxmlformats.org/officeDocument/2006/bibliography" SelectedStyle="\APASixthEditionOfficeOnline.xsl" StyleName="APA" Version="6"/>
+</file>
+
+<file path=customXml/item2.xml><?xml version="1.0" encoding="utf-8"?>
 <go:gDocsCustomXmlDataStorage xmlns:go="http://customooxmlschemas.google.com/" xmlns:r="http://schemas.openxmlformats.org/officeDocument/2006/relationships" uri="GoogleDocsCustomDataVersion2">
   <go:docsCustomData xmlns:go="http://customooxmlschemas.google.com/" roundtripDataSignature="AMtx7miJ6jBku9xl85SWSecz3EkDtTZ7ig==">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</go:docsCustomData>
 </go:gDocsCustomXmlDataStorage>
 </file>
 
-<file path=customXml/item2.xml><?xml version="1.0" encoding="utf-8"?>
-<b:Sources xmlns:b="http://schemas.openxmlformats.org/officeDocument/2006/bibliography" xmlns="http://schemas.openxmlformats.org/officeDocument/2006/bibliography" SelectedStyle="\APASixthEditionOfficeOnline.xsl" StyleName="APA" Version="6"/>
+<file path=customXml/itemProps1.xml><?xml version="1.0" encoding="utf-8"?>
+<ds:datastoreItem xmlns:ds="http://schemas.openxmlformats.org/officeDocument/2006/customXml" ds:itemID="{B760E781-241A-41DF-B721-04AFE38F8B17}">
+  <ds:schemaRefs>
+    <ds:schemaRef ds:uri="http://schemas.openxmlformats.org/officeDocument/2006/bibliography"/>
+  </ds:schemaRefs>
+</ds:datastoreItem>
 </file>
 
-<file path=customXml/itemProps1.xml><?xml version="1.0" encoding="utf-8"?>
+<file path=customXml/itemProps2.xml><?xml version="1.0" encoding="utf-8"?>
 <ds:datastoreItem xmlns:ds="http://schemas.openxmlformats.org/officeDocument/2006/customXml" ds:itemID="{11111111-1234-1234-1234-123412341234}">
   <ds:schemaRefs>
     <ds:schemaRef ds:uri="http://customooxmlschemas.google.com/"/>
     <ds:schemaRef ds:uri="http://schemas.openxmlformats.org/officeDocument/2006/relationships"/>
   </ds:schemaRefs>
 </ds:datastoreItem>
-</file>
-
-<file path=customXml/itemProps2.xml><?xml version="1.0" encoding="utf-8"?>
-<ds:datastoreItem xmlns:ds="http://schemas.openxmlformats.org/officeDocument/2006/customXml" ds:itemID="{B760E781-241A-41DF-B721-04AFE38F8B17}">
-  <ds:schemaRefs>
-    <ds:schemaRef ds:uri="http://schemas.openxmlformats.org/officeDocument/2006/bibliography"/>
-  </ds:schemaRefs>
-</ds:datastoreItem>
 </file>
</xml_diff>

<commit_message>
add section 5 testing and validation draft to the report
</commit_message>
<xml_diff>
--- a/docs/deliverables/3.2/Deliverable 3-2 Implementation - Submission.docx
+++ b/docs/deliverables/3.2/Deliverable 3-2 Implementation - Submission.docx
@@ -120,8 +120,13 @@
       <w:pPr>
         <w:jc w:val="center"/>
       </w:pPr>
-      <w:r>
-        <w:t>SmartBudget – Personal Finance Tracker</w:t>
+      <w:proofErr w:type="spellStart"/>
+      <w:r>
+        <w:t>SmartBudget</w:t>
+      </w:r>
+      <w:proofErr w:type="spellEnd"/>
+      <w:r>
+        <w:t xml:space="preserve"> – Personal Finance Tracker</w:t>
       </w:r>
     </w:p>
     <w:p>
@@ -197,8 +202,13 @@
         <w:jc w:val="center"/>
       </w:pPr>
       <w:r>
-        <w:t>Mohsen Pasdar, Muhammed Ahmed, Alia Hagi-Dhaffe</w:t>
-      </w:r>
+        <w:t>Mohsen Pasdar, Muhammed Ahmed, Alia Hagi-</w:t>
+      </w:r>
+      <w:proofErr w:type="spellStart"/>
+      <w:r>
+        <w:t>Dhaffe</w:t>
+      </w:r>
+      <w:proofErr w:type="spellEnd"/>
     </w:p>
     <w:p>
       <w:pPr>
@@ -727,13 +737,34 @@
     <w:p>
       <w:bookmarkStart w:id="1" w:name="_heading=h.eh2mv956rqcp" w:colFirst="0" w:colLast="0"/>
       <w:bookmarkEnd w:id="1"/>
-      <w:r>
-        <w:t xml:space="preserve">SmartBudget is a personal finance application that helps users record daily transactions, set monthly budgets by category, and view summary reports to better understand their spending habits. The main goal of the system is to make personal budgeting simple and practical by giving users a clear view of their income and expenses, while also helping them manage spending through budget tracking, alerts, and summary reports. Across the earlier deliverables, our team developed the project step by step, beginning with requirements, use cases, and testing documentation, and then moving into software design, GUI development, and the initial implementation of the system. </w:t>
-      </w:r>
-    </w:p>
-    <w:p>
-      <w:r>
-        <w:t xml:space="preserve">This document represents Deliverable 3.2 for the SmartBudget project. The main purpose of this iteration is to complete and strengthen the implementation by refactoring the existing codebase, finishing important backlog items from Deliverable 3.1, and carrying out more complete testing and validation. In particular, this report focuses on codebase improvements for better structure and maintainability, the addition of remaining features such as persistence and loading saved data on startup, and the testing work needed to confirm that the system functions correctly after integration. These areas match the main requirements of the Deliverable 3.2, which emphasizes refactoring, final implementation of core features, and full testing and validation. </w:t>
+      <w:proofErr w:type="spellStart"/>
+      <w:r>
+        <w:t>SmartBudget</w:t>
+      </w:r>
+      <w:proofErr w:type="spellEnd"/>
+      <w:r>
+        <w:t xml:space="preserve"> is a personal finance application that helps users record daily transactions, set monthly budgets by category, and view summary reports to better understand their spending habits. The main goal of the system is to make personal budgeting simple and practical by giving users a clear view of their income and expenses, while also helping them manage spending through budget tracking, alerts, and summary reports. Across the earlier deliverables, our team developed the project step by step, beginning with requirements, use cases, and testing documentation, and then moving into software design, GUI development, and the initial implementation of the system. </w:t>
+      </w:r>
+    </w:p>
+    <w:p>
+      <w:r>
+        <w:t xml:space="preserve">This document represents Deliverable 3.2 for the </w:t>
+      </w:r>
+      <w:proofErr w:type="spellStart"/>
+      <w:r>
+        <w:t>SmartBudget</w:t>
+      </w:r>
+      <w:proofErr w:type="spellEnd"/>
+      <w:r>
+        <w:t xml:space="preserve"> project. The main purpose of this iteration is to complete and strengthen the implementation by refactoring the existing codebase, finishing important backlog items from Deliverable 3.1, and carrying out more complete testing and validation. </w:t>
+      </w:r>
+      <w:proofErr w:type="gramStart"/>
+      <w:r>
+        <w:t>In particular, this</w:t>
+      </w:r>
+      <w:proofErr w:type="gramEnd"/>
+      <w:r>
+        <w:t xml:space="preserve"> report focuses on codebase improvements for better structure and maintainability, the addition of remaining features such as persistence and loading saved data on startup, and the testing work needed to confirm that the system functions correctly after integration. These areas match the main requirements of the Deliverable 3.2, which emphasizes refactoring, final implementation of core features, and full testing and validation. </w:t>
       </w:r>
     </w:p>
     <w:p>
@@ -765,17 +796,41 @@
     </w:p>
     <w:p>
       <w:r>
-        <w:t xml:space="preserve">Deliverable 3.2 builds directly on the work completed in Deliverable 3.1, where the SmartBudget project moved from earlier planning and prototype work into a functional implementation stage. In Deliverable 3.1, the team completed the main software design documentation, including the layered architecture overview, UML class diagrams, sequence diagrams, and activity diagrams for the system’s key workflows. At the same time, the project reached an important development milestone because the main modules of the application were already implemented and connected to the JavaFX interface. These modules included transaction management, transaction viewing and filtering, monthly budgets, overspending alerts, summary reports, and navigation across the main pages of the system. </w:t>
-      </w:r>
-    </w:p>
-    <w:p>
-      <w:r>
-        <w:t xml:space="preserve">By the end of Deliverable 3.1, SmartBudget was able to demonstrate the main user workflows during an active session and already reflected the core requirements defined earlier in Deliverable 2.2. This showed that the project had moved beyond the design and prototype stage and into a working desktop application with a clear layered structure separating the UI, business logic, domain model, and persistence concerns. In other words, the starting point for Deliverable 3.2 was not an incomplete design, but a working system that already supported the main features at a functional level. </w:t>
-      </w:r>
-    </w:p>
-    <w:p>
-      <w:r>
-        <w:t xml:space="preserve">At the same time, Deliverable 3.1 clearly identified the main work that still remained for the next cycle. The most important limitation was that data persistence had not yet been finalized, which meant that transactions and budgets were not saved after the application closed. The preliminary testing and coverage review also showed that some important areas still needed stronger automated testing, especially alert logic, report generation, and the persistence-related workflows planned for the next stage. In addition, a few small GUI refinements were still listed in the backlog. </w:t>
+        <w:t xml:space="preserve">Deliverable 3.2 builds directly on the work completed in Deliverable 3.1, where the </w:t>
+      </w:r>
+      <w:proofErr w:type="spellStart"/>
+      <w:r>
+        <w:t>SmartBudget</w:t>
+      </w:r>
+      <w:proofErr w:type="spellEnd"/>
+      <w:r>
+        <w:t xml:space="preserve"> project moved from earlier planning and prototype work into a functional implementation stage. In Deliverable 3.1, the team completed the main software design documentation, including the layered architecture overview, UML class diagrams, sequence diagrams, and activity diagrams for the system’s key workflows. At the same time, the project reached an important development milestone because the main modules of the application were already implemented and connected to the JavaFX interface. These modules included transaction management, transaction viewing and filtering, monthly budgets, overspending alerts, summary reports, and navigation across the main pages of the system. </w:t>
+      </w:r>
+    </w:p>
+    <w:p>
+      <w:r>
+        <w:t xml:space="preserve">By the end of Deliverable 3.1, </w:t>
+      </w:r>
+      <w:proofErr w:type="spellStart"/>
+      <w:r>
+        <w:t>SmartBudget</w:t>
+      </w:r>
+      <w:proofErr w:type="spellEnd"/>
+      <w:r>
+        <w:t xml:space="preserve"> was able to demonstrate the main user workflows during an active session and already reflected the core requirements defined earlier in Deliverable 2.2. This showed that the project had moved beyond the design and prototype stage and into a working desktop application with a clear layered structure separating the UI, business logic, domain model, and persistence concerns. In other words, the starting point for Deliverable 3.2 was not an incomplete design, but a working system that already supported the main features at a functional level. </w:t>
+      </w:r>
+    </w:p>
+    <w:p>
+      <w:r>
+        <w:t xml:space="preserve">At the same time, Deliverable 3.1 clearly identified the main work that </w:t>
+      </w:r>
+      <w:proofErr w:type="gramStart"/>
+      <w:r>
+        <w:t>still remained</w:t>
+      </w:r>
+      <w:proofErr w:type="gramEnd"/>
+      <w:r>
+        <w:t xml:space="preserve"> for the next cycle. The most important limitation was that data persistence had not yet been finalized, which meant that transactions and budgets were not saved after the application closed. The preliminary testing and coverage review also showed that some important areas still needed stronger automated testing, especially alert logic, report generation, and the persistence-related workflows planned for the next stage. In addition, a few small GUI refinements were still listed in the backlog. </w:t>
       </w:r>
     </w:p>
     <w:p>
@@ -801,7 +856,23 @@
     </w:p>
     <w:p>
       <w:r>
-        <w:t>In Deliverable 3.2, our main focus was to strengthen the existing SmartBudget implementation by improving code quality and long-term maintainability. Since the core workflows and main classes were already implemented in Deliverable 3.1, this iteration did not require a complete redesign. Instead, the refactoring work focused on targeted improvements that make the system easier to understand, test, and extend. This approach matches the purpose of Deliverable 3.2, which emphasizes refactoring, codebase improvements, and system-level validation rather than new design work.</w:t>
+        <w:t xml:space="preserve">In Deliverable 3.2, our </w:t>
+      </w:r>
+      <w:proofErr w:type="gramStart"/>
+      <w:r>
+        <w:t>main focus</w:t>
+      </w:r>
+      <w:proofErr w:type="gramEnd"/>
+      <w:r>
+        <w:t xml:space="preserve"> was to strengthen the existing </w:t>
+      </w:r>
+      <w:proofErr w:type="spellStart"/>
+      <w:r>
+        <w:t>SmartBudget</w:t>
+      </w:r>
+      <w:proofErr w:type="spellEnd"/>
+      <w:r>
+        <w:t xml:space="preserve"> implementation by improving code quality and long-term maintainability. Since the core workflows and main classes were already implemented in Deliverable 3.1, this iteration did not require a complete redesign. Instead, the refactoring work focused on targeted improvements that make the system easier to understand, test, and extend. This approach matches the purpose of Deliverable 3.2, which emphasizes refactoring, codebase improvements, and system-level validation rather than new design work.</w:t>
       </w:r>
     </w:p>
     <w:p>
@@ -965,7 +1036,15 @@
     </w:p>
     <w:p>
       <w:r>
-        <w:t>During this iteration, the team applied small-to-medium refactoring changes rather than large structural changes. The main actions were centered on cleaning up existing implementation code and making it easier to integrate persistence and testing.</w:t>
+        <w:t xml:space="preserve">During this iteration, the team applied small-to-medium refactoring changes rather than large structural changes. The main actions were </w:t>
+      </w:r>
+      <w:proofErr w:type="spellStart"/>
+      <w:r>
+        <w:t>centered</w:t>
+      </w:r>
+      <w:proofErr w:type="spellEnd"/>
+      <w:r>
+        <w:t xml:space="preserve"> on cleaning up existing implementation code and making it easier to integrate persistence and testing.</w:t>
       </w:r>
     </w:p>
     <w:p>
@@ -1198,7 +1277,15 @@
     </w:p>
     <w:p>
       <w:r>
-        <w:t>Deliverable 3.2 focuses on completing SmartBudget as a fully functional and integrated application. Since the core features and main workflows were already implemented in Deliverable 3.1, this iteration did not require building the system from scratch. Instead, the goal was to finalize the remaining essential features from the project backlog and ensure that the implementation matches the requirements and design that were documented earlier. This aligns directly with the Deliverable 3.2, which emphasizes feature completeness, integration across modules, and a system that is ready for final testing.</w:t>
+        <w:t xml:space="preserve">Deliverable 3.2 focuses on completing </w:t>
+      </w:r>
+      <w:proofErr w:type="spellStart"/>
+      <w:r>
+        <w:t>SmartBudget</w:t>
+      </w:r>
+      <w:proofErr w:type="spellEnd"/>
+      <w:r>
+        <w:t xml:space="preserve"> as a fully functional and integrated application. Since the core features and main workflows were already implemented in Deliverable 3.1, this iteration did not require building the system from scratch. Instead, the goal was to finalize the remaining essential features from the project backlog and ensure that the implementation matches the requirements and design that were documented earlier. This aligns directly with the Deliverable 3.2, which emphasizes feature completeness, integration across modules, and a system that is ready for final testing.</w:t>
       </w:r>
     </w:p>
     <w:p>
@@ -1215,7 +1302,15 @@
     </w:p>
     <w:p>
       <w:r>
-        <w:t>By the end of Deliverable 3.1, SmartBudget already supported the main user workflows through the JavaFX interface. The system included working modules for recording, editing, deleting, and filtering transactions, managing monthly budgets, triggering overspending alerts, generating summary reports, and navigating between the Transactions, Budgets, and Reports pages. The project also included JavaFX modals and confirmations to make user actions clearer and reduce mistakes, along with initial unit testing and manual GUI smoke testing for the main workflows.</w:t>
+        <w:t xml:space="preserve">By the end of Deliverable 3.1, </w:t>
+      </w:r>
+      <w:proofErr w:type="spellStart"/>
+      <w:r>
+        <w:t>SmartBudget</w:t>
+      </w:r>
+      <w:proofErr w:type="spellEnd"/>
+      <w:r>
+        <w:t xml:space="preserve"> already supported the main user workflows through the JavaFX interface. The system included working modules for recording, editing, deleting, and filtering transactions, managing monthly budgets, triggering overspending alerts, generating summary reports, and navigating between the Transactions, Budgets, and Reports pages. The project also included JavaFX modals and confirmations to make user actions clearer and reduce mistakes, along with initial unit testing and manual GUI smoke testing for the main workflows.</w:t>
       </w:r>
     </w:p>
     <w:p>
@@ -1237,7 +1332,31 @@
     </w:p>
     <w:p>
       <w:r>
-        <w:t>The main implementation focus in Deliverable 3.2 was to finish the remaining “must-have” items from the project backlog that were required to make SmartBudget usable across multiple sessions. Based on the backlog status from Deliverable 3.1, the most important items planned for Iteration 3.2 were:</w:t>
+        <w:t xml:space="preserve">The main implementation </w:t>
+      </w:r>
+      <w:proofErr w:type="gramStart"/>
+      <w:r>
+        <w:t>focus</w:t>
+      </w:r>
+      <w:proofErr w:type="gramEnd"/>
+      <w:r>
+        <w:t xml:space="preserve"> </w:t>
+      </w:r>
+      <w:proofErr w:type="gramStart"/>
+      <w:r>
+        <w:t>in</w:t>
+      </w:r>
+      <w:proofErr w:type="gramEnd"/>
+      <w:r>
+        <w:t xml:space="preserve"> Deliverable 3.2 was to finish the remaining “must-have” items from the project backlog that were required to make </w:t>
+      </w:r>
+      <w:proofErr w:type="spellStart"/>
+      <w:r>
+        <w:t>SmartBudget</w:t>
+      </w:r>
+      <w:proofErr w:type="spellEnd"/>
+      <w:r>
+        <w:t xml:space="preserve"> usable across multiple sessions. Based on the backlog status from Deliverable 3.1, the most important items planned for Iteration 3.2 were:</w:t>
       </w:r>
     </w:p>
     <w:p>
@@ -1274,12 +1393,28 @@
         </w:numPr>
       </w:pPr>
       <w:r>
-        <w:t xml:space="preserve">adding tests to confirm persistence behavior stays correct and does not break existing workflows. </w:t>
-      </w:r>
-    </w:p>
-    <w:p>
-      <w:r>
-        <w:t xml:space="preserve">These changes complete an essential part of the system’s original functional requirements, since persistence was always expected to be part of SmartBudget so that users can keep their transaction and budget history over time. </w:t>
+        <w:t xml:space="preserve">adding tests to confirm persistence </w:t>
+      </w:r>
+      <w:proofErr w:type="spellStart"/>
+      <w:r>
+        <w:t>behavior</w:t>
+      </w:r>
+      <w:proofErr w:type="spellEnd"/>
+      <w:r>
+        <w:t xml:space="preserve"> stays correct and does not break existing workflows. </w:t>
+      </w:r>
+    </w:p>
+    <w:p>
+      <w:r>
+        <w:t xml:space="preserve">These changes complete an essential part of the system’s original functional requirements, since persistence was always expected to be part of </w:t>
+      </w:r>
+      <w:proofErr w:type="spellStart"/>
+      <w:r>
+        <w:t>SmartBudget</w:t>
+      </w:r>
+      <w:proofErr w:type="spellEnd"/>
+      <w:r>
+        <w:t xml:space="preserve"> so that users can keep their transaction and budget history over time. </w:t>
       </w:r>
     </w:p>
     <w:p>
@@ -1313,6 +1448,1056 @@
         </w:numPr>
       </w:pPr>
       <w:r>
+        <w:t>Testing and Validation</w:t>
+      </w:r>
+    </w:p>
+    <w:p>
+      <w:r>
+        <w:t xml:space="preserve">The goal of testing in Deliverable 3.2 is to confirm that </w:t>
+      </w:r>
+      <w:proofErr w:type="spellStart"/>
+      <w:r>
+        <w:t>SmartBudget</w:t>
+      </w:r>
+      <w:proofErr w:type="spellEnd"/>
+      <w:r>
+        <w:t xml:space="preserve"> is stable, correct, and ready for final review as a complete system. In this iteration, testing focuses on two major areas. First, we validate that each core feature meets its functional requirements through comprehensive functional testing, including edge cases and error conditions. Second, we perform system and integration testing to confirm that the full workflow works end-to-end and </w:t>
+      </w:r>
+      <w:r>
+        <w:lastRenderedPageBreak/>
+        <w:t xml:space="preserve">that modules interact correctly, especially after persistence and startup loading were implemented. </w:t>
+      </w:r>
+    </w:p>
+    <w:p>
+      <w:pPr>
+        <w:pStyle w:val="Heading2"/>
+        <w:numPr>
+          <w:ilvl w:val="1"/>
+          <w:numId w:val="1"/>
+        </w:numPr>
+      </w:pPr>
+      <w:r>
+        <w:t>Testing Strategy and Approach</w:t>
+      </w:r>
+    </w:p>
+    <w:p>
+      <w:r>
+        <w:t xml:space="preserve">Our testing strategy combines automated unit tests with functional workflow testing. Automated tests are used to validate business rules in the domain/service layers (independent from the GUI), while functional and integration testing validate that real user workflows behave correctly through the application interface. This approach builds on our earlier testing direction from Deliverable 3.1, where we used JUnit unit tests for core logic and manual GUI smoke tests for workflow validation, </w:t>
+      </w:r>
+      <w:proofErr w:type="gramStart"/>
+      <w:r>
+        <w:t>and also</w:t>
+      </w:r>
+      <w:proofErr w:type="gramEnd"/>
+      <w:r>
+        <w:t xml:space="preserve"> addresses the coverage gaps identified for alerts, reporting, and persistence.</w:t>
+      </w:r>
+    </w:p>
+    <w:p>
+      <w:pPr>
+        <w:pStyle w:val="Heading2"/>
+        <w:numPr>
+          <w:ilvl w:val="1"/>
+          <w:numId w:val="1"/>
+        </w:numPr>
+      </w:pPr>
+      <w:r>
+        <w:t>Functional Testing</w:t>
+      </w:r>
+    </w:p>
+    <w:p>
+      <w:r>
+        <w:t xml:space="preserve">Functional testing verifies that each major feature behaves correctly and meets its requirements, including normal scenarios, error handling, and edge cases. Test cases were designed to cover the main functions of </w:t>
+      </w:r>
+      <w:proofErr w:type="spellStart"/>
+      <w:r>
+        <w:t>SmartBudget</w:t>
+      </w:r>
+      <w:proofErr w:type="spellEnd"/>
+      <w:r>
+        <w:t xml:space="preserve"> (transactions, filters, budgets, alerts, reports, and persistence) and validate the expected </w:t>
+      </w:r>
+      <w:proofErr w:type="spellStart"/>
+      <w:r>
+        <w:t>behavior</w:t>
+      </w:r>
+      <w:proofErr w:type="spellEnd"/>
+      <w:r>
+        <w:t xml:space="preserve"> when users provide both valid and invalid inputs.</w:t>
+      </w:r>
+    </w:p>
+    <w:p>
+      <w:pPr>
+        <w:pStyle w:val="Heading3"/>
+        <w:numPr>
+          <w:ilvl w:val="2"/>
+          <w:numId w:val="1"/>
+        </w:numPr>
+      </w:pPr>
+      <w:r>
+        <w:t>Transactions (Record/Edit/Delete)</w:t>
+      </w:r>
+    </w:p>
+    <w:p>
+      <w:pPr>
+        <w:pStyle w:val="ListParagraph"/>
+        <w:numPr>
+          <w:ilvl w:val="0"/>
+          <w:numId w:val="37"/>
+        </w:numPr>
+        <w:rPr>
+          <w:highlight w:val="yellow"/>
+          <w:lang w:val="en-CA"/>
+        </w:rPr>
+      </w:pPr>
+      <w:r>
+        <w:rPr>
+          <w:highlight w:val="yellow"/>
+          <w:lang w:val="en-CA"/>
+        </w:rPr>
+        <w:t>Valid transaction creation (income/expense)</w:t>
+      </w:r>
+    </w:p>
+    <w:p>
+      <w:pPr>
+        <w:pStyle w:val="ListParagraph"/>
+        <w:numPr>
+          <w:ilvl w:val="0"/>
+          <w:numId w:val="37"/>
+        </w:numPr>
+        <w:rPr>
+          <w:highlight w:val="yellow"/>
+          <w:lang w:val="en-CA"/>
+        </w:rPr>
+      </w:pPr>
+      <w:r>
+        <w:rPr>
+          <w:highlight w:val="yellow"/>
+          <w:lang w:val="en-CA"/>
+        </w:rPr>
+        <w:t>Invalid inputs: negative amount, non-numeric amount, missing required fields, invalid date</w:t>
+      </w:r>
+    </w:p>
+    <w:p>
+      <w:pPr>
+        <w:pStyle w:val="ListParagraph"/>
+        <w:numPr>
+          <w:ilvl w:val="0"/>
+          <w:numId w:val="37"/>
+        </w:numPr>
+        <w:rPr>
+          <w:highlight w:val="yellow"/>
+          <w:lang w:val="en-CA"/>
+        </w:rPr>
+      </w:pPr>
+      <w:r>
+        <w:rPr>
+          <w:highlight w:val="yellow"/>
+          <w:lang w:val="en-CA"/>
+        </w:rPr>
+        <w:t>Edit transaction and confirm list/totals update</w:t>
+      </w:r>
+    </w:p>
+    <w:p>
+      <w:pPr>
+        <w:pStyle w:val="ListParagraph"/>
+        <w:numPr>
+          <w:ilvl w:val="0"/>
+          <w:numId w:val="37"/>
+        </w:numPr>
+        <w:rPr>
+          <w:highlight w:val="yellow"/>
+          <w:lang w:val="en-CA"/>
+        </w:rPr>
+      </w:pPr>
+      <w:r>
+        <w:rPr>
+          <w:highlight w:val="yellow"/>
+          <w:lang w:val="en-CA"/>
+        </w:rPr>
+        <w:t>Delete transaction with confirmation and cancel-delete behavior</w:t>
+      </w:r>
+    </w:p>
+    <w:p>
+      <w:pPr>
+        <w:pStyle w:val="Heading3"/>
+        <w:numPr>
+          <w:ilvl w:val="2"/>
+          <w:numId w:val="1"/>
+        </w:numPr>
+      </w:pPr>
+      <w:r>
+        <w:t>View &amp; Filter Transactions</w:t>
+      </w:r>
+    </w:p>
+    <w:p>
+      <w:pPr>
+        <w:pStyle w:val="ListParagraph"/>
+        <w:numPr>
+          <w:ilvl w:val="0"/>
+          <w:numId w:val="38"/>
+        </w:numPr>
+        <w:rPr>
+          <w:highlight w:val="yellow"/>
+          <w:lang w:val="en-CA"/>
+        </w:rPr>
+      </w:pPr>
+      <w:r>
+        <w:rPr>
+          <w:highlight w:val="yellow"/>
+          <w:lang w:val="en-CA"/>
+        </w:rPr>
+        <w:t>Filter by date range</w:t>
+      </w:r>
+    </w:p>
+    <w:p>
+      <w:pPr>
+        <w:pStyle w:val="ListParagraph"/>
+        <w:numPr>
+          <w:ilvl w:val="0"/>
+          <w:numId w:val="38"/>
+        </w:numPr>
+        <w:rPr>
+          <w:highlight w:val="yellow"/>
+          <w:lang w:val="en-CA"/>
+        </w:rPr>
+      </w:pPr>
+      <w:r>
+        <w:rPr>
+          <w:highlight w:val="yellow"/>
+          <w:lang w:val="en-CA"/>
+        </w:rPr>
+        <w:t>Filter by category</w:t>
+      </w:r>
+    </w:p>
+    <w:p>
+      <w:pPr>
+        <w:pStyle w:val="ListParagraph"/>
+        <w:numPr>
+          <w:ilvl w:val="0"/>
+          <w:numId w:val="38"/>
+        </w:numPr>
+        <w:rPr>
+          <w:highlight w:val="yellow"/>
+          <w:lang w:val="en-CA"/>
+        </w:rPr>
+      </w:pPr>
+      <w:r>
+        <w:rPr>
+          <w:highlight w:val="yellow"/>
+          <w:lang w:val="en-CA"/>
+        </w:rPr>
+        <w:t>Combined filters</w:t>
+      </w:r>
+    </w:p>
+    <w:p>
+      <w:pPr>
+        <w:pStyle w:val="ListParagraph"/>
+        <w:numPr>
+          <w:ilvl w:val="0"/>
+          <w:numId w:val="38"/>
+        </w:numPr>
+        <w:rPr>
+          <w:highlight w:val="yellow"/>
+          <w:lang w:val="en-CA"/>
+        </w:rPr>
+      </w:pPr>
+      <w:r>
+        <w:rPr>
+          <w:highlight w:val="yellow"/>
+          <w:lang w:val="en-CA"/>
+        </w:rPr>
+        <w:t>Empty results case (“no records found” behavior)</w:t>
+      </w:r>
+    </w:p>
+    <w:p>
+      <w:pPr>
+        <w:pStyle w:val="Heading3"/>
+        <w:numPr>
+          <w:ilvl w:val="2"/>
+          <w:numId w:val="1"/>
+        </w:numPr>
+      </w:pPr>
+      <w:r>
+        <w:t>Budgets and Overspending Alerts</w:t>
+      </w:r>
+    </w:p>
+    <w:p>
+      <w:pPr>
+        <w:pStyle w:val="ListParagraph"/>
+        <w:numPr>
+          <w:ilvl w:val="0"/>
+          <w:numId w:val="41"/>
+        </w:numPr>
+        <w:rPr>
+          <w:highlight w:val="yellow"/>
+          <w:lang w:val="en-CA"/>
+        </w:rPr>
+      </w:pPr>
+      <w:r>
+        <w:rPr>
+          <w:highlight w:val="yellow"/>
+          <w:lang w:val="en-CA"/>
+        </w:rPr>
+        <w:lastRenderedPageBreak/>
+        <w:t>Create/edit/delete budget</w:t>
+      </w:r>
+    </w:p>
+    <w:p>
+      <w:pPr>
+        <w:pStyle w:val="ListParagraph"/>
+        <w:numPr>
+          <w:ilvl w:val="0"/>
+          <w:numId w:val="41"/>
+        </w:numPr>
+        <w:rPr>
+          <w:lang w:val="en-CA"/>
+        </w:rPr>
+      </w:pPr>
+      <w:r>
+        <w:rPr>
+          <w:highlight w:val="yellow"/>
+          <w:lang w:val="en-CA"/>
+        </w:rPr>
+        <w:t>Overspending detection when spending reaches/exceeds limit</w:t>
+      </w:r>
+    </w:p>
+    <w:p>
+      <w:pPr>
+        <w:pStyle w:val="Heading3"/>
+        <w:numPr>
+          <w:ilvl w:val="2"/>
+          <w:numId w:val="1"/>
+        </w:numPr>
+      </w:pPr>
+      <w:r>
+        <w:t>Reports (Summary + Category Breakdown)</w:t>
+      </w:r>
+    </w:p>
+    <w:p>
+      <w:pPr>
+        <w:pStyle w:val="ListParagraph"/>
+        <w:numPr>
+          <w:ilvl w:val="0"/>
+          <w:numId w:val="40"/>
+        </w:numPr>
+        <w:rPr>
+          <w:highlight w:val="yellow"/>
+          <w:lang w:val="en-CA"/>
+        </w:rPr>
+      </w:pPr>
+      <w:r>
+        <w:rPr>
+          <w:highlight w:val="yellow"/>
+          <w:lang w:val="en-CA"/>
+        </w:rPr>
+        <w:t>Generate report for a valid period</w:t>
+      </w:r>
+    </w:p>
+    <w:p>
+      <w:pPr>
+        <w:pStyle w:val="ListParagraph"/>
+        <w:numPr>
+          <w:ilvl w:val="0"/>
+          <w:numId w:val="40"/>
+        </w:numPr>
+        <w:rPr>
+          <w:highlight w:val="yellow"/>
+          <w:lang w:val="en-CA"/>
+        </w:rPr>
+      </w:pPr>
+      <w:r>
+        <w:rPr>
+          <w:highlight w:val="yellow"/>
+          <w:lang w:val="en-CA"/>
+        </w:rPr>
+        <w:t>Date range boundaries and ordering (start &gt; end)</w:t>
+      </w:r>
+    </w:p>
+    <w:p>
+      <w:pPr>
+        <w:pStyle w:val="ListParagraph"/>
+        <w:numPr>
+          <w:ilvl w:val="0"/>
+          <w:numId w:val="40"/>
+        </w:numPr>
+        <w:rPr>
+          <w:highlight w:val="yellow"/>
+          <w:lang w:val="en-CA"/>
+        </w:rPr>
+      </w:pPr>
+      <w:r>
+        <w:rPr>
+          <w:highlight w:val="yellow"/>
+          <w:lang w:val="en-CA"/>
+        </w:rPr>
+        <w:t>Empty period (no transactions)</w:t>
+      </w:r>
+    </w:p>
+    <w:p>
+      <w:pPr>
+        <w:pStyle w:val="ListParagraph"/>
+        <w:numPr>
+          <w:ilvl w:val="0"/>
+          <w:numId w:val="40"/>
+        </w:numPr>
+        <w:rPr>
+          <w:lang w:val="en-CA"/>
+        </w:rPr>
+      </w:pPr>
+      <w:r>
+        <w:rPr>
+          <w:highlight w:val="yellow"/>
+          <w:lang w:val="en-CA"/>
+        </w:rPr>
+        <w:t>Verify calculations: income total, expense total, balance, category totals</w:t>
+      </w:r>
+    </w:p>
+    <w:p>
+      <w:pPr>
+        <w:pStyle w:val="Heading3"/>
+        <w:numPr>
+          <w:ilvl w:val="2"/>
+          <w:numId w:val="1"/>
+        </w:numPr>
+      </w:pPr>
+      <w:r>
+        <w:t xml:space="preserve">Persistence </w:t>
+      </w:r>
+      <w:proofErr w:type="spellStart"/>
+      <w:r>
+        <w:t>behaviors</w:t>
+      </w:r>
+      <w:proofErr w:type="spellEnd"/>
+      <w:r>
+        <w:t xml:space="preserve"> (Save/Load)</w:t>
+      </w:r>
+    </w:p>
+    <w:p>
+      <w:pPr>
+        <w:rPr>
+          <w:lang w:val="en-CA"/>
+        </w:rPr>
+      </w:pPr>
+      <w:r>
+        <w:rPr>
+          <w:lang w:val="en-CA"/>
+        </w:rPr>
+        <w:t>Because persistence is a key completion goal for Iteration 3.2, functional testing includes verifying that transactions and budgets are stored correctly and restored accurately across sessions. This directly supports FR1 (persist across sessions) and the “load saved data on startup” user story expectations documented earlier.</w:t>
+      </w:r>
+    </w:p>
+    <w:p>
+      <w:pPr>
+        <w:pStyle w:val="ListParagraph"/>
+        <w:numPr>
+          <w:ilvl w:val="0"/>
+          <w:numId w:val="39"/>
+        </w:numPr>
+        <w:rPr>
+          <w:highlight w:val="yellow"/>
+          <w:lang w:val="en-CA"/>
+        </w:rPr>
+      </w:pPr>
+      <w:r>
+        <w:rPr>
+          <w:highlight w:val="yellow"/>
+          <w:lang w:val="en-CA"/>
+        </w:rPr>
+        <w:t>Save data after add/edit/delete transaction</w:t>
+      </w:r>
+    </w:p>
+    <w:p>
+      <w:pPr>
+        <w:pStyle w:val="ListParagraph"/>
+        <w:numPr>
+          <w:ilvl w:val="0"/>
+          <w:numId w:val="39"/>
+        </w:numPr>
+        <w:rPr>
+          <w:highlight w:val="yellow"/>
+          <w:lang w:val="en-CA"/>
+        </w:rPr>
+      </w:pPr>
+      <w:r>
+        <w:rPr>
+          <w:highlight w:val="yellow"/>
+          <w:lang w:val="en-CA"/>
+        </w:rPr>
+        <w:t>Save data after add/edit/delete budget</w:t>
+      </w:r>
+    </w:p>
+    <w:p>
+      <w:pPr>
+        <w:pStyle w:val="ListParagraph"/>
+        <w:numPr>
+          <w:ilvl w:val="0"/>
+          <w:numId w:val="39"/>
+        </w:numPr>
+        <w:rPr>
+          <w:highlight w:val="yellow"/>
+          <w:lang w:val="en-CA"/>
+        </w:rPr>
+      </w:pPr>
+      <w:r>
+        <w:rPr>
+          <w:highlight w:val="yellow"/>
+          <w:lang w:val="en-CA"/>
+        </w:rPr>
+        <w:t>Restart application → confirm data restored</w:t>
+      </w:r>
+    </w:p>
+    <w:p>
+      <w:pPr>
+        <w:pStyle w:val="ListParagraph"/>
+        <w:numPr>
+          <w:ilvl w:val="0"/>
+          <w:numId w:val="39"/>
+        </w:numPr>
+        <w:rPr>
+          <w:highlight w:val="yellow"/>
+          <w:lang w:val="en-CA"/>
+        </w:rPr>
+      </w:pPr>
+      <w:r>
+        <w:rPr>
+          <w:highlight w:val="yellow"/>
+          <w:lang w:val="en-CA"/>
+        </w:rPr>
+        <w:t>“No data found” startup behavior (first run / missing file)</w:t>
+      </w:r>
+    </w:p>
+    <w:p>
+      <w:pPr>
+        <w:pStyle w:val="ListParagraph"/>
+        <w:numPr>
+          <w:ilvl w:val="0"/>
+          <w:numId w:val="39"/>
+        </w:numPr>
+        <w:rPr>
+          <w:highlight w:val="yellow"/>
+          <w:lang w:val="en-CA"/>
+        </w:rPr>
+      </w:pPr>
+      <w:r>
+        <w:rPr>
+          <w:highlight w:val="yellow"/>
+          <w:lang w:val="en-CA"/>
+        </w:rPr>
+        <w:t>Corrupted/invalid data file behavior (graceful error handling)</w:t>
+      </w:r>
+    </w:p>
+    <w:p>
+      <w:pPr>
+        <w:pStyle w:val="Heading2"/>
+        <w:numPr>
+          <w:ilvl w:val="1"/>
+          <w:numId w:val="1"/>
+        </w:numPr>
+      </w:pPr>
+      <w:r>
+        <w:t>System and Integration Testing</w:t>
+      </w:r>
+    </w:p>
+    <w:p>
+      <w:proofErr w:type="spellStart"/>
+      <w:r>
+        <w:t>ystem</w:t>
+      </w:r>
+      <w:proofErr w:type="spellEnd"/>
+      <w:r>
+        <w:t xml:space="preserve"> and integration testing validates that the full application works end-to-end and that features interact correctly, especially after persistence and refactoring changes. These tests focus on workflow completion, data consistency, and communication between modules (Transactions ↔ Budgets/Alerts ↔ Reports) as required by the 3.2</w:t>
+      </w:r>
+    </w:p>
+    <w:p/>
+    <w:p>
+      <w:pPr>
+        <w:rPr>
+          <w:highlight w:val="yellow"/>
+          <w:lang w:val="en-CA"/>
+        </w:rPr>
+      </w:pPr>
+      <w:r>
+        <w:rPr>
+          <w:b/>
+          <w:bCs/>
+          <w:highlight w:val="yellow"/>
+          <w:lang w:val="en-CA"/>
+        </w:rPr>
+        <w:t>Recommended end-to-end workflow tests (fill in results later):</w:t>
+      </w:r>
+    </w:p>
+    <w:p>
+      <w:pPr>
+        <w:numPr>
+          <w:ilvl w:val="0"/>
+          <w:numId w:val="33"/>
+        </w:numPr>
+        <w:rPr>
+          <w:highlight w:val="yellow"/>
+          <w:lang w:val="en-CA"/>
+        </w:rPr>
+      </w:pPr>
+      <w:r>
+        <w:rPr>
+          <w:highlight w:val="yellow"/>
+          <w:lang w:val="en-CA"/>
+        </w:rPr>
+        <w:t>Add transactions → set budget → trigger overspending alert</w:t>
+      </w:r>
+    </w:p>
+    <w:p>
+      <w:pPr>
+        <w:numPr>
+          <w:ilvl w:val="0"/>
+          <w:numId w:val="33"/>
+        </w:numPr>
+        <w:rPr>
+          <w:highlight w:val="yellow"/>
+          <w:lang w:val="en-CA"/>
+        </w:rPr>
+      </w:pPr>
+      <w:r>
+        <w:rPr>
+          <w:highlight w:val="yellow"/>
+          <w:lang w:val="en-CA"/>
+        </w:rPr>
+        <w:t>Add transactions → generate report → confirm totals and breakdown</w:t>
+      </w:r>
+    </w:p>
+    <w:p>
+      <w:pPr>
+        <w:numPr>
+          <w:ilvl w:val="0"/>
+          <w:numId w:val="33"/>
+        </w:numPr>
+        <w:rPr>
+          <w:highlight w:val="yellow"/>
+          <w:lang w:val="en-CA"/>
+        </w:rPr>
+      </w:pPr>
+      <w:r>
+        <w:rPr>
+          <w:highlight w:val="yellow"/>
+          <w:lang w:val="en-CA"/>
+        </w:rPr>
+        <w:t>Save data → restart app → load data → generate report from loaded data</w:t>
+      </w:r>
+    </w:p>
+    <w:p>
+      <w:pPr>
+        <w:numPr>
+          <w:ilvl w:val="0"/>
+          <w:numId w:val="33"/>
+        </w:numPr>
+        <w:rPr>
+          <w:highlight w:val="yellow"/>
+          <w:lang w:val="en-CA"/>
+        </w:rPr>
+      </w:pPr>
+      <w:r>
+        <w:rPr>
+          <w:highlight w:val="yellow"/>
+          <w:lang w:val="en-CA"/>
+        </w:rPr>
+        <w:t>Save data → restart app → edit/delete loaded transaction → confirm persistence updates correctly</w:t>
+      </w:r>
+    </w:p>
+    <w:p>
+      <w:pPr>
+        <w:numPr>
+          <w:ilvl w:val="0"/>
+          <w:numId w:val="33"/>
+        </w:numPr>
+        <w:rPr>
+          <w:highlight w:val="yellow"/>
+          <w:lang w:val="en-CA"/>
+        </w:rPr>
+      </w:pPr>
+      <w:r>
+        <w:rPr>
+          <w:highlight w:val="yellow"/>
+          <w:lang w:val="en-CA"/>
+        </w:rPr>
+        <w:lastRenderedPageBreak/>
+        <w:t>Save data → restart app → budgets still present → alerts still work with loaded transactions</w:t>
+      </w:r>
+    </w:p>
+    <w:p>
+      <w:pPr>
+        <w:rPr>
+          <w:highlight w:val="yellow"/>
+          <w:lang w:val="en-CA"/>
+        </w:rPr>
+      </w:pPr>
+      <w:r>
+        <w:rPr>
+          <w:b/>
+          <w:bCs/>
+          <w:highlight w:val="yellow"/>
+          <w:lang w:val="en-CA"/>
+        </w:rPr>
+        <w:t>Placeholder (fill in):</w:t>
+      </w:r>
+    </w:p>
+    <w:p>
+      <w:pPr>
+        <w:numPr>
+          <w:ilvl w:val="0"/>
+          <w:numId w:val="34"/>
+        </w:numPr>
+        <w:rPr>
+          <w:highlight w:val="yellow"/>
+          <w:lang w:val="en-CA"/>
+        </w:rPr>
+      </w:pPr>
+      <w:r>
+        <w:rPr>
+          <w:highlight w:val="yellow"/>
+          <w:lang w:val="en-CA"/>
+        </w:rPr>
+        <w:t>Workflow test table (recommended):</w:t>
+      </w:r>
+    </w:p>
+    <w:tbl>
+      <w:tblPr>
+        <w:tblW w:w="0" w:type="auto"/>
+        <w:tblCellSpacing w:w="15" w:type="dxa"/>
+        <w:tblBorders>
+          <w:top w:val="single" w:sz="4" w:space="0" w:color="auto"/>
+          <w:left w:val="single" w:sz="4" w:space="0" w:color="auto"/>
+          <w:bottom w:val="single" w:sz="4" w:space="0" w:color="auto"/>
+          <w:right w:val="single" w:sz="4" w:space="0" w:color="auto"/>
+          <w:insideH w:val="single" w:sz="4" w:space="0" w:color="auto"/>
+          <w:insideV w:val="single" w:sz="4" w:space="0" w:color="auto"/>
+        </w:tblBorders>
+        <w:tblCellMar>
+          <w:top w:w="15" w:type="dxa"/>
+          <w:left w:w="15" w:type="dxa"/>
+          <w:bottom w:w="15" w:type="dxa"/>
+          <w:right w:w="15" w:type="dxa"/>
+        </w:tblCellMar>
+        <w:tblLook w:val="04A0" w:firstRow="1" w:lastRow="0" w:firstColumn="1" w:lastColumn="0" w:noHBand="0" w:noVBand="1"/>
+      </w:tblPr>
+      <w:tblGrid>
+        <w:gridCol w:w="1763"/>
+        <w:gridCol w:w="1541"/>
+        <w:gridCol w:w="1729"/>
+        <w:gridCol w:w="1462"/>
+        <w:gridCol w:w="1288"/>
+        <w:gridCol w:w="1236"/>
+      </w:tblGrid>
+      <w:tr>
+        <w:trPr>
+          <w:tblHeader/>
+          <w:tblCellSpacing w:w="15" w:type="dxa"/>
+        </w:trPr>
+        <w:tc>
+          <w:tcPr>
+            <w:tcW w:w="0" w:type="auto"/>
+            <w:vAlign w:val="center"/>
+            <w:hideMark/>
+          </w:tcPr>
+          <w:p>
+            <w:pPr>
+              <w:rPr>
+                <w:b/>
+                <w:bCs/>
+                <w:highlight w:val="yellow"/>
+                <w:lang w:val="en-CA"/>
+              </w:rPr>
+            </w:pPr>
+            <w:r>
+              <w:rPr>
+                <w:b/>
+                <w:bCs/>
+                <w:highlight w:val="yellow"/>
+                <w:lang w:val="en-CA"/>
+              </w:rPr>
+              <w:t>Workflow ID</w:t>
+            </w:r>
+          </w:p>
+        </w:tc>
+        <w:tc>
+          <w:tcPr>
+            <w:tcW w:w="0" w:type="auto"/>
+            <w:vAlign w:val="center"/>
+            <w:hideMark/>
+          </w:tcPr>
+          <w:p>
+            <w:pPr>
+              <w:rPr>
+                <w:b/>
+                <w:bCs/>
+                <w:highlight w:val="yellow"/>
+                <w:lang w:val="en-CA"/>
+              </w:rPr>
+            </w:pPr>
+            <w:r>
+              <w:rPr>
+                <w:b/>
+                <w:bCs/>
+                <w:highlight w:val="yellow"/>
+                <w:lang w:val="en-CA"/>
+              </w:rPr>
+              <w:t>Scenario</w:t>
+            </w:r>
+          </w:p>
+        </w:tc>
+        <w:tc>
+          <w:tcPr>
+            <w:tcW w:w="0" w:type="auto"/>
+            <w:vAlign w:val="center"/>
+            <w:hideMark/>
+          </w:tcPr>
+          <w:p>
+            <w:pPr>
+              <w:rPr>
+                <w:b/>
+                <w:bCs/>
+                <w:highlight w:val="yellow"/>
+                <w:lang w:val="en-CA"/>
+              </w:rPr>
+            </w:pPr>
+            <w:r>
+              <w:rPr>
+                <w:b/>
+                <w:bCs/>
+                <w:highlight w:val="yellow"/>
+                <w:lang w:val="en-CA"/>
+              </w:rPr>
+              <w:t>Expected Result</w:t>
+            </w:r>
+          </w:p>
+        </w:tc>
+        <w:tc>
+          <w:tcPr>
+            <w:tcW w:w="0" w:type="auto"/>
+            <w:vAlign w:val="center"/>
+            <w:hideMark/>
+          </w:tcPr>
+          <w:p>
+            <w:pPr>
+              <w:rPr>
+                <w:b/>
+                <w:bCs/>
+                <w:highlight w:val="yellow"/>
+                <w:lang w:val="en-CA"/>
+              </w:rPr>
+            </w:pPr>
+            <w:r>
+              <w:rPr>
+                <w:b/>
+                <w:bCs/>
+                <w:highlight w:val="yellow"/>
+                <w:lang w:val="en-CA"/>
+              </w:rPr>
+              <w:t>Actual Result</w:t>
+            </w:r>
+          </w:p>
+        </w:tc>
+        <w:tc>
+          <w:tcPr>
+            <w:tcW w:w="0" w:type="auto"/>
+            <w:vAlign w:val="center"/>
+            <w:hideMark/>
+          </w:tcPr>
+          <w:p>
+            <w:pPr>
+              <w:rPr>
+                <w:b/>
+                <w:bCs/>
+                <w:highlight w:val="yellow"/>
+                <w:lang w:val="en-CA"/>
+              </w:rPr>
+            </w:pPr>
+            <w:r>
+              <w:rPr>
+                <w:b/>
+                <w:bCs/>
+                <w:highlight w:val="yellow"/>
+                <w:lang w:val="en-CA"/>
+              </w:rPr>
+              <w:t>Status</w:t>
+            </w:r>
+          </w:p>
+        </w:tc>
+        <w:tc>
+          <w:tcPr>
+            <w:tcW w:w="0" w:type="auto"/>
+            <w:vAlign w:val="center"/>
+            <w:hideMark/>
+          </w:tcPr>
+          <w:p>
+            <w:pPr>
+              <w:rPr>
+                <w:b/>
+                <w:bCs/>
+                <w:lang w:val="en-CA"/>
+              </w:rPr>
+            </w:pPr>
+            <w:r>
+              <w:rPr>
+                <w:b/>
+                <w:bCs/>
+                <w:highlight w:val="yellow"/>
+                <w:lang w:val="en-CA"/>
+              </w:rPr>
+              <w:t>Notes</w:t>
+            </w:r>
+          </w:p>
+        </w:tc>
+      </w:tr>
+    </w:tbl>
+    <w:p/>
+    <w:p>
+      <w:pPr>
+        <w:pStyle w:val="Heading2"/>
+        <w:numPr>
+          <w:ilvl w:val="1"/>
+          <w:numId w:val="1"/>
+        </w:numPr>
+      </w:pPr>
+      <w:r>
+        <w:t>Edge Cases and Error Handling</w:t>
+      </w:r>
+    </w:p>
+    <w:p>
+      <w:r>
+        <w:t xml:space="preserve">To ensure robustness, we tested edge cases and error conditions across core features. This includes invalid user inputs, empty datasets, boundary dates, and unusual sequences of actions (e.g., deleting items used in reports, editing items after loading saved data). The purpose is to verify the system behaves predictably and provides clear user feedback rather than crashing or producing incorrect results. </w:t>
+      </w:r>
+    </w:p>
+    <w:p>
+      <w:pPr>
+        <w:rPr>
+          <w:b/>
+          <w:bCs/>
+        </w:rPr>
+      </w:pPr>
+      <w:r>
+        <w:rPr>
+          <w:b/>
+          <w:bCs/>
+          <w:highlight w:val="yellow"/>
+        </w:rPr>
+        <w:t>Placeholder examples to populate:</w:t>
+      </w:r>
+    </w:p>
+    <w:p>
+      <w:pPr>
+        <w:pStyle w:val="ListParagraph"/>
+        <w:numPr>
+          <w:ilvl w:val="0"/>
+          <w:numId w:val="35"/>
+        </w:numPr>
+        <w:rPr>
+          <w:highlight w:val="yellow"/>
+        </w:rPr>
+      </w:pPr>
+      <w:r>
+        <w:rPr>
+          <w:highlight w:val="yellow"/>
+        </w:rPr>
+        <w:t>Invalid amount formats: [cases]</w:t>
+      </w:r>
+    </w:p>
+    <w:p>
+      <w:pPr>
+        <w:pStyle w:val="ListParagraph"/>
+        <w:numPr>
+          <w:ilvl w:val="0"/>
+          <w:numId w:val="35"/>
+        </w:numPr>
+        <w:rPr>
+          <w:highlight w:val="yellow"/>
+        </w:rPr>
+      </w:pPr>
+      <w:r>
+        <w:rPr>
+          <w:highlight w:val="yellow"/>
+        </w:rPr>
+        <w:t>Date range issues: [cases]</w:t>
+      </w:r>
+    </w:p>
+    <w:p>
+      <w:pPr>
+        <w:pStyle w:val="ListParagraph"/>
+        <w:numPr>
+          <w:ilvl w:val="0"/>
+          <w:numId w:val="35"/>
+        </w:numPr>
+        <w:rPr>
+          <w:highlight w:val="yellow"/>
+        </w:rPr>
+      </w:pPr>
+      <w:r>
+        <w:rPr>
+          <w:highlight w:val="yellow"/>
+        </w:rPr>
+        <w:t>Empty report period: [cases]</w:t>
+      </w:r>
+    </w:p>
+    <w:p>
+      <w:pPr>
+        <w:pStyle w:val="ListParagraph"/>
+        <w:numPr>
+          <w:ilvl w:val="0"/>
+          <w:numId w:val="35"/>
+        </w:numPr>
+        <w:rPr>
+          <w:highlight w:val="yellow"/>
+        </w:rPr>
+      </w:pPr>
+      <w:r>
+        <w:rPr>
+          <w:highlight w:val="yellow"/>
+        </w:rPr>
+        <w:t>Missing storage file / first launch: [cases]</w:t>
+      </w:r>
+    </w:p>
+    <w:p>
+      <w:pPr>
+        <w:pStyle w:val="ListParagraph"/>
+        <w:numPr>
+          <w:ilvl w:val="0"/>
+          <w:numId w:val="35"/>
+        </w:numPr>
+        <w:rPr>
+          <w:highlight w:val="yellow"/>
+        </w:rPr>
+      </w:pPr>
+      <w:r>
+        <w:rPr>
+          <w:highlight w:val="yellow"/>
+        </w:rPr>
+        <w:t>Handling corrupted JSON file: [cases]</w:t>
+      </w:r>
+    </w:p>
+    <w:p>
+      <w:pPr>
+        <w:pStyle w:val="Heading2"/>
+        <w:numPr>
+          <w:ilvl w:val="1"/>
+          <w:numId w:val="1"/>
+        </w:numPr>
+      </w:pPr>
+      <w:r>
+        <w:t>Defects Found, Fixes, and Retesting</w:t>
+      </w:r>
+    </w:p>
+    <w:p>
+      <w:r>
+        <w:t>During testing, any discovered defects were recorded, fixed, and retested to confirm the fix. This follows the deliverable requirement that bugs found during testing should be addressed and then validated again.</w:t>
+      </w:r>
+    </w:p>
+    <w:p>
+      <w:pPr>
+        <w:pStyle w:val="Heading1"/>
+        <w:numPr>
+          <w:ilvl w:val="0"/>
+          <w:numId w:val="1"/>
+        </w:numPr>
+      </w:pPr>
+      <w:r>
         <w:t>Updated Backlog with Design Stories</w:t>
       </w:r>
       <w:bookmarkEnd w:id="2"/>
@@ -1327,20 +2512,40 @@
         <w:rPr>
           <w:color w:val="EE0000"/>
         </w:rPr>
-        <w:t>This section presents the updated backlog for SmartBudget for Iteration 3.1 and the upcoming development cycle. The backlog is based on the project’s core user stories defined earlier (Deliverable 2.2), and it has been refined into more specific design and implementation stories that reflect the current system architecture (UI → Services → Domain → Persistence) and the work completed so far.</w:t>
-      </w:r>
-    </w:p>
-    <w:p>
-      <w:pPr>
+        <w:t xml:space="preserve">This section presents the updated backlog for </w:t>
+      </w:r>
+      <w:proofErr w:type="spellStart"/>
+      <w:r>
         <w:rPr>
           <w:color w:val="EE0000"/>
         </w:rPr>
-      </w:pPr>
+        <w:t>SmartBudget</w:t>
+      </w:r>
+      <w:proofErr w:type="spellEnd"/>
       <w:r>
         <w:rPr>
           <w:color w:val="EE0000"/>
         </w:rPr>
+        <w:t xml:space="preserve"> for Iteration 3.1 and the upcoming development cycle. The backlog is based on the project’s core user stories defined earlier (Deliverable 2.2), and it has been refined into more specific design and implementation </w:t>
+      </w:r>
+      <w:r>
+        <w:rPr>
+          <w:color w:val="EE0000"/>
+        </w:rPr>
         <w:lastRenderedPageBreak/>
+        <w:t>stories that reflect the current system architecture (UI → Services → Domain → Persistence) and the work completed so far.</w:t>
+      </w:r>
+    </w:p>
+    <w:p>
+      <w:pPr>
+        <w:rPr>
+          <w:color w:val="EE0000"/>
+        </w:rPr>
+      </w:pPr>
+      <w:r>
+        <w:rPr>
+          <w:color w:val="EE0000"/>
+        </w:rPr>
         <w:t>Because most core features are now functional, this backlog is split into:</w:t>
       </w:r>
     </w:p>
@@ -1478,7 +2683,21 @@
         <w:rPr>
           <w:color w:val="EE0000"/>
         </w:rPr>
-        <w:t xml:space="preserve"> (features that affect correct app behavior are highest priority),</w:t>
+        <w:t xml:space="preserve"> (features that affect correct app </w:t>
+      </w:r>
+      <w:proofErr w:type="spellStart"/>
+      <w:r>
+        <w:rPr>
+          <w:color w:val="EE0000"/>
+        </w:rPr>
+        <w:t>behavior</w:t>
+      </w:r>
+      <w:proofErr w:type="spellEnd"/>
+      <w:r>
+        <w:rPr>
+          <w:color w:val="EE0000"/>
+        </w:rPr>
+        <w:t xml:space="preserve"> are highest priority),</w:t>
       </w:r>
     </w:p>
     <w:p>
@@ -2586,7 +3805,34 @@
                 <w:sz w:val="20"/>
                 <w:szCs w:val="20"/>
               </w:rPr>
-              <w:t>transaction workflows so that the system can detect when spending exceeds a budget and notify the UI when needed.</w:t>
+              <w:t xml:space="preserve">transaction workflows so that the system </w:t>
+            </w:r>
+            <w:r>
+              <w:rPr>
+                <w:color w:val="EE0000"/>
+                <w:sz w:val="20"/>
+                <w:szCs w:val="20"/>
+              </w:rPr>
+              <w:lastRenderedPageBreak/>
+              <w:t xml:space="preserve">can detect when spending exceeds a budget and </w:t>
+            </w:r>
+            <w:proofErr w:type="gramStart"/>
+            <w:r>
+              <w:rPr>
+                <w:color w:val="EE0000"/>
+                <w:sz w:val="20"/>
+                <w:szCs w:val="20"/>
+              </w:rPr>
+              <w:t>notify</w:t>
+            </w:r>
+            <w:proofErr w:type="gramEnd"/>
+            <w:r>
+              <w:rPr>
+                <w:color w:val="EE0000"/>
+                <w:sz w:val="20"/>
+                <w:szCs w:val="20"/>
+              </w:rPr>
+              <w:t xml:space="preserve"> the UI when needed.</w:t>
             </w:r>
           </w:p>
         </w:tc>
@@ -2610,6 +3856,7 @@
                 <w:sz w:val="20"/>
                 <w:szCs w:val="20"/>
               </w:rPr>
+              <w:lastRenderedPageBreak/>
               <w:t>US-5</w:t>
             </w:r>
           </w:p>
@@ -2756,16 +4003,7 @@
                 <w:sz w:val="20"/>
                 <w:szCs w:val="20"/>
               </w:rPr>
-              <w:t xml:space="preserve">As a developer, I have implemented summary report generation for a selected period so that users can view totals and </w:t>
-            </w:r>
-            <w:r>
-              <w:rPr>
-                <w:color w:val="EE0000"/>
-                <w:sz w:val="20"/>
-                <w:szCs w:val="20"/>
-              </w:rPr>
-              <w:lastRenderedPageBreak/>
-              <w:t>category breakdowns for a custom date range.</w:t>
+              <w:t>As a developer, I have implemented summary report generation for a selected period so that users can view totals and category breakdowns for a custom date range.</w:t>
             </w:r>
           </w:p>
         </w:tc>
@@ -2789,7 +4027,6 @@
                 <w:sz w:val="20"/>
                 <w:szCs w:val="20"/>
               </w:rPr>
-              <w:lastRenderedPageBreak/>
               <w:t>US-6</w:t>
             </w:r>
           </w:p>
@@ -3106,7 +4343,25 @@
                 <w:sz w:val="20"/>
                 <w:szCs w:val="20"/>
               </w:rPr>
-              <w:t>As a developer, I have implemented JavaFX modals and confirmations for transactions and budgets so that create</w:t>
+              <w:t xml:space="preserve">As a developer, I have implemented JavaFX modals and confirmations for transactions and </w:t>
+            </w:r>
+            <w:proofErr w:type="gramStart"/>
+            <w:r>
+              <w:rPr>
+                <w:color w:val="EE0000"/>
+                <w:sz w:val="20"/>
+                <w:szCs w:val="20"/>
+              </w:rPr>
+              <w:t>budgets</w:t>
+            </w:r>
+            <w:proofErr w:type="gramEnd"/>
+            <w:r>
+              <w:rPr>
+                <w:color w:val="EE0000"/>
+                <w:sz w:val="20"/>
+                <w:szCs w:val="20"/>
+              </w:rPr>
+              <w:t xml:space="preserve"> so that create</w:t>
             </w:r>
             <w:r>
               <w:rPr>
@@ -3510,7 +4765,25 @@
                 <w:sz w:val="20"/>
                 <w:szCs w:val="20"/>
               </w:rPr>
-              <w:t>As a developer, I have generated a JaCoCo coverage report so that we can measure test execution coverage and identify untested modules for the next cycle.</w:t>
+              <w:t xml:space="preserve">As a developer, I have generated a </w:t>
+            </w:r>
+            <w:proofErr w:type="spellStart"/>
+            <w:r>
+              <w:rPr>
+                <w:color w:val="EE0000"/>
+                <w:sz w:val="20"/>
+                <w:szCs w:val="20"/>
+              </w:rPr>
+              <w:t>JaCoCo</w:t>
+            </w:r>
+            <w:proofErr w:type="spellEnd"/>
+            <w:r>
+              <w:rPr>
+                <w:color w:val="EE0000"/>
+                <w:sz w:val="20"/>
+                <w:szCs w:val="20"/>
+              </w:rPr>
+              <w:t xml:space="preserve"> coverage report so that we can measure test execution coverage and identify untested modules for the next cycle.</w:t>
             </w:r>
           </w:p>
         </w:tc>
@@ -4020,7 +5293,25 @@
                 <w:sz w:val="20"/>
                 <w:szCs w:val="20"/>
               </w:rPr>
-              <w:t>As a developer, I have written unit tests for persistence (save/load correctness + restart regression tests) so that persistence behavior is reliable and does not break existing features.</w:t>
+              <w:t xml:space="preserve">As a developer, I have written unit tests for persistence (save/load correctness + restart regression tests) so that persistence </w:t>
+            </w:r>
+            <w:proofErr w:type="spellStart"/>
+            <w:r>
+              <w:rPr>
+                <w:color w:val="EE0000"/>
+                <w:sz w:val="20"/>
+                <w:szCs w:val="20"/>
+              </w:rPr>
+              <w:t>behavior</w:t>
+            </w:r>
+            <w:proofErr w:type="spellEnd"/>
+            <w:r>
+              <w:rPr>
+                <w:color w:val="EE0000"/>
+                <w:sz w:val="20"/>
+                <w:szCs w:val="20"/>
+              </w:rPr>
+              <w:t xml:space="preserve"> is reliable and does not break existing features.</w:t>
             </w:r>
           </w:p>
         </w:tc>
@@ -4190,7 +5481,25 @@
                 <w:sz w:val="20"/>
                 <w:szCs w:val="20"/>
               </w:rPr>
-              <w:t>As a developer, I have added unit tests for AlertService so that overspending alert rules (including boundary cases) are verified and UC-6 is validated.</w:t>
+              <w:t xml:space="preserve">As a developer, I have added unit tests for </w:t>
+            </w:r>
+            <w:proofErr w:type="spellStart"/>
+            <w:r>
+              <w:rPr>
+                <w:color w:val="EE0000"/>
+                <w:sz w:val="20"/>
+                <w:szCs w:val="20"/>
+              </w:rPr>
+              <w:t>AlertService</w:t>
+            </w:r>
+            <w:proofErr w:type="spellEnd"/>
+            <w:r>
+              <w:rPr>
+                <w:color w:val="EE0000"/>
+                <w:sz w:val="20"/>
+                <w:szCs w:val="20"/>
+              </w:rPr>
+              <w:t xml:space="preserve"> so that overspending alert rules (including boundary cases) are verified and UC-6 is validated.</w:t>
             </w:r>
           </w:p>
         </w:tc>
@@ -4360,7 +5669,61 @@
                 <w:sz w:val="20"/>
                 <w:szCs w:val="20"/>
               </w:rPr>
-              <w:t>As a developer, I have added unit tests for ReportService and PeriodRange so that report calculations, date range validation, and empty-result behavior are correct and UC-5 is validated.</w:t>
+              <w:t xml:space="preserve">As a developer, I have added unit tests for </w:t>
+            </w:r>
+            <w:proofErr w:type="spellStart"/>
+            <w:r>
+              <w:rPr>
+                <w:color w:val="EE0000"/>
+                <w:sz w:val="20"/>
+                <w:szCs w:val="20"/>
+              </w:rPr>
+              <w:t>ReportService</w:t>
+            </w:r>
+            <w:proofErr w:type="spellEnd"/>
+            <w:r>
+              <w:rPr>
+                <w:color w:val="EE0000"/>
+                <w:sz w:val="20"/>
+                <w:szCs w:val="20"/>
+              </w:rPr>
+              <w:t xml:space="preserve"> and </w:t>
+            </w:r>
+            <w:proofErr w:type="spellStart"/>
+            <w:r>
+              <w:rPr>
+                <w:color w:val="EE0000"/>
+                <w:sz w:val="20"/>
+                <w:szCs w:val="20"/>
+              </w:rPr>
+              <w:t>PeriodRange</w:t>
+            </w:r>
+            <w:proofErr w:type="spellEnd"/>
+            <w:r>
+              <w:rPr>
+                <w:color w:val="EE0000"/>
+                <w:sz w:val="20"/>
+                <w:szCs w:val="20"/>
+              </w:rPr>
+              <w:t xml:space="preserve"> so that report calculations, date range validation, and empty-result </w:t>
+            </w:r>
+            <w:proofErr w:type="spellStart"/>
+            <w:r>
+              <w:rPr>
+                <w:color w:val="EE0000"/>
+                <w:sz w:val="20"/>
+                <w:szCs w:val="20"/>
+              </w:rPr>
+              <w:t>behavior</w:t>
+            </w:r>
+            <w:proofErr w:type="spellEnd"/>
+            <w:r>
+              <w:rPr>
+                <w:color w:val="EE0000"/>
+                <w:sz w:val="20"/>
+                <w:szCs w:val="20"/>
+              </w:rPr>
+              <w:t xml:space="preserve"> are correct and UC-5 is validated.</w:t>
             </w:r>
           </w:p>
         </w:tc>
@@ -4700,7 +6063,21 @@
         <w:rPr>
           <w:color w:val="EE0000"/>
         </w:rPr>
-        <w:t>The backlog shows that SmartBudget has reached a strong implementation state: core transaction, budget, and report workflows are functional, supported by design documentation and initial testing.</w:t>
+        <w:t xml:space="preserve">The backlog shows that </w:t>
+      </w:r>
+      <w:proofErr w:type="spellStart"/>
+      <w:r>
+        <w:rPr>
+          <w:color w:val="EE0000"/>
+        </w:rPr>
+        <w:t>SmartBudget</w:t>
+      </w:r>
+      <w:proofErr w:type="spellEnd"/>
+      <w:r>
+        <w:rPr>
+          <w:color w:val="EE0000"/>
+        </w:rPr>
+        <w:t xml:space="preserve"> has reached a strong implementation state: core transaction, budget, and report workflows are functional, supported by design documentation and initial testing.</w:t>
       </w:r>
     </w:p>
     <w:p>
@@ -4758,7 +6135,15 @@
     </w:p>
     <w:p>
       <w:r>
-        <w:t>The SmartBudget project is hosted on GitHub, and all project deliverables, documents, and source files are stored and updated there throughout each iteration.</w:t>
+        <w:t xml:space="preserve">The </w:t>
+      </w:r>
+      <w:proofErr w:type="spellStart"/>
+      <w:r>
+        <w:t>SmartBudget</w:t>
+      </w:r>
+      <w:proofErr w:type="spellEnd"/>
+      <w:r>
+        <w:t xml:space="preserve"> project is hosted on GitHub, and all project deliverables, documents, and source files are stored and updated there throughout each iteration.</w:t>
       </w:r>
     </w:p>
     <w:p>
@@ -5141,6 +6526,119 @@
     </w:lvl>
   </w:abstractNum>
   <w:abstractNum w:abstractNumId="1" w15:restartNumberingAfterBreak="0">
+    <w:nsid w:val="077953AC"/>
+    <w:multiLevelType w:val="hybridMultilevel"/>
+    <w:tmpl w:val="8126F658"/>
+    <w:lvl w:ilvl="0" w:tplc="10090001">
+      <w:start w:val="1"/>
+      <w:numFmt w:val="bullet"/>
+      <w:lvlText w:val=""/>
+      <w:lvlJc w:val="left"/>
+      <w:pPr>
+        <w:ind w:left="1287" w:hanging="360"/>
+      </w:pPr>
+      <w:rPr>
+        <w:rFonts w:ascii="Symbol" w:hAnsi="Symbol" w:hint="default"/>
+      </w:rPr>
+    </w:lvl>
+    <w:lvl w:ilvl="1" w:tplc="10090003" w:tentative="1">
+      <w:start w:val="1"/>
+      <w:numFmt w:val="bullet"/>
+      <w:lvlText w:val="o"/>
+      <w:lvlJc w:val="left"/>
+      <w:pPr>
+        <w:ind w:left="2007" w:hanging="360"/>
+      </w:pPr>
+      <w:rPr>
+        <w:rFonts w:ascii="Courier New" w:hAnsi="Courier New" w:cs="Courier New" w:hint="default"/>
+      </w:rPr>
+    </w:lvl>
+    <w:lvl w:ilvl="2" w:tplc="10090005" w:tentative="1">
+      <w:start w:val="1"/>
+      <w:numFmt w:val="bullet"/>
+      <w:lvlText w:val=""/>
+      <w:lvlJc w:val="left"/>
+      <w:pPr>
+        <w:ind w:left="2727" w:hanging="360"/>
+      </w:pPr>
+      <w:rPr>
+        <w:rFonts w:ascii="Wingdings" w:hAnsi="Wingdings" w:hint="default"/>
+      </w:rPr>
+    </w:lvl>
+    <w:lvl w:ilvl="3" w:tplc="10090001" w:tentative="1">
+      <w:start w:val="1"/>
+      <w:numFmt w:val="bullet"/>
+      <w:lvlText w:val=""/>
+      <w:lvlJc w:val="left"/>
+      <w:pPr>
+        <w:ind w:left="3447" w:hanging="360"/>
+      </w:pPr>
+      <w:rPr>
+        <w:rFonts w:ascii="Symbol" w:hAnsi="Symbol" w:hint="default"/>
+      </w:rPr>
+    </w:lvl>
+    <w:lvl w:ilvl="4" w:tplc="10090003" w:tentative="1">
+      <w:start w:val="1"/>
+      <w:numFmt w:val="bullet"/>
+      <w:lvlText w:val="o"/>
+      <w:lvlJc w:val="left"/>
+      <w:pPr>
+        <w:ind w:left="4167" w:hanging="360"/>
+      </w:pPr>
+      <w:rPr>
+        <w:rFonts w:ascii="Courier New" w:hAnsi="Courier New" w:cs="Courier New" w:hint="default"/>
+      </w:rPr>
+    </w:lvl>
+    <w:lvl w:ilvl="5" w:tplc="10090005" w:tentative="1">
+      <w:start w:val="1"/>
+      <w:numFmt w:val="bullet"/>
+      <w:lvlText w:val=""/>
+      <w:lvlJc w:val="left"/>
+      <w:pPr>
+        <w:ind w:left="4887" w:hanging="360"/>
+      </w:pPr>
+      <w:rPr>
+        <w:rFonts w:ascii="Wingdings" w:hAnsi="Wingdings" w:hint="default"/>
+      </w:rPr>
+    </w:lvl>
+    <w:lvl w:ilvl="6" w:tplc="10090001" w:tentative="1">
+      <w:start w:val="1"/>
+      <w:numFmt w:val="bullet"/>
+      <w:lvlText w:val=""/>
+      <w:lvlJc w:val="left"/>
+      <w:pPr>
+        <w:ind w:left="5607" w:hanging="360"/>
+      </w:pPr>
+      <w:rPr>
+        <w:rFonts w:ascii="Symbol" w:hAnsi="Symbol" w:hint="default"/>
+      </w:rPr>
+    </w:lvl>
+    <w:lvl w:ilvl="7" w:tplc="10090003" w:tentative="1">
+      <w:start w:val="1"/>
+      <w:numFmt w:val="bullet"/>
+      <w:lvlText w:val="o"/>
+      <w:lvlJc w:val="left"/>
+      <w:pPr>
+        <w:ind w:left="6327" w:hanging="360"/>
+      </w:pPr>
+      <w:rPr>
+        <w:rFonts w:ascii="Courier New" w:hAnsi="Courier New" w:cs="Courier New" w:hint="default"/>
+      </w:rPr>
+    </w:lvl>
+    <w:lvl w:ilvl="8" w:tplc="10090005" w:tentative="1">
+      <w:start w:val="1"/>
+      <w:numFmt w:val="bullet"/>
+      <w:lvlText w:val=""/>
+      <w:lvlJc w:val="left"/>
+      <w:pPr>
+        <w:ind w:left="7047" w:hanging="360"/>
+      </w:pPr>
+      <w:rPr>
+        <w:rFonts w:ascii="Wingdings" w:hAnsi="Wingdings" w:hint="default"/>
+      </w:rPr>
+    </w:lvl>
+  </w:abstractNum>
+  <w:abstractNum w:abstractNumId="2" w15:restartNumberingAfterBreak="0">
     <w:nsid w:val="0A895C99"/>
     <w:multiLevelType w:val="hybridMultilevel"/>
     <w:tmpl w:val="3C34F278"/>
@@ -5253,7 +6751,7 @@
       </w:rPr>
     </w:lvl>
   </w:abstractNum>
-  <w:abstractNum w:abstractNumId="2" w15:restartNumberingAfterBreak="0">
+  <w:abstractNum w:abstractNumId="3" w15:restartNumberingAfterBreak="0">
     <w:nsid w:val="0B2B31DE"/>
     <w:multiLevelType w:val="multilevel"/>
     <w:tmpl w:val="8976E374"/>
@@ -5384,7 +6882,7 @@
       </w:rPr>
     </w:lvl>
   </w:abstractNum>
-  <w:abstractNum w:abstractNumId="3" w15:restartNumberingAfterBreak="0">
+  <w:abstractNum w:abstractNumId="4" w15:restartNumberingAfterBreak="0">
     <w:nsid w:val="0C3D29D1"/>
     <w:multiLevelType w:val="hybridMultilevel"/>
     <w:tmpl w:val="C9CE7AF8"/>
@@ -5497,7 +6995,120 @@
       </w:rPr>
     </w:lvl>
   </w:abstractNum>
-  <w:abstractNum w:abstractNumId="4" w15:restartNumberingAfterBreak="0">
+  <w:abstractNum w:abstractNumId="5" w15:restartNumberingAfterBreak="0">
+    <w:nsid w:val="0C787D80"/>
+    <w:multiLevelType w:val="hybridMultilevel"/>
+    <w:tmpl w:val="F438896C"/>
+    <w:lvl w:ilvl="0" w:tplc="10090001">
+      <w:start w:val="1"/>
+      <w:numFmt w:val="bullet"/>
+      <w:lvlText w:val=""/>
+      <w:lvlJc w:val="left"/>
+      <w:pPr>
+        <w:ind w:left="1287" w:hanging="360"/>
+      </w:pPr>
+      <w:rPr>
+        <w:rFonts w:ascii="Symbol" w:hAnsi="Symbol" w:hint="default"/>
+      </w:rPr>
+    </w:lvl>
+    <w:lvl w:ilvl="1" w:tplc="10090003" w:tentative="1">
+      <w:start w:val="1"/>
+      <w:numFmt w:val="bullet"/>
+      <w:lvlText w:val="o"/>
+      <w:lvlJc w:val="left"/>
+      <w:pPr>
+        <w:ind w:left="2007" w:hanging="360"/>
+      </w:pPr>
+      <w:rPr>
+        <w:rFonts w:ascii="Courier New" w:hAnsi="Courier New" w:cs="Courier New" w:hint="default"/>
+      </w:rPr>
+    </w:lvl>
+    <w:lvl w:ilvl="2" w:tplc="10090005" w:tentative="1">
+      <w:start w:val="1"/>
+      <w:numFmt w:val="bullet"/>
+      <w:lvlText w:val=""/>
+      <w:lvlJc w:val="left"/>
+      <w:pPr>
+        <w:ind w:left="2727" w:hanging="360"/>
+      </w:pPr>
+      <w:rPr>
+        <w:rFonts w:ascii="Wingdings" w:hAnsi="Wingdings" w:hint="default"/>
+      </w:rPr>
+    </w:lvl>
+    <w:lvl w:ilvl="3" w:tplc="10090001" w:tentative="1">
+      <w:start w:val="1"/>
+      <w:numFmt w:val="bullet"/>
+      <w:lvlText w:val=""/>
+      <w:lvlJc w:val="left"/>
+      <w:pPr>
+        <w:ind w:left="3447" w:hanging="360"/>
+      </w:pPr>
+      <w:rPr>
+        <w:rFonts w:ascii="Symbol" w:hAnsi="Symbol" w:hint="default"/>
+      </w:rPr>
+    </w:lvl>
+    <w:lvl w:ilvl="4" w:tplc="10090003" w:tentative="1">
+      <w:start w:val="1"/>
+      <w:numFmt w:val="bullet"/>
+      <w:lvlText w:val="o"/>
+      <w:lvlJc w:val="left"/>
+      <w:pPr>
+        <w:ind w:left="4167" w:hanging="360"/>
+      </w:pPr>
+      <w:rPr>
+        <w:rFonts w:ascii="Courier New" w:hAnsi="Courier New" w:cs="Courier New" w:hint="default"/>
+      </w:rPr>
+    </w:lvl>
+    <w:lvl w:ilvl="5" w:tplc="10090005" w:tentative="1">
+      <w:start w:val="1"/>
+      <w:numFmt w:val="bullet"/>
+      <w:lvlText w:val=""/>
+      <w:lvlJc w:val="left"/>
+      <w:pPr>
+        <w:ind w:left="4887" w:hanging="360"/>
+      </w:pPr>
+      <w:rPr>
+        <w:rFonts w:ascii="Wingdings" w:hAnsi="Wingdings" w:hint="default"/>
+      </w:rPr>
+    </w:lvl>
+    <w:lvl w:ilvl="6" w:tplc="10090001" w:tentative="1">
+      <w:start w:val="1"/>
+      <w:numFmt w:val="bullet"/>
+      <w:lvlText w:val=""/>
+      <w:lvlJc w:val="left"/>
+      <w:pPr>
+        <w:ind w:left="5607" w:hanging="360"/>
+      </w:pPr>
+      <w:rPr>
+        <w:rFonts w:ascii="Symbol" w:hAnsi="Symbol" w:hint="default"/>
+      </w:rPr>
+    </w:lvl>
+    <w:lvl w:ilvl="7" w:tplc="10090003" w:tentative="1">
+      <w:start w:val="1"/>
+      <w:numFmt w:val="bullet"/>
+      <w:lvlText w:val="o"/>
+      <w:lvlJc w:val="left"/>
+      <w:pPr>
+        <w:ind w:left="6327" w:hanging="360"/>
+      </w:pPr>
+      <w:rPr>
+        <w:rFonts w:ascii="Courier New" w:hAnsi="Courier New" w:cs="Courier New" w:hint="default"/>
+      </w:rPr>
+    </w:lvl>
+    <w:lvl w:ilvl="8" w:tplc="10090005" w:tentative="1">
+      <w:start w:val="1"/>
+      <w:numFmt w:val="bullet"/>
+      <w:lvlText w:val=""/>
+      <w:lvlJc w:val="left"/>
+      <w:pPr>
+        <w:ind w:left="7047" w:hanging="360"/>
+      </w:pPr>
+      <w:rPr>
+        <w:rFonts w:ascii="Wingdings" w:hAnsi="Wingdings" w:hint="default"/>
+      </w:rPr>
+    </w:lvl>
+  </w:abstractNum>
+  <w:abstractNum w:abstractNumId="6" w15:restartNumberingAfterBreak="0">
     <w:nsid w:val="0DAD614E"/>
     <w:multiLevelType w:val="multilevel"/>
     <w:tmpl w:val="791A8010"/>
@@ -5610,7 +7221,120 @@
       </w:rPr>
     </w:lvl>
   </w:abstractNum>
-  <w:abstractNum w:abstractNumId="5" w15:restartNumberingAfterBreak="0">
+  <w:abstractNum w:abstractNumId="7" w15:restartNumberingAfterBreak="0">
+    <w:nsid w:val="0DD30FAE"/>
+    <w:multiLevelType w:val="hybridMultilevel"/>
+    <w:tmpl w:val="79BEFF36"/>
+    <w:lvl w:ilvl="0" w:tplc="10090001">
+      <w:start w:val="1"/>
+      <w:numFmt w:val="bullet"/>
+      <w:lvlText w:val=""/>
+      <w:lvlJc w:val="left"/>
+      <w:pPr>
+        <w:ind w:left="1287" w:hanging="360"/>
+      </w:pPr>
+      <w:rPr>
+        <w:rFonts w:ascii="Symbol" w:hAnsi="Symbol" w:hint="default"/>
+      </w:rPr>
+    </w:lvl>
+    <w:lvl w:ilvl="1" w:tplc="10090003" w:tentative="1">
+      <w:start w:val="1"/>
+      <w:numFmt w:val="bullet"/>
+      <w:lvlText w:val="o"/>
+      <w:lvlJc w:val="left"/>
+      <w:pPr>
+        <w:ind w:left="2007" w:hanging="360"/>
+      </w:pPr>
+      <w:rPr>
+        <w:rFonts w:ascii="Courier New" w:hAnsi="Courier New" w:cs="Courier New" w:hint="default"/>
+      </w:rPr>
+    </w:lvl>
+    <w:lvl w:ilvl="2" w:tplc="10090005" w:tentative="1">
+      <w:start w:val="1"/>
+      <w:numFmt w:val="bullet"/>
+      <w:lvlText w:val=""/>
+      <w:lvlJc w:val="left"/>
+      <w:pPr>
+        <w:ind w:left="2727" w:hanging="360"/>
+      </w:pPr>
+      <w:rPr>
+        <w:rFonts w:ascii="Wingdings" w:hAnsi="Wingdings" w:hint="default"/>
+      </w:rPr>
+    </w:lvl>
+    <w:lvl w:ilvl="3" w:tplc="10090001" w:tentative="1">
+      <w:start w:val="1"/>
+      <w:numFmt w:val="bullet"/>
+      <w:lvlText w:val=""/>
+      <w:lvlJc w:val="left"/>
+      <w:pPr>
+        <w:ind w:left="3447" w:hanging="360"/>
+      </w:pPr>
+      <w:rPr>
+        <w:rFonts w:ascii="Symbol" w:hAnsi="Symbol" w:hint="default"/>
+      </w:rPr>
+    </w:lvl>
+    <w:lvl w:ilvl="4" w:tplc="10090003" w:tentative="1">
+      <w:start w:val="1"/>
+      <w:numFmt w:val="bullet"/>
+      <w:lvlText w:val="o"/>
+      <w:lvlJc w:val="left"/>
+      <w:pPr>
+        <w:ind w:left="4167" w:hanging="360"/>
+      </w:pPr>
+      <w:rPr>
+        <w:rFonts w:ascii="Courier New" w:hAnsi="Courier New" w:cs="Courier New" w:hint="default"/>
+      </w:rPr>
+    </w:lvl>
+    <w:lvl w:ilvl="5" w:tplc="10090005" w:tentative="1">
+      <w:start w:val="1"/>
+      <w:numFmt w:val="bullet"/>
+      <w:lvlText w:val=""/>
+      <w:lvlJc w:val="left"/>
+      <w:pPr>
+        <w:ind w:left="4887" w:hanging="360"/>
+      </w:pPr>
+      <w:rPr>
+        <w:rFonts w:ascii="Wingdings" w:hAnsi="Wingdings" w:hint="default"/>
+      </w:rPr>
+    </w:lvl>
+    <w:lvl w:ilvl="6" w:tplc="10090001" w:tentative="1">
+      <w:start w:val="1"/>
+      <w:numFmt w:val="bullet"/>
+      <w:lvlText w:val=""/>
+      <w:lvlJc w:val="left"/>
+      <w:pPr>
+        <w:ind w:left="5607" w:hanging="360"/>
+      </w:pPr>
+      <w:rPr>
+        <w:rFonts w:ascii="Symbol" w:hAnsi="Symbol" w:hint="default"/>
+      </w:rPr>
+    </w:lvl>
+    <w:lvl w:ilvl="7" w:tplc="10090003" w:tentative="1">
+      <w:start w:val="1"/>
+      <w:numFmt w:val="bullet"/>
+      <w:lvlText w:val="o"/>
+      <w:lvlJc w:val="left"/>
+      <w:pPr>
+        <w:ind w:left="6327" w:hanging="360"/>
+      </w:pPr>
+      <w:rPr>
+        <w:rFonts w:ascii="Courier New" w:hAnsi="Courier New" w:cs="Courier New" w:hint="default"/>
+      </w:rPr>
+    </w:lvl>
+    <w:lvl w:ilvl="8" w:tplc="10090005" w:tentative="1">
+      <w:start w:val="1"/>
+      <w:numFmt w:val="bullet"/>
+      <w:lvlText w:val=""/>
+      <w:lvlJc w:val="left"/>
+      <w:pPr>
+        <w:ind w:left="7047" w:hanging="360"/>
+      </w:pPr>
+      <w:rPr>
+        <w:rFonts w:ascii="Wingdings" w:hAnsi="Wingdings" w:hint="default"/>
+      </w:rPr>
+    </w:lvl>
+  </w:abstractNum>
+  <w:abstractNum w:abstractNumId="8" w15:restartNumberingAfterBreak="0">
     <w:nsid w:val="0DFB0E96"/>
     <w:multiLevelType w:val="hybridMultilevel"/>
     <w:tmpl w:val="7B7A56E0"/>
@@ -5723,7 +7447,7 @@
       </w:rPr>
     </w:lvl>
   </w:abstractNum>
-  <w:abstractNum w:abstractNumId="6" w15:restartNumberingAfterBreak="0">
+  <w:abstractNum w:abstractNumId="9" w15:restartNumberingAfterBreak="0">
     <w:nsid w:val="165278DE"/>
     <w:multiLevelType w:val="hybridMultilevel"/>
     <w:tmpl w:val="5C628D0C"/>
@@ -5836,7 +7560,7 @@
       </w:rPr>
     </w:lvl>
   </w:abstractNum>
-  <w:abstractNum w:abstractNumId="7" w15:restartNumberingAfterBreak="0">
+  <w:abstractNum w:abstractNumId="10" w15:restartNumberingAfterBreak="0">
     <w:nsid w:val="20342629"/>
     <w:multiLevelType w:val="multilevel"/>
     <w:tmpl w:val="7576CCA6"/>
@@ -5967,7 +7691,7 @@
       </w:rPr>
     </w:lvl>
   </w:abstractNum>
-  <w:abstractNum w:abstractNumId="8" w15:restartNumberingAfterBreak="0">
+  <w:abstractNum w:abstractNumId="11" w15:restartNumberingAfterBreak="0">
     <w:nsid w:val="269319C9"/>
     <w:multiLevelType w:val="multilevel"/>
     <w:tmpl w:val="F4D8AE02"/>
@@ -6080,7 +7804,120 @@
       </w:rPr>
     </w:lvl>
   </w:abstractNum>
-  <w:abstractNum w:abstractNumId="9" w15:restartNumberingAfterBreak="0">
+  <w:abstractNum w:abstractNumId="12" w15:restartNumberingAfterBreak="0">
+    <w:nsid w:val="33CF4F3E"/>
+    <w:multiLevelType w:val="multilevel"/>
+    <w:tmpl w:val="992A8BF4"/>
+    <w:lvl w:ilvl="0">
+      <w:start w:val="1"/>
+      <w:numFmt w:val="decimal"/>
+      <w:lvlText w:val="%1."/>
+      <w:lvlJc w:val="left"/>
+      <w:pPr>
+        <w:tabs>
+          <w:tab w:val="num" w:pos="720"/>
+        </w:tabs>
+        <w:ind w:left="720" w:hanging="360"/>
+      </w:pPr>
+    </w:lvl>
+    <w:lvl w:ilvl="1" w:tentative="1">
+      <w:start w:val="1"/>
+      <w:numFmt w:val="decimal"/>
+      <w:lvlText w:val="%2."/>
+      <w:lvlJc w:val="left"/>
+      <w:pPr>
+        <w:tabs>
+          <w:tab w:val="num" w:pos="1440"/>
+        </w:tabs>
+        <w:ind w:left="1440" w:hanging="360"/>
+      </w:pPr>
+    </w:lvl>
+    <w:lvl w:ilvl="2" w:tentative="1">
+      <w:start w:val="1"/>
+      <w:numFmt w:val="decimal"/>
+      <w:lvlText w:val="%3."/>
+      <w:lvlJc w:val="left"/>
+      <w:pPr>
+        <w:tabs>
+          <w:tab w:val="num" w:pos="2160"/>
+        </w:tabs>
+        <w:ind w:left="2160" w:hanging="360"/>
+      </w:pPr>
+    </w:lvl>
+    <w:lvl w:ilvl="3" w:tentative="1">
+      <w:start w:val="1"/>
+      <w:numFmt w:val="decimal"/>
+      <w:lvlText w:val="%4."/>
+      <w:lvlJc w:val="left"/>
+      <w:pPr>
+        <w:tabs>
+          <w:tab w:val="num" w:pos="2880"/>
+        </w:tabs>
+        <w:ind w:left="2880" w:hanging="360"/>
+      </w:pPr>
+    </w:lvl>
+    <w:lvl w:ilvl="4" w:tentative="1">
+      <w:start w:val="1"/>
+      <w:numFmt w:val="decimal"/>
+      <w:lvlText w:val="%5."/>
+      <w:lvlJc w:val="left"/>
+      <w:pPr>
+        <w:tabs>
+          <w:tab w:val="num" w:pos="3600"/>
+        </w:tabs>
+        <w:ind w:left="3600" w:hanging="360"/>
+      </w:pPr>
+    </w:lvl>
+    <w:lvl w:ilvl="5" w:tentative="1">
+      <w:start w:val="1"/>
+      <w:numFmt w:val="decimal"/>
+      <w:lvlText w:val="%6."/>
+      <w:lvlJc w:val="left"/>
+      <w:pPr>
+        <w:tabs>
+          <w:tab w:val="num" w:pos="4320"/>
+        </w:tabs>
+        <w:ind w:left="4320" w:hanging="360"/>
+      </w:pPr>
+    </w:lvl>
+    <w:lvl w:ilvl="6" w:tentative="1">
+      <w:start w:val="1"/>
+      <w:numFmt w:val="decimal"/>
+      <w:lvlText w:val="%7."/>
+      <w:lvlJc w:val="left"/>
+      <w:pPr>
+        <w:tabs>
+          <w:tab w:val="num" w:pos="5040"/>
+        </w:tabs>
+        <w:ind w:left="5040" w:hanging="360"/>
+      </w:pPr>
+    </w:lvl>
+    <w:lvl w:ilvl="7" w:tentative="1">
+      <w:start w:val="1"/>
+      <w:numFmt w:val="decimal"/>
+      <w:lvlText w:val="%8."/>
+      <w:lvlJc w:val="left"/>
+      <w:pPr>
+        <w:tabs>
+          <w:tab w:val="num" w:pos="5760"/>
+        </w:tabs>
+        <w:ind w:left="5760" w:hanging="360"/>
+      </w:pPr>
+    </w:lvl>
+    <w:lvl w:ilvl="8" w:tentative="1">
+      <w:start w:val="1"/>
+      <w:numFmt w:val="decimal"/>
+      <w:lvlText w:val="%9."/>
+      <w:lvlJc w:val="left"/>
+      <w:pPr>
+        <w:tabs>
+          <w:tab w:val="num" w:pos="6480"/>
+        </w:tabs>
+        <w:ind w:left="6480" w:hanging="360"/>
+      </w:pPr>
+    </w:lvl>
+  </w:abstractNum>
+  <w:abstractNum w:abstractNumId="13" w15:restartNumberingAfterBreak="0">
     <w:nsid w:val="38EC6D76"/>
     <w:multiLevelType w:val="hybridMultilevel"/>
     <w:tmpl w:val="3D2E6BD2"/>
@@ -6193,7 +8030,120 @@
       </w:rPr>
     </w:lvl>
   </w:abstractNum>
-  <w:abstractNum w:abstractNumId="10" w15:restartNumberingAfterBreak="0">
+  <w:abstractNum w:abstractNumId="14" w15:restartNumberingAfterBreak="0">
+    <w:nsid w:val="3EE220FD"/>
+    <w:multiLevelType w:val="hybridMultilevel"/>
+    <w:tmpl w:val="67BAB9E4"/>
+    <w:lvl w:ilvl="0" w:tplc="10090001">
+      <w:start w:val="1"/>
+      <w:numFmt w:val="bullet"/>
+      <w:lvlText w:val=""/>
+      <w:lvlJc w:val="left"/>
+      <w:pPr>
+        <w:ind w:left="1287" w:hanging="360"/>
+      </w:pPr>
+      <w:rPr>
+        <w:rFonts w:ascii="Symbol" w:hAnsi="Symbol" w:hint="default"/>
+      </w:rPr>
+    </w:lvl>
+    <w:lvl w:ilvl="1" w:tplc="10090003" w:tentative="1">
+      <w:start w:val="1"/>
+      <w:numFmt w:val="bullet"/>
+      <w:lvlText w:val="o"/>
+      <w:lvlJc w:val="left"/>
+      <w:pPr>
+        <w:ind w:left="2007" w:hanging="360"/>
+      </w:pPr>
+      <w:rPr>
+        <w:rFonts w:ascii="Courier New" w:hAnsi="Courier New" w:cs="Courier New" w:hint="default"/>
+      </w:rPr>
+    </w:lvl>
+    <w:lvl w:ilvl="2" w:tplc="10090005" w:tentative="1">
+      <w:start w:val="1"/>
+      <w:numFmt w:val="bullet"/>
+      <w:lvlText w:val=""/>
+      <w:lvlJc w:val="left"/>
+      <w:pPr>
+        <w:ind w:left="2727" w:hanging="360"/>
+      </w:pPr>
+      <w:rPr>
+        <w:rFonts w:ascii="Wingdings" w:hAnsi="Wingdings" w:hint="default"/>
+      </w:rPr>
+    </w:lvl>
+    <w:lvl w:ilvl="3" w:tplc="10090001" w:tentative="1">
+      <w:start w:val="1"/>
+      <w:numFmt w:val="bullet"/>
+      <w:lvlText w:val=""/>
+      <w:lvlJc w:val="left"/>
+      <w:pPr>
+        <w:ind w:left="3447" w:hanging="360"/>
+      </w:pPr>
+      <w:rPr>
+        <w:rFonts w:ascii="Symbol" w:hAnsi="Symbol" w:hint="default"/>
+      </w:rPr>
+    </w:lvl>
+    <w:lvl w:ilvl="4" w:tplc="10090003" w:tentative="1">
+      <w:start w:val="1"/>
+      <w:numFmt w:val="bullet"/>
+      <w:lvlText w:val="o"/>
+      <w:lvlJc w:val="left"/>
+      <w:pPr>
+        <w:ind w:left="4167" w:hanging="360"/>
+      </w:pPr>
+      <w:rPr>
+        <w:rFonts w:ascii="Courier New" w:hAnsi="Courier New" w:cs="Courier New" w:hint="default"/>
+      </w:rPr>
+    </w:lvl>
+    <w:lvl w:ilvl="5" w:tplc="10090005" w:tentative="1">
+      <w:start w:val="1"/>
+      <w:numFmt w:val="bullet"/>
+      <w:lvlText w:val=""/>
+      <w:lvlJc w:val="left"/>
+      <w:pPr>
+        <w:ind w:left="4887" w:hanging="360"/>
+      </w:pPr>
+      <w:rPr>
+        <w:rFonts w:ascii="Wingdings" w:hAnsi="Wingdings" w:hint="default"/>
+      </w:rPr>
+    </w:lvl>
+    <w:lvl w:ilvl="6" w:tplc="10090001" w:tentative="1">
+      <w:start w:val="1"/>
+      <w:numFmt w:val="bullet"/>
+      <w:lvlText w:val=""/>
+      <w:lvlJc w:val="left"/>
+      <w:pPr>
+        <w:ind w:left="5607" w:hanging="360"/>
+      </w:pPr>
+      <w:rPr>
+        <w:rFonts w:ascii="Symbol" w:hAnsi="Symbol" w:hint="default"/>
+      </w:rPr>
+    </w:lvl>
+    <w:lvl w:ilvl="7" w:tplc="10090003" w:tentative="1">
+      <w:start w:val="1"/>
+      <w:numFmt w:val="bullet"/>
+      <w:lvlText w:val="o"/>
+      <w:lvlJc w:val="left"/>
+      <w:pPr>
+        <w:ind w:left="6327" w:hanging="360"/>
+      </w:pPr>
+      <w:rPr>
+        <w:rFonts w:ascii="Courier New" w:hAnsi="Courier New" w:cs="Courier New" w:hint="default"/>
+      </w:rPr>
+    </w:lvl>
+    <w:lvl w:ilvl="8" w:tplc="10090005" w:tentative="1">
+      <w:start w:val="1"/>
+      <w:numFmt w:val="bullet"/>
+      <w:lvlText w:val=""/>
+      <w:lvlJc w:val="left"/>
+      <w:pPr>
+        <w:ind w:left="7047" w:hanging="360"/>
+      </w:pPr>
+      <w:rPr>
+        <w:rFonts w:ascii="Wingdings" w:hAnsi="Wingdings" w:hint="default"/>
+      </w:rPr>
+    </w:lvl>
+  </w:abstractNum>
+  <w:abstractNum w:abstractNumId="15" w15:restartNumberingAfterBreak="0">
     <w:nsid w:val="40E3060E"/>
     <w:multiLevelType w:val="hybridMultilevel"/>
     <w:tmpl w:val="D39EDEB8"/>
@@ -6306,7 +8256,7 @@
       </w:rPr>
     </w:lvl>
   </w:abstractNum>
-  <w:abstractNum w:abstractNumId="11" w15:restartNumberingAfterBreak="0">
+  <w:abstractNum w:abstractNumId="16" w15:restartNumberingAfterBreak="0">
     <w:nsid w:val="41063FAF"/>
     <w:multiLevelType w:val="hybridMultilevel"/>
     <w:tmpl w:val="E08008FA"/>
@@ -6419,7 +8369,7 @@
       </w:rPr>
     </w:lvl>
   </w:abstractNum>
-  <w:abstractNum w:abstractNumId="12" w15:restartNumberingAfterBreak="0">
+  <w:abstractNum w:abstractNumId="17" w15:restartNumberingAfterBreak="0">
     <w:nsid w:val="427F439A"/>
     <w:multiLevelType w:val="multilevel"/>
     <w:tmpl w:val="617AF518"/>
@@ -6550,7 +8500,7 @@
       </w:rPr>
     </w:lvl>
   </w:abstractNum>
-  <w:abstractNum w:abstractNumId="13" w15:restartNumberingAfterBreak="0">
+  <w:abstractNum w:abstractNumId="18" w15:restartNumberingAfterBreak="0">
     <w:nsid w:val="4F3D2FEC"/>
     <w:multiLevelType w:val="multilevel"/>
     <w:tmpl w:val="6102F482"/>
@@ -6681,7 +8631,233 @@
       </w:rPr>
     </w:lvl>
   </w:abstractNum>
-  <w:abstractNum w:abstractNumId="14" w15:restartNumberingAfterBreak="0">
+  <w:abstractNum w:abstractNumId="19" w15:restartNumberingAfterBreak="0">
+    <w:nsid w:val="55392475"/>
+    <w:multiLevelType w:val="hybridMultilevel"/>
+    <w:tmpl w:val="8D78B29C"/>
+    <w:lvl w:ilvl="0" w:tplc="10090001">
+      <w:start w:val="1"/>
+      <w:numFmt w:val="bullet"/>
+      <w:lvlText w:val=""/>
+      <w:lvlJc w:val="left"/>
+      <w:pPr>
+        <w:ind w:left="1287" w:hanging="360"/>
+      </w:pPr>
+      <w:rPr>
+        <w:rFonts w:ascii="Symbol" w:hAnsi="Symbol" w:hint="default"/>
+      </w:rPr>
+    </w:lvl>
+    <w:lvl w:ilvl="1" w:tplc="10090003" w:tentative="1">
+      <w:start w:val="1"/>
+      <w:numFmt w:val="bullet"/>
+      <w:lvlText w:val="o"/>
+      <w:lvlJc w:val="left"/>
+      <w:pPr>
+        <w:ind w:left="2007" w:hanging="360"/>
+      </w:pPr>
+      <w:rPr>
+        <w:rFonts w:ascii="Courier New" w:hAnsi="Courier New" w:cs="Courier New" w:hint="default"/>
+      </w:rPr>
+    </w:lvl>
+    <w:lvl w:ilvl="2" w:tplc="10090005" w:tentative="1">
+      <w:start w:val="1"/>
+      <w:numFmt w:val="bullet"/>
+      <w:lvlText w:val=""/>
+      <w:lvlJc w:val="left"/>
+      <w:pPr>
+        <w:ind w:left="2727" w:hanging="360"/>
+      </w:pPr>
+      <w:rPr>
+        <w:rFonts w:ascii="Wingdings" w:hAnsi="Wingdings" w:hint="default"/>
+      </w:rPr>
+    </w:lvl>
+    <w:lvl w:ilvl="3" w:tplc="10090001" w:tentative="1">
+      <w:start w:val="1"/>
+      <w:numFmt w:val="bullet"/>
+      <w:lvlText w:val=""/>
+      <w:lvlJc w:val="left"/>
+      <w:pPr>
+        <w:ind w:left="3447" w:hanging="360"/>
+      </w:pPr>
+      <w:rPr>
+        <w:rFonts w:ascii="Symbol" w:hAnsi="Symbol" w:hint="default"/>
+      </w:rPr>
+    </w:lvl>
+    <w:lvl w:ilvl="4" w:tplc="10090003" w:tentative="1">
+      <w:start w:val="1"/>
+      <w:numFmt w:val="bullet"/>
+      <w:lvlText w:val="o"/>
+      <w:lvlJc w:val="left"/>
+      <w:pPr>
+        <w:ind w:left="4167" w:hanging="360"/>
+      </w:pPr>
+      <w:rPr>
+        <w:rFonts w:ascii="Courier New" w:hAnsi="Courier New" w:cs="Courier New" w:hint="default"/>
+      </w:rPr>
+    </w:lvl>
+    <w:lvl w:ilvl="5" w:tplc="10090005" w:tentative="1">
+      <w:start w:val="1"/>
+      <w:numFmt w:val="bullet"/>
+      <w:lvlText w:val=""/>
+      <w:lvlJc w:val="left"/>
+      <w:pPr>
+        <w:ind w:left="4887" w:hanging="360"/>
+      </w:pPr>
+      <w:rPr>
+        <w:rFonts w:ascii="Wingdings" w:hAnsi="Wingdings" w:hint="default"/>
+      </w:rPr>
+    </w:lvl>
+    <w:lvl w:ilvl="6" w:tplc="10090001" w:tentative="1">
+      <w:start w:val="1"/>
+      <w:numFmt w:val="bullet"/>
+      <w:lvlText w:val=""/>
+      <w:lvlJc w:val="left"/>
+      <w:pPr>
+        <w:ind w:left="5607" w:hanging="360"/>
+      </w:pPr>
+      <w:rPr>
+        <w:rFonts w:ascii="Symbol" w:hAnsi="Symbol" w:hint="default"/>
+      </w:rPr>
+    </w:lvl>
+    <w:lvl w:ilvl="7" w:tplc="10090003" w:tentative="1">
+      <w:start w:val="1"/>
+      <w:numFmt w:val="bullet"/>
+      <w:lvlText w:val="o"/>
+      <w:lvlJc w:val="left"/>
+      <w:pPr>
+        <w:ind w:left="6327" w:hanging="360"/>
+      </w:pPr>
+      <w:rPr>
+        <w:rFonts w:ascii="Courier New" w:hAnsi="Courier New" w:cs="Courier New" w:hint="default"/>
+      </w:rPr>
+    </w:lvl>
+    <w:lvl w:ilvl="8" w:tplc="10090005" w:tentative="1">
+      <w:start w:val="1"/>
+      <w:numFmt w:val="bullet"/>
+      <w:lvlText w:val=""/>
+      <w:lvlJc w:val="left"/>
+      <w:pPr>
+        <w:ind w:left="7047" w:hanging="360"/>
+      </w:pPr>
+      <w:rPr>
+        <w:rFonts w:ascii="Wingdings" w:hAnsi="Wingdings" w:hint="default"/>
+      </w:rPr>
+    </w:lvl>
+  </w:abstractNum>
+  <w:abstractNum w:abstractNumId="20" w15:restartNumberingAfterBreak="0">
+    <w:nsid w:val="565960C4"/>
+    <w:multiLevelType w:val="hybridMultilevel"/>
+    <w:tmpl w:val="1FEAD71C"/>
+    <w:lvl w:ilvl="0" w:tplc="10090001">
+      <w:start w:val="1"/>
+      <w:numFmt w:val="bullet"/>
+      <w:lvlText w:val=""/>
+      <w:lvlJc w:val="left"/>
+      <w:pPr>
+        <w:ind w:left="1287" w:hanging="360"/>
+      </w:pPr>
+      <w:rPr>
+        <w:rFonts w:ascii="Symbol" w:hAnsi="Symbol" w:hint="default"/>
+      </w:rPr>
+    </w:lvl>
+    <w:lvl w:ilvl="1" w:tplc="10090003" w:tentative="1">
+      <w:start w:val="1"/>
+      <w:numFmt w:val="bullet"/>
+      <w:lvlText w:val="o"/>
+      <w:lvlJc w:val="left"/>
+      <w:pPr>
+        <w:ind w:left="2007" w:hanging="360"/>
+      </w:pPr>
+      <w:rPr>
+        <w:rFonts w:ascii="Courier New" w:hAnsi="Courier New" w:cs="Courier New" w:hint="default"/>
+      </w:rPr>
+    </w:lvl>
+    <w:lvl w:ilvl="2" w:tplc="10090005" w:tentative="1">
+      <w:start w:val="1"/>
+      <w:numFmt w:val="bullet"/>
+      <w:lvlText w:val=""/>
+      <w:lvlJc w:val="left"/>
+      <w:pPr>
+        <w:ind w:left="2727" w:hanging="360"/>
+      </w:pPr>
+      <w:rPr>
+        <w:rFonts w:ascii="Wingdings" w:hAnsi="Wingdings" w:hint="default"/>
+      </w:rPr>
+    </w:lvl>
+    <w:lvl w:ilvl="3" w:tplc="10090001" w:tentative="1">
+      <w:start w:val="1"/>
+      <w:numFmt w:val="bullet"/>
+      <w:lvlText w:val=""/>
+      <w:lvlJc w:val="left"/>
+      <w:pPr>
+        <w:ind w:left="3447" w:hanging="360"/>
+      </w:pPr>
+      <w:rPr>
+        <w:rFonts w:ascii="Symbol" w:hAnsi="Symbol" w:hint="default"/>
+      </w:rPr>
+    </w:lvl>
+    <w:lvl w:ilvl="4" w:tplc="10090003" w:tentative="1">
+      <w:start w:val="1"/>
+      <w:numFmt w:val="bullet"/>
+      <w:lvlText w:val="o"/>
+      <w:lvlJc w:val="left"/>
+      <w:pPr>
+        <w:ind w:left="4167" w:hanging="360"/>
+      </w:pPr>
+      <w:rPr>
+        <w:rFonts w:ascii="Courier New" w:hAnsi="Courier New" w:cs="Courier New" w:hint="default"/>
+      </w:rPr>
+    </w:lvl>
+    <w:lvl w:ilvl="5" w:tplc="10090005" w:tentative="1">
+      <w:start w:val="1"/>
+      <w:numFmt w:val="bullet"/>
+      <w:lvlText w:val=""/>
+      <w:lvlJc w:val="left"/>
+      <w:pPr>
+        <w:ind w:left="4887" w:hanging="360"/>
+      </w:pPr>
+      <w:rPr>
+        <w:rFonts w:ascii="Wingdings" w:hAnsi="Wingdings" w:hint="default"/>
+      </w:rPr>
+    </w:lvl>
+    <w:lvl w:ilvl="6" w:tplc="10090001" w:tentative="1">
+      <w:start w:val="1"/>
+      <w:numFmt w:val="bullet"/>
+      <w:lvlText w:val=""/>
+      <w:lvlJc w:val="left"/>
+      <w:pPr>
+        <w:ind w:left="5607" w:hanging="360"/>
+      </w:pPr>
+      <w:rPr>
+        <w:rFonts w:ascii="Symbol" w:hAnsi="Symbol" w:hint="default"/>
+      </w:rPr>
+    </w:lvl>
+    <w:lvl w:ilvl="7" w:tplc="10090003" w:tentative="1">
+      <w:start w:val="1"/>
+      <w:numFmt w:val="bullet"/>
+      <w:lvlText w:val="o"/>
+      <w:lvlJc w:val="left"/>
+      <w:pPr>
+        <w:ind w:left="6327" w:hanging="360"/>
+      </w:pPr>
+      <w:rPr>
+        <w:rFonts w:ascii="Courier New" w:hAnsi="Courier New" w:cs="Courier New" w:hint="default"/>
+      </w:rPr>
+    </w:lvl>
+    <w:lvl w:ilvl="8" w:tplc="10090005" w:tentative="1">
+      <w:start w:val="1"/>
+      <w:numFmt w:val="bullet"/>
+      <w:lvlText w:val=""/>
+      <w:lvlJc w:val="left"/>
+      <w:pPr>
+        <w:ind w:left="7047" w:hanging="360"/>
+      </w:pPr>
+      <w:rPr>
+        <w:rFonts w:ascii="Wingdings" w:hAnsi="Wingdings" w:hint="default"/>
+      </w:rPr>
+    </w:lvl>
+  </w:abstractNum>
+  <w:abstractNum w:abstractNumId="21" w15:restartNumberingAfterBreak="0">
     <w:nsid w:val="608E6A09"/>
     <w:multiLevelType w:val="multilevel"/>
     <w:tmpl w:val="630417F6"/>
@@ -6830,7 +9006,7 @@
       </w:rPr>
     </w:lvl>
   </w:abstractNum>
-  <w:abstractNum w:abstractNumId="15" w15:restartNumberingAfterBreak="0">
+  <w:abstractNum w:abstractNumId="22" w15:restartNumberingAfterBreak="0">
     <w:nsid w:val="6123375C"/>
     <w:multiLevelType w:val="multilevel"/>
     <w:tmpl w:val="2880F8C0"/>
@@ -6961,7 +9137,7 @@
       </w:rPr>
     </w:lvl>
   </w:abstractNum>
-  <w:abstractNum w:abstractNumId="16" w15:restartNumberingAfterBreak="0">
+  <w:abstractNum w:abstractNumId="23" w15:restartNumberingAfterBreak="0">
     <w:nsid w:val="634A4715"/>
     <w:multiLevelType w:val="multilevel"/>
     <w:tmpl w:val="55F2927C"/>
@@ -7075,7 +9251,7 @@
       </w:rPr>
     </w:lvl>
   </w:abstractNum>
-  <w:abstractNum w:abstractNumId="17" w15:restartNumberingAfterBreak="0">
+  <w:abstractNum w:abstractNumId="24" w15:restartNumberingAfterBreak="0">
     <w:nsid w:val="651479FD"/>
     <w:multiLevelType w:val="multilevel"/>
     <w:tmpl w:val="BADE4A1C"/>
@@ -7189,7 +9365,7 @@
       </w:rPr>
     </w:lvl>
   </w:abstractNum>
-  <w:abstractNum w:abstractNumId="18" w15:restartNumberingAfterBreak="0">
+  <w:abstractNum w:abstractNumId="25" w15:restartNumberingAfterBreak="0">
     <w:nsid w:val="68445857"/>
     <w:multiLevelType w:val="multilevel"/>
     <w:tmpl w:val="A4607B1C"/>
@@ -7320,7 +9496,7 @@
       </w:rPr>
     </w:lvl>
   </w:abstractNum>
-  <w:abstractNum w:abstractNumId="19" w15:restartNumberingAfterBreak="0">
+  <w:abstractNum w:abstractNumId="26" w15:restartNumberingAfterBreak="0">
     <w:nsid w:val="68EC6A07"/>
     <w:multiLevelType w:val="hybridMultilevel"/>
     <w:tmpl w:val="D758CA6E"/>
@@ -7433,7 +9609,7 @@
       </w:rPr>
     </w:lvl>
   </w:abstractNum>
-  <w:abstractNum w:abstractNumId="20" w15:restartNumberingAfterBreak="0">
+  <w:abstractNum w:abstractNumId="27" w15:restartNumberingAfterBreak="0">
     <w:nsid w:val="69A116B1"/>
     <w:multiLevelType w:val="multilevel"/>
     <w:tmpl w:val="CAB05F3A"/>
@@ -7522,7 +9698,156 @@
       </w:pPr>
     </w:lvl>
   </w:abstractNum>
-  <w:abstractNum w:abstractNumId="21" w15:restartNumberingAfterBreak="0">
+  <w:abstractNum w:abstractNumId="28" w15:restartNumberingAfterBreak="0">
+    <w:nsid w:val="71E06661"/>
+    <w:multiLevelType w:val="multilevel"/>
+    <w:tmpl w:val="E6E8E2B0"/>
+    <w:lvl w:ilvl="0">
+      <w:start w:val="1"/>
+      <w:numFmt w:val="bullet"/>
+      <w:lvlText w:val=""/>
+      <w:lvlJc w:val="left"/>
+      <w:pPr>
+        <w:tabs>
+          <w:tab w:val="num" w:pos="720"/>
+        </w:tabs>
+        <w:ind w:left="720" w:hanging="360"/>
+      </w:pPr>
+      <w:rPr>
+        <w:rFonts w:ascii="Symbol" w:hAnsi="Symbol" w:hint="default"/>
+        <w:sz w:val="20"/>
+      </w:rPr>
+    </w:lvl>
+    <w:lvl w:ilvl="1" w:tentative="1">
+      <w:start w:val="1"/>
+      <w:numFmt w:val="bullet"/>
+      <w:lvlText w:val="o"/>
+      <w:lvlJc w:val="left"/>
+      <w:pPr>
+        <w:tabs>
+          <w:tab w:val="num" w:pos="1440"/>
+        </w:tabs>
+        <w:ind w:left="1440" w:hanging="360"/>
+      </w:pPr>
+      <w:rPr>
+        <w:rFonts w:ascii="Courier New" w:hAnsi="Courier New" w:hint="default"/>
+        <w:sz w:val="20"/>
+      </w:rPr>
+    </w:lvl>
+    <w:lvl w:ilvl="2" w:tentative="1">
+      <w:start w:val="1"/>
+      <w:numFmt w:val="bullet"/>
+      <w:lvlText w:val=""/>
+      <w:lvlJc w:val="left"/>
+      <w:pPr>
+        <w:tabs>
+          <w:tab w:val="num" w:pos="2160"/>
+        </w:tabs>
+        <w:ind w:left="2160" w:hanging="360"/>
+      </w:pPr>
+      <w:rPr>
+        <w:rFonts w:ascii="Wingdings" w:hAnsi="Wingdings" w:hint="default"/>
+        <w:sz w:val="20"/>
+      </w:rPr>
+    </w:lvl>
+    <w:lvl w:ilvl="3" w:tentative="1">
+      <w:start w:val="1"/>
+      <w:numFmt w:val="bullet"/>
+      <w:lvlText w:val=""/>
+      <w:lvlJc w:val="left"/>
+      <w:pPr>
+        <w:tabs>
+          <w:tab w:val="num" w:pos="2880"/>
+        </w:tabs>
+        <w:ind w:left="2880" w:hanging="360"/>
+      </w:pPr>
+      <w:rPr>
+        <w:rFonts w:ascii="Wingdings" w:hAnsi="Wingdings" w:hint="default"/>
+        <w:sz w:val="20"/>
+      </w:rPr>
+    </w:lvl>
+    <w:lvl w:ilvl="4" w:tentative="1">
+      <w:start w:val="1"/>
+      <w:numFmt w:val="bullet"/>
+      <w:lvlText w:val=""/>
+      <w:lvlJc w:val="left"/>
+      <w:pPr>
+        <w:tabs>
+          <w:tab w:val="num" w:pos="3600"/>
+        </w:tabs>
+        <w:ind w:left="3600" w:hanging="360"/>
+      </w:pPr>
+      <w:rPr>
+        <w:rFonts w:ascii="Wingdings" w:hAnsi="Wingdings" w:hint="default"/>
+        <w:sz w:val="20"/>
+      </w:rPr>
+    </w:lvl>
+    <w:lvl w:ilvl="5" w:tentative="1">
+      <w:start w:val="1"/>
+      <w:numFmt w:val="bullet"/>
+      <w:lvlText w:val=""/>
+      <w:lvlJc w:val="left"/>
+      <w:pPr>
+        <w:tabs>
+          <w:tab w:val="num" w:pos="4320"/>
+        </w:tabs>
+        <w:ind w:left="4320" w:hanging="360"/>
+      </w:pPr>
+      <w:rPr>
+        <w:rFonts w:ascii="Wingdings" w:hAnsi="Wingdings" w:hint="default"/>
+        <w:sz w:val="20"/>
+      </w:rPr>
+    </w:lvl>
+    <w:lvl w:ilvl="6" w:tentative="1">
+      <w:start w:val="1"/>
+      <w:numFmt w:val="bullet"/>
+      <w:lvlText w:val=""/>
+      <w:lvlJc w:val="left"/>
+      <w:pPr>
+        <w:tabs>
+          <w:tab w:val="num" w:pos="5040"/>
+        </w:tabs>
+        <w:ind w:left="5040" w:hanging="360"/>
+      </w:pPr>
+      <w:rPr>
+        <w:rFonts w:ascii="Wingdings" w:hAnsi="Wingdings" w:hint="default"/>
+        <w:sz w:val="20"/>
+      </w:rPr>
+    </w:lvl>
+    <w:lvl w:ilvl="7" w:tentative="1">
+      <w:start w:val="1"/>
+      <w:numFmt w:val="bullet"/>
+      <w:lvlText w:val=""/>
+      <w:lvlJc w:val="left"/>
+      <w:pPr>
+        <w:tabs>
+          <w:tab w:val="num" w:pos="5760"/>
+        </w:tabs>
+        <w:ind w:left="5760" w:hanging="360"/>
+      </w:pPr>
+      <w:rPr>
+        <w:rFonts w:ascii="Wingdings" w:hAnsi="Wingdings" w:hint="default"/>
+        <w:sz w:val="20"/>
+      </w:rPr>
+    </w:lvl>
+    <w:lvl w:ilvl="8" w:tentative="1">
+      <w:start w:val="1"/>
+      <w:numFmt w:val="bullet"/>
+      <w:lvlText w:val=""/>
+      <w:lvlJc w:val="left"/>
+      <w:pPr>
+        <w:tabs>
+          <w:tab w:val="num" w:pos="6480"/>
+        </w:tabs>
+        <w:ind w:left="6480" w:hanging="360"/>
+      </w:pPr>
+      <w:rPr>
+        <w:rFonts w:ascii="Wingdings" w:hAnsi="Wingdings" w:hint="default"/>
+        <w:sz w:val="20"/>
+      </w:rPr>
+    </w:lvl>
+  </w:abstractNum>
+  <w:abstractNum w:abstractNumId="29" w15:restartNumberingAfterBreak="0">
     <w:nsid w:val="770430B5"/>
     <w:multiLevelType w:val="hybridMultilevel"/>
     <w:tmpl w:val="AAF4D5D0"/>
@@ -7635,7 +9960,7 @@
       </w:rPr>
     </w:lvl>
   </w:abstractNum>
-  <w:abstractNum w:abstractNumId="22" w15:restartNumberingAfterBreak="0">
+  <w:abstractNum w:abstractNumId="30" w15:restartNumberingAfterBreak="0">
     <w:nsid w:val="7B303AC4"/>
     <w:multiLevelType w:val="multilevel"/>
     <w:tmpl w:val="6186C6E0"/>
@@ -7767,73 +10092,73 @@
     </w:lvl>
   </w:abstractNum>
   <w:num w:numId="1" w16cid:durableId="636689723">
-    <w:abstractNumId w:val="20"/>
+    <w:abstractNumId w:val="27"/>
   </w:num>
   <w:num w:numId="2" w16cid:durableId="2067365523">
-    <w:abstractNumId w:val="16"/>
+    <w:abstractNumId w:val="23"/>
   </w:num>
   <w:num w:numId="3" w16cid:durableId="1150168574">
+    <w:abstractNumId w:val="6"/>
+  </w:num>
+  <w:num w:numId="4" w16cid:durableId="135226851">
+    <w:abstractNumId w:val="10"/>
+  </w:num>
+  <w:num w:numId="5" w16cid:durableId="1127090221">
+    <w:abstractNumId w:val="3"/>
+  </w:num>
+  <w:num w:numId="6" w16cid:durableId="1421293766">
+    <w:abstractNumId w:val="30"/>
+  </w:num>
+  <w:num w:numId="7" w16cid:durableId="1200707560">
+    <w:abstractNumId w:val="22"/>
+  </w:num>
+  <w:num w:numId="8" w16cid:durableId="177038596">
+    <w:abstractNumId w:val="17"/>
+  </w:num>
+  <w:num w:numId="9" w16cid:durableId="1887334189">
+    <w:abstractNumId w:val="25"/>
+  </w:num>
+  <w:num w:numId="10" w16cid:durableId="1248155252">
+    <w:abstractNumId w:val="18"/>
+  </w:num>
+  <w:num w:numId="11" w16cid:durableId="20866556">
+    <w:abstractNumId w:val="11"/>
+  </w:num>
+  <w:num w:numId="12" w16cid:durableId="255485134">
     <w:abstractNumId w:val="4"/>
   </w:num>
-  <w:num w:numId="4" w16cid:durableId="135226851">
-    <w:abstractNumId w:val="7"/>
-  </w:num>
-  <w:num w:numId="5" w16cid:durableId="1127090221">
-    <w:abstractNumId w:val="2"/>
-  </w:num>
-  <w:num w:numId="6" w16cid:durableId="1421293766">
-    <w:abstractNumId w:val="22"/>
-  </w:num>
-  <w:num w:numId="7" w16cid:durableId="1200707560">
-    <w:abstractNumId w:val="15"/>
-  </w:num>
-  <w:num w:numId="8" w16cid:durableId="177038596">
-    <w:abstractNumId w:val="12"/>
-  </w:num>
-  <w:num w:numId="9" w16cid:durableId="1887334189">
-    <w:abstractNumId w:val="18"/>
-  </w:num>
-  <w:num w:numId="10" w16cid:durableId="1248155252">
-    <w:abstractNumId w:val="13"/>
-  </w:num>
-  <w:num w:numId="11" w16cid:durableId="20866556">
-    <w:abstractNumId w:val="8"/>
-  </w:num>
-  <w:num w:numId="12" w16cid:durableId="255485134">
-    <w:abstractNumId w:val="3"/>
-  </w:num>
   <w:num w:numId="13" w16cid:durableId="1531915552">
-    <w:abstractNumId w:val="19"/>
+    <w:abstractNumId w:val="26"/>
   </w:num>
   <w:num w:numId="14" w16cid:durableId="45835494">
-    <w:abstractNumId w:val="5"/>
+    <w:abstractNumId w:val="8"/>
   </w:num>
   <w:num w:numId="15" w16cid:durableId="370301717">
     <w:abstractNumId w:val="0"/>
   </w:num>
   <w:num w:numId="16" w16cid:durableId="1536455891">
-    <w:abstractNumId w:val="6"/>
+    <w:abstractNumId w:val="9"/>
   </w:num>
   <w:num w:numId="17" w16cid:durableId="1349527978">
-    <w:abstractNumId w:val="1"/>
+    <w:abstractNumId w:val="2"/>
   </w:num>
   <w:num w:numId="18" w16cid:durableId="1860000853">
+    <w:abstractNumId w:val="29"/>
+  </w:num>
+  <w:num w:numId="19" w16cid:durableId="1208956972">
+    <w:abstractNumId w:val="13"/>
+  </w:num>
+  <w:num w:numId="20" w16cid:durableId="796680837">
+    <w:abstractNumId w:val="16"/>
+  </w:num>
+  <w:num w:numId="21" w16cid:durableId="1329209884">
     <w:abstractNumId w:val="21"/>
   </w:num>
-  <w:num w:numId="19" w16cid:durableId="1208956972">
-    <w:abstractNumId w:val="9"/>
-  </w:num>
-  <w:num w:numId="20" w16cid:durableId="796680837">
-    <w:abstractNumId w:val="11"/>
-  </w:num>
-  <w:num w:numId="21" w16cid:durableId="1329209884">
-    <w:abstractNumId w:val="14"/>
-  </w:num>
   <w:num w:numId="22" w16cid:durableId="1103844102">
-    <w:abstractNumId w:val="17"/>
+    <w:abstractNumId w:val="24"/>
   </w:num>
   <w:num w:numId="23" w16cid:durableId="155732580">
-    <w:abstractNumId w:val="17"/>
+    <w:abstractNumId w:val="24"/>
     <w:lvlOverride w:ilvl="0">
       <w:lvl w:ilvl="0">
         <w:start w:val="1"/>
@@ -7963,31 +10288,58 @@
     </w:lvlOverride>
   </w:num>
   <w:num w:numId="24" w16cid:durableId="1611429283">
-    <w:abstractNumId w:val="17"/>
+    <w:abstractNumId w:val="24"/>
   </w:num>
   <w:num w:numId="25" w16cid:durableId="918754324">
-    <w:abstractNumId w:val="17"/>
+    <w:abstractNumId w:val="24"/>
   </w:num>
   <w:num w:numId="26" w16cid:durableId="631328741">
-    <w:abstractNumId w:val="17"/>
+    <w:abstractNumId w:val="24"/>
   </w:num>
   <w:num w:numId="27" w16cid:durableId="928343797">
-    <w:abstractNumId w:val="17"/>
+    <w:abstractNumId w:val="24"/>
   </w:num>
   <w:num w:numId="28" w16cid:durableId="1972862496">
-    <w:abstractNumId w:val="17"/>
+    <w:abstractNumId w:val="24"/>
   </w:num>
   <w:num w:numId="29" w16cid:durableId="53283506">
-    <w:abstractNumId w:val="17"/>
+    <w:abstractNumId w:val="24"/>
   </w:num>
   <w:num w:numId="30" w16cid:durableId="919025089">
-    <w:abstractNumId w:val="17"/>
+    <w:abstractNumId w:val="24"/>
   </w:num>
   <w:num w:numId="31" w16cid:durableId="363795691">
-    <w:abstractNumId w:val="17"/>
+    <w:abstractNumId w:val="24"/>
   </w:num>
   <w:num w:numId="32" w16cid:durableId="1863088587">
-    <w:abstractNumId w:val="10"/>
+    <w:abstractNumId w:val="15"/>
+  </w:num>
+  <w:num w:numId="33" w16cid:durableId="1029641042">
+    <w:abstractNumId w:val="12"/>
+  </w:num>
+  <w:num w:numId="34" w16cid:durableId="151340634">
+    <w:abstractNumId w:val="28"/>
+  </w:num>
+  <w:num w:numId="35" w16cid:durableId="269437506">
+    <w:abstractNumId w:val="7"/>
+  </w:num>
+  <w:num w:numId="36" w16cid:durableId="2031567496">
+    <w:abstractNumId w:val="24"/>
+  </w:num>
+  <w:num w:numId="37" w16cid:durableId="503594456">
+    <w:abstractNumId w:val="14"/>
+  </w:num>
+  <w:num w:numId="38" w16cid:durableId="1262178702">
+    <w:abstractNumId w:val="1"/>
+  </w:num>
+  <w:num w:numId="39" w16cid:durableId="1934127663">
+    <w:abstractNumId w:val="19"/>
+  </w:num>
+  <w:num w:numId="40" w16cid:durableId="1298530812">
+    <w:abstractNumId w:val="20"/>
+  </w:num>
+  <w:num w:numId="41" w16cid:durableId="824903860">
+    <w:abstractNumId w:val="5"/>
   </w:num>
 </w:numbering>
 </file>
@@ -8452,7 +10804,6 @@
         <w:numId w:val="22"/>
       </w:numPr>
       <w:spacing w:before="180" w:after="60"/>
-      <w:ind w:left="1225" w:hanging="505"/>
       <w:outlineLvl w:val="2"/>
     </w:pPr>
     <w:rPr>
@@ -8610,7 +10961,6 @@
   <w:style w:type="character" w:default="1" w:styleId="DefaultParagraphFont">
     <w:name w:val="Default Paragraph Font"/>
     <w:uiPriority w:val="1"/>
-    <w:semiHidden/>
     <w:unhideWhenUsed/>
   </w:style>
   <w:style w:type="table" w:default="1" w:styleId="TableNormal">

</xml_diff>

<commit_message>
add section 6 to the report
</commit_message>
<xml_diff>
--- a/docs/deliverables/3.2/Deliverable 3-2 Implementation - Submission.docx
+++ b/docs/deliverables/3.2/Deliverable 3-2 Implementation - Submission.docx
@@ -756,15 +756,7 @@
       </w:r>
       <w:proofErr w:type="spellEnd"/>
       <w:r>
-        <w:t xml:space="preserve"> project. The main purpose of this iteration is to complete and strengthen the implementation by refactoring the existing codebase, finishing important backlog items from Deliverable 3.1, and carrying out more complete testing and validation. </w:t>
-      </w:r>
-      <w:proofErr w:type="gramStart"/>
-      <w:r>
-        <w:t>In particular, this</w:t>
-      </w:r>
-      <w:proofErr w:type="gramEnd"/>
-      <w:r>
-        <w:t xml:space="preserve"> report focuses on codebase improvements for better structure and maintainability, the addition of remaining features such as persistence and loading saved data on startup, and the testing work needed to confirm that the system functions correctly after integration. These areas match the main requirements of the Deliverable 3.2, which emphasizes refactoring, final implementation of core features, and full testing and validation. </w:t>
+        <w:t xml:space="preserve"> project. The main purpose of this iteration is to complete and strengthen the implementation by refactoring the existing codebase, finishing important backlog items from Deliverable 3.1, and carrying out more complete testing and validation. In particular, this report focuses on codebase improvements for better structure and maintainability, the addition of remaining features such as persistence and loading saved data on startup, and the testing work needed to confirm that the system functions correctly after integration. These areas match the main requirements of the Deliverable 3.2, which emphasizes refactoring, final implementation of core features, and full testing and validation. </w:t>
       </w:r>
     </w:p>
     <w:p>
@@ -822,15 +814,7 @@
     </w:p>
     <w:p>
       <w:r>
-        <w:t xml:space="preserve">At the same time, Deliverable 3.1 clearly identified the main work that </w:t>
-      </w:r>
-      <w:proofErr w:type="gramStart"/>
-      <w:r>
-        <w:t>still remained</w:t>
-      </w:r>
-      <w:proofErr w:type="gramEnd"/>
-      <w:r>
-        <w:t xml:space="preserve"> for the next cycle. The most important limitation was that data persistence had not yet been finalized, which meant that transactions and budgets were not saved after the application closed. The preliminary testing and coverage review also showed that some important areas still needed stronger automated testing, especially alert logic, report generation, and the persistence-related workflows planned for the next stage. In addition, a few small GUI refinements were still listed in the backlog. </w:t>
+        <w:t xml:space="preserve">At the same time, Deliverable 3.1 clearly identified the main work that still remained for the next cycle. The most important limitation was that data persistence had not yet been finalized, which meant that transactions and budgets were not saved after the application closed. The preliminary testing and coverage review also showed that some important areas still needed stronger automated testing, especially alert logic, report generation, and the persistence-related workflows planned for the next stage. In addition, a few small GUI refinements were still listed in the backlog. </w:t>
       </w:r>
     </w:p>
     <w:p>
@@ -856,15 +840,7 @@
     </w:p>
     <w:p>
       <w:r>
-        <w:t xml:space="preserve">In Deliverable 3.2, our </w:t>
-      </w:r>
-      <w:proofErr w:type="gramStart"/>
-      <w:r>
-        <w:t>main focus</w:t>
-      </w:r>
-      <w:proofErr w:type="gramEnd"/>
-      <w:r>
-        <w:t xml:space="preserve"> was to strengthen the existing </w:t>
+        <w:t xml:space="preserve">In Deliverable 3.2, our main focus was to strengthen the existing </w:t>
       </w:r>
       <w:proofErr w:type="spellStart"/>
       <w:r>
@@ -1332,23 +1308,7 @@
     </w:p>
     <w:p>
       <w:r>
-        <w:t xml:space="preserve">The main implementation </w:t>
-      </w:r>
-      <w:proofErr w:type="gramStart"/>
-      <w:r>
-        <w:t>focus</w:t>
-      </w:r>
-      <w:proofErr w:type="gramEnd"/>
-      <w:r>
-        <w:t xml:space="preserve"> </w:t>
-      </w:r>
-      <w:proofErr w:type="gramStart"/>
-      <w:r>
-        <w:t>in</w:t>
-      </w:r>
-      <w:proofErr w:type="gramEnd"/>
-      <w:r>
-        <w:t xml:space="preserve"> Deliverable 3.2 was to finish the remaining “must-have” items from the project backlog that were required to make </w:t>
+        <w:t xml:space="preserve">The main implementation focus in Deliverable 3.2 was to finish the remaining “must-have” items from the project backlog that were required to make </w:t>
       </w:r>
       <w:proofErr w:type="spellStart"/>
       <w:r>
@@ -1482,15 +1442,7 @@
     </w:p>
     <w:p>
       <w:r>
-        <w:t xml:space="preserve">Our testing strategy combines automated unit tests with functional workflow testing. Automated tests are used to validate business rules in the domain/service layers (independent from the GUI), while functional and integration testing validate that real user workflows behave correctly through the application interface. This approach builds on our earlier testing direction from Deliverable 3.1, where we used JUnit unit tests for core logic and manual GUI smoke tests for workflow validation, </w:t>
-      </w:r>
-      <w:proofErr w:type="gramStart"/>
-      <w:r>
-        <w:t>and also</w:t>
-      </w:r>
-      <w:proofErr w:type="gramEnd"/>
-      <w:r>
-        <w:t xml:space="preserve"> addresses the coverage gaps identified for alerts, reporting, and persistence.</w:t>
+        <w:t>Our testing strategy combines automated unit tests with functional workflow testing. Automated tests are used to validate business rules in the domain/service layers (independent from the GUI), while functional and integration testing validate that real user workflows behave correctly through the application interface. This approach builds on our earlier testing direction from Deliverable 3.1, where we used JUnit unit tests for core logic and manual GUI smoke tests for workflow validation, and also addresses the coverage gaps identified for alerts, reporting, and persistence.</w:t>
       </w:r>
     </w:p>
     <w:p>
@@ -2498,107 +2450,19 @@
         </w:numPr>
       </w:pPr>
       <w:r>
-        <w:t>Updated Backlog with Design Stories</w:t>
+        <w:t>Updated Backlog</w:t>
       </w:r>
       <w:bookmarkEnd w:id="2"/>
     </w:p>
     <w:p>
-      <w:pPr>
-        <w:rPr>
-          <w:color w:val="EE0000"/>
-        </w:rPr>
-      </w:pPr>
-      <w:r>
-        <w:rPr>
-          <w:color w:val="EE0000"/>
-        </w:rPr>
-        <w:t xml:space="preserve">This section presents the updated backlog for </w:t>
-      </w:r>
-      <w:proofErr w:type="spellStart"/>
-      <w:r>
-        <w:rPr>
-          <w:color w:val="EE0000"/>
-        </w:rPr>
-        <w:t>SmartBudget</w:t>
-      </w:r>
-      <w:proofErr w:type="spellEnd"/>
-      <w:r>
-        <w:rPr>
-          <w:color w:val="EE0000"/>
-        </w:rPr>
-        <w:t xml:space="preserve"> for Iteration 3.1 and the upcoming development cycle. The backlog is based on the project’s core user stories defined earlier (Deliverable 2.2), and it has been refined into more specific design and implementation </w:t>
-      </w:r>
-      <w:r>
-        <w:rPr>
-          <w:color w:val="EE0000"/>
-        </w:rPr>
+      <w:r>
+        <w:t>This section summarizes the backlog status for Iteration 3.2 and shows the progress made since the previous deliverable. The backlog items are based on the design stories introduced in Deliverable 3.1 and track the remaining development tasks required to reach a fully functional system.</w:t>
+      </w:r>
+    </w:p>
+    <w:p>
+      <w:r>
         <w:lastRenderedPageBreak/>
-        <w:t>stories that reflect the current system architecture (UI → Services → Domain → Persistence) and the work completed so far.</w:t>
-      </w:r>
-    </w:p>
-    <w:p>
-      <w:pPr>
-        <w:rPr>
-          <w:color w:val="EE0000"/>
-        </w:rPr>
-      </w:pPr>
-      <w:r>
-        <w:rPr>
-          <w:color w:val="EE0000"/>
-        </w:rPr>
-        <w:t>Because most core features are now functional, this backlog is split into:</w:t>
-      </w:r>
-    </w:p>
-    <w:p>
-      <w:pPr>
-        <w:pStyle w:val="ListParagraph"/>
-        <w:numPr>
-          <w:ilvl w:val="0"/>
-          <w:numId w:val="12"/>
-        </w:numPr>
-        <w:rPr>
-          <w:color w:val="EE0000"/>
-        </w:rPr>
-      </w:pPr>
-      <w:r>
-        <w:rPr>
-          <w:b/>
-          <w:bCs/>
-          <w:color w:val="EE0000"/>
-        </w:rPr>
-        <w:t>Completed design/implementation stories</w:t>
-      </w:r>
-      <w:r>
-        <w:rPr>
-          <w:color w:val="EE0000"/>
-        </w:rPr>
-        <w:t xml:space="preserve"> (Done in Iteration 3.1), and</w:t>
-      </w:r>
-    </w:p>
-    <w:p>
-      <w:pPr>
-        <w:pStyle w:val="ListParagraph"/>
-        <w:numPr>
-          <w:ilvl w:val="0"/>
-          <w:numId w:val="12"/>
-        </w:numPr>
-        <w:rPr>
-          <w:color w:val="EE0000"/>
-        </w:rPr>
-      </w:pPr>
-      <w:r>
-        <w:rPr>
-          <w:b/>
-          <w:bCs/>
-          <w:color w:val="EE0000"/>
-        </w:rPr>
-        <w:t>Remaining / next-cycle stories</w:t>
-      </w:r>
-      <w:r>
-        <w:rPr>
-          <w:color w:val="EE0000"/>
-        </w:rPr>
-        <w:t xml:space="preserve"> (To Do), focusing mainly on persistence, missing test coverage, and a few UI improvements.</w:t>
+        <w:t>During this iteration, the focus of development was on completing the persistence functionality and integrating it with the existing modules of the system. This work allows the application to store and restore user data across sessions, which was identified as the main missing capability in the previous iteration.</w:t>
       </w:r>
     </w:p>
     <w:p>
@@ -2608,181 +2472,39 @@
           <w:ilvl w:val="1"/>
           <w:numId w:val="1"/>
         </w:numPr>
-        <w:rPr>
-          <w:color w:val="EE0000"/>
-        </w:rPr>
-      </w:pPr>
-      <w:bookmarkStart w:id="3" w:name="_Toc222073286"/>
-      <w:r>
-        <w:rPr>
-          <w:color w:val="EE0000"/>
-        </w:rPr>
-        <w:t>Backlog Format and Prioritization Approach</w:t>
+      </w:pPr>
+      <w:r>
+        <w:t>Completed Backlog Items</w:t>
+      </w:r>
+    </w:p>
+    <w:p>
+      <w:bookmarkStart w:id="3" w:name="_Toc222073287"/>
+      <w:r>
+        <w:t>The following backlog items were completed during this iteration:</w:t>
       </w:r>
       <w:bookmarkEnd w:id="3"/>
-    </w:p>
-    <w:p>
-      <w:pPr>
-        <w:rPr>
-          <w:color w:val="EE0000"/>
-        </w:rPr>
-      </w:pPr>
-      <w:r>
-        <w:rPr>
-          <w:color w:val="EE0000"/>
-        </w:rPr>
-        <w:t>Backlog items are prioritized based on:</w:t>
-      </w:r>
-    </w:p>
-    <w:p>
-      <w:pPr>
-        <w:pStyle w:val="ListParagraph"/>
-        <w:numPr>
-          <w:ilvl w:val="0"/>
-          <w:numId w:val="14"/>
-        </w:numPr>
-        <w:rPr>
-          <w:color w:val="EE0000"/>
-        </w:rPr>
-      </w:pPr>
-      <w:r>
-        <w:rPr>
-          <w:b/>
-          <w:bCs/>
-          <w:color w:val="EE0000"/>
-        </w:rPr>
-        <w:t>Dependency order</w:t>
-      </w:r>
-      <w:r>
-        <w:rPr>
-          <w:color w:val="EE0000"/>
-        </w:rPr>
-        <w:t xml:space="preserve"> (persistence must exist before persistence testing, for example),</w:t>
-      </w:r>
-    </w:p>
-    <w:p>
-      <w:pPr>
-        <w:pStyle w:val="ListParagraph"/>
-        <w:numPr>
-          <w:ilvl w:val="0"/>
-          <w:numId w:val="14"/>
-        </w:numPr>
-        <w:rPr>
-          <w:color w:val="EE0000"/>
-        </w:rPr>
-      </w:pPr>
-      <w:r>
-        <w:rPr>
-          <w:b/>
-          <w:bCs/>
-          <w:color w:val="EE0000"/>
-        </w:rPr>
-        <w:t>Core system value</w:t>
-      </w:r>
-      <w:r>
-        <w:rPr>
-          <w:color w:val="EE0000"/>
-        </w:rPr>
-        <w:t xml:space="preserve"> (features that affect correct app </w:t>
-      </w:r>
-      <w:proofErr w:type="spellStart"/>
-      <w:r>
-        <w:rPr>
-          <w:color w:val="EE0000"/>
-        </w:rPr>
-        <w:t>behavior</w:t>
-      </w:r>
-      <w:proofErr w:type="spellEnd"/>
-      <w:r>
-        <w:rPr>
-          <w:color w:val="EE0000"/>
-        </w:rPr>
-        <w:t xml:space="preserve"> are highest priority),</w:t>
-      </w:r>
-    </w:p>
-    <w:p>
-      <w:pPr>
-        <w:pStyle w:val="ListParagraph"/>
-        <w:numPr>
-          <w:ilvl w:val="0"/>
-          <w:numId w:val="14"/>
-        </w:numPr>
-        <w:rPr>
-          <w:color w:val="EE0000"/>
-        </w:rPr>
-      </w:pPr>
-      <w:r>
-        <w:rPr>
-          <w:b/>
-          <w:bCs/>
-          <w:color w:val="EE0000"/>
-        </w:rPr>
-        <w:t>Quality improvements</w:t>
-      </w:r>
-      <w:r>
-        <w:rPr>
-          <w:color w:val="EE0000"/>
-        </w:rPr>
-        <w:t xml:space="preserve"> (test coverage, validation, and UI polish).</w:t>
-      </w:r>
-    </w:p>
-    <w:p>
-      <w:pPr>
-        <w:pStyle w:val="Heading2"/>
-        <w:numPr>
-          <w:ilvl w:val="1"/>
-          <w:numId w:val="1"/>
-        </w:numPr>
-        <w:rPr>
-          <w:color w:val="EE0000"/>
-        </w:rPr>
-      </w:pPr>
-      <w:bookmarkStart w:id="4" w:name="_Toc222073287"/>
-      <w:r>
-        <w:rPr>
-          <w:color w:val="EE0000"/>
-        </w:rPr>
-        <w:t>Updated Backlog (Design Stories)</w:t>
-      </w:r>
-      <w:bookmarkEnd w:id="4"/>
     </w:p>
     <w:p>
       <w:pPr>
         <w:pStyle w:val="Caption"/>
         <w:keepNext/>
         <w:jc w:val="center"/>
-        <w:rPr>
-          <w:color w:val="EE0000"/>
-        </w:rPr>
-      </w:pPr>
-      <w:r>
-        <w:rPr>
-          <w:color w:val="EE0000"/>
-        </w:rPr>
+      </w:pPr>
+      <w:r>
         <w:t xml:space="preserve">Table </w:t>
       </w:r>
       <w:r>
-        <w:rPr>
-          <w:color w:val="EE0000"/>
-        </w:rPr>
         <w:fldChar w:fldCharType="begin"/>
       </w:r>
       <w:r>
-        <w:rPr>
-          <w:color w:val="EE0000"/>
-        </w:rPr>
         <w:instrText xml:space="preserve"> STYLEREF 1 \s </w:instrText>
       </w:r>
       <w:r>
-        <w:rPr>
-          <w:color w:val="EE0000"/>
-        </w:rPr>
         <w:fldChar w:fldCharType="separate"/>
       </w:r>
       <w:r>
         <w:rPr>
           <w:noProof/>
-          <w:color w:val="EE0000"/>
           <w:cs/>
         </w:rPr>
         <w:t>‎</w:t>
@@ -2790,60 +2512,47 @@
       <w:r>
         <w:rPr>
           <w:noProof/>
-          <w:color w:val="EE0000"/>
         </w:rPr>
         <w:t>6</w:t>
       </w:r>
       <w:r>
         <w:rPr>
           <w:noProof/>
-          <w:color w:val="EE0000"/>
         </w:rPr>
         <w:fldChar w:fldCharType="end"/>
       </w:r>
       <w:r>
-        <w:rPr>
-          <w:color w:val="EE0000"/>
-        </w:rPr>
         <w:noBreakHyphen/>
       </w:r>
       <w:r>
-        <w:rPr>
-          <w:color w:val="EE0000"/>
-        </w:rPr>
         <w:fldChar w:fldCharType="begin"/>
       </w:r>
       <w:r>
-        <w:rPr>
-          <w:color w:val="EE0000"/>
-        </w:rPr>
         <w:instrText xml:space="preserve"> SEQ Table \* ARABIC \s 1 </w:instrText>
       </w:r>
       <w:r>
-        <w:rPr>
-          <w:color w:val="EE0000"/>
-        </w:rPr>
         <w:fldChar w:fldCharType="separate"/>
       </w:r>
       <w:r>
         <w:rPr>
           <w:noProof/>
-          <w:color w:val="EE0000"/>
         </w:rPr>
         <w:t>1</w:t>
       </w:r>
       <w:r>
         <w:rPr>
           <w:noProof/>
-          <w:color w:val="EE0000"/>
         </w:rPr>
         <w:fldChar w:fldCharType="end"/>
       </w:r>
       <w:r>
-        <w:rPr>
-          <w:color w:val="EE0000"/>
-        </w:rPr>
-        <w:t>: Updated Backlog (Design Stories)</w:t>
+        <w:t xml:space="preserve">: Updated Backlog </w:t>
+      </w:r>
+      <w:r>
+        <w:t xml:space="preserve">- </w:t>
+      </w:r>
+      <w:r>
+        <w:t>Completed Items</w:t>
       </w:r>
     </w:p>
     <w:tbl>
@@ -2876,14 +2585,12 @@
               <w:ind w:firstLine="0"/>
               <w:jc w:val="center"/>
               <w:rPr>
-                <w:color w:val="EE0000"/>
                 <w:sz w:val="20"/>
                 <w:szCs w:val="20"/>
               </w:rPr>
             </w:pPr>
             <w:r>
               <w:rPr>
-                <w:color w:val="EE0000"/>
                 <w:sz w:val="20"/>
                 <w:szCs w:val="20"/>
               </w:rPr>
@@ -2902,14 +2609,12 @@
               <w:jc w:val="center"/>
               <w:cnfStyle w:val="100000000000" w:firstRow="1" w:lastRow="0" w:firstColumn="0" w:lastColumn="0" w:oddVBand="0" w:evenVBand="0" w:oddHBand="0" w:evenHBand="0" w:firstRowFirstColumn="0" w:firstRowLastColumn="0" w:lastRowFirstColumn="0" w:lastRowLastColumn="0"/>
               <w:rPr>
-                <w:color w:val="EE0000"/>
                 <w:sz w:val="20"/>
                 <w:szCs w:val="20"/>
               </w:rPr>
             </w:pPr>
             <w:r>
               <w:rPr>
-                <w:color w:val="EE0000"/>
                 <w:sz w:val="20"/>
                 <w:szCs w:val="20"/>
               </w:rPr>
@@ -2928,14 +2633,12 @@
               <w:jc w:val="center"/>
               <w:cnfStyle w:val="100000000000" w:firstRow="1" w:lastRow="0" w:firstColumn="0" w:lastColumn="0" w:oddVBand="0" w:evenVBand="0" w:oddHBand="0" w:evenHBand="0" w:firstRowFirstColumn="0" w:firstRowLastColumn="0" w:lastRowFirstColumn="0" w:lastRowLastColumn="0"/>
               <w:rPr>
-                <w:color w:val="EE0000"/>
                 <w:sz w:val="20"/>
                 <w:szCs w:val="20"/>
               </w:rPr>
             </w:pPr>
             <w:r>
               <w:rPr>
-                <w:color w:val="EE0000"/>
                 <w:sz w:val="20"/>
                 <w:szCs w:val="20"/>
               </w:rPr>
@@ -2954,14 +2657,12 @@
               <w:jc w:val="center"/>
               <w:cnfStyle w:val="100000000000" w:firstRow="1" w:lastRow="0" w:firstColumn="0" w:lastColumn="0" w:oddVBand="0" w:evenVBand="0" w:oddHBand="0" w:evenHBand="0" w:firstRowFirstColumn="0" w:firstRowLastColumn="0" w:lastRowFirstColumn="0" w:lastRowLastColumn="0"/>
               <w:rPr>
-                <w:color w:val="EE0000"/>
                 <w:sz w:val="20"/>
                 <w:szCs w:val="20"/>
               </w:rPr>
             </w:pPr>
             <w:r>
               <w:rPr>
-                <w:color w:val="EE0000"/>
                 <w:sz w:val="20"/>
                 <w:szCs w:val="20"/>
               </w:rPr>
@@ -2980,14 +2681,12 @@
               <w:jc w:val="center"/>
               <w:cnfStyle w:val="100000000000" w:firstRow="1" w:lastRow="0" w:firstColumn="0" w:lastColumn="0" w:oddVBand="0" w:evenVBand="0" w:oddHBand="0" w:evenHBand="0" w:firstRowFirstColumn="0" w:firstRowLastColumn="0" w:lastRowFirstColumn="0" w:lastRowLastColumn="0"/>
               <w:rPr>
-                <w:color w:val="EE0000"/>
                 <w:sz w:val="20"/>
                 <w:szCs w:val="20"/>
               </w:rPr>
             </w:pPr>
             <w:r>
               <w:rPr>
-                <w:color w:val="EE0000"/>
                 <w:sz w:val="20"/>
                 <w:szCs w:val="20"/>
               </w:rPr>
@@ -3006,14 +2705,12 @@
               <w:jc w:val="center"/>
               <w:cnfStyle w:val="100000000000" w:firstRow="1" w:lastRow="0" w:firstColumn="0" w:lastColumn="0" w:oddVBand="0" w:evenVBand="0" w:oddHBand="0" w:evenHBand="0" w:firstRowFirstColumn="0" w:firstRowLastColumn="0" w:lastRowFirstColumn="0" w:lastRowLastColumn="0"/>
               <w:rPr>
-                <w:color w:val="EE0000"/>
                 <w:sz w:val="20"/>
                 <w:szCs w:val="20"/>
               </w:rPr>
             </w:pPr>
             <w:r>
               <w:rPr>
-                <w:color w:val="EE0000"/>
                 <w:sz w:val="20"/>
                 <w:szCs w:val="20"/>
               </w:rPr>
@@ -3032,14 +2729,12 @@
               <w:jc w:val="center"/>
               <w:cnfStyle w:val="100000000000" w:firstRow="1" w:lastRow="0" w:firstColumn="0" w:lastColumn="0" w:oddVBand="0" w:evenVBand="0" w:oddHBand="0" w:evenHBand="0" w:firstRowFirstColumn="0" w:firstRowLastColumn="0" w:lastRowFirstColumn="0" w:lastRowLastColumn="0"/>
               <w:rPr>
-                <w:color w:val="EE0000"/>
                 <w:sz w:val="20"/>
                 <w:szCs w:val="20"/>
               </w:rPr>
             </w:pPr>
             <w:r>
               <w:rPr>
-                <w:color w:val="EE0000"/>
                 <w:sz w:val="20"/>
                 <w:szCs w:val="20"/>
               </w:rPr>
@@ -3058,18 +2753,16 @@
             <w:pPr>
               <w:ind w:firstLine="0"/>
               <w:rPr>
-                <w:color w:val="EE0000"/>
                 <w:sz w:val="20"/>
                 <w:szCs w:val="20"/>
               </w:rPr>
             </w:pPr>
             <w:r>
               <w:rPr>
-                <w:color w:val="EE0000"/>
-                <w:sz w:val="20"/>
-                <w:szCs w:val="20"/>
-              </w:rPr>
-              <w:t>DS-01</w:t>
+                <w:sz w:val="20"/>
+                <w:szCs w:val="20"/>
+              </w:rPr>
+              <w:t>DS-11</w:t>
             </w:r>
           </w:p>
         </w:tc>
@@ -3082,18 +2775,16 @@
               <w:ind w:firstLine="0"/>
               <w:cnfStyle w:val="000000000000" w:firstRow="0" w:lastRow="0" w:firstColumn="0" w:lastColumn="0" w:oddVBand="0" w:evenVBand="0" w:oddHBand="0" w:evenHBand="0" w:firstRowFirstColumn="0" w:firstRowLastColumn="0" w:lastRowFirstColumn="0" w:lastRowLastColumn="0"/>
               <w:rPr>
-                <w:color w:val="EE0000"/>
                 <w:sz w:val="20"/>
                 <w:szCs w:val="20"/>
               </w:rPr>
             </w:pPr>
             <w:r>
               <w:rPr>
-                <w:color w:val="EE0000"/>
-                <w:sz w:val="20"/>
-                <w:szCs w:val="20"/>
-              </w:rPr>
-              <w:t>As a developer, I have a layered architecture design (UI, Services, Domain, Persistence) so that responsibilities are separated and the system is easier to maintain and test.</w:t>
+                <w:sz w:val="20"/>
+                <w:szCs w:val="20"/>
+              </w:rPr>
+              <w:t>As a developer, I have implemented a persistence layer (Storage interface + JSON save/load + integration) so that application data is saved and restored across sessions.</w:t>
             </w:r>
           </w:p>
         </w:tc>
@@ -3106,18 +2797,16 @@
               <w:ind w:firstLine="0"/>
               <w:cnfStyle w:val="000000000000" w:firstRow="0" w:lastRow="0" w:firstColumn="0" w:lastColumn="0" w:oddVBand="0" w:evenVBand="0" w:oddHBand="0" w:evenHBand="0" w:firstRowFirstColumn="0" w:firstRowLastColumn="0" w:lastRowFirstColumn="0" w:lastRowLastColumn="0"/>
               <w:rPr>
-                <w:color w:val="EE0000"/>
                 <w:sz w:val="20"/>
                 <w:szCs w:val="20"/>
               </w:rPr>
             </w:pPr>
             <w:r>
               <w:rPr>
-                <w:color w:val="EE0000"/>
-                <w:sz w:val="20"/>
-                <w:szCs w:val="20"/>
-              </w:rPr>
-              <w:t>All</w:t>
+                <w:sz w:val="20"/>
+                <w:szCs w:val="20"/>
+              </w:rPr>
+              <w:t>US-8</w:t>
             </w:r>
           </w:p>
         </w:tc>
@@ -3130,14 +2819,12 @@
               <w:ind w:firstLine="0"/>
               <w:cnfStyle w:val="000000000000" w:firstRow="0" w:lastRow="0" w:firstColumn="0" w:lastColumn="0" w:oddVBand="0" w:evenVBand="0" w:oddHBand="0" w:evenHBand="0" w:firstRowFirstColumn="0" w:firstRowLastColumn="0" w:lastRowFirstColumn="0" w:lastRowLastColumn="0"/>
               <w:rPr>
-                <w:color w:val="EE0000"/>
                 <w:sz w:val="20"/>
                 <w:szCs w:val="20"/>
               </w:rPr>
             </w:pPr>
             <w:r>
               <w:rPr>
-                <w:color w:val="EE0000"/>
                 <w:sz w:val="20"/>
                 <w:szCs w:val="20"/>
               </w:rPr>
@@ -3154,18 +2841,16 @@
               <w:ind w:firstLine="0"/>
               <w:cnfStyle w:val="000000000000" w:firstRow="0" w:lastRow="0" w:firstColumn="0" w:lastColumn="0" w:oddVBand="0" w:evenVBand="0" w:oddHBand="0" w:evenHBand="0" w:firstRowFirstColumn="0" w:firstRowLastColumn="0" w:lastRowFirstColumn="0" w:lastRowLastColumn="0"/>
               <w:rPr>
-                <w:color w:val="EE0000"/>
                 <w:sz w:val="20"/>
                 <w:szCs w:val="20"/>
               </w:rPr>
             </w:pPr>
             <w:r>
               <w:rPr>
-                <w:color w:val="EE0000"/>
-                <w:sz w:val="20"/>
-                <w:szCs w:val="20"/>
-              </w:rPr>
-              <w:t>None</w:t>
+                <w:sz w:val="20"/>
+                <w:szCs w:val="20"/>
+              </w:rPr>
+              <w:t>DS-01</w:t>
             </w:r>
           </w:p>
         </w:tc>
@@ -3178,18 +2863,23 @@
               <w:ind w:firstLine="0"/>
               <w:cnfStyle w:val="000000000000" w:firstRow="0" w:lastRow="0" w:firstColumn="0" w:lastColumn="0" w:oddVBand="0" w:evenVBand="0" w:oddHBand="0" w:evenHBand="0" w:firstRowFirstColumn="0" w:firstRowLastColumn="0" w:lastRowFirstColumn="0" w:lastRowLastColumn="0"/>
               <w:rPr>
-                <w:color w:val="EE0000"/>
                 <w:sz w:val="20"/>
                 <w:szCs w:val="20"/>
               </w:rPr>
             </w:pPr>
             <w:r>
               <w:rPr>
-                <w:color w:val="EE0000"/>
-                <w:sz w:val="20"/>
-                <w:szCs w:val="20"/>
-              </w:rPr>
-              <w:t>Done</w:t>
+                <w:sz w:val="20"/>
+                <w:szCs w:val="20"/>
+              </w:rPr>
+              <w:t>Do</w:t>
+            </w:r>
+            <w:r>
+              <w:rPr>
+                <w:sz w:val="20"/>
+                <w:szCs w:val="20"/>
+              </w:rPr>
+              <w:t>ne</w:t>
             </w:r>
           </w:p>
         </w:tc>
@@ -3202,18 +2892,16 @@
               <w:ind w:firstLine="0"/>
               <w:cnfStyle w:val="000000000000" w:firstRow="0" w:lastRow="0" w:firstColumn="0" w:lastColumn="0" w:oddVBand="0" w:evenVBand="0" w:oddHBand="0" w:evenHBand="0" w:firstRowFirstColumn="0" w:firstRowLastColumn="0" w:lastRowFirstColumn="0" w:lastRowLastColumn="0"/>
               <w:rPr>
-                <w:color w:val="EE0000"/>
                 <w:sz w:val="20"/>
                 <w:szCs w:val="20"/>
               </w:rPr>
             </w:pPr>
             <w:r>
               <w:rPr>
-                <w:color w:val="EE0000"/>
-                <w:sz w:val="20"/>
-                <w:szCs w:val="20"/>
-              </w:rPr>
-              <w:t>Iteration 3.1</w:t>
+                <w:sz w:val="20"/>
+                <w:szCs w:val="20"/>
+              </w:rPr>
+              <w:t>Iteration 3.2</w:t>
             </w:r>
           </w:p>
         </w:tc>
@@ -3228,18 +2916,16 @@
             <w:pPr>
               <w:ind w:firstLine="0"/>
               <w:rPr>
-                <w:color w:val="EE0000"/>
                 <w:sz w:val="20"/>
                 <w:szCs w:val="20"/>
               </w:rPr>
             </w:pPr>
             <w:r>
               <w:rPr>
-                <w:color w:val="EE0000"/>
-                <w:sz w:val="20"/>
-                <w:szCs w:val="20"/>
-              </w:rPr>
-              <w:t>DS-02</w:t>
+                <w:sz w:val="20"/>
+                <w:szCs w:val="20"/>
+              </w:rPr>
+              <w:t>DS-12</w:t>
             </w:r>
           </w:p>
         </w:tc>
@@ -3252,18 +2938,16 @@
               <w:ind w:firstLine="0"/>
               <w:cnfStyle w:val="000000000000" w:firstRow="0" w:lastRow="0" w:firstColumn="0" w:lastColumn="0" w:oddVBand="0" w:evenVBand="0" w:oddHBand="0" w:evenHBand="0" w:firstRowFirstColumn="0" w:firstRowLastColumn="0" w:lastRowFirstColumn="0" w:lastRowLastColumn="0"/>
               <w:rPr>
-                <w:color w:val="EE0000"/>
                 <w:sz w:val="20"/>
                 <w:szCs w:val="20"/>
               </w:rPr>
             </w:pPr>
             <w:r>
               <w:rPr>
-                <w:color w:val="EE0000"/>
-                <w:sz w:val="20"/>
-                <w:szCs w:val="20"/>
-              </w:rPr>
-              <w:t>As a developer, I have implemented the Transactions module (add/edit/delete transaction workflows) so that users can manage their transactions correctly through the service and domain layers.</w:t>
+                <w:sz w:val="20"/>
+                <w:szCs w:val="20"/>
+              </w:rPr>
+              <w:t>As a developer, I have implemented loading saved data on startup so that users automatically see their saved transactions and budgets when launching the application.</w:t>
             </w:r>
           </w:p>
         </w:tc>
@@ -3276,18 +2960,16 @@
               <w:ind w:firstLine="0"/>
               <w:cnfStyle w:val="000000000000" w:firstRow="0" w:lastRow="0" w:firstColumn="0" w:lastColumn="0" w:oddVBand="0" w:evenVBand="0" w:oddHBand="0" w:evenHBand="0" w:firstRowFirstColumn="0" w:firstRowLastColumn="0" w:lastRowFirstColumn="0" w:lastRowLastColumn="0"/>
               <w:rPr>
-                <w:color w:val="EE0000"/>
                 <w:sz w:val="20"/>
                 <w:szCs w:val="20"/>
               </w:rPr>
             </w:pPr>
             <w:r>
               <w:rPr>
-                <w:color w:val="EE0000"/>
-                <w:sz w:val="20"/>
-                <w:szCs w:val="20"/>
-              </w:rPr>
-              <w:t>US-1, US-2</w:t>
+                <w:sz w:val="20"/>
+                <w:szCs w:val="20"/>
+              </w:rPr>
+              <w:t>US-8</w:t>
             </w:r>
           </w:p>
         </w:tc>
@@ -3300,14 +2982,12 @@
               <w:ind w:firstLine="0"/>
               <w:cnfStyle w:val="000000000000" w:firstRow="0" w:lastRow="0" w:firstColumn="0" w:lastColumn="0" w:oddVBand="0" w:evenVBand="0" w:oddHBand="0" w:evenHBand="0" w:firstRowFirstColumn="0" w:firstRowLastColumn="0" w:lastRowFirstColumn="0" w:lastRowLastColumn="0"/>
               <w:rPr>
-                <w:color w:val="EE0000"/>
                 <w:sz w:val="20"/>
                 <w:szCs w:val="20"/>
               </w:rPr>
             </w:pPr>
             <w:r>
               <w:rPr>
-                <w:color w:val="EE0000"/>
                 <w:sz w:val="20"/>
                 <w:szCs w:val="20"/>
               </w:rPr>
@@ -3324,18 +3004,16 @@
               <w:ind w:firstLine="0"/>
               <w:cnfStyle w:val="000000000000" w:firstRow="0" w:lastRow="0" w:firstColumn="0" w:lastColumn="0" w:oddVBand="0" w:evenVBand="0" w:oddHBand="0" w:evenHBand="0" w:firstRowFirstColumn="0" w:firstRowLastColumn="0" w:lastRowFirstColumn="0" w:lastRowLastColumn="0"/>
               <w:rPr>
-                <w:color w:val="EE0000"/>
                 <w:sz w:val="20"/>
                 <w:szCs w:val="20"/>
               </w:rPr>
             </w:pPr>
             <w:r>
               <w:rPr>
-                <w:color w:val="EE0000"/>
-                <w:sz w:val="20"/>
-                <w:szCs w:val="20"/>
-              </w:rPr>
-              <w:t>DS-01</w:t>
+                <w:sz w:val="20"/>
+                <w:szCs w:val="20"/>
+              </w:rPr>
+              <w:t>DS-11</w:t>
             </w:r>
           </w:p>
         </w:tc>
@@ -3348,14 +3026,12 @@
               <w:ind w:firstLine="0"/>
               <w:cnfStyle w:val="000000000000" w:firstRow="0" w:lastRow="0" w:firstColumn="0" w:lastColumn="0" w:oddVBand="0" w:evenVBand="0" w:oddHBand="0" w:evenHBand="0" w:firstRowFirstColumn="0" w:firstRowLastColumn="0" w:lastRowFirstColumn="0" w:lastRowLastColumn="0"/>
               <w:rPr>
-                <w:color w:val="EE0000"/>
                 <w:sz w:val="20"/>
                 <w:szCs w:val="20"/>
               </w:rPr>
             </w:pPr>
             <w:r>
               <w:rPr>
-                <w:color w:val="EE0000"/>
                 <w:sz w:val="20"/>
                 <w:szCs w:val="20"/>
               </w:rPr>
@@ -3372,18 +3048,16 @@
               <w:ind w:firstLine="0"/>
               <w:cnfStyle w:val="000000000000" w:firstRow="0" w:lastRow="0" w:firstColumn="0" w:lastColumn="0" w:oddVBand="0" w:evenVBand="0" w:oddHBand="0" w:evenHBand="0" w:firstRowFirstColumn="0" w:firstRowLastColumn="0" w:lastRowFirstColumn="0" w:lastRowLastColumn="0"/>
               <w:rPr>
-                <w:color w:val="EE0000"/>
                 <w:sz w:val="20"/>
                 <w:szCs w:val="20"/>
               </w:rPr>
             </w:pPr>
             <w:r>
               <w:rPr>
-                <w:color w:val="EE0000"/>
-                <w:sz w:val="20"/>
-                <w:szCs w:val="20"/>
-              </w:rPr>
-              <w:t>Iteration 3.1</w:t>
+                <w:sz w:val="20"/>
+                <w:szCs w:val="20"/>
+              </w:rPr>
+              <w:t>Iteration 3.2</w:t>
             </w:r>
           </w:p>
         </w:tc>
@@ -3398,18 +3072,16 @@
             <w:pPr>
               <w:ind w:firstLine="0"/>
               <w:rPr>
-                <w:color w:val="EE0000"/>
                 <w:sz w:val="20"/>
                 <w:szCs w:val="20"/>
               </w:rPr>
             </w:pPr>
             <w:r>
               <w:rPr>
-                <w:color w:val="EE0000"/>
-                <w:sz w:val="20"/>
-                <w:szCs w:val="20"/>
-              </w:rPr>
-              <w:t>DS-03</w:t>
+                <w:sz w:val="20"/>
+                <w:szCs w:val="20"/>
+              </w:rPr>
+              <w:t>DS-13</w:t>
             </w:r>
           </w:p>
         </w:tc>
@@ -3422,18 +3094,32 @@
               <w:ind w:firstLine="0"/>
               <w:cnfStyle w:val="000000000000" w:firstRow="0" w:lastRow="0" w:firstColumn="0" w:lastColumn="0" w:oddVBand="0" w:evenVBand="0" w:oddHBand="0" w:evenHBand="0" w:firstRowFirstColumn="0" w:firstRowLastColumn="0" w:lastRowFirstColumn="0" w:lastRowLastColumn="0"/>
               <w:rPr>
-                <w:color w:val="EE0000"/>
                 <w:sz w:val="20"/>
                 <w:szCs w:val="20"/>
               </w:rPr>
             </w:pPr>
             <w:r>
               <w:rPr>
-                <w:color w:val="EE0000"/>
-                <w:sz w:val="20"/>
-                <w:szCs w:val="20"/>
-              </w:rPr>
-              <w:t>As a developer, I have implemented transaction viewing and filtering so that users can search and review their transactions based on criteria such as category, type, and date range.</w:t>
+                <w:sz w:val="20"/>
+                <w:szCs w:val="20"/>
+              </w:rPr>
+              <w:t xml:space="preserve">As a developer, I have written unit tests for persistence (save/load correctness + restart regression tests) so that persistence </w:t>
+            </w:r>
+            <w:proofErr w:type="spellStart"/>
+            <w:r>
+              <w:rPr>
+                <w:sz w:val="20"/>
+                <w:szCs w:val="20"/>
+              </w:rPr>
+              <w:t>behavior</w:t>
+            </w:r>
+            <w:proofErr w:type="spellEnd"/>
+            <w:r>
+              <w:rPr>
+                <w:sz w:val="20"/>
+                <w:szCs w:val="20"/>
+              </w:rPr>
+              <w:t xml:space="preserve"> is reliable and does not break existing features.</w:t>
             </w:r>
           </w:p>
         </w:tc>
@@ -3446,18 +3132,16 @@
               <w:ind w:firstLine="0"/>
               <w:cnfStyle w:val="000000000000" w:firstRow="0" w:lastRow="0" w:firstColumn="0" w:lastColumn="0" w:oddVBand="0" w:evenVBand="0" w:oddHBand="0" w:evenHBand="0" w:firstRowFirstColumn="0" w:firstRowLastColumn="0" w:lastRowFirstColumn="0" w:lastRowLastColumn="0"/>
               <w:rPr>
-                <w:color w:val="EE0000"/>
                 <w:sz w:val="20"/>
                 <w:szCs w:val="20"/>
               </w:rPr>
             </w:pPr>
             <w:r>
               <w:rPr>
-                <w:color w:val="EE0000"/>
-                <w:sz w:val="20"/>
-                <w:szCs w:val="20"/>
-              </w:rPr>
-              <w:t>US-3</w:t>
+                <w:sz w:val="20"/>
+                <w:szCs w:val="20"/>
+              </w:rPr>
+              <w:t>US-8</w:t>
             </w:r>
           </w:p>
         </w:tc>
@@ -3470,14 +3154,12 @@
               <w:ind w:firstLine="0"/>
               <w:cnfStyle w:val="000000000000" w:firstRow="0" w:lastRow="0" w:firstColumn="0" w:lastColumn="0" w:oddVBand="0" w:evenVBand="0" w:oddHBand="0" w:evenHBand="0" w:firstRowFirstColumn="0" w:firstRowLastColumn="0" w:lastRowFirstColumn="0" w:lastRowLastColumn="0"/>
               <w:rPr>
-                <w:color w:val="EE0000"/>
                 <w:sz w:val="20"/>
                 <w:szCs w:val="20"/>
               </w:rPr>
             </w:pPr>
             <w:r>
               <w:rPr>
-                <w:color w:val="EE0000"/>
                 <w:sz w:val="20"/>
                 <w:szCs w:val="20"/>
               </w:rPr>
@@ -3494,18 +3176,16 @@
               <w:ind w:firstLine="0"/>
               <w:cnfStyle w:val="000000000000" w:firstRow="0" w:lastRow="0" w:firstColumn="0" w:lastColumn="0" w:oddVBand="0" w:evenVBand="0" w:oddHBand="0" w:evenHBand="0" w:firstRowFirstColumn="0" w:firstRowLastColumn="0" w:lastRowFirstColumn="0" w:lastRowLastColumn="0"/>
               <w:rPr>
-                <w:color w:val="EE0000"/>
                 <w:sz w:val="20"/>
                 <w:szCs w:val="20"/>
               </w:rPr>
             </w:pPr>
             <w:r>
               <w:rPr>
-                <w:color w:val="EE0000"/>
-                <w:sz w:val="20"/>
-                <w:szCs w:val="20"/>
-              </w:rPr>
-              <w:t>DS-02</w:t>
+                <w:sz w:val="20"/>
+                <w:szCs w:val="20"/>
+              </w:rPr>
+              <w:t>DS-11, DS-12</w:t>
             </w:r>
           </w:p>
         </w:tc>
@@ -3518,14 +3198,12 @@
               <w:ind w:firstLine="0"/>
               <w:cnfStyle w:val="000000000000" w:firstRow="0" w:lastRow="0" w:firstColumn="0" w:lastColumn="0" w:oddVBand="0" w:evenVBand="0" w:oddHBand="0" w:evenHBand="0" w:firstRowFirstColumn="0" w:firstRowLastColumn="0" w:lastRowFirstColumn="0" w:lastRowLastColumn="0"/>
               <w:rPr>
-                <w:color w:val="EE0000"/>
                 <w:sz w:val="20"/>
                 <w:szCs w:val="20"/>
               </w:rPr>
             </w:pPr>
             <w:r>
               <w:rPr>
-                <w:color w:val="EE0000"/>
                 <w:sz w:val="20"/>
                 <w:szCs w:val="20"/>
               </w:rPr>
@@ -3542,18 +3220,317 @@
               <w:ind w:firstLine="0"/>
               <w:cnfStyle w:val="000000000000" w:firstRow="0" w:lastRow="0" w:firstColumn="0" w:lastColumn="0" w:oddVBand="0" w:evenVBand="0" w:oddHBand="0" w:evenHBand="0" w:firstRowFirstColumn="0" w:firstRowLastColumn="0" w:lastRowFirstColumn="0" w:lastRowLastColumn="0"/>
               <w:rPr>
-                <w:color w:val="EE0000"/>
                 <w:sz w:val="20"/>
                 <w:szCs w:val="20"/>
               </w:rPr>
             </w:pPr>
             <w:r>
               <w:rPr>
-                <w:color w:val="EE0000"/>
-                <w:sz w:val="20"/>
-                <w:szCs w:val="20"/>
-              </w:rPr>
-              <w:t>Iteration 3.1</w:t>
+                <w:sz w:val="20"/>
+                <w:szCs w:val="20"/>
+              </w:rPr>
+              <w:t>Iteration 3.2</w:t>
+            </w:r>
+          </w:p>
+        </w:tc>
+      </w:tr>
+    </w:tbl>
+    <w:p>
+      <w:pPr>
+        <w:ind w:firstLine="0"/>
+        <w:rPr>
+          <w:color w:val="EE0000"/>
+        </w:rPr>
+      </w:pPr>
+    </w:p>
+    <w:p>
+      <w:pPr>
+        <w:ind w:firstLine="0"/>
+      </w:pPr>
+      <w:r>
+        <w:t xml:space="preserve">These completed items significantly improve the reliability of the </w:t>
+      </w:r>
+      <w:proofErr w:type="spellStart"/>
+      <w:r>
+        <w:t>SmartBudget</w:t>
+      </w:r>
+      <w:proofErr w:type="spellEnd"/>
+      <w:r>
+        <w:t xml:space="preserve"> system by ensuring that user data is not lost when the application closes. The persistence layer now integrates with the service layer and domain objects, allowing transactions and budgets to be stored and restored correctly.</w:t>
+      </w:r>
+    </w:p>
+    <w:p>
+      <w:pPr>
+        <w:pStyle w:val="Heading2"/>
+        <w:numPr>
+          <w:ilvl w:val="1"/>
+          <w:numId w:val="1"/>
+        </w:numPr>
+      </w:pPr>
+      <w:r>
+        <w:t>Remaining Backlog Items (Next Iteration)</w:t>
+      </w:r>
+    </w:p>
+    <w:p>
+      <w:r>
+        <w:t>The remaining backlog items will be addressed in the next development cycle. These tasks focus mainly on improving testing coverage and refining specific parts of the system.</w:t>
+      </w:r>
+    </w:p>
+    <w:p>
+      <w:pPr>
+        <w:pStyle w:val="Caption"/>
+        <w:keepNext/>
+        <w:jc w:val="center"/>
+      </w:pPr>
+      <w:r>
+        <w:t xml:space="preserve">Table </w:t>
+      </w:r>
+      <w:r>
+        <w:fldChar w:fldCharType="begin"/>
+      </w:r>
+      <w:r>
+        <w:instrText xml:space="preserve"> STYLEREF 1 \s </w:instrText>
+      </w:r>
+      <w:r>
+        <w:fldChar w:fldCharType="separate"/>
+      </w:r>
+      <w:r>
+        <w:rPr>
+          <w:noProof/>
+          <w:cs/>
+        </w:rPr>
+        <w:t>‎</w:t>
+      </w:r>
+      <w:r>
+        <w:rPr>
+          <w:noProof/>
+        </w:rPr>
+        <w:t>6</w:t>
+      </w:r>
+      <w:r>
+        <w:rPr>
+          <w:noProof/>
+        </w:rPr>
+        <w:fldChar w:fldCharType="end"/>
+      </w:r>
+      <w:r>
+        <w:noBreakHyphen/>
+      </w:r>
+      <w:r>
+        <w:fldChar w:fldCharType="begin"/>
+      </w:r>
+      <w:r>
+        <w:instrText xml:space="preserve"> SEQ Table \* ARABIC \s 1 </w:instrText>
+      </w:r>
+      <w:r>
+        <w:fldChar w:fldCharType="separate"/>
+      </w:r>
+      <w:r>
+        <w:rPr>
+          <w:noProof/>
+        </w:rPr>
+        <w:t>1</w:t>
+      </w:r>
+      <w:r>
+        <w:rPr>
+          <w:noProof/>
+        </w:rPr>
+        <w:fldChar w:fldCharType="end"/>
+      </w:r>
+      <w:r>
+        <w:t>: Updated Backlog</w:t>
+      </w:r>
+      <w:r>
+        <w:t xml:space="preserve"> - </w:t>
+      </w:r>
+      <w:r>
+        <w:t>Items To Do Next Report</w:t>
+      </w:r>
+    </w:p>
+    <w:tbl>
+      <w:tblPr>
+        <w:tblStyle w:val="GridTable1Light"/>
+        <w:tblW w:w="0" w:type="auto"/>
+        <w:tblLook w:val="04A0" w:firstRow="1" w:lastRow="0" w:firstColumn="1" w:lastColumn="0" w:noHBand="0" w:noVBand="1"/>
+      </w:tblPr>
+      <w:tblGrid>
+        <w:gridCol w:w="539"/>
+        <w:gridCol w:w="3634"/>
+        <w:gridCol w:w="872"/>
+        <w:gridCol w:w="958"/>
+        <w:gridCol w:w="1261"/>
+        <w:gridCol w:w="861"/>
+        <w:gridCol w:w="894"/>
+      </w:tblGrid>
+      <w:tr>
+        <w:trPr>
+          <w:cnfStyle w:val="100000000000" w:firstRow="1" w:lastRow="0" w:firstColumn="0" w:lastColumn="0" w:oddVBand="0" w:evenVBand="0" w:oddHBand="0" w:evenHBand="0" w:firstRowFirstColumn="0" w:firstRowLastColumn="0" w:lastRowFirstColumn="0" w:lastRowLastColumn="0"/>
+        </w:trPr>
+        <w:tc>
+          <w:tcPr>
+            <w:cnfStyle w:val="001000000000" w:firstRow="0" w:lastRow="0" w:firstColumn="1" w:lastColumn="0" w:oddVBand="0" w:evenVBand="0" w:oddHBand="0" w:evenHBand="0" w:firstRowFirstColumn="0" w:firstRowLastColumn="0" w:lastRowFirstColumn="0" w:lastRowLastColumn="0"/>
+            <w:tcW w:w="539" w:type="dxa"/>
+            <w:vAlign w:val="center"/>
+          </w:tcPr>
+          <w:p>
+            <w:pPr>
+              <w:ind w:firstLine="0"/>
+              <w:jc w:val="center"/>
+              <w:rPr>
+                <w:sz w:val="20"/>
+                <w:szCs w:val="20"/>
+              </w:rPr>
+            </w:pPr>
+            <w:r>
+              <w:rPr>
+                <w:sz w:val="20"/>
+                <w:szCs w:val="20"/>
+              </w:rPr>
+              <w:t>ID</w:t>
+            </w:r>
+          </w:p>
+        </w:tc>
+        <w:tc>
+          <w:tcPr>
+            <w:tcW w:w="3634" w:type="dxa"/>
+            <w:vAlign w:val="center"/>
+          </w:tcPr>
+          <w:p>
+            <w:pPr>
+              <w:ind w:firstLine="0"/>
+              <w:jc w:val="center"/>
+              <w:cnfStyle w:val="100000000000" w:firstRow="1" w:lastRow="0" w:firstColumn="0" w:lastColumn="0" w:oddVBand="0" w:evenVBand="0" w:oddHBand="0" w:evenHBand="0" w:firstRowFirstColumn="0" w:firstRowLastColumn="0" w:lastRowFirstColumn="0" w:lastRowLastColumn="0"/>
+              <w:rPr>
+                <w:sz w:val="20"/>
+                <w:szCs w:val="20"/>
+              </w:rPr>
+            </w:pPr>
+            <w:r>
+              <w:rPr>
+                <w:sz w:val="20"/>
+                <w:szCs w:val="20"/>
+              </w:rPr>
+              <w:t>Design Story (Developer Story Format)</w:t>
+            </w:r>
+          </w:p>
+        </w:tc>
+        <w:tc>
+          <w:tcPr>
+            <w:tcW w:w="872" w:type="dxa"/>
+            <w:vAlign w:val="center"/>
+          </w:tcPr>
+          <w:p>
+            <w:pPr>
+              <w:ind w:firstLine="0"/>
+              <w:jc w:val="center"/>
+              <w:cnfStyle w:val="100000000000" w:firstRow="1" w:lastRow="0" w:firstColumn="0" w:lastColumn="0" w:oddVBand="0" w:evenVBand="0" w:oddHBand="0" w:evenHBand="0" w:firstRowFirstColumn="0" w:firstRowLastColumn="0" w:lastRowFirstColumn="0" w:lastRowLastColumn="0"/>
+              <w:rPr>
+                <w:sz w:val="20"/>
+                <w:szCs w:val="20"/>
+              </w:rPr>
+            </w:pPr>
+            <w:r>
+              <w:rPr>
+                <w:sz w:val="20"/>
+                <w:szCs w:val="20"/>
+              </w:rPr>
+              <w:t>Related User Story</w:t>
+            </w:r>
+          </w:p>
+        </w:tc>
+        <w:tc>
+          <w:tcPr>
+            <w:tcW w:w="958" w:type="dxa"/>
+            <w:vAlign w:val="center"/>
+          </w:tcPr>
+          <w:p>
+            <w:pPr>
+              <w:ind w:firstLine="0"/>
+              <w:jc w:val="center"/>
+              <w:cnfStyle w:val="100000000000" w:firstRow="1" w:lastRow="0" w:firstColumn="0" w:lastColumn="0" w:oddVBand="0" w:evenVBand="0" w:oddHBand="0" w:evenHBand="0" w:firstRowFirstColumn="0" w:firstRowLastColumn="0" w:lastRowFirstColumn="0" w:lastRowLastColumn="0"/>
+              <w:rPr>
+                <w:sz w:val="20"/>
+                <w:szCs w:val="20"/>
+              </w:rPr>
+            </w:pPr>
+            <w:r>
+              <w:rPr>
+                <w:sz w:val="20"/>
+                <w:szCs w:val="20"/>
+              </w:rPr>
+              <w:t>Priority</w:t>
+            </w:r>
+          </w:p>
+        </w:tc>
+        <w:tc>
+          <w:tcPr>
+            <w:tcW w:w="1261" w:type="dxa"/>
+            <w:vAlign w:val="center"/>
+          </w:tcPr>
+          <w:p>
+            <w:pPr>
+              <w:ind w:firstLine="0"/>
+              <w:jc w:val="center"/>
+              <w:cnfStyle w:val="100000000000" w:firstRow="1" w:lastRow="0" w:firstColumn="0" w:lastColumn="0" w:oddVBand="0" w:evenVBand="0" w:oddHBand="0" w:evenHBand="0" w:firstRowFirstColumn="0" w:firstRowLastColumn="0" w:lastRowFirstColumn="0" w:lastRowLastColumn="0"/>
+              <w:rPr>
+                <w:sz w:val="20"/>
+                <w:szCs w:val="20"/>
+              </w:rPr>
+            </w:pPr>
+            <w:r>
+              <w:rPr>
+                <w:sz w:val="20"/>
+                <w:szCs w:val="20"/>
+              </w:rPr>
+              <w:t>Dependency</w:t>
+            </w:r>
+          </w:p>
+        </w:tc>
+        <w:tc>
+          <w:tcPr>
+            <w:tcW w:w="861" w:type="dxa"/>
+            <w:vAlign w:val="center"/>
+          </w:tcPr>
+          <w:p>
+            <w:pPr>
+              <w:ind w:firstLine="0"/>
+              <w:jc w:val="center"/>
+              <w:cnfStyle w:val="100000000000" w:firstRow="1" w:lastRow="0" w:firstColumn="0" w:lastColumn="0" w:oddVBand="0" w:evenVBand="0" w:oddHBand="0" w:evenHBand="0" w:firstRowFirstColumn="0" w:firstRowLastColumn="0" w:lastRowFirstColumn="0" w:lastRowLastColumn="0"/>
+              <w:rPr>
+                <w:sz w:val="20"/>
+                <w:szCs w:val="20"/>
+              </w:rPr>
+            </w:pPr>
+            <w:r>
+              <w:rPr>
+                <w:sz w:val="20"/>
+                <w:szCs w:val="20"/>
+              </w:rPr>
+              <w:t>Status</w:t>
+            </w:r>
+          </w:p>
+        </w:tc>
+        <w:tc>
+          <w:tcPr>
+            <w:tcW w:w="894" w:type="dxa"/>
+            <w:vAlign w:val="center"/>
+          </w:tcPr>
+          <w:p>
+            <w:pPr>
+              <w:ind w:firstLine="0"/>
+              <w:jc w:val="center"/>
+              <w:cnfStyle w:val="100000000000" w:firstRow="1" w:lastRow="0" w:firstColumn="0" w:lastColumn="0" w:oddVBand="0" w:evenVBand="0" w:oddHBand="0" w:evenHBand="0" w:firstRowFirstColumn="0" w:firstRowLastColumn="0" w:lastRowFirstColumn="0" w:lastRowLastColumn="0"/>
+              <w:rPr>
+                <w:sz w:val="20"/>
+                <w:szCs w:val="20"/>
+              </w:rPr>
+            </w:pPr>
+            <w:r>
+              <w:rPr>
+                <w:sz w:val="20"/>
+                <w:szCs w:val="20"/>
+              </w:rPr>
+              <w:t>Target</w:t>
             </w:r>
           </w:p>
         </w:tc>
@@ -3568,18 +3545,16 @@
             <w:pPr>
               <w:ind w:firstLine="0"/>
               <w:rPr>
-                <w:color w:val="EE0000"/>
                 <w:sz w:val="20"/>
                 <w:szCs w:val="20"/>
               </w:rPr>
             </w:pPr>
             <w:r>
               <w:rPr>
-                <w:color w:val="EE0000"/>
-                <w:sz w:val="20"/>
-                <w:szCs w:val="20"/>
-              </w:rPr>
-              <w:t>DS-04</w:t>
+                <w:sz w:val="20"/>
+                <w:szCs w:val="20"/>
+              </w:rPr>
+              <w:t>DS-14</w:t>
             </w:r>
           </w:p>
         </w:tc>
@@ -3592,18 +3567,40 @@
               <w:ind w:firstLine="0"/>
               <w:cnfStyle w:val="000000000000" w:firstRow="0" w:lastRow="0" w:firstColumn="0" w:lastColumn="0" w:oddVBand="0" w:evenVBand="0" w:oddHBand="0" w:evenHBand="0" w:firstRowFirstColumn="0" w:firstRowLastColumn="0" w:lastRowFirstColumn="0" w:lastRowLastColumn="0"/>
               <w:rPr>
-                <w:color w:val="EE0000"/>
                 <w:sz w:val="20"/>
                 <w:szCs w:val="20"/>
               </w:rPr>
             </w:pPr>
             <w:r>
               <w:rPr>
-                <w:color w:val="EE0000"/>
-                <w:sz w:val="20"/>
-                <w:szCs w:val="20"/>
-              </w:rPr>
-              <w:t>As a developer, I have implemented the Budgets module (set/edit/delete monthly budgets) so that users can plan spending limits per category through the service and domain layers.</w:t>
+                <w:sz w:val="20"/>
+                <w:szCs w:val="20"/>
+              </w:rPr>
+              <w:t xml:space="preserve">As a developer, I have added unit tests for </w:t>
+            </w:r>
+            <w:proofErr w:type="spellStart"/>
+            <w:r>
+              <w:rPr>
+                <w:sz w:val="20"/>
+                <w:szCs w:val="20"/>
+              </w:rPr>
+              <w:t>AlertService</w:t>
+            </w:r>
+            <w:proofErr w:type="spellEnd"/>
+            <w:r>
+              <w:rPr>
+                <w:sz w:val="20"/>
+                <w:szCs w:val="20"/>
+              </w:rPr>
+              <w:t xml:space="preserve"> so that overspending alert </w:t>
+            </w:r>
+            <w:r>
+              <w:rPr>
+                <w:sz w:val="20"/>
+                <w:szCs w:val="20"/>
+              </w:rPr>
+              <w:lastRenderedPageBreak/>
+              <w:t>rules (including boundary cases) are verified and UC-6 is validated.</w:t>
             </w:r>
           </w:p>
         </w:tc>
@@ -3616,18 +3613,17 @@
               <w:ind w:firstLine="0"/>
               <w:cnfStyle w:val="000000000000" w:firstRow="0" w:lastRow="0" w:firstColumn="0" w:lastColumn="0" w:oddVBand="0" w:evenVBand="0" w:oddHBand="0" w:evenHBand="0" w:firstRowFirstColumn="0" w:firstRowLastColumn="0" w:lastRowFirstColumn="0" w:lastRowLastColumn="0"/>
               <w:rPr>
-                <w:color w:val="EE0000"/>
                 <w:sz w:val="20"/>
                 <w:szCs w:val="20"/>
               </w:rPr>
             </w:pPr>
             <w:r>
               <w:rPr>
-                <w:color w:val="EE0000"/>
-                <w:sz w:val="20"/>
-                <w:szCs w:val="20"/>
-              </w:rPr>
-              <w:t>US-4</w:t>
+                <w:sz w:val="20"/>
+                <w:szCs w:val="20"/>
+              </w:rPr>
+              <w:lastRenderedPageBreak/>
+              <w:t>US-5</w:t>
             </w:r>
           </w:p>
         </w:tc>
@@ -3640,18 +3636,16 @@
               <w:ind w:firstLine="0"/>
               <w:cnfStyle w:val="000000000000" w:firstRow="0" w:lastRow="0" w:firstColumn="0" w:lastColumn="0" w:oddVBand="0" w:evenVBand="0" w:oddHBand="0" w:evenHBand="0" w:firstRowFirstColumn="0" w:firstRowLastColumn="0" w:lastRowFirstColumn="0" w:lastRowLastColumn="0"/>
               <w:rPr>
-                <w:color w:val="EE0000"/>
                 <w:sz w:val="20"/>
                 <w:szCs w:val="20"/>
               </w:rPr>
             </w:pPr>
             <w:r>
               <w:rPr>
-                <w:color w:val="EE0000"/>
-                <w:sz w:val="20"/>
-                <w:szCs w:val="20"/>
-              </w:rPr>
-              <w:t>High</w:t>
+                <w:sz w:val="20"/>
+                <w:szCs w:val="20"/>
+              </w:rPr>
+              <w:t>Medium</w:t>
             </w:r>
           </w:p>
         </w:tc>
@@ -3664,18 +3658,16 @@
               <w:ind w:firstLine="0"/>
               <w:cnfStyle w:val="000000000000" w:firstRow="0" w:lastRow="0" w:firstColumn="0" w:lastColumn="0" w:oddVBand="0" w:evenVBand="0" w:oddHBand="0" w:evenHBand="0" w:firstRowFirstColumn="0" w:firstRowLastColumn="0" w:lastRowFirstColumn="0" w:lastRowLastColumn="0"/>
               <w:rPr>
-                <w:color w:val="EE0000"/>
                 <w:sz w:val="20"/>
                 <w:szCs w:val="20"/>
               </w:rPr>
             </w:pPr>
             <w:r>
               <w:rPr>
-                <w:color w:val="EE0000"/>
-                <w:sz w:val="20"/>
-                <w:szCs w:val="20"/>
-              </w:rPr>
-              <w:t>DS-01</w:t>
+                <w:sz w:val="20"/>
+                <w:szCs w:val="20"/>
+              </w:rPr>
+              <w:t>DS-05</w:t>
             </w:r>
           </w:p>
         </w:tc>
@@ -3688,18 +3680,16 @@
               <w:ind w:firstLine="0"/>
               <w:cnfStyle w:val="000000000000" w:firstRow="0" w:lastRow="0" w:firstColumn="0" w:lastColumn="0" w:oddVBand="0" w:evenVBand="0" w:oddHBand="0" w:evenHBand="0" w:firstRowFirstColumn="0" w:firstRowLastColumn="0" w:lastRowFirstColumn="0" w:lastRowLastColumn="0"/>
               <w:rPr>
-                <w:color w:val="EE0000"/>
                 <w:sz w:val="20"/>
                 <w:szCs w:val="20"/>
               </w:rPr>
             </w:pPr>
             <w:r>
               <w:rPr>
-                <w:color w:val="EE0000"/>
-                <w:sz w:val="20"/>
-                <w:szCs w:val="20"/>
-              </w:rPr>
-              <w:t>Done</w:t>
+                <w:sz w:val="20"/>
+                <w:szCs w:val="20"/>
+              </w:rPr>
+              <w:t>To Do</w:t>
             </w:r>
           </w:p>
         </w:tc>
@@ -3712,18 +3702,16 @@
               <w:ind w:firstLine="0"/>
               <w:cnfStyle w:val="000000000000" w:firstRow="0" w:lastRow="0" w:firstColumn="0" w:lastColumn="0" w:oddVBand="0" w:evenVBand="0" w:oddHBand="0" w:evenHBand="0" w:firstRowFirstColumn="0" w:firstRowLastColumn="0" w:lastRowFirstColumn="0" w:lastRowLastColumn="0"/>
               <w:rPr>
-                <w:color w:val="EE0000"/>
                 <w:sz w:val="20"/>
                 <w:szCs w:val="20"/>
               </w:rPr>
             </w:pPr>
             <w:r>
               <w:rPr>
-                <w:color w:val="EE0000"/>
-                <w:sz w:val="20"/>
-                <w:szCs w:val="20"/>
-              </w:rPr>
-              <w:t>Iteration 3.1</w:t>
+                <w:sz w:val="20"/>
+                <w:szCs w:val="20"/>
+              </w:rPr>
+              <w:t>Iteration 3.2</w:t>
             </w:r>
           </w:p>
         </w:tc>
@@ -3738,18 +3726,16 @@
             <w:pPr>
               <w:ind w:firstLine="0"/>
               <w:rPr>
-                <w:color w:val="EE0000"/>
                 <w:sz w:val="20"/>
                 <w:szCs w:val="20"/>
               </w:rPr>
             </w:pPr>
             <w:r>
               <w:rPr>
-                <w:color w:val="EE0000"/>
-                <w:sz w:val="20"/>
-                <w:szCs w:val="20"/>
-              </w:rPr>
-              <w:t>DS-05</w:t>
+                <w:sz w:val="20"/>
+                <w:szCs w:val="20"/>
+              </w:rPr>
+              <w:t>DS-15</w:t>
             </w:r>
           </w:p>
         </w:tc>
@@ -3762,77 +3748,64 @@
               <w:ind w:firstLine="0"/>
               <w:cnfStyle w:val="000000000000" w:firstRow="0" w:lastRow="0" w:firstColumn="0" w:lastColumn="0" w:oddVBand="0" w:evenVBand="0" w:oddHBand="0" w:evenHBand="0" w:firstRowFirstColumn="0" w:firstRowLastColumn="0" w:lastRowFirstColumn="0" w:lastRowLastColumn="0"/>
               <w:rPr>
-                <w:color w:val="EE0000"/>
                 <w:sz w:val="20"/>
                 <w:szCs w:val="20"/>
               </w:rPr>
             </w:pPr>
             <w:r>
               <w:rPr>
-                <w:color w:val="EE0000"/>
-                <w:sz w:val="20"/>
-                <w:szCs w:val="20"/>
-              </w:rPr>
-              <w:t>As a developer, I have integrated overspending alert logic into budget</w:t>
-            </w:r>
-            <w:r>
-              <w:rPr>
-                <w:color w:val="EE0000"/>
-                <w:sz w:val="20"/>
-                <w:szCs w:val="20"/>
-              </w:rPr>
-              <w:t xml:space="preserve"> </w:t>
-            </w:r>
-            <w:r>
-              <w:rPr>
-                <w:color w:val="EE0000"/>
-                <w:sz w:val="20"/>
-                <w:szCs w:val="20"/>
-              </w:rPr>
-              <w:t>/</w:t>
-            </w:r>
-            <w:r>
-              <w:rPr>
-                <w:color w:val="EE0000"/>
-                <w:sz w:val="20"/>
-                <w:szCs w:val="20"/>
-              </w:rPr>
-              <w:t xml:space="preserve"> </w:t>
-            </w:r>
-            <w:r>
-              <w:rPr>
-                <w:color w:val="EE0000"/>
-                <w:sz w:val="20"/>
-                <w:szCs w:val="20"/>
-              </w:rPr>
-              <w:t xml:space="preserve">transaction workflows so that the system </w:t>
-            </w:r>
-            <w:r>
-              <w:rPr>
-                <w:color w:val="EE0000"/>
-                <w:sz w:val="20"/>
-                <w:szCs w:val="20"/>
-              </w:rPr>
-              <w:lastRenderedPageBreak/>
-              <w:t xml:space="preserve">can detect when spending exceeds a budget and </w:t>
-            </w:r>
-            <w:proofErr w:type="gramStart"/>
-            <w:r>
-              <w:rPr>
-                <w:color w:val="EE0000"/>
-                <w:sz w:val="20"/>
-                <w:szCs w:val="20"/>
-              </w:rPr>
-              <w:t>notify</w:t>
-            </w:r>
-            <w:proofErr w:type="gramEnd"/>
-            <w:r>
-              <w:rPr>
-                <w:color w:val="EE0000"/>
-                <w:sz w:val="20"/>
-                <w:szCs w:val="20"/>
-              </w:rPr>
-              <w:t xml:space="preserve"> the UI when needed.</w:t>
+                <w:sz w:val="20"/>
+                <w:szCs w:val="20"/>
+              </w:rPr>
+              <w:t xml:space="preserve">As a developer, I have added unit tests for </w:t>
+            </w:r>
+            <w:proofErr w:type="spellStart"/>
+            <w:r>
+              <w:rPr>
+                <w:sz w:val="20"/>
+                <w:szCs w:val="20"/>
+              </w:rPr>
+              <w:t>ReportService</w:t>
+            </w:r>
+            <w:proofErr w:type="spellEnd"/>
+            <w:r>
+              <w:rPr>
+                <w:sz w:val="20"/>
+                <w:szCs w:val="20"/>
+              </w:rPr>
+              <w:t xml:space="preserve"> and </w:t>
+            </w:r>
+            <w:proofErr w:type="spellStart"/>
+            <w:r>
+              <w:rPr>
+                <w:sz w:val="20"/>
+                <w:szCs w:val="20"/>
+              </w:rPr>
+              <w:t>PeriodRange</w:t>
+            </w:r>
+            <w:proofErr w:type="spellEnd"/>
+            <w:r>
+              <w:rPr>
+                <w:sz w:val="20"/>
+                <w:szCs w:val="20"/>
+              </w:rPr>
+              <w:t xml:space="preserve"> so that report calculations, date range validation, and empty-result </w:t>
+            </w:r>
+            <w:proofErr w:type="spellStart"/>
+            <w:r>
+              <w:rPr>
+                <w:sz w:val="20"/>
+                <w:szCs w:val="20"/>
+              </w:rPr>
+              <w:t>behavior</w:t>
+            </w:r>
+            <w:proofErr w:type="spellEnd"/>
+            <w:r>
+              <w:rPr>
+                <w:sz w:val="20"/>
+                <w:szCs w:val="20"/>
+              </w:rPr>
+              <w:t xml:space="preserve"> are correct and UC-5 is validated.</w:t>
             </w:r>
           </w:p>
         </w:tc>
@@ -3845,19 +3818,16 @@
               <w:ind w:firstLine="0"/>
               <w:cnfStyle w:val="000000000000" w:firstRow="0" w:lastRow="0" w:firstColumn="0" w:lastColumn="0" w:oddVBand="0" w:evenVBand="0" w:oddHBand="0" w:evenHBand="0" w:firstRowFirstColumn="0" w:firstRowLastColumn="0" w:lastRowFirstColumn="0" w:lastRowLastColumn="0"/>
               <w:rPr>
-                <w:color w:val="EE0000"/>
                 <w:sz w:val="20"/>
                 <w:szCs w:val="20"/>
               </w:rPr>
             </w:pPr>
             <w:r>
               <w:rPr>
-                <w:color w:val="EE0000"/>
-                <w:sz w:val="20"/>
-                <w:szCs w:val="20"/>
-              </w:rPr>
-              <w:lastRenderedPageBreak/>
-              <w:t>US-5</w:t>
+                <w:sz w:val="20"/>
+                <w:szCs w:val="20"/>
+              </w:rPr>
+              <w:t>US-6</w:t>
             </w:r>
           </w:p>
         </w:tc>
@@ -3870,14 +3840,12 @@
               <w:ind w:firstLine="0"/>
               <w:cnfStyle w:val="000000000000" w:firstRow="0" w:lastRow="0" w:firstColumn="0" w:lastColumn="0" w:oddVBand="0" w:evenVBand="0" w:oddHBand="0" w:evenHBand="0" w:firstRowFirstColumn="0" w:firstRowLastColumn="0" w:lastRowFirstColumn="0" w:lastRowLastColumn="0"/>
               <w:rPr>
-                <w:color w:val="EE0000"/>
                 <w:sz w:val="20"/>
                 <w:szCs w:val="20"/>
               </w:rPr>
             </w:pPr>
             <w:r>
               <w:rPr>
-                <w:color w:val="EE0000"/>
                 <w:sz w:val="20"/>
                 <w:szCs w:val="20"/>
               </w:rPr>
@@ -3894,18 +3862,16 @@
               <w:ind w:firstLine="0"/>
               <w:cnfStyle w:val="000000000000" w:firstRow="0" w:lastRow="0" w:firstColumn="0" w:lastColumn="0" w:oddVBand="0" w:evenVBand="0" w:oddHBand="0" w:evenHBand="0" w:firstRowFirstColumn="0" w:firstRowLastColumn="0" w:lastRowFirstColumn="0" w:lastRowLastColumn="0"/>
               <w:rPr>
-                <w:color w:val="EE0000"/>
                 <w:sz w:val="20"/>
                 <w:szCs w:val="20"/>
               </w:rPr>
             </w:pPr>
             <w:r>
               <w:rPr>
-                <w:color w:val="EE0000"/>
-                <w:sz w:val="20"/>
-                <w:szCs w:val="20"/>
-              </w:rPr>
-              <w:t>DS-04, DS-02</w:t>
+                <w:sz w:val="20"/>
+                <w:szCs w:val="20"/>
+              </w:rPr>
+              <w:t>DS-06</w:t>
             </w:r>
           </w:p>
         </w:tc>
@@ -3918,18 +3884,16 @@
               <w:ind w:firstLine="0"/>
               <w:cnfStyle w:val="000000000000" w:firstRow="0" w:lastRow="0" w:firstColumn="0" w:lastColumn="0" w:oddVBand="0" w:evenVBand="0" w:oddHBand="0" w:evenHBand="0" w:firstRowFirstColumn="0" w:firstRowLastColumn="0" w:lastRowFirstColumn="0" w:lastRowLastColumn="0"/>
               <w:rPr>
-                <w:color w:val="EE0000"/>
                 <w:sz w:val="20"/>
                 <w:szCs w:val="20"/>
               </w:rPr>
             </w:pPr>
             <w:r>
               <w:rPr>
-                <w:color w:val="EE0000"/>
-                <w:sz w:val="20"/>
-                <w:szCs w:val="20"/>
-              </w:rPr>
-              <w:t>Done (partial)</w:t>
+                <w:sz w:val="20"/>
+                <w:szCs w:val="20"/>
+              </w:rPr>
+              <w:t>To Do</w:t>
             </w:r>
           </w:p>
         </w:tc>
@@ -3942,18 +3906,16 @@
               <w:ind w:firstLine="0"/>
               <w:cnfStyle w:val="000000000000" w:firstRow="0" w:lastRow="0" w:firstColumn="0" w:lastColumn="0" w:oddVBand="0" w:evenVBand="0" w:oddHBand="0" w:evenHBand="0" w:firstRowFirstColumn="0" w:firstRowLastColumn="0" w:lastRowFirstColumn="0" w:lastRowLastColumn="0"/>
               <w:rPr>
-                <w:color w:val="EE0000"/>
                 <w:sz w:val="20"/>
                 <w:szCs w:val="20"/>
               </w:rPr>
             </w:pPr>
             <w:r>
               <w:rPr>
-                <w:color w:val="EE0000"/>
-                <w:sz w:val="20"/>
-                <w:szCs w:val="20"/>
-              </w:rPr>
-              <w:t>Iteration 3.1</w:t>
+                <w:sz w:val="20"/>
+                <w:szCs w:val="20"/>
+              </w:rPr>
+              <w:t>Iteration 3.2</w:t>
             </w:r>
           </w:p>
         </w:tc>
@@ -3968,18 +3930,16 @@
             <w:pPr>
               <w:ind w:firstLine="0"/>
               <w:rPr>
-                <w:color w:val="EE0000"/>
                 <w:sz w:val="20"/>
                 <w:szCs w:val="20"/>
               </w:rPr>
             </w:pPr>
             <w:r>
               <w:rPr>
-                <w:color w:val="EE0000"/>
-                <w:sz w:val="20"/>
-                <w:szCs w:val="20"/>
-              </w:rPr>
-              <w:t>DS-06</w:t>
+                <w:sz w:val="20"/>
+                <w:szCs w:val="20"/>
+              </w:rPr>
+              <w:t>DS-17</w:t>
             </w:r>
           </w:p>
         </w:tc>
@@ -3992,18 +3952,16 @@
               <w:ind w:firstLine="0"/>
               <w:cnfStyle w:val="000000000000" w:firstRow="0" w:lastRow="0" w:firstColumn="0" w:lastColumn="0" w:oddVBand="0" w:evenVBand="0" w:oddHBand="0" w:evenHBand="0" w:firstRowFirstColumn="0" w:firstRowLastColumn="0" w:lastRowFirstColumn="0" w:lastRowLastColumn="0"/>
               <w:rPr>
-                <w:color w:val="EE0000"/>
                 <w:sz w:val="20"/>
                 <w:szCs w:val="20"/>
               </w:rPr>
             </w:pPr>
             <w:r>
               <w:rPr>
-                <w:color w:val="EE0000"/>
-                <w:sz w:val="20"/>
-                <w:szCs w:val="20"/>
-              </w:rPr>
-              <w:t>As a developer, I have implemented summary report generation for a selected period so that users can view totals and category breakdowns for a custom date range.</w:t>
+                <w:sz w:val="20"/>
+                <w:szCs w:val="20"/>
+              </w:rPr>
+              <w:t>As a developer, I have improved the transaction form UI to filter categories by transaction type (Income vs Expense) so that users only see relevant categories and input errors are reduced.</w:t>
             </w:r>
           </w:p>
         </w:tc>
@@ -4016,18 +3974,16 @@
               <w:ind w:firstLine="0"/>
               <w:cnfStyle w:val="000000000000" w:firstRow="0" w:lastRow="0" w:firstColumn="0" w:lastColumn="0" w:oddVBand="0" w:evenVBand="0" w:oddHBand="0" w:evenHBand="0" w:firstRowFirstColumn="0" w:firstRowLastColumn="0" w:lastRowFirstColumn="0" w:lastRowLastColumn="0"/>
               <w:rPr>
-                <w:color w:val="EE0000"/>
                 <w:sz w:val="20"/>
                 <w:szCs w:val="20"/>
               </w:rPr>
             </w:pPr>
             <w:r>
               <w:rPr>
-                <w:color w:val="EE0000"/>
-                <w:sz w:val="20"/>
-                <w:szCs w:val="20"/>
-              </w:rPr>
-              <w:t>US-6</w:t>
+                <w:sz w:val="20"/>
+                <w:szCs w:val="20"/>
+              </w:rPr>
+              <w:t>US-1</w:t>
             </w:r>
           </w:p>
         </w:tc>
@@ -4040,18 +3996,16 @@
               <w:ind w:firstLine="0"/>
               <w:cnfStyle w:val="000000000000" w:firstRow="0" w:lastRow="0" w:firstColumn="0" w:lastColumn="0" w:oddVBand="0" w:evenVBand="0" w:oddHBand="0" w:evenHBand="0" w:firstRowFirstColumn="0" w:firstRowLastColumn="0" w:lastRowFirstColumn="0" w:lastRowLastColumn="0"/>
               <w:rPr>
-                <w:color w:val="EE0000"/>
                 <w:sz w:val="20"/>
                 <w:szCs w:val="20"/>
               </w:rPr>
             </w:pPr>
             <w:r>
               <w:rPr>
-                <w:color w:val="EE0000"/>
-                <w:sz w:val="20"/>
-                <w:szCs w:val="20"/>
-              </w:rPr>
-              <w:t>High</w:t>
+                <w:sz w:val="20"/>
+                <w:szCs w:val="20"/>
+              </w:rPr>
+              <w:t>Medium</w:t>
             </w:r>
           </w:p>
         </w:tc>
@@ -4064,18 +4018,16 @@
               <w:ind w:firstLine="0"/>
               <w:cnfStyle w:val="000000000000" w:firstRow="0" w:lastRow="0" w:firstColumn="0" w:lastColumn="0" w:oddVBand="0" w:evenVBand="0" w:oddHBand="0" w:evenHBand="0" w:firstRowFirstColumn="0" w:firstRowLastColumn="0" w:lastRowFirstColumn="0" w:lastRowLastColumn="0"/>
               <w:rPr>
-                <w:color w:val="EE0000"/>
                 <w:sz w:val="20"/>
                 <w:szCs w:val="20"/>
               </w:rPr>
             </w:pPr>
             <w:r>
               <w:rPr>
-                <w:color w:val="EE0000"/>
-                <w:sz w:val="20"/>
-                <w:szCs w:val="20"/>
-              </w:rPr>
-              <w:t>DS-02</w:t>
+                <w:sz w:val="20"/>
+                <w:szCs w:val="20"/>
+              </w:rPr>
+              <w:t>DS-08</w:t>
             </w:r>
           </w:p>
         </w:tc>
@@ -4088,18 +4040,16 @@
               <w:ind w:firstLine="0"/>
               <w:cnfStyle w:val="000000000000" w:firstRow="0" w:lastRow="0" w:firstColumn="0" w:lastColumn="0" w:oddVBand="0" w:evenVBand="0" w:oddHBand="0" w:evenHBand="0" w:firstRowFirstColumn="0" w:firstRowLastColumn="0" w:lastRowFirstColumn="0" w:lastRowLastColumn="0"/>
               <w:rPr>
-                <w:color w:val="EE0000"/>
                 <w:sz w:val="20"/>
                 <w:szCs w:val="20"/>
               </w:rPr>
             </w:pPr>
             <w:r>
               <w:rPr>
-                <w:color w:val="EE0000"/>
-                <w:sz w:val="20"/>
-                <w:szCs w:val="20"/>
-              </w:rPr>
-              <w:t>Done</w:t>
+                <w:sz w:val="20"/>
+                <w:szCs w:val="20"/>
+              </w:rPr>
+              <w:t>To Do</w:t>
             </w:r>
           </w:p>
         </w:tc>
@@ -4112,1904 +4062,12 @@
               <w:ind w:firstLine="0"/>
               <w:cnfStyle w:val="000000000000" w:firstRow="0" w:lastRow="0" w:firstColumn="0" w:lastColumn="0" w:oddVBand="0" w:evenVBand="0" w:oddHBand="0" w:evenHBand="0" w:firstRowFirstColumn="0" w:firstRowLastColumn="0" w:lastRowFirstColumn="0" w:lastRowLastColumn="0"/>
               <w:rPr>
-                <w:color w:val="EE0000"/>
                 <w:sz w:val="20"/>
                 <w:szCs w:val="20"/>
               </w:rPr>
             </w:pPr>
             <w:r>
               <w:rPr>
-                <w:color w:val="EE0000"/>
-                <w:sz w:val="20"/>
-                <w:szCs w:val="20"/>
-              </w:rPr>
-              <w:t>Iteration 3.1</w:t>
-            </w:r>
-          </w:p>
-        </w:tc>
-      </w:tr>
-      <w:tr>
-        <w:tc>
-          <w:tcPr>
-            <w:cnfStyle w:val="001000000000" w:firstRow="0" w:lastRow="0" w:firstColumn="1" w:lastColumn="0" w:oddVBand="0" w:evenVBand="0" w:oddHBand="0" w:evenHBand="0" w:firstRowFirstColumn="0" w:firstRowLastColumn="0" w:lastRowFirstColumn="0" w:lastRowLastColumn="0"/>
-            <w:tcW w:w="539" w:type="dxa"/>
-          </w:tcPr>
-          <w:p>
-            <w:pPr>
-              <w:ind w:firstLine="0"/>
-              <w:rPr>
-                <w:color w:val="EE0000"/>
-                <w:sz w:val="20"/>
-                <w:szCs w:val="20"/>
-              </w:rPr>
-            </w:pPr>
-            <w:r>
-              <w:rPr>
-                <w:color w:val="EE0000"/>
-                <w:sz w:val="20"/>
-                <w:szCs w:val="20"/>
-              </w:rPr>
-              <w:t>DS-07</w:t>
-            </w:r>
-          </w:p>
-        </w:tc>
-        <w:tc>
-          <w:tcPr>
-            <w:tcW w:w="3634" w:type="dxa"/>
-          </w:tcPr>
-          <w:p>
-            <w:pPr>
-              <w:ind w:firstLine="0"/>
-              <w:cnfStyle w:val="000000000000" w:firstRow="0" w:lastRow="0" w:firstColumn="0" w:lastColumn="0" w:oddVBand="0" w:evenVBand="0" w:oddHBand="0" w:evenHBand="0" w:firstRowFirstColumn="0" w:firstRowLastColumn="0" w:lastRowFirstColumn="0" w:lastRowLastColumn="0"/>
-              <w:rPr>
-                <w:color w:val="EE0000"/>
-                <w:sz w:val="20"/>
-                <w:szCs w:val="20"/>
-              </w:rPr>
-            </w:pPr>
-            <w:r>
-              <w:rPr>
-                <w:color w:val="EE0000"/>
-                <w:sz w:val="20"/>
-                <w:szCs w:val="20"/>
-              </w:rPr>
-              <w:t>As a developer, I have implemented JavaFX page navigation (Transactions, Budgets, Reports) so that users can move between main features using a consistent UI structure.</w:t>
-            </w:r>
-          </w:p>
-        </w:tc>
-        <w:tc>
-          <w:tcPr>
-            <w:tcW w:w="872" w:type="dxa"/>
-          </w:tcPr>
-          <w:p>
-            <w:pPr>
-              <w:ind w:firstLine="0"/>
-              <w:cnfStyle w:val="000000000000" w:firstRow="0" w:lastRow="0" w:firstColumn="0" w:lastColumn="0" w:oddVBand="0" w:evenVBand="0" w:oddHBand="0" w:evenHBand="0" w:firstRowFirstColumn="0" w:firstRowLastColumn="0" w:lastRowFirstColumn="0" w:lastRowLastColumn="0"/>
-              <w:rPr>
-                <w:color w:val="EE0000"/>
-                <w:sz w:val="20"/>
-                <w:szCs w:val="20"/>
-              </w:rPr>
-            </w:pPr>
-            <w:r>
-              <w:rPr>
-                <w:color w:val="EE0000"/>
-                <w:sz w:val="20"/>
-                <w:szCs w:val="20"/>
-              </w:rPr>
-              <w:t>All</w:t>
-            </w:r>
-          </w:p>
-        </w:tc>
-        <w:tc>
-          <w:tcPr>
-            <w:tcW w:w="958" w:type="dxa"/>
-          </w:tcPr>
-          <w:p>
-            <w:pPr>
-              <w:ind w:firstLine="0"/>
-              <w:cnfStyle w:val="000000000000" w:firstRow="0" w:lastRow="0" w:firstColumn="0" w:lastColumn="0" w:oddVBand="0" w:evenVBand="0" w:oddHBand="0" w:evenHBand="0" w:firstRowFirstColumn="0" w:firstRowLastColumn="0" w:lastRowFirstColumn="0" w:lastRowLastColumn="0"/>
-              <w:rPr>
-                <w:color w:val="EE0000"/>
-                <w:sz w:val="20"/>
-                <w:szCs w:val="20"/>
-              </w:rPr>
-            </w:pPr>
-            <w:r>
-              <w:rPr>
-                <w:color w:val="EE0000"/>
-                <w:sz w:val="20"/>
-                <w:szCs w:val="20"/>
-              </w:rPr>
-              <w:t>High</w:t>
-            </w:r>
-          </w:p>
-        </w:tc>
-        <w:tc>
-          <w:tcPr>
-            <w:tcW w:w="1261" w:type="dxa"/>
-          </w:tcPr>
-          <w:p>
-            <w:pPr>
-              <w:ind w:firstLine="0"/>
-              <w:cnfStyle w:val="000000000000" w:firstRow="0" w:lastRow="0" w:firstColumn="0" w:lastColumn="0" w:oddVBand="0" w:evenVBand="0" w:oddHBand="0" w:evenHBand="0" w:firstRowFirstColumn="0" w:firstRowLastColumn="0" w:lastRowFirstColumn="0" w:lastRowLastColumn="0"/>
-              <w:rPr>
-                <w:color w:val="EE0000"/>
-                <w:sz w:val="20"/>
-                <w:szCs w:val="20"/>
-              </w:rPr>
-            </w:pPr>
-            <w:r>
-              <w:rPr>
-                <w:color w:val="EE0000"/>
-                <w:sz w:val="20"/>
-                <w:szCs w:val="20"/>
-              </w:rPr>
-              <w:t>DS-01</w:t>
-            </w:r>
-          </w:p>
-        </w:tc>
-        <w:tc>
-          <w:tcPr>
-            <w:tcW w:w="861" w:type="dxa"/>
-          </w:tcPr>
-          <w:p>
-            <w:pPr>
-              <w:ind w:firstLine="0"/>
-              <w:cnfStyle w:val="000000000000" w:firstRow="0" w:lastRow="0" w:firstColumn="0" w:lastColumn="0" w:oddVBand="0" w:evenVBand="0" w:oddHBand="0" w:evenHBand="0" w:firstRowFirstColumn="0" w:firstRowLastColumn="0" w:lastRowFirstColumn="0" w:lastRowLastColumn="0"/>
-              <w:rPr>
-                <w:color w:val="EE0000"/>
-                <w:sz w:val="20"/>
-                <w:szCs w:val="20"/>
-              </w:rPr>
-            </w:pPr>
-            <w:r>
-              <w:rPr>
-                <w:color w:val="EE0000"/>
-                <w:sz w:val="20"/>
-                <w:szCs w:val="20"/>
-              </w:rPr>
-              <w:t>Done</w:t>
-            </w:r>
-          </w:p>
-        </w:tc>
-        <w:tc>
-          <w:tcPr>
-            <w:tcW w:w="894" w:type="dxa"/>
-          </w:tcPr>
-          <w:p>
-            <w:pPr>
-              <w:ind w:firstLine="0"/>
-              <w:cnfStyle w:val="000000000000" w:firstRow="0" w:lastRow="0" w:firstColumn="0" w:lastColumn="0" w:oddVBand="0" w:evenVBand="0" w:oddHBand="0" w:evenHBand="0" w:firstRowFirstColumn="0" w:firstRowLastColumn="0" w:lastRowFirstColumn="0" w:lastRowLastColumn="0"/>
-              <w:rPr>
-                <w:color w:val="EE0000"/>
-                <w:sz w:val="20"/>
-                <w:szCs w:val="20"/>
-              </w:rPr>
-            </w:pPr>
-            <w:r>
-              <w:rPr>
-                <w:color w:val="EE0000"/>
-                <w:sz w:val="20"/>
-                <w:szCs w:val="20"/>
-              </w:rPr>
-              <w:t>Iteration 3.1</w:t>
-            </w:r>
-          </w:p>
-        </w:tc>
-      </w:tr>
-      <w:tr>
-        <w:tc>
-          <w:tcPr>
-            <w:cnfStyle w:val="001000000000" w:firstRow="0" w:lastRow="0" w:firstColumn="1" w:lastColumn="0" w:oddVBand="0" w:evenVBand="0" w:oddHBand="0" w:evenHBand="0" w:firstRowFirstColumn="0" w:firstRowLastColumn="0" w:lastRowFirstColumn="0" w:lastRowLastColumn="0"/>
-            <w:tcW w:w="539" w:type="dxa"/>
-          </w:tcPr>
-          <w:p>
-            <w:pPr>
-              <w:ind w:firstLine="0"/>
-              <w:rPr>
-                <w:color w:val="EE0000"/>
-                <w:sz w:val="20"/>
-                <w:szCs w:val="20"/>
-              </w:rPr>
-            </w:pPr>
-            <w:r>
-              <w:rPr>
-                <w:color w:val="EE0000"/>
-                <w:sz w:val="20"/>
-                <w:szCs w:val="20"/>
-              </w:rPr>
-              <w:t>DS-08</w:t>
-            </w:r>
-          </w:p>
-        </w:tc>
-        <w:tc>
-          <w:tcPr>
-            <w:tcW w:w="3634" w:type="dxa"/>
-          </w:tcPr>
-          <w:p>
-            <w:pPr>
-              <w:ind w:firstLine="0"/>
-              <w:cnfStyle w:val="000000000000" w:firstRow="0" w:lastRow="0" w:firstColumn="0" w:lastColumn="0" w:oddVBand="0" w:evenVBand="0" w:oddHBand="0" w:evenHBand="0" w:firstRowFirstColumn="0" w:firstRowLastColumn="0" w:lastRowFirstColumn="0" w:lastRowLastColumn="0"/>
-              <w:rPr>
-                <w:color w:val="EE0000"/>
-                <w:sz w:val="20"/>
-                <w:szCs w:val="20"/>
-              </w:rPr>
-            </w:pPr>
-            <w:r>
-              <w:rPr>
-                <w:color w:val="EE0000"/>
-                <w:sz w:val="20"/>
-                <w:szCs w:val="20"/>
-              </w:rPr>
-              <w:t xml:space="preserve">As a developer, I have implemented JavaFX modals and confirmations for transactions and </w:t>
-            </w:r>
-            <w:proofErr w:type="gramStart"/>
-            <w:r>
-              <w:rPr>
-                <w:color w:val="EE0000"/>
-                <w:sz w:val="20"/>
-                <w:szCs w:val="20"/>
-              </w:rPr>
-              <w:t>budgets</w:t>
-            </w:r>
-            <w:proofErr w:type="gramEnd"/>
-            <w:r>
-              <w:rPr>
-                <w:color w:val="EE0000"/>
-                <w:sz w:val="20"/>
-                <w:szCs w:val="20"/>
-              </w:rPr>
-              <w:t xml:space="preserve"> so that create</w:t>
-            </w:r>
-            <w:r>
-              <w:rPr>
-                <w:color w:val="EE0000"/>
-                <w:sz w:val="20"/>
-                <w:szCs w:val="20"/>
-              </w:rPr>
-              <w:t xml:space="preserve"> </w:t>
-            </w:r>
-            <w:r>
-              <w:rPr>
-                <w:color w:val="EE0000"/>
-                <w:sz w:val="20"/>
-                <w:szCs w:val="20"/>
-              </w:rPr>
-              <w:t>/</w:t>
-            </w:r>
-            <w:r>
-              <w:rPr>
-                <w:color w:val="EE0000"/>
-                <w:sz w:val="20"/>
-                <w:szCs w:val="20"/>
-              </w:rPr>
-              <w:t xml:space="preserve"> </w:t>
-            </w:r>
-            <w:r>
-              <w:rPr>
-                <w:color w:val="EE0000"/>
-                <w:sz w:val="20"/>
-                <w:szCs w:val="20"/>
-              </w:rPr>
-              <w:t>update</w:t>
-            </w:r>
-            <w:r>
-              <w:rPr>
-                <w:color w:val="EE0000"/>
-                <w:sz w:val="20"/>
-                <w:szCs w:val="20"/>
-              </w:rPr>
-              <w:t xml:space="preserve"> </w:t>
-            </w:r>
-            <w:r>
-              <w:rPr>
-                <w:color w:val="EE0000"/>
-                <w:sz w:val="20"/>
-                <w:szCs w:val="20"/>
-              </w:rPr>
-              <w:t>/</w:t>
-            </w:r>
-            <w:r>
-              <w:rPr>
-                <w:color w:val="EE0000"/>
-                <w:sz w:val="20"/>
-                <w:szCs w:val="20"/>
-              </w:rPr>
-              <w:t xml:space="preserve"> </w:t>
-            </w:r>
-            <w:r>
-              <w:rPr>
-                <w:color w:val="EE0000"/>
-                <w:sz w:val="20"/>
-                <w:szCs w:val="20"/>
-              </w:rPr>
-              <w:t>delete actions are clear, validated, and safe from accidental changes.</w:t>
-            </w:r>
-          </w:p>
-        </w:tc>
-        <w:tc>
-          <w:tcPr>
-            <w:tcW w:w="872" w:type="dxa"/>
-          </w:tcPr>
-          <w:p>
-            <w:pPr>
-              <w:ind w:firstLine="0"/>
-              <w:cnfStyle w:val="000000000000" w:firstRow="0" w:lastRow="0" w:firstColumn="0" w:lastColumn="0" w:oddVBand="0" w:evenVBand="0" w:oddHBand="0" w:evenHBand="0" w:firstRowFirstColumn="0" w:firstRowLastColumn="0" w:lastRowFirstColumn="0" w:lastRowLastColumn="0"/>
-              <w:rPr>
-                <w:color w:val="EE0000"/>
-                <w:sz w:val="20"/>
-                <w:szCs w:val="20"/>
-              </w:rPr>
-            </w:pPr>
-            <w:r>
-              <w:rPr>
-                <w:color w:val="EE0000"/>
-                <w:sz w:val="20"/>
-                <w:szCs w:val="20"/>
-              </w:rPr>
-              <w:t>US-1, US-2, US-4</w:t>
-            </w:r>
-          </w:p>
-        </w:tc>
-        <w:tc>
-          <w:tcPr>
-            <w:tcW w:w="958" w:type="dxa"/>
-          </w:tcPr>
-          <w:p>
-            <w:pPr>
-              <w:ind w:firstLine="0"/>
-              <w:cnfStyle w:val="000000000000" w:firstRow="0" w:lastRow="0" w:firstColumn="0" w:lastColumn="0" w:oddVBand="0" w:evenVBand="0" w:oddHBand="0" w:evenHBand="0" w:firstRowFirstColumn="0" w:firstRowLastColumn="0" w:lastRowFirstColumn="0" w:lastRowLastColumn="0"/>
-              <w:rPr>
-                <w:color w:val="EE0000"/>
-                <w:sz w:val="20"/>
-                <w:szCs w:val="20"/>
-              </w:rPr>
-            </w:pPr>
-            <w:r>
-              <w:rPr>
-                <w:color w:val="EE0000"/>
-                <w:sz w:val="20"/>
-                <w:szCs w:val="20"/>
-              </w:rPr>
-              <w:t>High</w:t>
-            </w:r>
-          </w:p>
-        </w:tc>
-        <w:tc>
-          <w:tcPr>
-            <w:tcW w:w="1261" w:type="dxa"/>
-          </w:tcPr>
-          <w:p>
-            <w:pPr>
-              <w:ind w:firstLine="0"/>
-              <w:cnfStyle w:val="000000000000" w:firstRow="0" w:lastRow="0" w:firstColumn="0" w:lastColumn="0" w:oddVBand="0" w:evenVBand="0" w:oddHBand="0" w:evenHBand="0" w:firstRowFirstColumn="0" w:firstRowLastColumn="0" w:lastRowFirstColumn="0" w:lastRowLastColumn="0"/>
-              <w:rPr>
-                <w:color w:val="EE0000"/>
-                <w:sz w:val="20"/>
-                <w:szCs w:val="20"/>
-              </w:rPr>
-            </w:pPr>
-            <w:r>
-              <w:rPr>
-                <w:color w:val="EE0000"/>
-                <w:sz w:val="20"/>
-                <w:szCs w:val="20"/>
-              </w:rPr>
-              <w:t>DS-07</w:t>
-            </w:r>
-          </w:p>
-        </w:tc>
-        <w:tc>
-          <w:tcPr>
-            <w:tcW w:w="861" w:type="dxa"/>
-          </w:tcPr>
-          <w:p>
-            <w:pPr>
-              <w:ind w:firstLine="0"/>
-              <w:cnfStyle w:val="000000000000" w:firstRow="0" w:lastRow="0" w:firstColumn="0" w:lastColumn="0" w:oddVBand="0" w:evenVBand="0" w:oddHBand="0" w:evenHBand="0" w:firstRowFirstColumn="0" w:firstRowLastColumn="0" w:lastRowFirstColumn="0" w:lastRowLastColumn="0"/>
-              <w:rPr>
-                <w:color w:val="EE0000"/>
-                <w:sz w:val="20"/>
-                <w:szCs w:val="20"/>
-              </w:rPr>
-            </w:pPr>
-            <w:r>
-              <w:rPr>
-                <w:color w:val="EE0000"/>
-                <w:sz w:val="20"/>
-                <w:szCs w:val="20"/>
-              </w:rPr>
-              <w:t>Done</w:t>
-            </w:r>
-          </w:p>
-        </w:tc>
-        <w:tc>
-          <w:tcPr>
-            <w:tcW w:w="894" w:type="dxa"/>
-          </w:tcPr>
-          <w:p>
-            <w:pPr>
-              <w:ind w:firstLine="0"/>
-              <w:cnfStyle w:val="000000000000" w:firstRow="0" w:lastRow="0" w:firstColumn="0" w:lastColumn="0" w:oddVBand="0" w:evenVBand="0" w:oddHBand="0" w:evenHBand="0" w:firstRowFirstColumn="0" w:firstRowLastColumn="0" w:lastRowFirstColumn="0" w:lastRowLastColumn="0"/>
-              <w:rPr>
-                <w:color w:val="EE0000"/>
-                <w:sz w:val="20"/>
-                <w:szCs w:val="20"/>
-              </w:rPr>
-            </w:pPr>
-            <w:r>
-              <w:rPr>
-                <w:color w:val="EE0000"/>
-                <w:sz w:val="20"/>
-                <w:szCs w:val="20"/>
-              </w:rPr>
-              <w:t>Iteration 3.1</w:t>
-            </w:r>
-          </w:p>
-        </w:tc>
-      </w:tr>
-      <w:tr>
-        <w:tc>
-          <w:tcPr>
-            <w:cnfStyle w:val="001000000000" w:firstRow="0" w:lastRow="0" w:firstColumn="1" w:lastColumn="0" w:oddVBand="0" w:evenVBand="0" w:oddHBand="0" w:evenHBand="0" w:firstRowFirstColumn="0" w:firstRowLastColumn="0" w:lastRowFirstColumn="0" w:lastRowLastColumn="0"/>
-            <w:tcW w:w="539" w:type="dxa"/>
-          </w:tcPr>
-          <w:p>
-            <w:pPr>
-              <w:ind w:firstLine="0"/>
-              <w:rPr>
-                <w:color w:val="EE0000"/>
-                <w:sz w:val="20"/>
-                <w:szCs w:val="20"/>
-              </w:rPr>
-            </w:pPr>
-            <w:r>
-              <w:rPr>
-                <w:color w:val="EE0000"/>
-                <w:sz w:val="20"/>
-                <w:szCs w:val="20"/>
-              </w:rPr>
-              <w:t>DS-09</w:t>
-            </w:r>
-          </w:p>
-        </w:tc>
-        <w:tc>
-          <w:tcPr>
-            <w:tcW w:w="3634" w:type="dxa"/>
-          </w:tcPr>
-          <w:p>
-            <w:pPr>
-              <w:ind w:firstLine="0"/>
-              <w:cnfStyle w:val="000000000000" w:firstRow="0" w:lastRow="0" w:firstColumn="0" w:lastColumn="0" w:oddVBand="0" w:evenVBand="0" w:oddHBand="0" w:evenHBand="0" w:firstRowFirstColumn="0" w:firstRowLastColumn="0" w:lastRowFirstColumn="0" w:lastRowLastColumn="0"/>
-              <w:rPr>
-                <w:color w:val="EE0000"/>
-                <w:sz w:val="20"/>
-                <w:szCs w:val="20"/>
-              </w:rPr>
-            </w:pPr>
-            <w:r>
-              <w:rPr>
-                <w:color w:val="EE0000"/>
-                <w:sz w:val="20"/>
-                <w:szCs w:val="20"/>
-              </w:rPr>
-              <w:t>As a developer, I have written initial unit tests for domain and service logic so that core business rules are verified independently from the GUI.</w:t>
-            </w:r>
-          </w:p>
-        </w:tc>
-        <w:tc>
-          <w:tcPr>
-            <w:tcW w:w="872" w:type="dxa"/>
-          </w:tcPr>
-          <w:p>
-            <w:pPr>
-              <w:ind w:firstLine="0"/>
-              <w:cnfStyle w:val="000000000000" w:firstRow="0" w:lastRow="0" w:firstColumn="0" w:lastColumn="0" w:oddVBand="0" w:evenVBand="0" w:oddHBand="0" w:evenHBand="0" w:firstRowFirstColumn="0" w:firstRowLastColumn="0" w:lastRowFirstColumn="0" w:lastRowLastColumn="0"/>
-              <w:rPr>
-                <w:color w:val="EE0000"/>
-                <w:sz w:val="20"/>
-                <w:szCs w:val="20"/>
-              </w:rPr>
-            </w:pPr>
-            <w:r>
-              <w:rPr>
-                <w:color w:val="EE0000"/>
-                <w:sz w:val="20"/>
-                <w:szCs w:val="20"/>
-              </w:rPr>
-              <w:t>All</w:t>
-            </w:r>
-          </w:p>
-        </w:tc>
-        <w:tc>
-          <w:tcPr>
-            <w:tcW w:w="958" w:type="dxa"/>
-          </w:tcPr>
-          <w:p>
-            <w:pPr>
-              <w:ind w:firstLine="0"/>
-              <w:cnfStyle w:val="000000000000" w:firstRow="0" w:lastRow="0" w:firstColumn="0" w:lastColumn="0" w:oddVBand="0" w:evenVBand="0" w:oddHBand="0" w:evenHBand="0" w:firstRowFirstColumn="0" w:firstRowLastColumn="0" w:lastRowFirstColumn="0" w:lastRowLastColumn="0"/>
-              <w:rPr>
-                <w:color w:val="EE0000"/>
-                <w:sz w:val="20"/>
-                <w:szCs w:val="20"/>
-              </w:rPr>
-            </w:pPr>
-            <w:r>
-              <w:rPr>
-                <w:color w:val="EE0000"/>
-                <w:sz w:val="20"/>
-                <w:szCs w:val="20"/>
-              </w:rPr>
-              <w:t>High</w:t>
-            </w:r>
-          </w:p>
-        </w:tc>
-        <w:tc>
-          <w:tcPr>
-            <w:tcW w:w="1261" w:type="dxa"/>
-          </w:tcPr>
-          <w:p>
-            <w:pPr>
-              <w:ind w:firstLine="0"/>
-              <w:cnfStyle w:val="000000000000" w:firstRow="0" w:lastRow="0" w:firstColumn="0" w:lastColumn="0" w:oddVBand="0" w:evenVBand="0" w:oddHBand="0" w:evenHBand="0" w:firstRowFirstColumn="0" w:firstRowLastColumn="0" w:lastRowFirstColumn="0" w:lastRowLastColumn="0"/>
-              <w:rPr>
-                <w:color w:val="EE0000"/>
-                <w:sz w:val="20"/>
-                <w:szCs w:val="20"/>
-              </w:rPr>
-            </w:pPr>
-            <w:r>
-              <w:rPr>
-                <w:color w:val="EE0000"/>
-                <w:sz w:val="20"/>
-                <w:szCs w:val="20"/>
-              </w:rPr>
-              <w:t>DS-02, DS-04, DS-06</w:t>
-            </w:r>
-          </w:p>
-        </w:tc>
-        <w:tc>
-          <w:tcPr>
-            <w:tcW w:w="861" w:type="dxa"/>
-          </w:tcPr>
-          <w:p>
-            <w:pPr>
-              <w:ind w:firstLine="0"/>
-              <w:cnfStyle w:val="000000000000" w:firstRow="0" w:lastRow="0" w:firstColumn="0" w:lastColumn="0" w:oddVBand="0" w:evenVBand="0" w:oddHBand="0" w:evenHBand="0" w:firstRowFirstColumn="0" w:firstRowLastColumn="0" w:lastRowFirstColumn="0" w:lastRowLastColumn="0"/>
-              <w:rPr>
-                <w:color w:val="EE0000"/>
-                <w:sz w:val="20"/>
-                <w:szCs w:val="20"/>
-              </w:rPr>
-            </w:pPr>
-            <w:r>
-              <w:rPr>
-                <w:color w:val="EE0000"/>
-                <w:sz w:val="20"/>
-                <w:szCs w:val="20"/>
-              </w:rPr>
-              <w:t>Done (partial)</w:t>
-            </w:r>
-          </w:p>
-        </w:tc>
-        <w:tc>
-          <w:tcPr>
-            <w:tcW w:w="894" w:type="dxa"/>
-          </w:tcPr>
-          <w:p>
-            <w:pPr>
-              <w:ind w:firstLine="0"/>
-              <w:cnfStyle w:val="000000000000" w:firstRow="0" w:lastRow="0" w:firstColumn="0" w:lastColumn="0" w:oddVBand="0" w:evenVBand="0" w:oddHBand="0" w:evenHBand="0" w:firstRowFirstColumn="0" w:firstRowLastColumn="0" w:lastRowFirstColumn="0" w:lastRowLastColumn="0"/>
-              <w:rPr>
-                <w:color w:val="EE0000"/>
-                <w:sz w:val="20"/>
-                <w:szCs w:val="20"/>
-              </w:rPr>
-            </w:pPr>
-            <w:r>
-              <w:rPr>
-                <w:color w:val="EE0000"/>
-                <w:sz w:val="20"/>
-                <w:szCs w:val="20"/>
-              </w:rPr>
-              <w:t>Iteration 3.1</w:t>
-            </w:r>
-          </w:p>
-        </w:tc>
-      </w:tr>
-      <w:tr>
-        <w:tc>
-          <w:tcPr>
-            <w:cnfStyle w:val="001000000000" w:firstRow="0" w:lastRow="0" w:firstColumn="1" w:lastColumn="0" w:oddVBand="0" w:evenVBand="0" w:oddHBand="0" w:evenHBand="0" w:firstRowFirstColumn="0" w:firstRowLastColumn="0" w:lastRowFirstColumn="0" w:lastRowLastColumn="0"/>
-            <w:tcW w:w="539" w:type="dxa"/>
-          </w:tcPr>
-          <w:p>
-            <w:pPr>
-              <w:ind w:firstLine="0"/>
-              <w:rPr>
-                <w:color w:val="EE0000"/>
-                <w:sz w:val="20"/>
-                <w:szCs w:val="20"/>
-              </w:rPr>
-            </w:pPr>
-            <w:r>
-              <w:rPr>
-                <w:color w:val="EE0000"/>
-                <w:sz w:val="20"/>
-                <w:szCs w:val="20"/>
-              </w:rPr>
-              <w:t>DS-10</w:t>
-            </w:r>
-          </w:p>
-        </w:tc>
-        <w:tc>
-          <w:tcPr>
-            <w:tcW w:w="3634" w:type="dxa"/>
-          </w:tcPr>
-          <w:p>
-            <w:pPr>
-              <w:ind w:firstLine="0"/>
-              <w:cnfStyle w:val="000000000000" w:firstRow="0" w:lastRow="0" w:firstColumn="0" w:lastColumn="0" w:oddVBand="0" w:evenVBand="0" w:oddHBand="0" w:evenHBand="0" w:firstRowFirstColumn="0" w:firstRowLastColumn="0" w:lastRowFirstColumn="0" w:lastRowLastColumn="0"/>
-              <w:rPr>
-                <w:color w:val="EE0000"/>
-                <w:sz w:val="20"/>
-                <w:szCs w:val="20"/>
-              </w:rPr>
-            </w:pPr>
-            <w:r>
-              <w:rPr>
-                <w:color w:val="EE0000"/>
-                <w:sz w:val="20"/>
-                <w:szCs w:val="20"/>
-              </w:rPr>
-              <w:t xml:space="preserve">As a developer, I have generated a </w:t>
-            </w:r>
-            <w:proofErr w:type="spellStart"/>
-            <w:r>
-              <w:rPr>
-                <w:color w:val="EE0000"/>
-                <w:sz w:val="20"/>
-                <w:szCs w:val="20"/>
-              </w:rPr>
-              <w:t>JaCoCo</w:t>
-            </w:r>
-            <w:proofErr w:type="spellEnd"/>
-            <w:r>
-              <w:rPr>
-                <w:color w:val="EE0000"/>
-                <w:sz w:val="20"/>
-                <w:szCs w:val="20"/>
-              </w:rPr>
-              <w:t xml:space="preserve"> coverage report so that we can measure test execution coverage and identify untested modules for the next cycle.</w:t>
-            </w:r>
-          </w:p>
-        </w:tc>
-        <w:tc>
-          <w:tcPr>
-            <w:tcW w:w="872" w:type="dxa"/>
-          </w:tcPr>
-          <w:p>
-            <w:pPr>
-              <w:ind w:firstLine="0"/>
-              <w:cnfStyle w:val="000000000000" w:firstRow="0" w:lastRow="0" w:firstColumn="0" w:lastColumn="0" w:oddVBand="0" w:evenVBand="0" w:oddHBand="0" w:evenHBand="0" w:firstRowFirstColumn="0" w:firstRowLastColumn="0" w:lastRowFirstColumn="0" w:lastRowLastColumn="0"/>
-              <w:rPr>
-                <w:color w:val="EE0000"/>
-                <w:sz w:val="20"/>
-                <w:szCs w:val="20"/>
-              </w:rPr>
-            </w:pPr>
-            <w:r>
-              <w:rPr>
-                <w:color w:val="EE0000"/>
-                <w:sz w:val="20"/>
-                <w:szCs w:val="20"/>
-              </w:rPr>
-              <w:t>All</w:t>
-            </w:r>
-          </w:p>
-        </w:tc>
-        <w:tc>
-          <w:tcPr>
-            <w:tcW w:w="958" w:type="dxa"/>
-          </w:tcPr>
-          <w:p>
-            <w:pPr>
-              <w:ind w:firstLine="0"/>
-              <w:cnfStyle w:val="000000000000" w:firstRow="0" w:lastRow="0" w:firstColumn="0" w:lastColumn="0" w:oddVBand="0" w:evenVBand="0" w:oddHBand="0" w:evenHBand="0" w:firstRowFirstColumn="0" w:firstRowLastColumn="0" w:lastRowFirstColumn="0" w:lastRowLastColumn="0"/>
-              <w:rPr>
-                <w:color w:val="EE0000"/>
-                <w:sz w:val="20"/>
-                <w:szCs w:val="20"/>
-              </w:rPr>
-            </w:pPr>
-            <w:r>
-              <w:rPr>
-                <w:color w:val="EE0000"/>
-                <w:sz w:val="20"/>
-                <w:szCs w:val="20"/>
-              </w:rPr>
-              <w:t>High</w:t>
-            </w:r>
-          </w:p>
-        </w:tc>
-        <w:tc>
-          <w:tcPr>
-            <w:tcW w:w="1261" w:type="dxa"/>
-          </w:tcPr>
-          <w:p>
-            <w:pPr>
-              <w:ind w:firstLine="0"/>
-              <w:cnfStyle w:val="000000000000" w:firstRow="0" w:lastRow="0" w:firstColumn="0" w:lastColumn="0" w:oddVBand="0" w:evenVBand="0" w:oddHBand="0" w:evenHBand="0" w:firstRowFirstColumn="0" w:firstRowLastColumn="0" w:lastRowFirstColumn="0" w:lastRowLastColumn="0"/>
-              <w:rPr>
-                <w:color w:val="EE0000"/>
-                <w:sz w:val="20"/>
-                <w:szCs w:val="20"/>
-              </w:rPr>
-            </w:pPr>
-            <w:r>
-              <w:rPr>
-                <w:color w:val="EE0000"/>
-                <w:sz w:val="20"/>
-                <w:szCs w:val="20"/>
-              </w:rPr>
-              <w:t>DS-09</w:t>
-            </w:r>
-          </w:p>
-        </w:tc>
-        <w:tc>
-          <w:tcPr>
-            <w:tcW w:w="861" w:type="dxa"/>
-          </w:tcPr>
-          <w:p>
-            <w:pPr>
-              <w:ind w:firstLine="0"/>
-              <w:cnfStyle w:val="000000000000" w:firstRow="0" w:lastRow="0" w:firstColumn="0" w:lastColumn="0" w:oddVBand="0" w:evenVBand="0" w:oddHBand="0" w:evenHBand="0" w:firstRowFirstColumn="0" w:firstRowLastColumn="0" w:lastRowFirstColumn="0" w:lastRowLastColumn="0"/>
-              <w:rPr>
-                <w:color w:val="EE0000"/>
-                <w:sz w:val="20"/>
-                <w:szCs w:val="20"/>
-              </w:rPr>
-            </w:pPr>
-            <w:r>
-              <w:rPr>
-                <w:color w:val="EE0000"/>
-                <w:sz w:val="20"/>
-                <w:szCs w:val="20"/>
-              </w:rPr>
-              <w:t>Done</w:t>
-            </w:r>
-          </w:p>
-        </w:tc>
-        <w:tc>
-          <w:tcPr>
-            <w:tcW w:w="894" w:type="dxa"/>
-          </w:tcPr>
-          <w:p>
-            <w:pPr>
-              <w:ind w:firstLine="0"/>
-              <w:cnfStyle w:val="000000000000" w:firstRow="0" w:lastRow="0" w:firstColumn="0" w:lastColumn="0" w:oddVBand="0" w:evenVBand="0" w:oddHBand="0" w:evenHBand="0" w:firstRowFirstColumn="0" w:firstRowLastColumn="0" w:lastRowFirstColumn="0" w:lastRowLastColumn="0"/>
-              <w:rPr>
-                <w:color w:val="EE0000"/>
-                <w:sz w:val="20"/>
-                <w:szCs w:val="20"/>
-              </w:rPr>
-            </w:pPr>
-            <w:r>
-              <w:rPr>
-                <w:color w:val="EE0000"/>
-                <w:sz w:val="20"/>
-                <w:szCs w:val="20"/>
-              </w:rPr>
-              <w:t>Iteration 3.1</w:t>
-            </w:r>
-          </w:p>
-        </w:tc>
-      </w:tr>
-      <w:tr>
-        <w:tc>
-          <w:tcPr>
-            <w:cnfStyle w:val="001000000000" w:firstRow="0" w:lastRow="0" w:firstColumn="1" w:lastColumn="0" w:oddVBand="0" w:evenVBand="0" w:oddHBand="0" w:evenHBand="0" w:firstRowFirstColumn="0" w:firstRowLastColumn="0" w:lastRowFirstColumn="0" w:lastRowLastColumn="0"/>
-            <w:tcW w:w="539" w:type="dxa"/>
-          </w:tcPr>
-          <w:p>
-            <w:pPr>
-              <w:ind w:firstLine="0"/>
-              <w:rPr>
-                <w:color w:val="EE0000"/>
-                <w:sz w:val="20"/>
-                <w:szCs w:val="20"/>
-              </w:rPr>
-            </w:pPr>
-            <w:r>
-              <w:rPr>
-                <w:color w:val="EE0000"/>
-                <w:sz w:val="20"/>
-                <w:szCs w:val="20"/>
-              </w:rPr>
-              <w:t>DS-11</w:t>
-            </w:r>
-          </w:p>
-        </w:tc>
-        <w:tc>
-          <w:tcPr>
-            <w:tcW w:w="3634" w:type="dxa"/>
-          </w:tcPr>
-          <w:p>
-            <w:pPr>
-              <w:ind w:firstLine="0"/>
-              <w:cnfStyle w:val="000000000000" w:firstRow="0" w:lastRow="0" w:firstColumn="0" w:lastColumn="0" w:oddVBand="0" w:evenVBand="0" w:oddHBand="0" w:evenHBand="0" w:firstRowFirstColumn="0" w:firstRowLastColumn="0" w:lastRowFirstColumn="0" w:lastRowLastColumn="0"/>
-              <w:rPr>
-                <w:color w:val="EE0000"/>
-                <w:sz w:val="20"/>
-                <w:szCs w:val="20"/>
-              </w:rPr>
-            </w:pPr>
-            <w:r>
-              <w:rPr>
-                <w:color w:val="EE0000"/>
-                <w:sz w:val="20"/>
-                <w:szCs w:val="20"/>
-              </w:rPr>
-              <w:t>As a developer, I have implemented a persistence layer (Storage interface + JSON save/load + integration) so that application data is saved and restored across sessions.</w:t>
-            </w:r>
-          </w:p>
-        </w:tc>
-        <w:tc>
-          <w:tcPr>
-            <w:tcW w:w="872" w:type="dxa"/>
-          </w:tcPr>
-          <w:p>
-            <w:pPr>
-              <w:ind w:firstLine="0"/>
-              <w:cnfStyle w:val="000000000000" w:firstRow="0" w:lastRow="0" w:firstColumn="0" w:lastColumn="0" w:oddVBand="0" w:evenVBand="0" w:oddHBand="0" w:evenHBand="0" w:firstRowFirstColumn="0" w:firstRowLastColumn="0" w:lastRowFirstColumn="0" w:lastRowLastColumn="0"/>
-              <w:rPr>
-                <w:color w:val="EE0000"/>
-                <w:sz w:val="20"/>
-                <w:szCs w:val="20"/>
-              </w:rPr>
-            </w:pPr>
-            <w:r>
-              <w:rPr>
-                <w:color w:val="EE0000"/>
-                <w:sz w:val="20"/>
-                <w:szCs w:val="20"/>
-              </w:rPr>
-              <w:t>US-8</w:t>
-            </w:r>
-          </w:p>
-        </w:tc>
-        <w:tc>
-          <w:tcPr>
-            <w:tcW w:w="958" w:type="dxa"/>
-          </w:tcPr>
-          <w:p>
-            <w:pPr>
-              <w:ind w:firstLine="0"/>
-              <w:cnfStyle w:val="000000000000" w:firstRow="0" w:lastRow="0" w:firstColumn="0" w:lastColumn="0" w:oddVBand="0" w:evenVBand="0" w:oddHBand="0" w:evenHBand="0" w:firstRowFirstColumn="0" w:firstRowLastColumn="0" w:lastRowFirstColumn="0" w:lastRowLastColumn="0"/>
-              <w:rPr>
-                <w:color w:val="EE0000"/>
-                <w:sz w:val="20"/>
-                <w:szCs w:val="20"/>
-              </w:rPr>
-            </w:pPr>
-            <w:r>
-              <w:rPr>
-                <w:color w:val="EE0000"/>
-                <w:sz w:val="20"/>
-                <w:szCs w:val="20"/>
-              </w:rPr>
-              <w:t>High</w:t>
-            </w:r>
-          </w:p>
-        </w:tc>
-        <w:tc>
-          <w:tcPr>
-            <w:tcW w:w="1261" w:type="dxa"/>
-          </w:tcPr>
-          <w:p>
-            <w:pPr>
-              <w:ind w:firstLine="0"/>
-              <w:cnfStyle w:val="000000000000" w:firstRow="0" w:lastRow="0" w:firstColumn="0" w:lastColumn="0" w:oddVBand="0" w:evenVBand="0" w:oddHBand="0" w:evenHBand="0" w:firstRowFirstColumn="0" w:firstRowLastColumn="0" w:lastRowFirstColumn="0" w:lastRowLastColumn="0"/>
-              <w:rPr>
-                <w:color w:val="EE0000"/>
-                <w:sz w:val="20"/>
-                <w:szCs w:val="20"/>
-              </w:rPr>
-            </w:pPr>
-            <w:r>
-              <w:rPr>
-                <w:color w:val="EE0000"/>
-                <w:sz w:val="20"/>
-                <w:szCs w:val="20"/>
-              </w:rPr>
-              <w:t>DS-01</w:t>
-            </w:r>
-          </w:p>
-        </w:tc>
-        <w:tc>
-          <w:tcPr>
-            <w:tcW w:w="861" w:type="dxa"/>
-          </w:tcPr>
-          <w:p>
-            <w:pPr>
-              <w:ind w:firstLine="0"/>
-              <w:cnfStyle w:val="000000000000" w:firstRow="0" w:lastRow="0" w:firstColumn="0" w:lastColumn="0" w:oddVBand="0" w:evenVBand="0" w:oddHBand="0" w:evenHBand="0" w:firstRowFirstColumn="0" w:firstRowLastColumn="0" w:lastRowFirstColumn="0" w:lastRowLastColumn="0"/>
-              <w:rPr>
-                <w:color w:val="EE0000"/>
-                <w:sz w:val="20"/>
-                <w:szCs w:val="20"/>
-              </w:rPr>
-            </w:pPr>
-            <w:r>
-              <w:rPr>
-                <w:color w:val="EE0000"/>
-                <w:sz w:val="20"/>
-                <w:szCs w:val="20"/>
-              </w:rPr>
-              <w:t>To Do</w:t>
-            </w:r>
-          </w:p>
-        </w:tc>
-        <w:tc>
-          <w:tcPr>
-            <w:tcW w:w="894" w:type="dxa"/>
-          </w:tcPr>
-          <w:p>
-            <w:pPr>
-              <w:ind w:firstLine="0"/>
-              <w:cnfStyle w:val="000000000000" w:firstRow="0" w:lastRow="0" w:firstColumn="0" w:lastColumn="0" w:oddVBand="0" w:evenVBand="0" w:oddHBand="0" w:evenHBand="0" w:firstRowFirstColumn="0" w:firstRowLastColumn="0" w:lastRowFirstColumn="0" w:lastRowLastColumn="0"/>
-              <w:rPr>
-                <w:color w:val="EE0000"/>
-                <w:sz w:val="20"/>
-                <w:szCs w:val="20"/>
-              </w:rPr>
-            </w:pPr>
-            <w:r>
-              <w:rPr>
-                <w:color w:val="EE0000"/>
-                <w:sz w:val="20"/>
-                <w:szCs w:val="20"/>
-              </w:rPr>
-              <w:t>Iteration 3.2</w:t>
-            </w:r>
-          </w:p>
-        </w:tc>
-      </w:tr>
-      <w:tr>
-        <w:tc>
-          <w:tcPr>
-            <w:cnfStyle w:val="001000000000" w:firstRow="0" w:lastRow="0" w:firstColumn="1" w:lastColumn="0" w:oddVBand="0" w:evenVBand="0" w:oddHBand="0" w:evenHBand="0" w:firstRowFirstColumn="0" w:firstRowLastColumn="0" w:lastRowFirstColumn="0" w:lastRowLastColumn="0"/>
-            <w:tcW w:w="539" w:type="dxa"/>
-          </w:tcPr>
-          <w:p>
-            <w:pPr>
-              <w:ind w:firstLine="0"/>
-              <w:rPr>
-                <w:color w:val="EE0000"/>
-                <w:sz w:val="20"/>
-                <w:szCs w:val="20"/>
-              </w:rPr>
-            </w:pPr>
-            <w:r>
-              <w:rPr>
-                <w:color w:val="EE0000"/>
-                <w:sz w:val="20"/>
-                <w:szCs w:val="20"/>
-              </w:rPr>
-              <w:t>DS-12</w:t>
-            </w:r>
-          </w:p>
-        </w:tc>
-        <w:tc>
-          <w:tcPr>
-            <w:tcW w:w="3634" w:type="dxa"/>
-          </w:tcPr>
-          <w:p>
-            <w:pPr>
-              <w:ind w:firstLine="0"/>
-              <w:cnfStyle w:val="000000000000" w:firstRow="0" w:lastRow="0" w:firstColumn="0" w:lastColumn="0" w:oddVBand="0" w:evenVBand="0" w:oddHBand="0" w:evenHBand="0" w:firstRowFirstColumn="0" w:firstRowLastColumn="0" w:lastRowFirstColumn="0" w:lastRowLastColumn="0"/>
-              <w:rPr>
-                <w:color w:val="EE0000"/>
-                <w:sz w:val="20"/>
-                <w:szCs w:val="20"/>
-              </w:rPr>
-            </w:pPr>
-            <w:r>
-              <w:rPr>
-                <w:color w:val="EE0000"/>
-                <w:sz w:val="20"/>
-                <w:szCs w:val="20"/>
-              </w:rPr>
-              <w:t>As a developer, I have implemented loading saved data on startup so that users automatically see their saved transactions and budgets when launching the application.</w:t>
-            </w:r>
-          </w:p>
-        </w:tc>
-        <w:tc>
-          <w:tcPr>
-            <w:tcW w:w="872" w:type="dxa"/>
-          </w:tcPr>
-          <w:p>
-            <w:pPr>
-              <w:ind w:firstLine="0"/>
-              <w:cnfStyle w:val="000000000000" w:firstRow="0" w:lastRow="0" w:firstColumn="0" w:lastColumn="0" w:oddVBand="0" w:evenVBand="0" w:oddHBand="0" w:evenHBand="0" w:firstRowFirstColumn="0" w:firstRowLastColumn="0" w:lastRowFirstColumn="0" w:lastRowLastColumn="0"/>
-              <w:rPr>
-                <w:color w:val="EE0000"/>
-                <w:sz w:val="20"/>
-                <w:szCs w:val="20"/>
-              </w:rPr>
-            </w:pPr>
-            <w:r>
-              <w:rPr>
-                <w:color w:val="EE0000"/>
-                <w:sz w:val="20"/>
-                <w:szCs w:val="20"/>
-              </w:rPr>
-              <w:t>US-8</w:t>
-            </w:r>
-          </w:p>
-        </w:tc>
-        <w:tc>
-          <w:tcPr>
-            <w:tcW w:w="958" w:type="dxa"/>
-          </w:tcPr>
-          <w:p>
-            <w:pPr>
-              <w:ind w:firstLine="0"/>
-              <w:cnfStyle w:val="000000000000" w:firstRow="0" w:lastRow="0" w:firstColumn="0" w:lastColumn="0" w:oddVBand="0" w:evenVBand="0" w:oddHBand="0" w:evenHBand="0" w:firstRowFirstColumn="0" w:firstRowLastColumn="0" w:lastRowFirstColumn="0" w:lastRowLastColumn="0"/>
-              <w:rPr>
-                <w:color w:val="EE0000"/>
-                <w:sz w:val="20"/>
-                <w:szCs w:val="20"/>
-              </w:rPr>
-            </w:pPr>
-            <w:r>
-              <w:rPr>
-                <w:color w:val="EE0000"/>
-                <w:sz w:val="20"/>
-                <w:szCs w:val="20"/>
-              </w:rPr>
-              <w:t>High</w:t>
-            </w:r>
-          </w:p>
-        </w:tc>
-        <w:tc>
-          <w:tcPr>
-            <w:tcW w:w="1261" w:type="dxa"/>
-          </w:tcPr>
-          <w:p>
-            <w:pPr>
-              <w:ind w:firstLine="0"/>
-              <w:cnfStyle w:val="000000000000" w:firstRow="0" w:lastRow="0" w:firstColumn="0" w:lastColumn="0" w:oddVBand="0" w:evenVBand="0" w:oddHBand="0" w:evenHBand="0" w:firstRowFirstColumn="0" w:firstRowLastColumn="0" w:lastRowFirstColumn="0" w:lastRowLastColumn="0"/>
-              <w:rPr>
-                <w:color w:val="EE0000"/>
-                <w:sz w:val="20"/>
-                <w:szCs w:val="20"/>
-              </w:rPr>
-            </w:pPr>
-            <w:r>
-              <w:rPr>
-                <w:color w:val="EE0000"/>
-                <w:sz w:val="20"/>
-                <w:szCs w:val="20"/>
-              </w:rPr>
-              <w:t>DS-11</w:t>
-            </w:r>
-          </w:p>
-        </w:tc>
-        <w:tc>
-          <w:tcPr>
-            <w:tcW w:w="861" w:type="dxa"/>
-          </w:tcPr>
-          <w:p>
-            <w:pPr>
-              <w:ind w:firstLine="0"/>
-              <w:cnfStyle w:val="000000000000" w:firstRow="0" w:lastRow="0" w:firstColumn="0" w:lastColumn="0" w:oddVBand="0" w:evenVBand="0" w:oddHBand="0" w:evenHBand="0" w:firstRowFirstColumn="0" w:firstRowLastColumn="0" w:lastRowFirstColumn="0" w:lastRowLastColumn="0"/>
-              <w:rPr>
-                <w:color w:val="EE0000"/>
-                <w:sz w:val="20"/>
-                <w:szCs w:val="20"/>
-              </w:rPr>
-            </w:pPr>
-            <w:r>
-              <w:rPr>
-                <w:color w:val="EE0000"/>
-                <w:sz w:val="20"/>
-                <w:szCs w:val="20"/>
-              </w:rPr>
-              <w:t>To Do</w:t>
-            </w:r>
-          </w:p>
-        </w:tc>
-        <w:tc>
-          <w:tcPr>
-            <w:tcW w:w="894" w:type="dxa"/>
-          </w:tcPr>
-          <w:p>
-            <w:pPr>
-              <w:ind w:firstLine="0"/>
-              <w:cnfStyle w:val="000000000000" w:firstRow="0" w:lastRow="0" w:firstColumn="0" w:lastColumn="0" w:oddVBand="0" w:evenVBand="0" w:oddHBand="0" w:evenHBand="0" w:firstRowFirstColumn="0" w:firstRowLastColumn="0" w:lastRowFirstColumn="0" w:lastRowLastColumn="0"/>
-              <w:rPr>
-                <w:color w:val="EE0000"/>
-                <w:sz w:val="20"/>
-                <w:szCs w:val="20"/>
-              </w:rPr>
-            </w:pPr>
-            <w:r>
-              <w:rPr>
-                <w:color w:val="EE0000"/>
-                <w:sz w:val="20"/>
-                <w:szCs w:val="20"/>
-              </w:rPr>
-              <w:t>Iteration 3.2</w:t>
-            </w:r>
-          </w:p>
-        </w:tc>
-      </w:tr>
-      <w:tr>
-        <w:tc>
-          <w:tcPr>
-            <w:cnfStyle w:val="001000000000" w:firstRow="0" w:lastRow="0" w:firstColumn="1" w:lastColumn="0" w:oddVBand="0" w:evenVBand="0" w:oddHBand="0" w:evenHBand="0" w:firstRowFirstColumn="0" w:firstRowLastColumn="0" w:lastRowFirstColumn="0" w:lastRowLastColumn="0"/>
-            <w:tcW w:w="539" w:type="dxa"/>
-          </w:tcPr>
-          <w:p>
-            <w:pPr>
-              <w:ind w:firstLine="0"/>
-              <w:rPr>
-                <w:color w:val="EE0000"/>
-                <w:sz w:val="20"/>
-                <w:szCs w:val="20"/>
-              </w:rPr>
-            </w:pPr>
-            <w:r>
-              <w:rPr>
-                <w:color w:val="EE0000"/>
-                <w:sz w:val="20"/>
-                <w:szCs w:val="20"/>
-              </w:rPr>
-              <w:t>DS-13</w:t>
-            </w:r>
-          </w:p>
-        </w:tc>
-        <w:tc>
-          <w:tcPr>
-            <w:tcW w:w="3634" w:type="dxa"/>
-          </w:tcPr>
-          <w:p>
-            <w:pPr>
-              <w:ind w:firstLine="0"/>
-              <w:cnfStyle w:val="000000000000" w:firstRow="0" w:lastRow="0" w:firstColumn="0" w:lastColumn="0" w:oddVBand="0" w:evenVBand="0" w:oddHBand="0" w:evenHBand="0" w:firstRowFirstColumn="0" w:firstRowLastColumn="0" w:lastRowFirstColumn="0" w:lastRowLastColumn="0"/>
-              <w:rPr>
-                <w:color w:val="EE0000"/>
-                <w:sz w:val="20"/>
-                <w:szCs w:val="20"/>
-              </w:rPr>
-            </w:pPr>
-            <w:r>
-              <w:rPr>
-                <w:color w:val="EE0000"/>
-                <w:sz w:val="20"/>
-                <w:szCs w:val="20"/>
-              </w:rPr>
-              <w:t xml:space="preserve">As a developer, I have written unit tests for persistence (save/load correctness + restart regression tests) so that persistence </w:t>
-            </w:r>
-            <w:proofErr w:type="spellStart"/>
-            <w:r>
-              <w:rPr>
-                <w:color w:val="EE0000"/>
-                <w:sz w:val="20"/>
-                <w:szCs w:val="20"/>
-              </w:rPr>
-              <w:t>behavior</w:t>
-            </w:r>
-            <w:proofErr w:type="spellEnd"/>
-            <w:r>
-              <w:rPr>
-                <w:color w:val="EE0000"/>
-                <w:sz w:val="20"/>
-                <w:szCs w:val="20"/>
-              </w:rPr>
-              <w:t xml:space="preserve"> is reliable and does not break existing features.</w:t>
-            </w:r>
-          </w:p>
-        </w:tc>
-        <w:tc>
-          <w:tcPr>
-            <w:tcW w:w="872" w:type="dxa"/>
-          </w:tcPr>
-          <w:p>
-            <w:pPr>
-              <w:ind w:firstLine="0"/>
-              <w:cnfStyle w:val="000000000000" w:firstRow="0" w:lastRow="0" w:firstColumn="0" w:lastColumn="0" w:oddVBand="0" w:evenVBand="0" w:oddHBand="0" w:evenHBand="0" w:firstRowFirstColumn="0" w:firstRowLastColumn="0" w:lastRowFirstColumn="0" w:lastRowLastColumn="0"/>
-              <w:rPr>
-                <w:color w:val="EE0000"/>
-                <w:sz w:val="20"/>
-                <w:szCs w:val="20"/>
-              </w:rPr>
-            </w:pPr>
-            <w:r>
-              <w:rPr>
-                <w:color w:val="EE0000"/>
-                <w:sz w:val="20"/>
-                <w:szCs w:val="20"/>
-              </w:rPr>
-              <w:t>US-8</w:t>
-            </w:r>
-          </w:p>
-        </w:tc>
-        <w:tc>
-          <w:tcPr>
-            <w:tcW w:w="958" w:type="dxa"/>
-          </w:tcPr>
-          <w:p>
-            <w:pPr>
-              <w:ind w:firstLine="0"/>
-              <w:cnfStyle w:val="000000000000" w:firstRow="0" w:lastRow="0" w:firstColumn="0" w:lastColumn="0" w:oddVBand="0" w:evenVBand="0" w:oddHBand="0" w:evenHBand="0" w:firstRowFirstColumn="0" w:firstRowLastColumn="0" w:lastRowFirstColumn="0" w:lastRowLastColumn="0"/>
-              <w:rPr>
-                <w:color w:val="EE0000"/>
-                <w:sz w:val="20"/>
-                <w:szCs w:val="20"/>
-              </w:rPr>
-            </w:pPr>
-            <w:r>
-              <w:rPr>
-                <w:color w:val="EE0000"/>
-                <w:sz w:val="20"/>
-                <w:szCs w:val="20"/>
-              </w:rPr>
-              <w:t>High</w:t>
-            </w:r>
-          </w:p>
-        </w:tc>
-        <w:tc>
-          <w:tcPr>
-            <w:tcW w:w="1261" w:type="dxa"/>
-          </w:tcPr>
-          <w:p>
-            <w:pPr>
-              <w:ind w:firstLine="0"/>
-              <w:cnfStyle w:val="000000000000" w:firstRow="0" w:lastRow="0" w:firstColumn="0" w:lastColumn="0" w:oddVBand="0" w:evenVBand="0" w:oddHBand="0" w:evenHBand="0" w:firstRowFirstColumn="0" w:firstRowLastColumn="0" w:lastRowFirstColumn="0" w:lastRowLastColumn="0"/>
-              <w:rPr>
-                <w:color w:val="EE0000"/>
-                <w:sz w:val="20"/>
-                <w:szCs w:val="20"/>
-              </w:rPr>
-            </w:pPr>
-            <w:r>
-              <w:rPr>
-                <w:color w:val="EE0000"/>
-                <w:sz w:val="20"/>
-                <w:szCs w:val="20"/>
-              </w:rPr>
-              <w:t>DS-11, DS-12</w:t>
-            </w:r>
-          </w:p>
-        </w:tc>
-        <w:tc>
-          <w:tcPr>
-            <w:tcW w:w="861" w:type="dxa"/>
-          </w:tcPr>
-          <w:p>
-            <w:pPr>
-              <w:ind w:firstLine="0"/>
-              <w:cnfStyle w:val="000000000000" w:firstRow="0" w:lastRow="0" w:firstColumn="0" w:lastColumn="0" w:oddVBand="0" w:evenVBand="0" w:oddHBand="0" w:evenHBand="0" w:firstRowFirstColumn="0" w:firstRowLastColumn="0" w:lastRowFirstColumn="0" w:lastRowLastColumn="0"/>
-              <w:rPr>
-                <w:color w:val="EE0000"/>
-                <w:sz w:val="20"/>
-                <w:szCs w:val="20"/>
-              </w:rPr>
-            </w:pPr>
-            <w:r>
-              <w:rPr>
-                <w:color w:val="EE0000"/>
-                <w:sz w:val="20"/>
-                <w:szCs w:val="20"/>
-              </w:rPr>
-              <w:t>To Do</w:t>
-            </w:r>
-          </w:p>
-        </w:tc>
-        <w:tc>
-          <w:tcPr>
-            <w:tcW w:w="894" w:type="dxa"/>
-          </w:tcPr>
-          <w:p>
-            <w:pPr>
-              <w:ind w:firstLine="0"/>
-              <w:cnfStyle w:val="000000000000" w:firstRow="0" w:lastRow="0" w:firstColumn="0" w:lastColumn="0" w:oddVBand="0" w:evenVBand="0" w:oddHBand="0" w:evenHBand="0" w:firstRowFirstColumn="0" w:firstRowLastColumn="0" w:lastRowFirstColumn="0" w:lastRowLastColumn="0"/>
-              <w:rPr>
-                <w:color w:val="EE0000"/>
-                <w:sz w:val="20"/>
-                <w:szCs w:val="20"/>
-              </w:rPr>
-            </w:pPr>
-            <w:r>
-              <w:rPr>
-                <w:color w:val="EE0000"/>
-                <w:sz w:val="20"/>
-                <w:szCs w:val="20"/>
-              </w:rPr>
-              <w:t>Iteration 3.2</w:t>
-            </w:r>
-          </w:p>
-        </w:tc>
-      </w:tr>
-      <w:tr>
-        <w:tc>
-          <w:tcPr>
-            <w:cnfStyle w:val="001000000000" w:firstRow="0" w:lastRow="0" w:firstColumn="1" w:lastColumn="0" w:oddVBand="0" w:evenVBand="0" w:oddHBand="0" w:evenHBand="0" w:firstRowFirstColumn="0" w:firstRowLastColumn="0" w:lastRowFirstColumn="0" w:lastRowLastColumn="0"/>
-            <w:tcW w:w="539" w:type="dxa"/>
-          </w:tcPr>
-          <w:p>
-            <w:pPr>
-              <w:ind w:firstLine="0"/>
-              <w:rPr>
-                <w:color w:val="EE0000"/>
-                <w:sz w:val="20"/>
-                <w:szCs w:val="20"/>
-              </w:rPr>
-            </w:pPr>
-            <w:r>
-              <w:rPr>
-                <w:color w:val="EE0000"/>
-                <w:sz w:val="20"/>
-                <w:szCs w:val="20"/>
-              </w:rPr>
-              <w:t>DS-14</w:t>
-            </w:r>
-          </w:p>
-        </w:tc>
-        <w:tc>
-          <w:tcPr>
-            <w:tcW w:w="3634" w:type="dxa"/>
-          </w:tcPr>
-          <w:p>
-            <w:pPr>
-              <w:ind w:firstLine="0"/>
-              <w:cnfStyle w:val="000000000000" w:firstRow="0" w:lastRow="0" w:firstColumn="0" w:lastColumn="0" w:oddVBand="0" w:evenVBand="0" w:oddHBand="0" w:evenHBand="0" w:firstRowFirstColumn="0" w:firstRowLastColumn="0" w:lastRowFirstColumn="0" w:lastRowLastColumn="0"/>
-              <w:rPr>
-                <w:color w:val="EE0000"/>
-                <w:sz w:val="20"/>
-                <w:szCs w:val="20"/>
-              </w:rPr>
-            </w:pPr>
-            <w:r>
-              <w:rPr>
-                <w:color w:val="EE0000"/>
-                <w:sz w:val="20"/>
-                <w:szCs w:val="20"/>
-              </w:rPr>
-              <w:t xml:space="preserve">As a developer, I have added unit tests for </w:t>
-            </w:r>
-            <w:proofErr w:type="spellStart"/>
-            <w:r>
-              <w:rPr>
-                <w:color w:val="EE0000"/>
-                <w:sz w:val="20"/>
-                <w:szCs w:val="20"/>
-              </w:rPr>
-              <w:t>AlertService</w:t>
-            </w:r>
-            <w:proofErr w:type="spellEnd"/>
-            <w:r>
-              <w:rPr>
-                <w:color w:val="EE0000"/>
-                <w:sz w:val="20"/>
-                <w:szCs w:val="20"/>
-              </w:rPr>
-              <w:t xml:space="preserve"> so that overspending alert rules (including boundary cases) are verified and UC-6 is validated.</w:t>
-            </w:r>
-          </w:p>
-        </w:tc>
-        <w:tc>
-          <w:tcPr>
-            <w:tcW w:w="872" w:type="dxa"/>
-          </w:tcPr>
-          <w:p>
-            <w:pPr>
-              <w:ind w:firstLine="0"/>
-              <w:cnfStyle w:val="000000000000" w:firstRow="0" w:lastRow="0" w:firstColumn="0" w:lastColumn="0" w:oddVBand="0" w:evenVBand="0" w:oddHBand="0" w:evenHBand="0" w:firstRowFirstColumn="0" w:firstRowLastColumn="0" w:lastRowFirstColumn="0" w:lastRowLastColumn="0"/>
-              <w:rPr>
-                <w:color w:val="EE0000"/>
-                <w:sz w:val="20"/>
-                <w:szCs w:val="20"/>
-              </w:rPr>
-            </w:pPr>
-            <w:r>
-              <w:rPr>
-                <w:color w:val="EE0000"/>
-                <w:sz w:val="20"/>
-                <w:szCs w:val="20"/>
-              </w:rPr>
-              <w:t>US-5</w:t>
-            </w:r>
-          </w:p>
-        </w:tc>
-        <w:tc>
-          <w:tcPr>
-            <w:tcW w:w="958" w:type="dxa"/>
-          </w:tcPr>
-          <w:p>
-            <w:pPr>
-              <w:ind w:firstLine="0"/>
-              <w:cnfStyle w:val="000000000000" w:firstRow="0" w:lastRow="0" w:firstColumn="0" w:lastColumn="0" w:oddVBand="0" w:evenVBand="0" w:oddHBand="0" w:evenHBand="0" w:firstRowFirstColumn="0" w:firstRowLastColumn="0" w:lastRowFirstColumn="0" w:lastRowLastColumn="0"/>
-              <w:rPr>
-                <w:color w:val="EE0000"/>
-                <w:sz w:val="20"/>
-                <w:szCs w:val="20"/>
-              </w:rPr>
-            </w:pPr>
-            <w:r>
-              <w:rPr>
-                <w:color w:val="EE0000"/>
-                <w:sz w:val="20"/>
-                <w:szCs w:val="20"/>
-              </w:rPr>
-              <w:t>Medium</w:t>
-            </w:r>
-          </w:p>
-        </w:tc>
-        <w:tc>
-          <w:tcPr>
-            <w:tcW w:w="1261" w:type="dxa"/>
-          </w:tcPr>
-          <w:p>
-            <w:pPr>
-              <w:ind w:firstLine="0"/>
-              <w:cnfStyle w:val="000000000000" w:firstRow="0" w:lastRow="0" w:firstColumn="0" w:lastColumn="0" w:oddVBand="0" w:evenVBand="0" w:oddHBand="0" w:evenHBand="0" w:firstRowFirstColumn="0" w:firstRowLastColumn="0" w:lastRowFirstColumn="0" w:lastRowLastColumn="0"/>
-              <w:rPr>
-                <w:color w:val="EE0000"/>
-                <w:sz w:val="20"/>
-                <w:szCs w:val="20"/>
-              </w:rPr>
-            </w:pPr>
-            <w:r>
-              <w:rPr>
-                <w:color w:val="EE0000"/>
-                <w:sz w:val="20"/>
-                <w:szCs w:val="20"/>
-              </w:rPr>
-              <w:t>DS-05</w:t>
-            </w:r>
-          </w:p>
-        </w:tc>
-        <w:tc>
-          <w:tcPr>
-            <w:tcW w:w="861" w:type="dxa"/>
-          </w:tcPr>
-          <w:p>
-            <w:pPr>
-              <w:ind w:firstLine="0"/>
-              <w:cnfStyle w:val="000000000000" w:firstRow="0" w:lastRow="0" w:firstColumn="0" w:lastColumn="0" w:oddVBand="0" w:evenVBand="0" w:oddHBand="0" w:evenHBand="0" w:firstRowFirstColumn="0" w:firstRowLastColumn="0" w:lastRowFirstColumn="0" w:lastRowLastColumn="0"/>
-              <w:rPr>
-                <w:color w:val="EE0000"/>
-                <w:sz w:val="20"/>
-                <w:szCs w:val="20"/>
-              </w:rPr>
-            </w:pPr>
-            <w:r>
-              <w:rPr>
-                <w:color w:val="EE0000"/>
-                <w:sz w:val="20"/>
-                <w:szCs w:val="20"/>
-              </w:rPr>
-              <w:t>To Do</w:t>
-            </w:r>
-          </w:p>
-        </w:tc>
-        <w:tc>
-          <w:tcPr>
-            <w:tcW w:w="894" w:type="dxa"/>
-          </w:tcPr>
-          <w:p>
-            <w:pPr>
-              <w:ind w:firstLine="0"/>
-              <w:cnfStyle w:val="000000000000" w:firstRow="0" w:lastRow="0" w:firstColumn="0" w:lastColumn="0" w:oddVBand="0" w:evenVBand="0" w:oddHBand="0" w:evenHBand="0" w:firstRowFirstColumn="0" w:firstRowLastColumn="0" w:lastRowFirstColumn="0" w:lastRowLastColumn="0"/>
-              <w:rPr>
-                <w:color w:val="EE0000"/>
-                <w:sz w:val="20"/>
-                <w:szCs w:val="20"/>
-              </w:rPr>
-            </w:pPr>
-            <w:r>
-              <w:rPr>
-                <w:color w:val="EE0000"/>
-                <w:sz w:val="20"/>
-                <w:szCs w:val="20"/>
-              </w:rPr>
-              <w:t>Iteration 3.2</w:t>
-            </w:r>
-          </w:p>
-        </w:tc>
-      </w:tr>
-      <w:tr>
-        <w:tc>
-          <w:tcPr>
-            <w:cnfStyle w:val="001000000000" w:firstRow="0" w:lastRow="0" w:firstColumn="1" w:lastColumn="0" w:oddVBand="0" w:evenVBand="0" w:oddHBand="0" w:evenHBand="0" w:firstRowFirstColumn="0" w:firstRowLastColumn="0" w:lastRowFirstColumn="0" w:lastRowLastColumn="0"/>
-            <w:tcW w:w="539" w:type="dxa"/>
-          </w:tcPr>
-          <w:p>
-            <w:pPr>
-              <w:ind w:firstLine="0"/>
-              <w:rPr>
-                <w:color w:val="EE0000"/>
-                <w:sz w:val="20"/>
-                <w:szCs w:val="20"/>
-              </w:rPr>
-            </w:pPr>
-            <w:r>
-              <w:rPr>
-                <w:color w:val="EE0000"/>
-                <w:sz w:val="20"/>
-                <w:szCs w:val="20"/>
-              </w:rPr>
-              <w:t>DS-15</w:t>
-            </w:r>
-          </w:p>
-        </w:tc>
-        <w:tc>
-          <w:tcPr>
-            <w:tcW w:w="3634" w:type="dxa"/>
-          </w:tcPr>
-          <w:p>
-            <w:pPr>
-              <w:ind w:firstLine="0"/>
-              <w:cnfStyle w:val="000000000000" w:firstRow="0" w:lastRow="0" w:firstColumn="0" w:lastColumn="0" w:oddVBand="0" w:evenVBand="0" w:oddHBand="0" w:evenHBand="0" w:firstRowFirstColumn="0" w:firstRowLastColumn="0" w:lastRowFirstColumn="0" w:lastRowLastColumn="0"/>
-              <w:rPr>
-                <w:color w:val="EE0000"/>
-                <w:sz w:val="20"/>
-                <w:szCs w:val="20"/>
-              </w:rPr>
-            </w:pPr>
-            <w:r>
-              <w:rPr>
-                <w:color w:val="EE0000"/>
-                <w:sz w:val="20"/>
-                <w:szCs w:val="20"/>
-              </w:rPr>
-              <w:t xml:space="preserve">As a developer, I have added unit tests for </w:t>
-            </w:r>
-            <w:proofErr w:type="spellStart"/>
-            <w:r>
-              <w:rPr>
-                <w:color w:val="EE0000"/>
-                <w:sz w:val="20"/>
-                <w:szCs w:val="20"/>
-              </w:rPr>
-              <w:t>ReportService</w:t>
-            </w:r>
-            <w:proofErr w:type="spellEnd"/>
-            <w:r>
-              <w:rPr>
-                <w:color w:val="EE0000"/>
-                <w:sz w:val="20"/>
-                <w:szCs w:val="20"/>
-              </w:rPr>
-              <w:t xml:space="preserve"> and </w:t>
-            </w:r>
-            <w:proofErr w:type="spellStart"/>
-            <w:r>
-              <w:rPr>
-                <w:color w:val="EE0000"/>
-                <w:sz w:val="20"/>
-                <w:szCs w:val="20"/>
-              </w:rPr>
-              <w:t>PeriodRange</w:t>
-            </w:r>
-            <w:proofErr w:type="spellEnd"/>
-            <w:r>
-              <w:rPr>
-                <w:color w:val="EE0000"/>
-                <w:sz w:val="20"/>
-                <w:szCs w:val="20"/>
-              </w:rPr>
-              <w:t xml:space="preserve"> so that report calculations, date range validation, and empty-result </w:t>
-            </w:r>
-            <w:proofErr w:type="spellStart"/>
-            <w:r>
-              <w:rPr>
-                <w:color w:val="EE0000"/>
-                <w:sz w:val="20"/>
-                <w:szCs w:val="20"/>
-              </w:rPr>
-              <w:t>behavior</w:t>
-            </w:r>
-            <w:proofErr w:type="spellEnd"/>
-            <w:r>
-              <w:rPr>
-                <w:color w:val="EE0000"/>
-                <w:sz w:val="20"/>
-                <w:szCs w:val="20"/>
-              </w:rPr>
-              <w:t xml:space="preserve"> are correct and UC-5 is validated.</w:t>
-            </w:r>
-          </w:p>
-        </w:tc>
-        <w:tc>
-          <w:tcPr>
-            <w:tcW w:w="872" w:type="dxa"/>
-          </w:tcPr>
-          <w:p>
-            <w:pPr>
-              <w:ind w:firstLine="0"/>
-              <w:cnfStyle w:val="000000000000" w:firstRow="0" w:lastRow="0" w:firstColumn="0" w:lastColumn="0" w:oddVBand="0" w:evenVBand="0" w:oddHBand="0" w:evenHBand="0" w:firstRowFirstColumn="0" w:firstRowLastColumn="0" w:lastRowFirstColumn="0" w:lastRowLastColumn="0"/>
-              <w:rPr>
-                <w:color w:val="EE0000"/>
-                <w:sz w:val="20"/>
-                <w:szCs w:val="20"/>
-              </w:rPr>
-            </w:pPr>
-            <w:r>
-              <w:rPr>
-                <w:color w:val="EE0000"/>
-                <w:sz w:val="20"/>
-                <w:szCs w:val="20"/>
-              </w:rPr>
-              <w:t>US-6</w:t>
-            </w:r>
-          </w:p>
-        </w:tc>
-        <w:tc>
-          <w:tcPr>
-            <w:tcW w:w="958" w:type="dxa"/>
-          </w:tcPr>
-          <w:p>
-            <w:pPr>
-              <w:ind w:firstLine="0"/>
-              <w:cnfStyle w:val="000000000000" w:firstRow="0" w:lastRow="0" w:firstColumn="0" w:lastColumn="0" w:oddVBand="0" w:evenVBand="0" w:oddHBand="0" w:evenHBand="0" w:firstRowFirstColumn="0" w:firstRowLastColumn="0" w:lastRowFirstColumn="0" w:lastRowLastColumn="0"/>
-              <w:rPr>
-                <w:color w:val="EE0000"/>
-                <w:sz w:val="20"/>
-                <w:szCs w:val="20"/>
-              </w:rPr>
-            </w:pPr>
-            <w:r>
-              <w:rPr>
-                <w:color w:val="EE0000"/>
-                <w:sz w:val="20"/>
-                <w:szCs w:val="20"/>
-              </w:rPr>
-              <w:t>Medium</w:t>
-            </w:r>
-          </w:p>
-        </w:tc>
-        <w:tc>
-          <w:tcPr>
-            <w:tcW w:w="1261" w:type="dxa"/>
-          </w:tcPr>
-          <w:p>
-            <w:pPr>
-              <w:ind w:firstLine="0"/>
-              <w:cnfStyle w:val="000000000000" w:firstRow="0" w:lastRow="0" w:firstColumn="0" w:lastColumn="0" w:oddVBand="0" w:evenVBand="0" w:oddHBand="0" w:evenHBand="0" w:firstRowFirstColumn="0" w:firstRowLastColumn="0" w:lastRowFirstColumn="0" w:lastRowLastColumn="0"/>
-              <w:rPr>
-                <w:color w:val="EE0000"/>
-                <w:sz w:val="20"/>
-                <w:szCs w:val="20"/>
-              </w:rPr>
-            </w:pPr>
-            <w:r>
-              <w:rPr>
-                <w:color w:val="EE0000"/>
-                <w:sz w:val="20"/>
-                <w:szCs w:val="20"/>
-              </w:rPr>
-              <w:t>DS-06</w:t>
-            </w:r>
-          </w:p>
-        </w:tc>
-        <w:tc>
-          <w:tcPr>
-            <w:tcW w:w="861" w:type="dxa"/>
-          </w:tcPr>
-          <w:p>
-            <w:pPr>
-              <w:ind w:firstLine="0"/>
-              <w:cnfStyle w:val="000000000000" w:firstRow="0" w:lastRow="0" w:firstColumn="0" w:lastColumn="0" w:oddVBand="0" w:evenVBand="0" w:oddHBand="0" w:evenHBand="0" w:firstRowFirstColumn="0" w:firstRowLastColumn="0" w:lastRowFirstColumn="0" w:lastRowLastColumn="0"/>
-              <w:rPr>
-                <w:color w:val="EE0000"/>
-                <w:sz w:val="20"/>
-                <w:szCs w:val="20"/>
-              </w:rPr>
-            </w:pPr>
-            <w:r>
-              <w:rPr>
-                <w:color w:val="EE0000"/>
-                <w:sz w:val="20"/>
-                <w:szCs w:val="20"/>
-              </w:rPr>
-              <w:t>To Do</w:t>
-            </w:r>
-          </w:p>
-        </w:tc>
-        <w:tc>
-          <w:tcPr>
-            <w:tcW w:w="894" w:type="dxa"/>
-          </w:tcPr>
-          <w:p>
-            <w:pPr>
-              <w:ind w:firstLine="0"/>
-              <w:cnfStyle w:val="000000000000" w:firstRow="0" w:lastRow="0" w:firstColumn="0" w:lastColumn="0" w:oddVBand="0" w:evenVBand="0" w:oddHBand="0" w:evenHBand="0" w:firstRowFirstColumn="0" w:firstRowLastColumn="0" w:lastRowFirstColumn="0" w:lastRowLastColumn="0"/>
-              <w:rPr>
-                <w:color w:val="EE0000"/>
-                <w:sz w:val="20"/>
-                <w:szCs w:val="20"/>
-              </w:rPr>
-            </w:pPr>
-            <w:r>
-              <w:rPr>
-                <w:color w:val="EE0000"/>
-                <w:sz w:val="20"/>
-                <w:szCs w:val="20"/>
-              </w:rPr>
-              <w:t>Iteration 3.2</w:t>
-            </w:r>
-          </w:p>
-        </w:tc>
-      </w:tr>
-      <w:tr>
-        <w:tc>
-          <w:tcPr>
-            <w:cnfStyle w:val="001000000000" w:firstRow="0" w:lastRow="0" w:firstColumn="1" w:lastColumn="0" w:oddVBand="0" w:evenVBand="0" w:oddHBand="0" w:evenHBand="0" w:firstRowFirstColumn="0" w:firstRowLastColumn="0" w:lastRowFirstColumn="0" w:lastRowLastColumn="0"/>
-            <w:tcW w:w="539" w:type="dxa"/>
-          </w:tcPr>
-          <w:p>
-            <w:pPr>
-              <w:ind w:firstLine="0"/>
-              <w:rPr>
-                <w:color w:val="EE0000"/>
-                <w:sz w:val="20"/>
-                <w:szCs w:val="20"/>
-              </w:rPr>
-            </w:pPr>
-            <w:r>
-              <w:rPr>
-                <w:color w:val="EE0000"/>
-                <w:sz w:val="20"/>
-                <w:szCs w:val="20"/>
-              </w:rPr>
-              <w:t>DS-17</w:t>
-            </w:r>
-          </w:p>
-        </w:tc>
-        <w:tc>
-          <w:tcPr>
-            <w:tcW w:w="3634" w:type="dxa"/>
-          </w:tcPr>
-          <w:p>
-            <w:pPr>
-              <w:ind w:firstLine="0"/>
-              <w:cnfStyle w:val="000000000000" w:firstRow="0" w:lastRow="0" w:firstColumn="0" w:lastColumn="0" w:oddVBand="0" w:evenVBand="0" w:oddHBand="0" w:evenHBand="0" w:firstRowFirstColumn="0" w:firstRowLastColumn="0" w:lastRowFirstColumn="0" w:lastRowLastColumn="0"/>
-              <w:rPr>
-                <w:color w:val="EE0000"/>
-                <w:sz w:val="20"/>
-                <w:szCs w:val="20"/>
-              </w:rPr>
-            </w:pPr>
-            <w:r>
-              <w:rPr>
-                <w:color w:val="EE0000"/>
-                <w:sz w:val="20"/>
-                <w:szCs w:val="20"/>
-              </w:rPr>
-              <w:t>As a developer, I have improved the transaction form UI to filter categories by transaction type (Income vs Expense) so that users only see relevant categories and input errors are reduced.</w:t>
-            </w:r>
-          </w:p>
-        </w:tc>
-        <w:tc>
-          <w:tcPr>
-            <w:tcW w:w="872" w:type="dxa"/>
-          </w:tcPr>
-          <w:p>
-            <w:pPr>
-              <w:ind w:firstLine="0"/>
-              <w:cnfStyle w:val="000000000000" w:firstRow="0" w:lastRow="0" w:firstColumn="0" w:lastColumn="0" w:oddVBand="0" w:evenVBand="0" w:oddHBand="0" w:evenHBand="0" w:firstRowFirstColumn="0" w:firstRowLastColumn="0" w:lastRowFirstColumn="0" w:lastRowLastColumn="0"/>
-              <w:rPr>
-                <w:color w:val="EE0000"/>
-                <w:sz w:val="20"/>
-                <w:szCs w:val="20"/>
-              </w:rPr>
-            </w:pPr>
-            <w:r>
-              <w:rPr>
-                <w:color w:val="EE0000"/>
-                <w:sz w:val="20"/>
-                <w:szCs w:val="20"/>
-              </w:rPr>
-              <w:t>US-1</w:t>
-            </w:r>
-          </w:p>
-        </w:tc>
-        <w:tc>
-          <w:tcPr>
-            <w:tcW w:w="958" w:type="dxa"/>
-          </w:tcPr>
-          <w:p>
-            <w:pPr>
-              <w:ind w:firstLine="0"/>
-              <w:cnfStyle w:val="000000000000" w:firstRow="0" w:lastRow="0" w:firstColumn="0" w:lastColumn="0" w:oddVBand="0" w:evenVBand="0" w:oddHBand="0" w:evenHBand="0" w:firstRowFirstColumn="0" w:firstRowLastColumn="0" w:lastRowFirstColumn="0" w:lastRowLastColumn="0"/>
-              <w:rPr>
-                <w:color w:val="EE0000"/>
-                <w:sz w:val="20"/>
-                <w:szCs w:val="20"/>
-              </w:rPr>
-            </w:pPr>
-            <w:r>
-              <w:rPr>
-                <w:color w:val="EE0000"/>
-                <w:sz w:val="20"/>
-                <w:szCs w:val="20"/>
-              </w:rPr>
-              <w:t>Medium</w:t>
-            </w:r>
-          </w:p>
-        </w:tc>
-        <w:tc>
-          <w:tcPr>
-            <w:tcW w:w="1261" w:type="dxa"/>
-          </w:tcPr>
-          <w:p>
-            <w:pPr>
-              <w:ind w:firstLine="0"/>
-              <w:cnfStyle w:val="000000000000" w:firstRow="0" w:lastRow="0" w:firstColumn="0" w:lastColumn="0" w:oddVBand="0" w:evenVBand="0" w:oddHBand="0" w:evenHBand="0" w:firstRowFirstColumn="0" w:firstRowLastColumn="0" w:lastRowFirstColumn="0" w:lastRowLastColumn="0"/>
-              <w:rPr>
-                <w:color w:val="EE0000"/>
-                <w:sz w:val="20"/>
-                <w:szCs w:val="20"/>
-              </w:rPr>
-            </w:pPr>
-            <w:r>
-              <w:rPr>
-                <w:color w:val="EE0000"/>
-                <w:sz w:val="20"/>
-                <w:szCs w:val="20"/>
-              </w:rPr>
-              <w:t>DS-08</w:t>
-            </w:r>
-          </w:p>
-        </w:tc>
-        <w:tc>
-          <w:tcPr>
-            <w:tcW w:w="861" w:type="dxa"/>
-          </w:tcPr>
-          <w:p>
-            <w:pPr>
-              <w:ind w:firstLine="0"/>
-              <w:cnfStyle w:val="000000000000" w:firstRow="0" w:lastRow="0" w:firstColumn="0" w:lastColumn="0" w:oddVBand="0" w:evenVBand="0" w:oddHBand="0" w:evenHBand="0" w:firstRowFirstColumn="0" w:firstRowLastColumn="0" w:lastRowFirstColumn="0" w:lastRowLastColumn="0"/>
-              <w:rPr>
-                <w:color w:val="EE0000"/>
-                <w:sz w:val="20"/>
-                <w:szCs w:val="20"/>
-              </w:rPr>
-            </w:pPr>
-            <w:r>
-              <w:rPr>
-                <w:color w:val="EE0000"/>
-                <w:sz w:val="20"/>
-                <w:szCs w:val="20"/>
-              </w:rPr>
-              <w:t>To Do</w:t>
-            </w:r>
-          </w:p>
-        </w:tc>
-        <w:tc>
-          <w:tcPr>
-            <w:tcW w:w="894" w:type="dxa"/>
-          </w:tcPr>
-          <w:p>
-            <w:pPr>
-              <w:ind w:firstLine="0"/>
-              <w:cnfStyle w:val="000000000000" w:firstRow="0" w:lastRow="0" w:firstColumn="0" w:lastColumn="0" w:oddVBand="0" w:evenVBand="0" w:oddHBand="0" w:evenHBand="0" w:firstRowFirstColumn="0" w:firstRowLastColumn="0" w:lastRowFirstColumn="0" w:lastRowLastColumn="0"/>
-              <w:rPr>
-                <w:color w:val="EE0000"/>
-                <w:sz w:val="20"/>
-                <w:szCs w:val="20"/>
-              </w:rPr>
-            </w:pPr>
-            <w:r>
-              <w:rPr>
-                <w:color w:val="EE0000"/>
                 <w:sz w:val="20"/>
                 <w:szCs w:val="20"/>
               </w:rPr>
@@ -6019,14 +4077,6 @@
         </w:tc>
       </w:tr>
     </w:tbl>
-    <w:p>
-      <w:pPr>
-        <w:ind w:firstLine="0"/>
-        <w:rPr>
-          <w:color w:val="EE0000"/>
-        </w:rPr>
-      </w:pPr>
-    </w:p>
     <w:p>
       <w:pPr>
         <w:pStyle w:val="Heading2"/>
@@ -6034,86 +4084,27 @@
           <w:ilvl w:val="1"/>
           <w:numId w:val="1"/>
         </w:numPr>
-        <w:rPr>
-          <w:color w:val="EE0000"/>
-        </w:rPr>
-      </w:pPr>
-      <w:bookmarkStart w:id="5" w:name="_Toc222073288"/>
-      <w:r>
-        <w:rPr>
-          <w:color w:val="EE0000"/>
-        </w:rPr>
-        <w:lastRenderedPageBreak/>
-        <w:t>Notes on Current Progress (Iteration 3.1)</w:t>
-      </w:r>
-      <w:bookmarkEnd w:id="5"/>
-    </w:p>
-    <w:p>
-      <w:pPr>
-        <w:pStyle w:val="ListParagraph"/>
-        <w:numPr>
-          <w:ilvl w:val="0"/>
-          <w:numId w:val="13"/>
-        </w:numPr>
-        <w:rPr>
-          <w:color w:val="EE0000"/>
-        </w:rPr>
-      </w:pPr>
-      <w:r>
-        <w:rPr>
-          <w:color w:val="EE0000"/>
-        </w:rPr>
-        <w:t xml:space="preserve">The backlog shows that </w:t>
+      </w:pPr>
+      <w:r>
+        <w:t>Remaining Backlog Items (Next Iteration)</w:t>
+      </w:r>
+    </w:p>
+    <w:p>
+      <w:r>
+        <w:t xml:space="preserve">At the end of Iteration 3.2, the </w:t>
       </w:r>
       <w:proofErr w:type="spellStart"/>
       <w:r>
-        <w:rPr>
-          <w:color w:val="EE0000"/>
-        </w:rPr>
         <w:t>SmartBudget</w:t>
       </w:r>
       <w:proofErr w:type="spellEnd"/>
       <w:r>
-        <w:rPr>
-          <w:color w:val="EE0000"/>
-        </w:rPr>
-        <w:t xml:space="preserve"> has reached a strong implementation state: core transaction, budget, and report workflows are functional, supported by design documentation and initial testing.</w:t>
-      </w:r>
-    </w:p>
-    <w:p>
-      <w:pPr>
-        <w:pStyle w:val="ListParagraph"/>
-        <w:numPr>
-          <w:ilvl w:val="0"/>
-          <w:numId w:val="13"/>
-        </w:numPr>
-        <w:rPr>
-          <w:color w:val="EE0000"/>
-        </w:rPr>
-      </w:pPr>
-      <w:r>
-        <w:rPr>
-          <w:color w:val="EE0000"/>
-        </w:rPr>
-        <w:t>The highest-priority remaining work is data persistence (save/load) and improving test coverage for key services (alerts and reports).</w:t>
-      </w:r>
-    </w:p>
-    <w:p>
-      <w:pPr>
-        <w:pStyle w:val="ListParagraph"/>
-        <w:numPr>
-          <w:ilvl w:val="0"/>
-          <w:numId w:val="13"/>
-        </w:numPr>
-        <w:rPr>
-          <w:color w:val="EE0000"/>
-        </w:rPr>
-      </w:pPr>
-      <w:r>
-        <w:rPr>
-          <w:color w:val="EE0000"/>
-        </w:rPr>
-        <w:t>A small but important UI improvement is planned to improve usability: restricting categories based on transaction type (income vs expense), which will reduce user errors and improve the overall experience.</w:t>
+        <w:t xml:space="preserve"> application now supports all core functional workflows defined in the project requirements, including transaction management, budgeting, reporting, and persistent storage of user data.</w:t>
+      </w:r>
+    </w:p>
+    <w:p>
+      <w:r>
+        <w:t>The remaining work primarily focuses on expanding automated testing and refining parts of the user interface to improve usability and maintainability. These improvements will be addressed in the next iteration as part of the final system refinement phase.</w:t>
       </w:r>
     </w:p>
     <w:p>
@@ -6124,11 +4115,11 @@
           <w:numId w:val="1"/>
         </w:numPr>
       </w:pPr>
-      <w:bookmarkStart w:id="6" w:name="_Toc222073312"/>
+      <w:bookmarkStart w:id="4" w:name="_Toc222073312"/>
       <w:r>
         <w:t>Code Repository</w:t>
       </w:r>
-      <w:bookmarkEnd w:id="6"/>
+      <w:bookmarkEnd w:id="4"/>
       <w:r>
         <w:t xml:space="preserve"> </w:t>
       </w:r>
@@ -6154,11 +4145,11 @@
           <w:numId w:val="1"/>
         </w:numPr>
       </w:pPr>
-      <w:bookmarkStart w:id="7" w:name="_Toc222073313"/>
+      <w:bookmarkStart w:id="5" w:name="_Toc222073313"/>
       <w:r>
         <w:t>Repository Link:</w:t>
       </w:r>
-      <w:bookmarkEnd w:id="7"/>
+      <w:bookmarkEnd w:id="5"/>
     </w:p>
     <w:p>
       <w:hyperlink r:id="rId11">
@@ -6179,11 +4170,11 @@
           <w:numId w:val="1"/>
         </w:numPr>
       </w:pPr>
-      <w:bookmarkStart w:id="8" w:name="_Toc222073314"/>
+      <w:bookmarkStart w:id="6" w:name="_Toc222073314"/>
       <w:r>
         <w:t>Conclusion</w:t>
       </w:r>
-      <w:bookmarkEnd w:id="8"/>
+      <w:bookmarkEnd w:id="6"/>
     </w:p>
     <w:p/>
     <w:sectPr>
@@ -10744,7 +8735,7 @@
   <w:style w:type="paragraph" w:default="1" w:styleId="Normal">
     <w:name w:val="Normal"/>
     <w:qFormat/>
-    <w:rsid w:val="00197917"/>
+    <w:rsid w:val="004858D9"/>
   </w:style>
   <w:style w:type="paragraph" w:styleId="Heading1">
     <w:name w:val="heading 1"/>

</xml_diff>

<commit_message>
add conclusion section to the report
</commit_message>
<xml_diff>
--- a/docs/deliverables/3.2/Deliverable 3-2 Implementation - Submission.docx
+++ b/docs/deliverables/3.2/Deliverable 3-2 Implementation - Submission.docx
@@ -320,7 +320,7 @@
           <w:r>
             <w:fldChar w:fldCharType="separate"/>
           </w:r>
-          <w:hyperlink w:anchor="_Toc222073260" w:history="1">
+          <w:hyperlink w:anchor="_Toc223885685" w:history="1">
             <w:r>
               <w:rPr>
                 <w:rStyle w:val="Hyperlink"/>
@@ -364,7 +364,7 @@
                 <w:noProof/>
                 <w:webHidden/>
               </w:rPr>
-              <w:instrText xml:space="preserve"> PAGEREF _Toc222073260 \h </w:instrText>
+              <w:instrText xml:space="preserve"> PAGEREF _Toc223885685 \h </w:instrText>
             </w:r>
             <w:r>
               <w:rPr>
@@ -385,6 +385,366 @@
                 <w:webHidden/>
               </w:rPr>
               <w:t>1</w:t>
+            </w:r>
+            <w:r>
+              <w:rPr>
+                <w:noProof/>
+                <w:webHidden/>
+              </w:rPr>
+              <w:fldChar w:fldCharType="end"/>
+            </w:r>
+          </w:hyperlink>
+        </w:p>
+        <w:p>
+          <w:pPr>
+            <w:pStyle w:val="TOC1"/>
+            <w:tabs>
+              <w:tab w:val="left" w:pos="960"/>
+              <w:tab w:val="right" w:leader="dot" w:pos="9019"/>
+            </w:tabs>
+            <w:rPr>
+              <w:rFonts w:asciiTheme="minorHAnsi" w:eastAsiaTheme="minorEastAsia" w:hAnsiTheme="minorHAnsi" w:cstheme="minorBidi"/>
+              <w:noProof/>
+              <w:kern w:val="2"/>
+              <w:lang w:val="en-CA"/>
+              <w14:ligatures w14:val="standardContextual"/>
+            </w:rPr>
+          </w:pPr>
+          <w:hyperlink w:anchor="_Toc223885686" w:history="1">
+            <w:r>
+              <w:rPr>
+                <w:rStyle w:val="Hyperlink"/>
+                <w:noProof/>
+              </w:rPr>
+              <w:t>2</w:t>
+            </w:r>
+            <w:r>
+              <w:rPr>
+                <w:rFonts w:asciiTheme="minorHAnsi" w:eastAsiaTheme="minorEastAsia" w:hAnsiTheme="minorHAnsi" w:cstheme="minorBidi"/>
+                <w:noProof/>
+                <w:kern w:val="2"/>
+                <w:lang w:val="en-CA"/>
+                <w14:ligatures w14:val="standardContextual"/>
+              </w:rPr>
+              <w:tab/>
+            </w:r>
+            <w:r>
+              <w:rPr>
+                <w:rStyle w:val="Hyperlink"/>
+                <w:noProof/>
+              </w:rPr>
+              <w:t>Starting Point from Deliverable 3.1</w:t>
+            </w:r>
+            <w:r>
+              <w:rPr>
+                <w:noProof/>
+                <w:webHidden/>
+              </w:rPr>
+              <w:tab/>
+            </w:r>
+            <w:r>
+              <w:rPr>
+                <w:noProof/>
+                <w:webHidden/>
+              </w:rPr>
+              <w:fldChar w:fldCharType="begin"/>
+            </w:r>
+            <w:r>
+              <w:rPr>
+                <w:noProof/>
+                <w:webHidden/>
+              </w:rPr>
+              <w:instrText xml:space="preserve"> PAGEREF _Toc223885686 \h </w:instrText>
+            </w:r>
+            <w:r>
+              <w:rPr>
+                <w:noProof/>
+                <w:webHidden/>
+              </w:rPr>
+            </w:r>
+            <w:r>
+              <w:rPr>
+                <w:noProof/>
+                <w:webHidden/>
+              </w:rPr>
+              <w:fldChar w:fldCharType="separate"/>
+            </w:r>
+            <w:r>
+              <w:rPr>
+                <w:noProof/>
+                <w:webHidden/>
+              </w:rPr>
+              <w:t>2</w:t>
+            </w:r>
+            <w:r>
+              <w:rPr>
+                <w:noProof/>
+                <w:webHidden/>
+              </w:rPr>
+              <w:fldChar w:fldCharType="end"/>
+            </w:r>
+          </w:hyperlink>
+        </w:p>
+        <w:p>
+          <w:pPr>
+            <w:pStyle w:val="TOC1"/>
+            <w:tabs>
+              <w:tab w:val="left" w:pos="960"/>
+              <w:tab w:val="right" w:leader="dot" w:pos="9019"/>
+            </w:tabs>
+            <w:rPr>
+              <w:rFonts w:asciiTheme="minorHAnsi" w:eastAsiaTheme="minorEastAsia" w:hAnsiTheme="minorHAnsi" w:cstheme="minorBidi"/>
+              <w:noProof/>
+              <w:kern w:val="2"/>
+              <w:lang w:val="en-CA"/>
+              <w14:ligatures w14:val="standardContextual"/>
+            </w:rPr>
+          </w:pPr>
+          <w:hyperlink w:anchor="_Toc223885687" w:history="1">
+            <w:r>
+              <w:rPr>
+                <w:rStyle w:val="Hyperlink"/>
+                <w:noProof/>
+              </w:rPr>
+              <w:t>3</w:t>
+            </w:r>
+            <w:r>
+              <w:rPr>
+                <w:rFonts w:asciiTheme="minorHAnsi" w:eastAsiaTheme="minorEastAsia" w:hAnsiTheme="minorHAnsi" w:cstheme="minorBidi"/>
+                <w:noProof/>
+                <w:kern w:val="2"/>
+                <w:lang w:val="en-CA"/>
+                <w14:ligatures w14:val="standardContextual"/>
+              </w:rPr>
+              <w:tab/>
+            </w:r>
+            <w:r>
+              <w:rPr>
+                <w:rStyle w:val="Hyperlink"/>
+                <w:noProof/>
+              </w:rPr>
+              <w:t>Refactoring and Codebase Improvements</w:t>
+            </w:r>
+            <w:r>
+              <w:rPr>
+                <w:noProof/>
+                <w:webHidden/>
+              </w:rPr>
+              <w:tab/>
+            </w:r>
+            <w:r>
+              <w:rPr>
+                <w:noProof/>
+                <w:webHidden/>
+              </w:rPr>
+              <w:fldChar w:fldCharType="begin"/>
+            </w:r>
+            <w:r>
+              <w:rPr>
+                <w:noProof/>
+                <w:webHidden/>
+              </w:rPr>
+              <w:instrText xml:space="preserve"> PAGEREF _Toc223885687 \h </w:instrText>
+            </w:r>
+            <w:r>
+              <w:rPr>
+                <w:noProof/>
+                <w:webHidden/>
+              </w:rPr>
+            </w:r>
+            <w:r>
+              <w:rPr>
+                <w:noProof/>
+                <w:webHidden/>
+              </w:rPr>
+              <w:fldChar w:fldCharType="separate"/>
+            </w:r>
+            <w:r>
+              <w:rPr>
+                <w:noProof/>
+                <w:webHidden/>
+              </w:rPr>
+              <w:t>3</w:t>
+            </w:r>
+            <w:r>
+              <w:rPr>
+                <w:noProof/>
+                <w:webHidden/>
+              </w:rPr>
+              <w:fldChar w:fldCharType="end"/>
+            </w:r>
+          </w:hyperlink>
+        </w:p>
+        <w:p>
+          <w:pPr>
+            <w:pStyle w:val="TOC2"/>
+            <w:tabs>
+              <w:tab w:val="left" w:pos="1440"/>
+              <w:tab w:val="right" w:leader="dot" w:pos="9019"/>
+            </w:tabs>
+            <w:rPr>
+              <w:rFonts w:asciiTheme="minorHAnsi" w:eastAsiaTheme="minorEastAsia" w:hAnsiTheme="minorHAnsi" w:cstheme="minorBidi"/>
+              <w:noProof/>
+              <w:kern w:val="2"/>
+              <w:lang w:val="en-CA"/>
+              <w14:ligatures w14:val="standardContextual"/>
+            </w:rPr>
+          </w:pPr>
+          <w:hyperlink w:anchor="_Toc223885688" w:history="1">
+            <w:r>
+              <w:rPr>
+                <w:rStyle w:val="Hyperlink"/>
+                <w:noProof/>
+              </w:rPr>
+              <w:t>3.1</w:t>
+            </w:r>
+            <w:r>
+              <w:rPr>
+                <w:rFonts w:asciiTheme="minorHAnsi" w:eastAsiaTheme="minorEastAsia" w:hAnsiTheme="minorHAnsi" w:cstheme="minorBidi"/>
+                <w:noProof/>
+                <w:kern w:val="2"/>
+                <w:lang w:val="en-CA"/>
+                <w14:ligatures w14:val="standardContextual"/>
+              </w:rPr>
+              <w:tab/>
+            </w:r>
+            <w:r>
+              <w:rPr>
+                <w:rStyle w:val="Hyperlink"/>
+                <w:noProof/>
+              </w:rPr>
+              <w:t>Refactoring Goals</w:t>
+            </w:r>
+            <w:r>
+              <w:rPr>
+                <w:noProof/>
+                <w:webHidden/>
+              </w:rPr>
+              <w:tab/>
+            </w:r>
+            <w:r>
+              <w:rPr>
+                <w:noProof/>
+                <w:webHidden/>
+              </w:rPr>
+              <w:fldChar w:fldCharType="begin"/>
+            </w:r>
+            <w:r>
+              <w:rPr>
+                <w:noProof/>
+                <w:webHidden/>
+              </w:rPr>
+              <w:instrText xml:space="preserve"> PAGEREF _Toc223885688 \h </w:instrText>
+            </w:r>
+            <w:r>
+              <w:rPr>
+                <w:noProof/>
+                <w:webHidden/>
+              </w:rPr>
+            </w:r>
+            <w:r>
+              <w:rPr>
+                <w:noProof/>
+                <w:webHidden/>
+              </w:rPr>
+              <w:fldChar w:fldCharType="separate"/>
+            </w:r>
+            <w:r>
+              <w:rPr>
+                <w:noProof/>
+                <w:webHidden/>
+              </w:rPr>
+              <w:t>3</w:t>
+            </w:r>
+            <w:r>
+              <w:rPr>
+                <w:noProof/>
+                <w:webHidden/>
+              </w:rPr>
+              <w:fldChar w:fldCharType="end"/>
+            </w:r>
+          </w:hyperlink>
+        </w:p>
+        <w:p>
+          <w:pPr>
+            <w:pStyle w:val="TOC2"/>
+            <w:tabs>
+              <w:tab w:val="left" w:pos="1440"/>
+              <w:tab w:val="right" w:leader="dot" w:pos="9019"/>
+            </w:tabs>
+            <w:rPr>
+              <w:rFonts w:asciiTheme="minorHAnsi" w:eastAsiaTheme="minorEastAsia" w:hAnsiTheme="minorHAnsi" w:cstheme="minorBidi"/>
+              <w:noProof/>
+              <w:kern w:val="2"/>
+              <w:lang w:val="en-CA"/>
+              <w14:ligatures w14:val="standardContextual"/>
+            </w:rPr>
+          </w:pPr>
+          <w:hyperlink w:anchor="_Toc223885689" w:history="1">
+            <w:r>
+              <w:rPr>
+                <w:rStyle w:val="Hyperlink"/>
+                <w:noProof/>
+              </w:rPr>
+              <w:t>3.2</w:t>
+            </w:r>
+            <w:r>
+              <w:rPr>
+                <w:rFonts w:asciiTheme="minorHAnsi" w:eastAsiaTheme="minorEastAsia" w:hAnsiTheme="minorHAnsi" w:cstheme="minorBidi"/>
+                <w:noProof/>
+                <w:kern w:val="2"/>
+                <w:lang w:val="en-CA"/>
+                <w14:ligatures w14:val="standardContextual"/>
+              </w:rPr>
+              <w:tab/>
+            </w:r>
+            <w:r>
+              <w:rPr>
+                <w:rStyle w:val="Hyperlink"/>
+                <w:noProof/>
+              </w:rPr>
+              <w:t>Major Refactoring Actions</w:t>
+            </w:r>
+            <w:r>
+              <w:rPr>
+                <w:noProof/>
+                <w:webHidden/>
+              </w:rPr>
+              <w:tab/>
+            </w:r>
+            <w:r>
+              <w:rPr>
+                <w:noProof/>
+                <w:webHidden/>
+              </w:rPr>
+              <w:fldChar w:fldCharType="begin"/>
+            </w:r>
+            <w:r>
+              <w:rPr>
+                <w:noProof/>
+                <w:webHidden/>
+              </w:rPr>
+              <w:instrText xml:space="preserve"> PAGEREF _Toc223885689 \h </w:instrText>
+            </w:r>
+            <w:r>
+              <w:rPr>
+                <w:noProof/>
+                <w:webHidden/>
+              </w:rPr>
+            </w:r>
+            <w:r>
+              <w:rPr>
+                <w:noProof/>
+                <w:webHidden/>
+              </w:rPr>
+              <w:fldChar w:fldCharType="separate"/>
+            </w:r>
+            <w:r>
+              <w:rPr>
+                <w:noProof/>
+                <w:webHidden/>
+              </w:rPr>
+              <w:t>3</w:t>
             </w:r>
             <w:r>
               <w:rPr>
@@ -410,12 +770,86 @@
               <w14:ligatures w14:val="standardContextual"/>
             </w:rPr>
           </w:pPr>
+          <w:hyperlink w:anchor="_Toc223885690" w:history="1">
+            <w:r>
+              <w:rPr>
+                <w:rStyle w:val="Hyperlink"/>
+                <w:noProof/>
+              </w:rPr>
+              <w:t>3.2.1</w:t>
+            </w:r>
+            <w:r>
+              <w:rPr>
+                <w:rFonts w:asciiTheme="minorHAnsi" w:eastAsiaTheme="minorEastAsia" w:hAnsiTheme="minorHAnsi" w:cstheme="minorBidi"/>
+                <w:noProof/>
+                <w:kern w:val="2"/>
+                <w:lang w:val="en-CA"/>
+                <w14:ligatures w14:val="standardContextual"/>
+              </w:rPr>
+              <w:tab/>
+            </w:r>
+            <w:r>
+              <w:rPr>
+                <w:rStyle w:val="Hyperlink"/>
+                <w:noProof/>
+              </w:rPr>
+              <w:t>Service and Controller cleanup</w:t>
+            </w:r>
+            <w:r>
+              <w:rPr>
+                <w:noProof/>
+                <w:webHidden/>
+              </w:rPr>
+              <w:tab/>
+            </w:r>
+            <w:r>
+              <w:rPr>
+                <w:noProof/>
+                <w:webHidden/>
+              </w:rPr>
+              <w:fldChar w:fldCharType="begin"/>
+            </w:r>
+            <w:r>
+              <w:rPr>
+                <w:noProof/>
+                <w:webHidden/>
+              </w:rPr>
+              <w:instrText xml:space="preserve"> PAGEREF _Toc223885690 \h </w:instrText>
+            </w:r>
+            <w:r>
+              <w:rPr>
+                <w:noProof/>
+                <w:webHidden/>
+              </w:rPr>
+            </w:r>
+            <w:r>
+              <w:rPr>
+                <w:noProof/>
+                <w:webHidden/>
+              </w:rPr>
+              <w:fldChar w:fldCharType="separate"/>
+            </w:r>
+            <w:r>
+              <w:rPr>
+                <w:noProof/>
+                <w:webHidden/>
+              </w:rPr>
+              <w:t>3</w:t>
+            </w:r>
+            <w:r>
+              <w:rPr>
+                <w:noProof/>
+                <w:webHidden/>
+              </w:rPr>
+              <w:fldChar w:fldCharType="end"/>
+            </w:r>
+          </w:hyperlink>
         </w:p>
         <w:p>
           <w:pPr>
-            <w:pStyle w:val="TOC1"/>
+            <w:pStyle w:val="TOC3"/>
             <w:tabs>
-              <w:tab w:val="left" w:pos="960"/>
+              <w:tab w:val="left" w:pos="1920"/>
               <w:tab w:val="right" w:leader="dot" w:pos="9019"/>
             </w:tabs>
             <w:rPr>
@@ -426,13 +860,13 @@
               <w14:ligatures w14:val="standardContextual"/>
             </w:rPr>
           </w:pPr>
-          <w:hyperlink w:anchor="_Toc222073312" w:history="1">
+          <w:hyperlink w:anchor="_Toc223885691" w:history="1">
             <w:r>
               <w:rPr>
                 <w:rStyle w:val="Hyperlink"/>
                 <w:noProof/>
               </w:rPr>
-              <w:t>9</w:t>
+              <w:t>3.2.2</w:t>
             </w:r>
             <w:r>
               <w:rPr>
@@ -449,7 +883,7 @@
                 <w:rStyle w:val="Hyperlink"/>
                 <w:noProof/>
               </w:rPr>
-              <w:t>Code Repository</w:t>
+              <w:t>Reducing duplication and improving validation flow</w:t>
             </w:r>
             <w:r>
               <w:rPr>
@@ -470,7 +904,7 @@
                 <w:noProof/>
                 <w:webHidden/>
               </w:rPr>
-              <w:instrText xml:space="preserve"> PAGEREF _Toc222073312 \h </w:instrText>
+              <w:instrText xml:space="preserve"> PAGEREF _Toc223885691 \h </w:instrText>
             </w:r>
             <w:r>
               <w:rPr>
@@ -490,7 +924,187 @@
                 <w:noProof/>
                 <w:webHidden/>
               </w:rPr>
-              <w:t>35</w:t>
+              <w:t>4</w:t>
+            </w:r>
+            <w:r>
+              <w:rPr>
+                <w:noProof/>
+                <w:webHidden/>
+              </w:rPr>
+              <w:fldChar w:fldCharType="end"/>
+            </w:r>
+          </w:hyperlink>
+        </w:p>
+        <w:p>
+          <w:pPr>
+            <w:pStyle w:val="TOC3"/>
+            <w:tabs>
+              <w:tab w:val="left" w:pos="1920"/>
+              <w:tab w:val="right" w:leader="dot" w:pos="9019"/>
+            </w:tabs>
+            <w:rPr>
+              <w:rFonts w:asciiTheme="minorHAnsi" w:eastAsiaTheme="minorEastAsia" w:hAnsiTheme="minorHAnsi" w:cstheme="minorBidi"/>
+              <w:noProof/>
+              <w:kern w:val="2"/>
+              <w:lang w:val="en-CA"/>
+              <w14:ligatures w14:val="standardContextual"/>
+            </w:rPr>
+          </w:pPr>
+          <w:hyperlink w:anchor="_Toc223885692" w:history="1">
+            <w:r>
+              <w:rPr>
+                <w:rStyle w:val="Hyperlink"/>
+                <w:noProof/>
+              </w:rPr>
+              <w:t>3.2.3</w:t>
+            </w:r>
+            <w:r>
+              <w:rPr>
+                <w:rFonts w:asciiTheme="minorHAnsi" w:eastAsiaTheme="minorEastAsia" w:hAnsiTheme="minorHAnsi" w:cstheme="minorBidi"/>
+                <w:noProof/>
+                <w:kern w:val="2"/>
+                <w:lang w:val="en-CA"/>
+                <w14:ligatures w14:val="standardContextual"/>
+              </w:rPr>
+              <w:tab/>
+            </w:r>
+            <w:r>
+              <w:rPr>
+                <w:rStyle w:val="Hyperlink"/>
+                <w:noProof/>
+              </w:rPr>
+              <w:t>Improving separation of concerns for persistence readiness</w:t>
+            </w:r>
+            <w:r>
+              <w:rPr>
+                <w:noProof/>
+                <w:webHidden/>
+              </w:rPr>
+              <w:tab/>
+            </w:r>
+            <w:r>
+              <w:rPr>
+                <w:noProof/>
+                <w:webHidden/>
+              </w:rPr>
+              <w:fldChar w:fldCharType="begin"/>
+            </w:r>
+            <w:r>
+              <w:rPr>
+                <w:noProof/>
+                <w:webHidden/>
+              </w:rPr>
+              <w:instrText xml:space="preserve"> PAGEREF _Toc223885692 \h </w:instrText>
+            </w:r>
+            <w:r>
+              <w:rPr>
+                <w:noProof/>
+                <w:webHidden/>
+              </w:rPr>
+            </w:r>
+            <w:r>
+              <w:rPr>
+                <w:noProof/>
+                <w:webHidden/>
+              </w:rPr>
+              <w:fldChar w:fldCharType="separate"/>
+            </w:r>
+            <w:r>
+              <w:rPr>
+                <w:noProof/>
+                <w:webHidden/>
+              </w:rPr>
+              <w:t>4</w:t>
+            </w:r>
+            <w:r>
+              <w:rPr>
+                <w:noProof/>
+                <w:webHidden/>
+              </w:rPr>
+              <w:fldChar w:fldCharType="end"/>
+            </w:r>
+          </w:hyperlink>
+        </w:p>
+        <w:p>
+          <w:pPr>
+            <w:pStyle w:val="TOC3"/>
+            <w:tabs>
+              <w:tab w:val="left" w:pos="1920"/>
+              <w:tab w:val="right" w:leader="dot" w:pos="9019"/>
+            </w:tabs>
+            <w:rPr>
+              <w:rFonts w:asciiTheme="minorHAnsi" w:eastAsiaTheme="minorEastAsia" w:hAnsiTheme="minorHAnsi" w:cstheme="minorBidi"/>
+              <w:noProof/>
+              <w:kern w:val="2"/>
+              <w:lang w:val="en-CA"/>
+              <w14:ligatures w14:val="standardContextual"/>
+            </w:rPr>
+          </w:pPr>
+          <w:hyperlink w:anchor="_Toc223885693" w:history="1">
+            <w:r>
+              <w:rPr>
+                <w:rStyle w:val="Hyperlink"/>
+                <w:noProof/>
+              </w:rPr>
+              <w:t>3.2.4</w:t>
+            </w:r>
+            <w:r>
+              <w:rPr>
+                <w:rFonts w:asciiTheme="minorHAnsi" w:eastAsiaTheme="minorEastAsia" w:hAnsiTheme="minorHAnsi" w:cstheme="minorBidi"/>
+                <w:noProof/>
+                <w:kern w:val="2"/>
+                <w:lang w:val="en-CA"/>
+                <w14:ligatures w14:val="standardContextual"/>
+              </w:rPr>
+              <w:tab/>
+            </w:r>
+            <w:r>
+              <w:rPr>
+                <w:rStyle w:val="Hyperlink"/>
+                <w:noProof/>
+              </w:rPr>
+              <w:t>Small structural improvements for testability</w:t>
+            </w:r>
+            <w:r>
+              <w:rPr>
+                <w:noProof/>
+                <w:webHidden/>
+              </w:rPr>
+              <w:tab/>
+            </w:r>
+            <w:r>
+              <w:rPr>
+                <w:noProof/>
+                <w:webHidden/>
+              </w:rPr>
+              <w:fldChar w:fldCharType="begin"/>
+            </w:r>
+            <w:r>
+              <w:rPr>
+                <w:noProof/>
+                <w:webHidden/>
+              </w:rPr>
+              <w:instrText xml:space="preserve"> PAGEREF _Toc223885693 \h </w:instrText>
+            </w:r>
+            <w:r>
+              <w:rPr>
+                <w:noProof/>
+                <w:webHidden/>
+              </w:rPr>
+            </w:r>
+            <w:r>
+              <w:rPr>
+                <w:noProof/>
+                <w:webHidden/>
+              </w:rPr>
+              <w:fldChar w:fldCharType="separate"/>
+            </w:r>
+            <w:r>
+              <w:rPr>
+                <w:noProof/>
+                <w:webHidden/>
+              </w:rPr>
+              <w:t>4</w:t>
             </w:r>
             <w:r>
               <w:rPr>
@@ -516,13 +1130,13 @@
               <w14:ligatures w14:val="standardContextual"/>
             </w:rPr>
           </w:pPr>
-          <w:hyperlink w:anchor="_Toc222073313" w:history="1">
+          <w:hyperlink w:anchor="_Toc223885694" w:history="1">
             <w:r>
               <w:rPr>
                 <w:rStyle w:val="Hyperlink"/>
                 <w:noProof/>
               </w:rPr>
-              <w:t>9.1</w:t>
+              <w:t>3.3</w:t>
             </w:r>
             <w:r>
               <w:rPr>
@@ -539,7 +1153,7 @@
                 <w:rStyle w:val="Hyperlink"/>
                 <w:noProof/>
               </w:rPr>
-              <w:t>Repository Link:</w:t>
+              <w:t>Impact of Refactoring</w:t>
             </w:r>
             <w:r>
               <w:rPr>
@@ -560,7 +1174,7 @@
                 <w:noProof/>
                 <w:webHidden/>
               </w:rPr>
-              <w:instrText xml:space="preserve"> PAGEREF _Toc222073313 \h </w:instrText>
+              <w:instrText xml:space="preserve"> PAGEREF _Toc223885694 \h </w:instrText>
             </w:r>
             <w:r>
               <w:rPr>
@@ -580,7 +1194,7 @@
                 <w:noProof/>
                 <w:webHidden/>
               </w:rPr>
-              <w:t>35</w:t>
+              <w:t>4</w:t>
             </w:r>
             <w:r>
               <w:rPr>
@@ -593,9 +1207,9 @@
         </w:p>
         <w:p>
           <w:pPr>
-            <w:pStyle w:val="TOC1"/>
+            <w:pStyle w:val="TOC3"/>
             <w:tabs>
-              <w:tab w:val="left" w:pos="1200"/>
+              <w:tab w:val="left" w:pos="1920"/>
               <w:tab w:val="right" w:leader="dot" w:pos="9019"/>
             </w:tabs>
             <w:rPr>
@@ -606,13 +1220,13 @@
               <w14:ligatures w14:val="standardContextual"/>
             </w:rPr>
           </w:pPr>
-          <w:hyperlink w:anchor="_Toc222073314" w:history="1">
+          <w:hyperlink w:anchor="_Toc223885695" w:history="1">
             <w:r>
               <w:rPr>
                 <w:rStyle w:val="Hyperlink"/>
                 <w:noProof/>
               </w:rPr>
-              <w:t>10</w:t>
+              <w:t>3.3.1</w:t>
             </w:r>
             <w:r>
               <w:rPr>
@@ -629,6 +1243,2256 @@
                 <w:rStyle w:val="Hyperlink"/>
                 <w:noProof/>
               </w:rPr>
+              <w:t>Improved maintainability and readability</w:t>
+            </w:r>
+            <w:r>
+              <w:rPr>
+                <w:noProof/>
+                <w:webHidden/>
+              </w:rPr>
+              <w:tab/>
+            </w:r>
+            <w:r>
+              <w:rPr>
+                <w:noProof/>
+                <w:webHidden/>
+              </w:rPr>
+              <w:fldChar w:fldCharType="begin"/>
+            </w:r>
+            <w:r>
+              <w:rPr>
+                <w:noProof/>
+                <w:webHidden/>
+              </w:rPr>
+              <w:instrText xml:space="preserve"> PAGEREF _Toc223885695 \h </w:instrText>
+            </w:r>
+            <w:r>
+              <w:rPr>
+                <w:noProof/>
+                <w:webHidden/>
+              </w:rPr>
+            </w:r>
+            <w:r>
+              <w:rPr>
+                <w:noProof/>
+                <w:webHidden/>
+              </w:rPr>
+              <w:fldChar w:fldCharType="separate"/>
+            </w:r>
+            <w:r>
+              <w:rPr>
+                <w:noProof/>
+                <w:webHidden/>
+              </w:rPr>
+              <w:t>4</w:t>
+            </w:r>
+            <w:r>
+              <w:rPr>
+                <w:noProof/>
+                <w:webHidden/>
+              </w:rPr>
+              <w:fldChar w:fldCharType="end"/>
+            </w:r>
+          </w:hyperlink>
+        </w:p>
+        <w:p>
+          <w:pPr>
+            <w:pStyle w:val="TOC3"/>
+            <w:tabs>
+              <w:tab w:val="left" w:pos="1920"/>
+              <w:tab w:val="right" w:leader="dot" w:pos="9019"/>
+            </w:tabs>
+            <w:rPr>
+              <w:rFonts w:asciiTheme="minorHAnsi" w:eastAsiaTheme="minorEastAsia" w:hAnsiTheme="minorHAnsi" w:cstheme="minorBidi"/>
+              <w:noProof/>
+              <w:kern w:val="2"/>
+              <w:lang w:val="en-CA"/>
+              <w14:ligatures w14:val="standardContextual"/>
+            </w:rPr>
+          </w:pPr>
+          <w:hyperlink w:anchor="_Toc223885696" w:history="1">
+            <w:r>
+              <w:rPr>
+                <w:rStyle w:val="Hyperlink"/>
+                <w:noProof/>
+              </w:rPr>
+              <w:t>3.3.2</w:t>
+            </w:r>
+            <w:r>
+              <w:rPr>
+                <w:rFonts w:asciiTheme="minorHAnsi" w:eastAsiaTheme="minorEastAsia" w:hAnsiTheme="minorHAnsi" w:cstheme="minorBidi"/>
+                <w:noProof/>
+                <w:kern w:val="2"/>
+                <w:lang w:val="en-CA"/>
+                <w14:ligatures w14:val="standardContextual"/>
+              </w:rPr>
+              <w:tab/>
+            </w:r>
+            <w:r>
+              <w:rPr>
+                <w:rStyle w:val="Hyperlink"/>
+                <w:noProof/>
+              </w:rPr>
+              <w:t>Better consistency and fewer logic errors</w:t>
+            </w:r>
+            <w:r>
+              <w:rPr>
+                <w:noProof/>
+                <w:webHidden/>
+              </w:rPr>
+              <w:tab/>
+            </w:r>
+            <w:r>
+              <w:rPr>
+                <w:noProof/>
+                <w:webHidden/>
+              </w:rPr>
+              <w:fldChar w:fldCharType="begin"/>
+            </w:r>
+            <w:r>
+              <w:rPr>
+                <w:noProof/>
+                <w:webHidden/>
+              </w:rPr>
+              <w:instrText xml:space="preserve"> PAGEREF _Toc223885696 \h </w:instrText>
+            </w:r>
+            <w:r>
+              <w:rPr>
+                <w:noProof/>
+                <w:webHidden/>
+              </w:rPr>
+            </w:r>
+            <w:r>
+              <w:rPr>
+                <w:noProof/>
+                <w:webHidden/>
+              </w:rPr>
+              <w:fldChar w:fldCharType="separate"/>
+            </w:r>
+            <w:r>
+              <w:rPr>
+                <w:noProof/>
+                <w:webHidden/>
+              </w:rPr>
+              <w:t>4</w:t>
+            </w:r>
+            <w:r>
+              <w:rPr>
+                <w:noProof/>
+                <w:webHidden/>
+              </w:rPr>
+              <w:fldChar w:fldCharType="end"/>
+            </w:r>
+          </w:hyperlink>
+        </w:p>
+        <w:p>
+          <w:pPr>
+            <w:pStyle w:val="TOC3"/>
+            <w:tabs>
+              <w:tab w:val="left" w:pos="1920"/>
+              <w:tab w:val="right" w:leader="dot" w:pos="9019"/>
+            </w:tabs>
+            <w:rPr>
+              <w:rFonts w:asciiTheme="minorHAnsi" w:eastAsiaTheme="minorEastAsia" w:hAnsiTheme="minorHAnsi" w:cstheme="minorBidi"/>
+              <w:noProof/>
+              <w:kern w:val="2"/>
+              <w:lang w:val="en-CA"/>
+              <w14:ligatures w14:val="standardContextual"/>
+            </w:rPr>
+          </w:pPr>
+          <w:hyperlink w:anchor="_Toc223885697" w:history="1">
+            <w:r>
+              <w:rPr>
+                <w:rStyle w:val="Hyperlink"/>
+                <w:noProof/>
+              </w:rPr>
+              <w:t>3.3.3</w:t>
+            </w:r>
+            <w:r>
+              <w:rPr>
+                <w:rFonts w:asciiTheme="minorHAnsi" w:eastAsiaTheme="minorEastAsia" w:hAnsiTheme="minorHAnsi" w:cstheme="minorBidi"/>
+                <w:noProof/>
+                <w:kern w:val="2"/>
+                <w:lang w:val="en-CA"/>
+                <w14:ligatures w14:val="standardContextual"/>
+              </w:rPr>
+              <w:tab/>
+            </w:r>
+            <w:r>
+              <w:rPr>
+                <w:rStyle w:val="Hyperlink"/>
+                <w:noProof/>
+              </w:rPr>
+              <w:t>Easier testing and stronger validation</w:t>
+            </w:r>
+            <w:r>
+              <w:rPr>
+                <w:noProof/>
+                <w:webHidden/>
+              </w:rPr>
+              <w:tab/>
+            </w:r>
+            <w:r>
+              <w:rPr>
+                <w:noProof/>
+                <w:webHidden/>
+              </w:rPr>
+              <w:fldChar w:fldCharType="begin"/>
+            </w:r>
+            <w:r>
+              <w:rPr>
+                <w:noProof/>
+                <w:webHidden/>
+              </w:rPr>
+              <w:instrText xml:space="preserve"> PAGEREF _Toc223885697 \h </w:instrText>
+            </w:r>
+            <w:r>
+              <w:rPr>
+                <w:noProof/>
+                <w:webHidden/>
+              </w:rPr>
+            </w:r>
+            <w:r>
+              <w:rPr>
+                <w:noProof/>
+                <w:webHidden/>
+              </w:rPr>
+              <w:fldChar w:fldCharType="separate"/>
+            </w:r>
+            <w:r>
+              <w:rPr>
+                <w:noProof/>
+                <w:webHidden/>
+              </w:rPr>
+              <w:t>4</w:t>
+            </w:r>
+            <w:r>
+              <w:rPr>
+                <w:noProof/>
+                <w:webHidden/>
+              </w:rPr>
+              <w:fldChar w:fldCharType="end"/>
+            </w:r>
+          </w:hyperlink>
+        </w:p>
+        <w:p>
+          <w:pPr>
+            <w:pStyle w:val="TOC1"/>
+            <w:tabs>
+              <w:tab w:val="left" w:pos="960"/>
+              <w:tab w:val="right" w:leader="dot" w:pos="9019"/>
+            </w:tabs>
+            <w:rPr>
+              <w:rFonts w:asciiTheme="minorHAnsi" w:eastAsiaTheme="minorEastAsia" w:hAnsiTheme="minorHAnsi" w:cstheme="minorBidi"/>
+              <w:noProof/>
+              <w:kern w:val="2"/>
+              <w:lang w:val="en-CA"/>
+              <w14:ligatures w14:val="standardContextual"/>
+            </w:rPr>
+          </w:pPr>
+          <w:hyperlink w:anchor="_Toc223885698" w:history="1">
+            <w:r>
+              <w:rPr>
+                <w:rStyle w:val="Hyperlink"/>
+                <w:noProof/>
+              </w:rPr>
+              <w:t>4</w:t>
+            </w:r>
+            <w:r>
+              <w:rPr>
+                <w:rFonts w:asciiTheme="minorHAnsi" w:eastAsiaTheme="minorEastAsia" w:hAnsiTheme="minorHAnsi" w:cstheme="minorBidi"/>
+                <w:noProof/>
+                <w:kern w:val="2"/>
+                <w:lang w:val="en-CA"/>
+                <w14:ligatures w14:val="standardContextual"/>
+              </w:rPr>
+              <w:tab/>
+            </w:r>
+            <w:r>
+              <w:rPr>
+                <w:rStyle w:val="Hyperlink"/>
+                <w:noProof/>
+              </w:rPr>
+              <w:t>Final Implementation of Core Features</w:t>
+            </w:r>
+            <w:r>
+              <w:rPr>
+                <w:noProof/>
+                <w:webHidden/>
+              </w:rPr>
+              <w:tab/>
+            </w:r>
+            <w:r>
+              <w:rPr>
+                <w:noProof/>
+                <w:webHidden/>
+              </w:rPr>
+              <w:fldChar w:fldCharType="begin"/>
+            </w:r>
+            <w:r>
+              <w:rPr>
+                <w:noProof/>
+                <w:webHidden/>
+              </w:rPr>
+              <w:instrText xml:space="preserve"> PAGEREF _Toc223885698 \h </w:instrText>
+            </w:r>
+            <w:r>
+              <w:rPr>
+                <w:noProof/>
+                <w:webHidden/>
+              </w:rPr>
+            </w:r>
+            <w:r>
+              <w:rPr>
+                <w:noProof/>
+                <w:webHidden/>
+              </w:rPr>
+              <w:fldChar w:fldCharType="separate"/>
+            </w:r>
+            <w:r>
+              <w:rPr>
+                <w:noProof/>
+                <w:webHidden/>
+              </w:rPr>
+              <w:t>5</w:t>
+            </w:r>
+            <w:r>
+              <w:rPr>
+                <w:noProof/>
+                <w:webHidden/>
+              </w:rPr>
+              <w:fldChar w:fldCharType="end"/>
+            </w:r>
+          </w:hyperlink>
+        </w:p>
+        <w:p>
+          <w:pPr>
+            <w:pStyle w:val="TOC2"/>
+            <w:tabs>
+              <w:tab w:val="left" w:pos="1440"/>
+              <w:tab w:val="right" w:leader="dot" w:pos="9019"/>
+            </w:tabs>
+            <w:rPr>
+              <w:rFonts w:asciiTheme="minorHAnsi" w:eastAsiaTheme="minorEastAsia" w:hAnsiTheme="minorHAnsi" w:cstheme="minorBidi"/>
+              <w:noProof/>
+              <w:kern w:val="2"/>
+              <w:lang w:val="en-CA"/>
+              <w14:ligatures w14:val="standardContextual"/>
+            </w:rPr>
+          </w:pPr>
+          <w:hyperlink w:anchor="_Toc223885699" w:history="1">
+            <w:r>
+              <w:rPr>
+                <w:rStyle w:val="Hyperlink"/>
+                <w:noProof/>
+              </w:rPr>
+              <w:t>4.1</w:t>
+            </w:r>
+            <w:r>
+              <w:rPr>
+                <w:rFonts w:asciiTheme="minorHAnsi" w:eastAsiaTheme="minorEastAsia" w:hAnsiTheme="minorHAnsi" w:cstheme="minorBidi"/>
+                <w:noProof/>
+                <w:kern w:val="2"/>
+                <w:lang w:val="en-CA"/>
+                <w14:ligatures w14:val="standardContextual"/>
+              </w:rPr>
+              <w:tab/>
+            </w:r>
+            <w:r>
+              <w:rPr>
+                <w:rStyle w:val="Hyperlink"/>
+                <w:noProof/>
+              </w:rPr>
+              <w:t>Core functionality already completed in Deliverable 3.1</w:t>
+            </w:r>
+            <w:r>
+              <w:rPr>
+                <w:noProof/>
+                <w:webHidden/>
+              </w:rPr>
+              <w:tab/>
+            </w:r>
+            <w:r>
+              <w:rPr>
+                <w:noProof/>
+                <w:webHidden/>
+              </w:rPr>
+              <w:fldChar w:fldCharType="begin"/>
+            </w:r>
+            <w:r>
+              <w:rPr>
+                <w:noProof/>
+                <w:webHidden/>
+              </w:rPr>
+              <w:instrText xml:space="preserve"> PAGEREF _Toc223885699 \h </w:instrText>
+            </w:r>
+            <w:r>
+              <w:rPr>
+                <w:noProof/>
+                <w:webHidden/>
+              </w:rPr>
+            </w:r>
+            <w:r>
+              <w:rPr>
+                <w:noProof/>
+                <w:webHidden/>
+              </w:rPr>
+              <w:fldChar w:fldCharType="separate"/>
+            </w:r>
+            <w:r>
+              <w:rPr>
+                <w:noProof/>
+                <w:webHidden/>
+              </w:rPr>
+              <w:t>5</w:t>
+            </w:r>
+            <w:r>
+              <w:rPr>
+                <w:noProof/>
+                <w:webHidden/>
+              </w:rPr>
+              <w:fldChar w:fldCharType="end"/>
+            </w:r>
+          </w:hyperlink>
+        </w:p>
+        <w:p>
+          <w:pPr>
+            <w:pStyle w:val="TOC2"/>
+            <w:tabs>
+              <w:tab w:val="left" w:pos="1440"/>
+              <w:tab w:val="right" w:leader="dot" w:pos="9019"/>
+            </w:tabs>
+            <w:rPr>
+              <w:rFonts w:asciiTheme="minorHAnsi" w:eastAsiaTheme="minorEastAsia" w:hAnsiTheme="minorHAnsi" w:cstheme="minorBidi"/>
+              <w:noProof/>
+              <w:kern w:val="2"/>
+              <w:lang w:val="en-CA"/>
+              <w14:ligatures w14:val="standardContextual"/>
+            </w:rPr>
+          </w:pPr>
+          <w:hyperlink w:anchor="_Toc223885700" w:history="1">
+            <w:r>
+              <w:rPr>
+                <w:rStyle w:val="Hyperlink"/>
+                <w:noProof/>
+              </w:rPr>
+              <w:t>4.2</w:t>
+            </w:r>
+            <w:r>
+              <w:rPr>
+                <w:rFonts w:asciiTheme="minorHAnsi" w:eastAsiaTheme="minorEastAsia" w:hAnsiTheme="minorHAnsi" w:cstheme="minorBidi"/>
+                <w:noProof/>
+                <w:kern w:val="2"/>
+                <w:lang w:val="en-CA"/>
+                <w14:ligatures w14:val="standardContextual"/>
+              </w:rPr>
+              <w:tab/>
+            </w:r>
+            <w:r>
+              <w:rPr>
+                <w:rStyle w:val="Hyperlink"/>
+                <w:noProof/>
+              </w:rPr>
+              <w:t>Key core features completed in Deliverable 3.2</w:t>
+            </w:r>
+            <w:r>
+              <w:rPr>
+                <w:noProof/>
+                <w:webHidden/>
+              </w:rPr>
+              <w:tab/>
+            </w:r>
+            <w:r>
+              <w:rPr>
+                <w:noProof/>
+                <w:webHidden/>
+              </w:rPr>
+              <w:fldChar w:fldCharType="begin"/>
+            </w:r>
+            <w:r>
+              <w:rPr>
+                <w:noProof/>
+                <w:webHidden/>
+              </w:rPr>
+              <w:instrText xml:space="preserve"> PAGEREF _Toc223885700 \h </w:instrText>
+            </w:r>
+            <w:r>
+              <w:rPr>
+                <w:noProof/>
+                <w:webHidden/>
+              </w:rPr>
+            </w:r>
+            <w:r>
+              <w:rPr>
+                <w:noProof/>
+                <w:webHidden/>
+              </w:rPr>
+              <w:fldChar w:fldCharType="separate"/>
+            </w:r>
+            <w:r>
+              <w:rPr>
+                <w:noProof/>
+                <w:webHidden/>
+              </w:rPr>
+              <w:t>5</w:t>
+            </w:r>
+            <w:r>
+              <w:rPr>
+                <w:noProof/>
+                <w:webHidden/>
+              </w:rPr>
+              <w:fldChar w:fldCharType="end"/>
+            </w:r>
+          </w:hyperlink>
+        </w:p>
+        <w:p>
+          <w:pPr>
+            <w:pStyle w:val="TOC2"/>
+            <w:tabs>
+              <w:tab w:val="left" w:pos="1440"/>
+              <w:tab w:val="right" w:leader="dot" w:pos="9019"/>
+            </w:tabs>
+            <w:rPr>
+              <w:rFonts w:asciiTheme="minorHAnsi" w:eastAsiaTheme="minorEastAsia" w:hAnsiTheme="minorHAnsi" w:cstheme="minorBidi"/>
+              <w:noProof/>
+              <w:kern w:val="2"/>
+              <w:lang w:val="en-CA"/>
+              <w14:ligatures w14:val="standardContextual"/>
+            </w:rPr>
+          </w:pPr>
+          <w:hyperlink w:anchor="_Toc223885701" w:history="1">
+            <w:r>
+              <w:rPr>
+                <w:rStyle w:val="Hyperlink"/>
+                <w:noProof/>
+              </w:rPr>
+              <w:t>4.3</w:t>
+            </w:r>
+            <w:r>
+              <w:rPr>
+                <w:rFonts w:asciiTheme="minorHAnsi" w:eastAsiaTheme="minorEastAsia" w:hAnsiTheme="minorHAnsi" w:cstheme="minorBidi"/>
+                <w:noProof/>
+                <w:kern w:val="2"/>
+                <w:lang w:val="en-CA"/>
+                <w14:ligatures w14:val="standardContextual"/>
+              </w:rPr>
+              <w:tab/>
+            </w:r>
+            <w:r>
+              <w:rPr>
+                <w:rStyle w:val="Hyperlink"/>
+                <w:noProof/>
+              </w:rPr>
+              <w:t>Integration and consistency across the system</w:t>
+            </w:r>
+            <w:r>
+              <w:rPr>
+                <w:noProof/>
+                <w:webHidden/>
+              </w:rPr>
+              <w:tab/>
+            </w:r>
+            <w:r>
+              <w:rPr>
+                <w:noProof/>
+                <w:webHidden/>
+              </w:rPr>
+              <w:fldChar w:fldCharType="begin"/>
+            </w:r>
+            <w:r>
+              <w:rPr>
+                <w:noProof/>
+                <w:webHidden/>
+              </w:rPr>
+              <w:instrText xml:space="preserve"> PAGEREF _Toc223885701 \h </w:instrText>
+            </w:r>
+            <w:r>
+              <w:rPr>
+                <w:noProof/>
+                <w:webHidden/>
+              </w:rPr>
+            </w:r>
+            <w:r>
+              <w:rPr>
+                <w:noProof/>
+                <w:webHidden/>
+              </w:rPr>
+              <w:fldChar w:fldCharType="separate"/>
+            </w:r>
+            <w:r>
+              <w:rPr>
+                <w:noProof/>
+                <w:webHidden/>
+              </w:rPr>
+              <w:t>6</w:t>
+            </w:r>
+            <w:r>
+              <w:rPr>
+                <w:noProof/>
+                <w:webHidden/>
+              </w:rPr>
+              <w:fldChar w:fldCharType="end"/>
+            </w:r>
+          </w:hyperlink>
+        </w:p>
+        <w:p>
+          <w:pPr>
+            <w:pStyle w:val="TOC1"/>
+            <w:tabs>
+              <w:tab w:val="left" w:pos="960"/>
+              <w:tab w:val="right" w:leader="dot" w:pos="9019"/>
+            </w:tabs>
+            <w:rPr>
+              <w:rFonts w:asciiTheme="minorHAnsi" w:eastAsiaTheme="minorEastAsia" w:hAnsiTheme="minorHAnsi" w:cstheme="minorBidi"/>
+              <w:noProof/>
+              <w:kern w:val="2"/>
+              <w:lang w:val="en-CA"/>
+              <w14:ligatures w14:val="standardContextual"/>
+            </w:rPr>
+          </w:pPr>
+          <w:hyperlink w:anchor="_Toc223885702" w:history="1">
+            <w:r>
+              <w:rPr>
+                <w:rStyle w:val="Hyperlink"/>
+                <w:noProof/>
+              </w:rPr>
+              <w:t>5</w:t>
+            </w:r>
+            <w:r>
+              <w:rPr>
+                <w:rFonts w:asciiTheme="minorHAnsi" w:eastAsiaTheme="minorEastAsia" w:hAnsiTheme="minorHAnsi" w:cstheme="minorBidi"/>
+                <w:noProof/>
+                <w:kern w:val="2"/>
+                <w:lang w:val="en-CA"/>
+                <w14:ligatures w14:val="standardContextual"/>
+              </w:rPr>
+              <w:tab/>
+            </w:r>
+            <w:r>
+              <w:rPr>
+                <w:rStyle w:val="Hyperlink"/>
+                <w:noProof/>
+              </w:rPr>
+              <w:t>Testing and Validation</w:t>
+            </w:r>
+            <w:r>
+              <w:rPr>
+                <w:noProof/>
+                <w:webHidden/>
+              </w:rPr>
+              <w:tab/>
+            </w:r>
+            <w:r>
+              <w:rPr>
+                <w:noProof/>
+                <w:webHidden/>
+              </w:rPr>
+              <w:fldChar w:fldCharType="begin"/>
+            </w:r>
+            <w:r>
+              <w:rPr>
+                <w:noProof/>
+                <w:webHidden/>
+              </w:rPr>
+              <w:instrText xml:space="preserve"> PAGEREF _Toc223885702 \h </w:instrText>
+            </w:r>
+            <w:r>
+              <w:rPr>
+                <w:noProof/>
+                <w:webHidden/>
+              </w:rPr>
+            </w:r>
+            <w:r>
+              <w:rPr>
+                <w:noProof/>
+                <w:webHidden/>
+              </w:rPr>
+              <w:fldChar w:fldCharType="separate"/>
+            </w:r>
+            <w:r>
+              <w:rPr>
+                <w:noProof/>
+                <w:webHidden/>
+              </w:rPr>
+              <w:t>6</w:t>
+            </w:r>
+            <w:r>
+              <w:rPr>
+                <w:noProof/>
+                <w:webHidden/>
+              </w:rPr>
+              <w:fldChar w:fldCharType="end"/>
+            </w:r>
+          </w:hyperlink>
+        </w:p>
+        <w:p>
+          <w:pPr>
+            <w:pStyle w:val="TOC2"/>
+            <w:tabs>
+              <w:tab w:val="left" w:pos="1440"/>
+              <w:tab w:val="right" w:leader="dot" w:pos="9019"/>
+            </w:tabs>
+            <w:rPr>
+              <w:rFonts w:asciiTheme="minorHAnsi" w:eastAsiaTheme="minorEastAsia" w:hAnsiTheme="minorHAnsi" w:cstheme="minorBidi"/>
+              <w:noProof/>
+              <w:kern w:val="2"/>
+              <w:lang w:val="en-CA"/>
+              <w14:ligatures w14:val="standardContextual"/>
+            </w:rPr>
+          </w:pPr>
+          <w:hyperlink w:anchor="_Toc223885703" w:history="1">
+            <w:r>
+              <w:rPr>
+                <w:rStyle w:val="Hyperlink"/>
+                <w:noProof/>
+              </w:rPr>
+              <w:t>5.1</w:t>
+            </w:r>
+            <w:r>
+              <w:rPr>
+                <w:rFonts w:asciiTheme="minorHAnsi" w:eastAsiaTheme="minorEastAsia" w:hAnsiTheme="minorHAnsi" w:cstheme="minorBidi"/>
+                <w:noProof/>
+                <w:kern w:val="2"/>
+                <w:lang w:val="en-CA"/>
+                <w14:ligatures w14:val="standardContextual"/>
+              </w:rPr>
+              <w:tab/>
+            </w:r>
+            <w:r>
+              <w:rPr>
+                <w:rStyle w:val="Hyperlink"/>
+                <w:noProof/>
+              </w:rPr>
+              <w:t>Testing Strategy and Approach</w:t>
+            </w:r>
+            <w:r>
+              <w:rPr>
+                <w:noProof/>
+                <w:webHidden/>
+              </w:rPr>
+              <w:tab/>
+            </w:r>
+            <w:r>
+              <w:rPr>
+                <w:noProof/>
+                <w:webHidden/>
+              </w:rPr>
+              <w:fldChar w:fldCharType="begin"/>
+            </w:r>
+            <w:r>
+              <w:rPr>
+                <w:noProof/>
+                <w:webHidden/>
+              </w:rPr>
+              <w:instrText xml:space="preserve"> PAGEREF _Toc223885703 \h </w:instrText>
+            </w:r>
+            <w:r>
+              <w:rPr>
+                <w:noProof/>
+                <w:webHidden/>
+              </w:rPr>
+            </w:r>
+            <w:r>
+              <w:rPr>
+                <w:noProof/>
+                <w:webHidden/>
+              </w:rPr>
+              <w:fldChar w:fldCharType="separate"/>
+            </w:r>
+            <w:r>
+              <w:rPr>
+                <w:noProof/>
+                <w:webHidden/>
+              </w:rPr>
+              <w:t>7</w:t>
+            </w:r>
+            <w:r>
+              <w:rPr>
+                <w:noProof/>
+                <w:webHidden/>
+              </w:rPr>
+              <w:fldChar w:fldCharType="end"/>
+            </w:r>
+          </w:hyperlink>
+        </w:p>
+        <w:p>
+          <w:pPr>
+            <w:pStyle w:val="TOC2"/>
+            <w:tabs>
+              <w:tab w:val="left" w:pos="1440"/>
+              <w:tab w:val="right" w:leader="dot" w:pos="9019"/>
+            </w:tabs>
+            <w:rPr>
+              <w:rFonts w:asciiTheme="minorHAnsi" w:eastAsiaTheme="minorEastAsia" w:hAnsiTheme="minorHAnsi" w:cstheme="minorBidi"/>
+              <w:noProof/>
+              <w:kern w:val="2"/>
+              <w:lang w:val="en-CA"/>
+              <w14:ligatures w14:val="standardContextual"/>
+            </w:rPr>
+          </w:pPr>
+          <w:hyperlink w:anchor="_Toc223885704" w:history="1">
+            <w:r>
+              <w:rPr>
+                <w:rStyle w:val="Hyperlink"/>
+                <w:noProof/>
+              </w:rPr>
+              <w:t>5.2</w:t>
+            </w:r>
+            <w:r>
+              <w:rPr>
+                <w:rFonts w:asciiTheme="minorHAnsi" w:eastAsiaTheme="minorEastAsia" w:hAnsiTheme="minorHAnsi" w:cstheme="minorBidi"/>
+                <w:noProof/>
+                <w:kern w:val="2"/>
+                <w:lang w:val="en-CA"/>
+                <w14:ligatures w14:val="standardContextual"/>
+              </w:rPr>
+              <w:tab/>
+            </w:r>
+            <w:r>
+              <w:rPr>
+                <w:rStyle w:val="Hyperlink"/>
+                <w:noProof/>
+              </w:rPr>
+              <w:t>Functional Testing</w:t>
+            </w:r>
+            <w:r>
+              <w:rPr>
+                <w:noProof/>
+                <w:webHidden/>
+              </w:rPr>
+              <w:tab/>
+            </w:r>
+            <w:r>
+              <w:rPr>
+                <w:noProof/>
+                <w:webHidden/>
+              </w:rPr>
+              <w:fldChar w:fldCharType="begin"/>
+            </w:r>
+            <w:r>
+              <w:rPr>
+                <w:noProof/>
+                <w:webHidden/>
+              </w:rPr>
+              <w:instrText xml:space="preserve"> PAGEREF _Toc223885704 \h </w:instrText>
+            </w:r>
+            <w:r>
+              <w:rPr>
+                <w:noProof/>
+                <w:webHidden/>
+              </w:rPr>
+            </w:r>
+            <w:r>
+              <w:rPr>
+                <w:noProof/>
+                <w:webHidden/>
+              </w:rPr>
+              <w:fldChar w:fldCharType="separate"/>
+            </w:r>
+            <w:r>
+              <w:rPr>
+                <w:noProof/>
+                <w:webHidden/>
+              </w:rPr>
+              <w:t>7</w:t>
+            </w:r>
+            <w:r>
+              <w:rPr>
+                <w:noProof/>
+                <w:webHidden/>
+              </w:rPr>
+              <w:fldChar w:fldCharType="end"/>
+            </w:r>
+          </w:hyperlink>
+        </w:p>
+        <w:p>
+          <w:pPr>
+            <w:pStyle w:val="TOC3"/>
+            <w:tabs>
+              <w:tab w:val="left" w:pos="1920"/>
+              <w:tab w:val="right" w:leader="dot" w:pos="9019"/>
+            </w:tabs>
+            <w:rPr>
+              <w:rFonts w:asciiTheme="minorHAnsi" w:eastAsiaTheme="minorEastAsia" w:hAnsiTheme="minorHAnsi" w:cstheme="minorBidi"/>
+              <w:noProof/>
+              <w:kern w:val="2"/>
+              <w:lang w:val="en-CA"/>
+              <w14:ligatures w14:val="standardContextual"/>
+            </w:rPr>
+          </w:pPr>
+          <w:hyperlink w:anchor="_Toc223885705" w:history="1">
+            <w:r>
+              <w:rPr>
+                <w:rStyle w:val="Hyperlink"/>
+                <w:noProof/>
+              </w:rPr>
+              <w:t>5.2.1</w:t>
+            </w:r>
+            <w:r>
+              <w:rPr>
+                <w:rFonts w:asciiTheme="minorHAnsi" w:eastAsiaTheme="minorEastAsia" w:hAnsiTheme="minorHAnsi" w:cstheme="minorBidi"/>
+                <w:noProof/>
+                <w:kern w:val="2"/>
+                <w:lang w:val="en-CA"/>
+                <w14:ligatures w14:val="standardContextual"/>
+              </w:rPr>
+              <w:tab/>
+            </w:r>
+            <w:r>
+              <w:rPr>
+                <w:rStyle w:val="Hyperlink"/>
+                <w:noProof/>
+              </w:rPr>
+              <w:t>Transactions (Record/Edit/Delete)</w:t>
+            </w:r>
+            <w:r>
+              <w:rPr>
+                <w:noProof/>
+                <w:webHidden/>
+              </w:rPr>
+              <w:tab/>
+            </w:r>
+            <w:r>
+              <w:rPr>
+                <w:noProof/>
+                <w:webHidden/>
+              </w:rPr>
+              <w:fldChar w:fldCharType="begin"/>
+            </w:r>
+            <w:r>
+              <w:rPr>
+                <w:noProof/>
+                <w:webHidden/>
+              </w:rPr>
+              <w:instrText xml:space="preserve"> PAGEREF _Toc223885705 \h </w:instrText>
+            </w:r>
+            <w:r>
+              <w:rPr>
+                <w:noProof/>
+                <w:webHidden/>
+              </w:rPr>
+            </w:r>
+            <w:r>
+              <w:rPr>
+                <w:noProof/>
+                <w:webHidden/>
+              </w:rPr>
+              <w:fldChar w:fldCharType="separate"/>
+            </w:r>
+            <w:r>
+              <w:rPr>
+                <w:noProof/>
+                <w:webHidden/>
+              </w:rPr>
+              <w:t>7</w:t>
+            </w:r>
+            <w:r>
+              <w:rPr>
+                <w:noProof/>
+                <w:webHidden/>
+              </w:rPr>
+              <w:fldChar w:fldCharType="end"/>
+            </w:r>
+          </w:hyperlink>
+        </w:p>
+        <w:p>
+          <w:pPr>
+            <w:pStyle w:val="TOC3"/>
+            <w:tabs>
+              <w:tab w:val="left" w:pos="1920"/>
+              <w:tab w:val="right" w:leader="dot" w:pos="9019"/>
+            </w:tabs>
+            <w:rPr>
+              <w:rFonts w:asciiTheme="minorHAnsi" w:eastAsiaTheme="minorEastAsia" w:hAnsiTheme="minorHAnsi" w:cstheme="minorBidi"/>
+              <w:noProof/>
+              <w:kern w:val="2"/>
+              <w:lang w:val="en-CA"/>
+              <w14:ligatures w14:val="standardContextual"/>
+            </w:rPr>
+          </w:pPr>
+          <w:hyperlink w:anchor="_Toc223885706" w:history="1">
+            <w:r>
+              <w:rPr>
+                <w:rStyle w:val="Hyperlink"/>
+                <w:noProof/>
+              </w:rPr>
+              <w:t>5.2.2</w:t>
+            </w:r>
+            <w:r>
+              <w:rPr>
+                <w:rFonts w:asciiTheme="minorHAnsi" w:eastAsiaTheme="minorEastAsia" w:hAnsiTheme="minorHAnsi" w:cstheme="minorBidi"/>
+                <w:noProof/>
+                <w:kern w:val="2"/>
+                <w:lang w:val="en-CA"/>
+                <w14:ligatures w14:val="standardContextual"/>
+              </w:rPr>
+              <w:tab/>
+            </w:r>
+            <w:r>
+              <w:rPr>
+                <w:rStyle w:val="Hyperlink"/>
+                <w:noProof/>
+              </w:rPr>
+              <w:t>View &amp; Filter Transactions</w:t>
+            </w:r>
+            <w:r>
+              <w:rPr>
+                <w:noProof/>
+                <w:webHidden/>
+              </w:rPr>
+              <w:tab/>
+            </w:r>
+            <w:r>
+              <w:rPr>
+                <w:noProof/>
+                <w:webHidden/>
+              </w:rPr>
+              <w:fldChar w:fldCharType="begin"/>
+            </w:r>
+            <w:r>
+              <w:rPr>
+                <w:noProof/>
+                <w:webHidden/>
+              </w:rPr>
+              <w:instrText xml:space="preserve"> PAGEREF _Toc223885706 \h </w:instrText>
+            </w:r>
+            <w:r>
+              <w:rPr>
+                <w:noProof/>
+                <w:webHidden/>
+              </w:rPr>
+            </w:r>
+            <w:r>
+              <w:rPr>
+                <w:noProof/>
+                <w:webHidden/>
+              </w:rPr>
+              <w:fldChar w:fldCharType="separate"/>
+            </w:r>
+            <w:r>
+              <w:rPr>
+                <w:noProof/>
+                <w:webHidden/>
+              </w:rPr>
+              <w:t>7</w:t>
+            </w:r>
+            <w:r>
+              <w:rPr>
+                <w:noProof/>
+                <w:webHidden/>
+              </w:rPr>
+              <w:fldChar w:fldCharType="end"/>
+            </w:r>
+          </w:hyperlink>
+        </w:p>
+        <w:p>
+          <w:pPr>
+            <w:pStyle w:val="TOC3"/>
+            <w:tabs>
+              <w:tab w:val="left" w:pos="1920"/>
+              <w:tab w:val="right" w:leader="dot" w:pos="9019"/>
+            </w:tabs>
+            <w:rPr>
+              <w:rFonts w:asciiTheme="minorHAnsi" w:eastAsiaTheme="minorEastAsia" w:hAnsiTheme="minorHAnsi" w:cstheme="minorBidi"/>
+              <w:noProof/>
+              <w:kern w:val="2"/>
+              <w:lang w:val="en-CA"/>
+              <w14:ligatures w14:val="standardContextual"/>
+            </w:rPr>
+          </w:pPr>
+          <w:hyperlink w:anchor="_Toc223885707" w:history="1">
+            <w:r>
+              <w:rPr>
+                <w:rStyle w:val="Hyperlink"/>
+                <w:noProof/>
+              </w:rPr>
+              <w:t>5.2.3</w:t>
+            </w:r>
+            <w:r>
+              <w:rPr>
+                <w:rFonts w:asciiTheme="minorHAnsi" w:eastAsiaTheme="minorEastAsia" w:hAnsiTheme="minorHAnsi" w:cstheme="minorBidi"/>
+                <w:noProof/>
+                <w:kern w:val="2"/>
+                <w:lang w:val="en-CA"/>
+                <w14:ligatures w14:val="standardContextual"/>
+              </w:rPr>
+              <w:tab/>
+            </w:r>
+            <w:r>
+              <w:rPr>
+                <w:rStyle w:val="Hyperlink"/>
+                <w:noProof/>
+              </w:rPr>
+              <w:t>Budgets and Overspending Alerts</w:t>
+            </w:r>
+            <w:r>
+              <w:rPr>
+                <w:noProof/>
+                <w:webHidden/>
+              </w:rPr>
+              <w:tab/>
+            </w:r>
+            <w:r>
+              <w:rPr>
+                <w:noProof/>
+                <w:webHidden/>
+              </w:rPr>
+              <w:fldChar w:fldCharType="begin"/>
+            </w:r>
+            <w:r>
+              <w:rPr>
+                <w:noProof/>
+                <w:webHidden/>
+              </w:rPr>
+              <w:instrText xml:space="preserve"> PAGEREF _Toc223885707 \h </w:instrText>
+            </w:r>
+            <w:r>
+              <w:rPr>
+                <w:noProof/>
+                <w:webHidden/>
+              </w:rPr>
+            </w:r>
+            <w:r>
+              <w:rPr>
+                <w:noProof/>
+                <w:webHidden/>
+              </w:rPr>
+              <w:fldChar w:fldCharType="separate"/>
+            </w:r>
+            <w:r>
+              <w:rPr>
+                <w:noProof/>
+                <w:webHidden/>
+              </w:rPr>
+              <w:t>7</w:t>
+            </w:r>
+            <w:r>
+              <w:rPr>
+                <w:noProof/>
+                <w:webHidden/>
+              </w:rPr>
+              <w:fldChar w:fldCharType="end"/>
+            </w:r>
+          </w:hyperlink>
+        </w:p>
+        <w:p>
+          <w:pPr>
+            <w:pStyle w:val="TOC3"/>
+            <w:tabs>
+              <w:tab w:val="left" w:pos="1920"/>
+              <w:tab w:val="right" w:leader="dot" w:pos="9019"/>
+            </w:tabs>
+            <w:rPr>
+              <w:rFonts w:asciiTheme="minorHAnsi" w:eastAsiaTheme="minorEastAsia" w:hAnsiTheme="minorHAnsi" w:cstheme="minorBidi"/>
+              <w:noProof/>
+              <w:kern w:val="2"/>
+              <w:lang w:val="en-CA"/>
+              <w14:ligatures w14:val="standardContextual"/>
+            </w:rPr>
+          </w:pPr>
+          <w:hyperlink w:anchor="_Toc223885708" w:history="1">
+            <w:r>
+              <w:rPr>
+                <w:rStyle w:val="Hyperlink"/>
+                <w:noProof/>
+              </w:rPr>
+              <w:t>5.2.4</w:t>
+            </w:r>
+            <w:r>
+              <w:rPr>
+                <w:rFonts w:asciiTheme="minorHAnsi" w:eastAsiaTheme="minorEastAsia" w:hAnsiTheme="minorHAnsi" w:cstheme="minorBidi"/>
+                <w:noProof/>
+                <w:kern w:val="2"/>
+                <w:lang w:val="en-CA"/>
+                <w14:ligatures w14:val="standardContextual"/>
+              </w:rPr>
+              <w:tab/>
+            </w:r>
+            <w:r>
+              <w:rPr>
+                <w:rStyle w:val="Hyperlink"/>
+                <w:noProof/>
+              </w:rPr>
+              <w:t>Reports (Summary + Category Breakdown)</w:t>
+            </w:r>
+            <w:r>
+              <w:rPr>
+                <w:noProof/>
+                <w:webHidden/>
+              </w:rPr>
+              <w:tab/>
+            </w:r>
+            <w:r>
+              <w:rPr>
+                <w:noProof/>
+                <w:webHidden/>
+              </w:rPr>
+              <w:fldChar w:fldCharType="begin"/>
+            </w:r>
+            <w:r>
+              <w:rPr>
+                <w:noProof/>
+                <w:webHidden/>
+              </w:rPr>
+              <w:instrText xml:space="preserve"> PAGEREF _Toc223885708 \h </w:instrText>
+            </w:r>
+            <w:r>
+              <w:rPr>
+                <w:noProof/>
+                <w:webHidden/>
+              </w:rPr>
+            </w:r>
+            <w:r>
+              <w:rPr>
+                <w:noProof/>
+                <w:webHidden/>
+              </w:rPr>
+              <w:fldChar w:fldCharType="separate"/>
+            </w:r>
+            <w:r>
+              <w:rPr>
+                <w:noProof/>
+                <w:webHidden/>
+              </w:rPr>
+              <w:t>7</w:t>
+            </w:r>
+            <w:r>
+              <w:rPr>
+                <w:noProof/>
+                <w:webHidden/>
+              </w:rPr>
+              <w:fldChar w:fldCharType="end"/>
+            </w:r>
+          </w:hyperlink>
+        </w:p>
+        <w:p>
+          <w:pPr>
+            <w:pStyle w:val="TOC3"/>
+            <w:tabs>
+              <w:tab w:val="left" w:pos="1920"/>
+              <w:tab w:val="right" w:leader="dot" w:pos="9019"/>
+            </w:tabs>
+            <w:rPr>
+              <w:rFonts w:asciiTheme="minorHAnsi" w:eastAsiaTheme="minorEastAsia" w:hAnsiTheme="minorHAnsi" w:cstheme="minorBidi"/>
+              <w:noProof/>
+              <w:kern w:val="2"/>
+              <w:lang w:val="en-CA"/>
+              <w14:ligatures w14:val="standardContextual"/>
+            </w:rPr>
+          </w:pPr>
+          <w:hyperlink w:anchor="_Toc223885709" w:history="1">
+            <w:r>
+              <w:rPr>
+                <w:rStyle w:val="Hyperlink"/>
+                <w:noProof/>
+              </w:rPr>
+              <w:t>5.2.5</w:t>
+            </w:r>
+            <w:r>
+              <w:rPr>
+                <w:rFonts w:asciiTheme="minorHAnsi" w:eastAsiaTheme="minorEastAsia" w:hAnsiTheme="minorHAnsi" w:cstheme="minorBidi"/>
+                <w:noProof/>
+                <w:kern w:val="2"/>
+                <w:lang w:val="en-CA"/>
+                <w14:ligatures w14:val="standardContextual"/>
+              </w:rPr>
+              <w:tab/>
+            </w:r>
+            <w:r>
+              <w:rPr>
+                <w:rStyle w:val="Hyperlink"/>
+                <w:noProof/>
+              </w:rPr>
+              <w:t>Persistence behaviors (Save/Load)</w:t>
+            </w:r>
+            <w:r>
+              <w:rPr>
+                <w:noProof/>
+                <w:webHidden/>
+              </w:rPr>
+              <w:tab/>
+            </w:r>
+            <w:r>
+              <w:rPr>
+                <w:noProof/>
+                <w:webHidden/>
+              </w:rPr>
+              <w:fldChar w:fldCharType="begin"/>
+            </w:r>
+            <w:r>
+              <w:rPr>
+                <w:noProof/>
+                <w:webHidden/>
+              </w:rPr>
+              <w:instrText xml:space="preserve"> PAGEREF _Toc223885709 \h </w:instrText>
+            </w:r>
+            <w:r>
+              <w:rPr>
+                <w:noProof/>
+                <w:webHidden/>
+              </w:rPr>
+            </w:r>
+            <w:r>
+              <w:rPr>
+                <w:noProof/>
+                <w:webHidden/>
+              </w:rPr>
+              <w:fldChar w:fldCharType="separate"/>
+            </w:r>
+            <w:r>
+              <w:rPr>
+                <w:noProof/>
+                <w:webHidden/>
+              </w:rPr>
+              <w:t>8</w:t>
+            </w:r>
+            <w:r>
+              <w:rPr>
+                <w:noProof/>
+                <w:webHidden/>
+              </w:rPr>
+              <w:fldChar w:fldCharType="end"/>
+            </w:r>
+          </w:hyperlink>
+        </w:p>
+        <w:p>
+          <w:pPr>
+            <w:pStyle w:val="TOC2"/>
+            <w:tabs>
+              <w:tab w:val="left" w:pos="1440"/>
+              <w:tab w:val="right" w:leader="dot" w:pos="9019"/>
+            </w:tabs>
+            <w:rPr>
+              <w:rFonts w:asciiTheme="minorHAnsi" w:eastAsiaTheme="minorEastAsia" w:hAnsiTheme="minorHAnsi" w:cstheme="minorBidi"/>
+              <w:noProof/>
+              <w:kern w:val="2"/>
+              <w:lang w:val="en-CA"/>
+              <w14:ligatures w14:val="standardContextual"/>
+            </w:rPr>
+          </w:pPr>
+          <w:hyperlink w:anchor="_Toc223885710" w:history="1">
+            <w:r>
+              <w:rPr>
+                <w:rStyle w:val="Hyperlink"/>
+                <w:noProof/>
+              </w:rPr>
+              <w:t>5.3</w:t>
+            </w:r>
+            <w:r>
+              <w:rPr>
+                <w:rFonts w:asciiTheme="minorHAnsi" w:eastAsiaTheme="minorEastAsia" w:hAnsiTheme="minorHAnsi" w:cstheme="minorBidi"/>
+                <w:noProof/>
+                <w:kern w:val="2"/>
+                <w:lang w:val="en-CA"/>
+                <w14:ligatures w14:val="standardContextual"/>
+              </w:rPr>
+              <w:tab/>
+            </w:r>
+            <w:r>
+              <w:rPr>
+                <w:rStyle w:val="Hyperlink"/>
+                <w:noProof/>
+              </w:rPr>
+              <w:t>System and Integration Testing</w:t>
+            </w:r>
+            <w:r>
+              <w:rPr>
+                <w:noProof/>
+                <w:webHidden/>
+              </w:rPr>
+              <w:tab/>
+            </w:r>
+            <w:r>
+              <w:rPr>
+                <w:noProof/>
+                <w:webHidden/>
+              </w:rPr>
+              <w:fldChar w:fldCharType="begin"/>
+            </w:r>
+            <w:r>
+              <w:rPr>
+                <w:noProof/>
+                <w:webHidden/>
+              </w:rPr>
+              <w:instrText xml:space="preserve"> PAGEREF _Toc223885710 \h </w:instrText>
+            </w:r>
+            <w:r>
+              <w:rPr>
+                <w:noProof/>
+                <w:webHidden/>
+              </w:rPr>
+            </w:r>
+            <w:r>
+              <w:rPr>
+                <w:noProof/>
+                <w:webHidden/>
+              </w:rPr>
+              <w:fldChar w:fldCharType="separate"/>
+            </w:r>
+            <w:r>
+              <w:rPr>
+                <w:noProof/>
+                <w:webHidden/>
+              </w:rPr>
+              <w:t>8</w:t>
+            </w:r>
+            <w:r>
+              <w:rPr>
+                <w:noProof/>
+                <w:webHidden/>
+              </w:rPr>
+              <w:fldChar w:fldCharType="end"/>
+            </w:r>
+          </w:hyperlink>
+        </w:p>
+        <w:p>
+          <w:pPr>
+            <w:pStyle w:val="TOC2"/>
+            <w:tabs>
+              <w:tab w:val="left" w:pos="1440"/>
+              <w:tab w:val="right" w:leader="dot" w:pos="9019"/>
+            </w:tabs>
+            <w:rPr>
+              <w:rFonts w:asciiTheme="minorHAnsi" w:eastAsiaTheme="minorEastAsia" w:hAnsiTheme="minorHAnsi" w:cstheme="minorBidi"/>
+              <w:noProof/>
+              <w:kern w:val="2"/>
+              <w:lang w:val="en-CA"/>
+              <w14:ligatures w14:val="standardContextual"/>
+            </w:rPr>
+          </w:pPr>
+          <w:hyperlink w:anchor="_Toc223885711" w:history="1">
+            <w:r>
+              <w:rPr>
+                <w:rStyle w:val="Hyperlink"/>
+                <w:noProof/>
+              </w:rPr>
+              <w:t>5.4</w:t>
+            </w:r>
+            <w:r>
+              <w:rPr>
+                <w:rFonts w:asciiTheme="minorHAnsi" w:eastAsiaTheme="minorEastAsia" w:hAnsiTheme="minorHAnsi" w:cstheme="minorBidi"/>
+                <w:noProof/>
+                <w:kern w:val="2"/>
+                <w:lang w:val="en-CA"/>
+                <w14:ligatures w14:val="standardContextual"/>
+              </w:rPr>
+              <w:tab/>
+            </w:r>
+            <w:r>
+              <w:rPr>
+                <w:rStyle w:val="Hyperlink"/>
+                <w:noProof/>
+              </w:rPr>
+              <w:t>Edge Cases and Error Handling</w:t>
+            </w:r>
+            <w:r>
+              <w:rPr>
+                <w:noProof/>
+                <w:webHidden/>
+              </w:rPr>
+              <w:tab/>
+            </w:r>
+            <w:r>
+              <w:rPr>
+                <w:noProof/>
+                <w:webHidden/>
+              </w:rPr>
+              <w:fldChar w:fldCharType="begin"/>
+            </w:r>
+            <w:r>
+              <w:rPr>
+                <w:noProof/>
+                <w:webHidden/>
+              </w:rPr>
+              <w:instrText xml:space="preserve"> PAGEREF _Toc223885711 \h </w:instrText>
+            </w:r>
+            <w:r>
+              <w:rPr>
+                <w:noProof/>
+                <w:webHidden/>
+              </w:rPr>
+            </w:r>
+            <w:r>
+              <w:rPr>
+                <w:noProof/>
+                <w:webHidden/>
+              </w:rPr>
+              <w:fldChar w:fldCharType="separate"/>
+            </w:r>
+            <w:r>
+              <w:rPr>
+                <w:noProof/>
+                <w:webHidden/>
+              </w:rPr>
+              <w:t>9</w:t>
+            </w:r>
+            <w:r>
+              <w:rPr>
+                <w:noProof/>
+                <w:webHidden/>
+              </w:rPr>
+              <w:fldChar w:fldCharType="end"/>
+            </w:r>
+          </w:hyperlink>
+        </w:p>
+        <w:p>
+          <w:pPr>
+            <w:pStyle w:val="TOC2"/>
+            <w:tabs>
+              <w:tab w:val="left" w:pos="1440"/>
+              <w:tab w:val="right" w:leader="dot" w:pos="9019"/>
+            </w:tabs>
+            <w:rPr>
+              <w:rFonts w:asciiTheme="minorHAnsi" w:eastAsiaTheme="minorEastAsia" w:hAnsiTheme="minorHAnsi" w:cstheme="minorBidi"/>
+              <w:noProof/>
+              <w:kern w:val="2"/>
+              <w:lang w:val="en-CA"/>
+              <w14:ligatures w14:val="standardContextual"/>
+            </w:rPr>
+          </w:pPr>
+          <w:hyperlink w:anchor="_Toc223885712" w:history="1">
+            <w:r>
+              <w:rPr>
+                <w:rStyle w:val="Hyperlink"/>
+                <w:noProof/>
+              </w:rPr>
+              <w:t>5.5</w:t>
+            </w:r>
+            <w:r>
+              <w:rPr>
+                <w:rFonts w:asciiTheme="minorHAnsi" w:eastAsiaTheme="minorEastAsia" w:hAnsiTheme="minorHAnsi" w:cstheme="minorBidi"/>
+                <w:noProof/>
+                <w:kern w:val="2"/>
+                <w:lang w:val="en-CA"/>
+                <w14:ligatures w14:val="standardContextual"/>
+              </w:rPr>
+              <w:tab/>
+            </w:r>
+            <w:r>
+              <w:rPr>
+                <w:rStyle w:val="Hyperlink"/>
+                <w:noProof/>
+              </w:rPr>
+              <w:t>Defects Found, Fixes, and Retesting</w:t>
+            </w:r>
+            <w:r>
+              <w:rPr>
+                <w:noProof/>
+                <w:webHidden/>
+              </w:rPr>
+              <w:tab/>
+            </w:r>
+            <w:r>
+              <w:rPr>
+                <w:noProof/>
+                <w:webHidden/>
+              </w:rPr>
+              <w:fldChar w:fldCharType="begin"/>
+            </w:r>
+            <w:r>
+              <w:rPr>
+                <w:noProof/>
+                <w:webHidden/>
+              </w:rPr>
+              <w:instrText xml:space="preserve"> PAGEREF _Toc223885712 \h </w:instrText>
+            </w:r>
+            <w:r>
+              <w:rPr>
+                <w:noProof/>
+                <w:webHidden/>
+              </w:rPr>
+            </w:r>
+            <w:r>
+              <w:rPr>
+                <w:noProof/>
+                <w:webHidden/>
+              </w:rPr>
+              <w:fldChar w:fldCharType="separate"/>
+            </w:r>
+            <w:r>
+              <w:rPr>
+                <w:noProof/>
+                <w:webHidden/>
+              </w:rPr>
+              <w:t>9</w:t>
+            </w:r>
+            <w:r>
+              <w:rPr>
+                <w:noProof/>
+                <w:webHidden/>
+              </w:rPr>
+              <w:fldChar w:fldCharType="end"/>
+            </w:r>
+          </w:hyperlink>
+        </w:p>
+        <w:p>
+          <w:pPr>
+            <w:pStyle w:val="TOC1"/>
+            <w:tabs>
+              <w:tab w:val="left" w:pos="960"/>
+              <w:tab w:val="right" w:leader="dot" w:pos="9019"/>
+            </w:tabs>
+            <w:rPr>
+              <w:rFonts w:asciiTheme="minorHAnsi" w:eastAsiaTheme="minorEastAsia" w:hAnsiTheme="minorHAnsi" w:cstheme="minorBidi"/>
+              <w:noProof/>
+              <w:kern w:val="2"/>
+              <w:lang w:val="en-CA"/>
+              <w14:ligatures w14:val="standardContextual"/>
+            </w:rPr>
+          </w:pPr>
+          <w:hyperlink w:anchor="_Toc223885713" w:history="1">
+            <w:r>
+              <w:rPr>
+                <w:rStyle w:val="Hyperlink"/>
+                <w:noProof/>
+              </w:rPr>
+              <w:t>6</w:t>
+            </w:r>
+            <w:r>
+              <w:rPr>
+                <w:rFonts w:asciiTheme="minorHAnsi" w:eastAsiaTheme="minorEastAsia" w:hAnsiTheme="minorHAnsi" w:cstheme="minorBidi"/>
+                <w:noProof/>
+                <w:kern w:val="2"/>
+                <w:lang w:val="en-CA"/>
+                <w14:ligatures w14:val="standardContextual"/>
+              </w:rPr>
+              <w:tab/>
+            </w:r>
+            <w:r>
+              <w:rPr>
+                <w:rStyle w:val="Hyperlink"/>
+                <w:noProof/>
+              </w:rPr>
+              <w:t>Updated Backlog</w:t>
+            </w:r>
+            <w:r>
+              <w:rPr>
+                <w:noProof/>
+                <w:webHidden/>
+              </w:rPr>
+              <w:tab/>
+            </w:r>
+            <w:r>
+              <w:rPr>
+                <w:noProof/>
+                <w:webHidden/>
+              </w:rPr>
+              <w:fldChar w:fldCharType="begin"/>
+            </w:r>
+            <w:r>
+              <w:rPr>
+                <w:noProof/>
+                <w:webHidden/>
+              </w:rPr>
+              <w:instrText xml:space="preserve"> PAGEREF _Toc223885713 \h </w:instrText>
+            </w:r>
+            <w:r>
+              <w:rPr>
+                <w:noProof/>
+                <w:webHidden/>
+              </w:rPr>
+            </w:r>
+            <w:r>
+              <w:rPr>
+                <w:noProof/>
+                <w:webHidden/>
+              </w:rPr>
+              <w:fldChar w:fldCharType="separate"/>
+            </w:r>
+            <w:r>
+              <w:rPr>
+                <w:noProof/>
+                <w:webHidden/>
+              </w:rPr>
+              <w:t>9</w:t>
+            </w:r>
+            <w:r>
+              <w:rPr>
+                <w:noProof/>
+                <w:webHidden/>
+              </w:rPr>
+              <w:fldChar w:fldCharType="end"/>
+            </w:r>
+          </w:hyperlink>
+        </w:p>
+        <w:p>
+          <w:pPr>
+            <w:pStyle w:val="TOC2"/>
+            <w:tabs>
+              <w:tab w:val="left" w:pos="1440"/>
+              <w:tab w:val="right" w:leader="dot" w:pos="9019"/>
+            </w:tabs>
+            <w:rPr>
+              <w:rFonts w:asciiTheme="minorHAnsi" w:eastAsiaTheme="minorEastAsia" w:hAnsiTheme="minorHAnsi" w:cstheme="minorBidi"/>
+              <w:noProof/>
+              <w:kern w:val="2"/>
+              <w:lang w:val="en-CA"/>
+              <w14:ligatures w14:val="standardContextual"/>
+            </w:rPr>
+          </w:pPr>
+          <w:hyperlink w:anchor="_Toc223885714" w:history="1">
+            <w:r>
+              <w:rPr>
+                <w:rStyle w:val="Hyperlink"/>
+                <w:noProof/>
+              </w:rPr>
+              <w:t>6.1</w:t>
+            </w:r>
+            <w:r>
+              <w:rPr>
+                <w:rFonts w:asciiTheme="minorHAnsi" w:eastAsiaTheme="minorEastAsia" w:hAnsiTheme="minorHAnsi" w:cstheme="minorBidi"/>
+                <w:noProof/>
+                <w:kern w:val="2"/>
+                <w:lang w:val="en-CA"/>
+                <w14:ligatures w14:val="standardContextual"/>
+              </w:rPr>
+              <w:tab/>
+            </w:r>
+            <w:r>
+              <w:rPr>
+                <w:rStyle w:val="Hyperlink"/>
+                <w:noProof/>
+              </w:rPr>
+              <w:t>Completed Backlog Items</w:t>
+            </w:r>
+            <w:r>
+              <w:rPr>
+                <w:noProof/>
+                <w:webHidden/>
+              </w:rPr>
+              <w:tab/>
+            </w:r>
+            <w:r>
+              <w:rPr>
+                <w:noProof/>
+                <w:webHidden/>
+              </w:rPr>
+              <w:fldChar w:fldCharType="begin"/>
+            </w:r>
+            <w:r>
+              <w:rPr>
+                <w:noProof/>
+                <w:webHidden/>
+              </w:rPr>
+              <w:instrText xml:space="preserve"> PAGEREF _Toc223885714 \h </w:instrText>
+            </w:r>
+            <w:r>
+              <w:rPr>
+                <w:noProof/>
+                <w:webHidden/>
+              </w:rPr>
+            </w:r>
+            <w:r>
+              <w:rPr>
+                <w:noProof/>
+                <w:webHidden/>
+              </w:rPr>
+              <w:fldChar w:fldCharType="separate"/>
+            </w:r>
+            <w:r>
+              <w:rPr>
+                <w:noProof/>
+                <w:webHidden/>
+              </w:rPr>
+              <w:t>10</w:t>
+            </w:r>
+            <w:r>
+              <w:rPr>
+                <w:noProof/>
+                <w:webHidden/>
+              </w:rPr>
+              <w:fldChar w:fldCharType="end"/>
+            </w:r>
+          </w:hyperlink>
+        </w:p>
+        <w:p>
+          <w:pPr>
+            <w:pStyle w:val="TOC2"/>
+            <w:tabs>
+              <w:tab w:val="left" w:pos="1440"/>
+              <w:tab w:val="right" w:leader="dot" w:pos="9019"/>
+            </w:tabs>
+            <w:rPr>
+              <w:rFonts w:asciiTheme="minorHAnsi" w:eastAsiaTheme="minorEastAsia" w:hAnsiTheme="minorHAnsi" w:cstheme="minorBidi"/>
+              <w:noProof/>
+              <w:kern w:val="2"/>
+              <w:lang w:val="en-CA"/>
+              <w14:ligatures w14:val="standardContextual"/>
+            </w:rPr>
+          </w:pPr>
+          <w:hyperlink w:anchor="_Toc223885715" w:history="1">
+            <w:r>
+              <w:rPr>
+                <w:rStyle w:val="Hyperlink"/>
+                <w:noProof/>
+              </w:rPr>
+              <w:t>6.2</w:t>
+            </w:r>
+            <w:r>
+              <w:rPr>
+                <w:rFonts w:asciiTheme="minorHAnsi" w:eastAsiaTheme="minorEastAsia" w:hAnsiTheme="minorHAnsi" w:cstheme="minorBidi"/>
+                <w:noProof/>
+                <w:kern w:val="2"/>
+                <w:lang w:val="en-CA"/>
+                <w14:ligatures w14:val="standardContextual"/>
+              </w:rPr>
+              <w:tab/>
+            </w:r>
+            <w:r>
+              <w:rPr>
+                <w:rStyle w:val="Hyperlink"/>
+                <w:noProof/>
+              </w:rPr>
+              <w:t>Remaining Backlog Items (Next Iteration)</w:t>
+            </w:r>
+            <w:r>
+              <w:rPr>
+                <w:noProof/>
+                <w:webHidden/>
+              </w:rPr>
+              <w:tab/>
+            </w:r>
+            <w:r>
+              <w:rPr>
+                <w:noProof/>
+                <w:webHidden/>
+              </w:rPr>
+              <w:fldChar w:fldCharType="begin"/>
+            </w:r>
+            <w:r>
+              <w:rPr>
+                <w:noProof/>
+                <w:webHidden/>
+              </w:rPr>
+              <w:instrText xml:space="preserve"> PAGEREF _Toc223885715 \h </w:instrText>
+            </w:r>
+            <w:r>
+              <w:rPr>
+                <w:noProof/>
+                <w:webHidden/>
+              </w:rPr>
+            </w:r>
+            <w:r>
+              <w:rPr>
+                <w:noProof/>
+                <w:webHidden/>
+              </w:rPr>
+              <w:fldChar w:fldCharType="separate"/>
+            </w:r>
+            <w:r>
+              <w:rPr>
+                <w:noProof/>
+                <w:webHidden/>
+              </w:rPr>
+              <w:t>10</w:t>
+            </w:r>
+            <w:r>
+              <w:rPr>
+                <w:noProof/>
+                <w:webHidden/>
+              </w:rPr>
+              <w:fldChar w:fldCharType="end"/>
+            </w:r>
+          </w:hyperlink>
+        </w:p>
+        <w:p>
+          <w:pPr>
+            <w:pStyle w:val="TOC2"/>
+            <w:tabs>
+              <w:tab w:val="left" w:pos="1440"/>
+              <w:tab w:val="right" w:leader="dot" w:pos="9019"/>
+            </w:tabs>
+            <w:rPr>
+              <w:rFonts w:asciiTheme="minorHAnsi" w:eastAsiaTheme="minorEastAsia" w:hAnsiTheme="minorHAnsi" w:cstheme="minorBidi"/>
+              <w:noProof/>
+              <w:kern w:val="2"/>
+              <w:lang w:val="en-CA"/>
+              <w14:ligatures w14:val="standardContextual"/>
+            </w:rPr>
+          </w:pPr>
+          <w:hyperlink w:anchor="_Toc223885716" w:history="1">
+            <w:r>
+              <w:rPr>
+                <w:rStyle w:val="Hyperlink"/>
+                <w:noProof/>
+              </w:rPr>
+              <w:t>6.3</w:t>
+            </w:r>
+            <w:r>
+              <w:rPr>
+                <w:rFonts w:asciiTheme="minorHAnsi" w:eastAsiaTheme="minorEastAsia" w:hAnsiTheme="minorHAnsi" w:cstheme="minorBidi"/>
+                <w:noProof/>
+                <w:kern w:val="2"/>
+                <w:lang w:val="en-CA"/>
+                <w14:ligatures w14:val="standardContextual"/>
+              </w:rPr>
+              <w:tab/>
+            </w:r>
+            <w:r>
+              <w:rPr>
+                <w:rStyle w:val="Hyperlink"/>
+                <w:noProof/>
+              </w:rPr>
+              <w:t>Remaining Backlog Items (Next Iteration)</w:t>
+            </w:r>
+            <w:r>
+              <w:rPr>
+                <w:noProof/>
+                <w:webHidden/>
+              </w:rPr>
+              <w:tab/>
+            </w:r>
+            <w:r>
+              <w:rPr>
+                <w:noProof/>
+                <w:webHidden/>
+              </w:rPr>
+              <w:fldChar w:fldCharType="begin"/>
+            </w:r>
+            <w:r>
+              <w:rPr>
+                <w:noProof/>
+                <w:webHidden/>
+              </w:rPr>
+              <w:instrText xml:space="preserve"> PAGEREF _Toc223885716 \h </w:instrText>
+            </w:r>
+            <w:r>
+              <w:rPr>
+                <w:noProof/>
+                <w:webHidden/>
+              </w:rPr>
+            </w:r>
+            <w:r>
+              <w:rPr>
+                <w:noProof/>
+                <w:webHidden/>
+              </w:rPr>
+              <w:fldChar w:fldCharType="separate"/>
+            </w:r>
+            <w:r>
+              <w:rPr>
+                <w:noProof/>
+                <w:webHidden/>
+              </w:rPr>
+              <w:t>11</w:t>
+            </w:r>
+            <w:r>
+              <w:rPr>
+                <w:noProof/>
+                <w:webHidden/>
+              </w:rPr>
+              <w:fldChar w:fldCharType="end"/>
+            </w:r>
+          </w:hyperlink>
+        </w:p>
+        <w:p>
+          <w:pPr>
+            <w:pStyle w:val="TOC1"/>
+            <w:tabs>
+              <w:tab w:val="left" w:pos="960"/>
+              <w:tab w:val="right" w:leader="dot" w:pos="9019"/>
+            </w:tabs>
+            <w:rPr>
+              <w:rFonts w:asciiTheme="minorHAnsi" w:eastAsiaTheme="minorEastAsia" w:hAnsiTheme="minorHAnsi" w:cstheme="minorBidi"/>
+              <w:noProof/>
+              <w:kern w:val="2"/>
+              <w:lang w:val="en-CA"/>
+              <w14:ligatures w14:val="standardContextual"/>
+            </w:rPr>
+          </w:pPr>
+          <w:hyperlink w:anchor="_Toc223885717" w:history="1">
+            <w:r>
+              <w:rPr>
+                <w:rStyle w:val="Hyperlink"/>
+                <w:noProof/>
+              </w:rPr>
+              <w:t>7</w:t>
+            </w:r>
+            <w:r>
+              <w:rPr>
+                <w:rFonts w:asciiTheme="minorHAnsi" w:eastAsiaTheme="minorEastAsia" w:hAnsiTheme="minorHAnsi" w:cstheme="minorBidi"/>
+                <w:noProof/>
+                <w:kern w:val="2"/>
+                <w:lang w:val="en-CA"/>
+                <w14:ligatures w14:val="standardContextual"/>
+              </w:rPr>
+              <w:tab/>
+            </w:r>
+            <w:r>
+              <w:rPr>
+                <w:rStyle w:val="Hyperlink"/>
+                <w:noProof/>
+              </w:rPr>
+              <w:t>Code Repository</w:t>
+            </w:r>
+            <w:r>
+              <w:rPr>
+                <w:noProof/>
+                <w:webHidden/>
+              </w:rPr>
+              <w:tab/>
+            </w:r>
+            <w:r>
+              <w:rPr>
+                <w:noProof/>
+                <w:webHidden/>
+              </w:rPr>
+              <w:fldChar w:fldCharType="begin"/>
+            </w:r>
+            <w:r>
+              <w:rPr>
+                <w:noProof/>
+                <w:webHidden/>
+              </w:rPr>
+              <w:instrText xml:space="preserve"> PAGEREF _Toc223885717 \h </w:instrText>
+            </w:r>
+            <w:r>
+              <w:rPr>
+                <w:noProof/>
+                <w:webHidden/>
+              </w:rPr>
+            </w:r>
+            <w:r>
+              <w:rPr>
+                <w:noProof/>
+                <w:webHidden/>
+              </w:rPr>
+              <w:fldChar w:fldCharType="separate"/>
+            </w:r>
+            <w:r>
+              <w:rPr>
+                <w:noProof/>
+                <w:webHidden/>
+              </w:rPr>
+              <w:t>11</w:t>
+            </w:r>
+            <w:r>
+              <w:rPr>
+                <w:noProof/>
+                <w:webHidden/>
+              </w:rPr>
+              <w:fldChar w:fldCharType="end"/>
+            </w:r>
+          </w:hyperlink>
+        </w:p>
+        <w:p>
+          <w:pPr>
+            <w:pStyle w:val="TOC2"/>
+            <w:tabs>
+              <w:tab w:val="left" w:pos="1440"/>
+              <w:tab w:val="right" w:leader="dot" w:pos="9019"/>
+            </w:tabs>
+            <w:rPr>
+              <w:rFonts w:asciiTheme="minorHAnsi" w:eastAsiaTheme="minorEastAsia" w:hAnsiTheme="minorHAnsi" w:cstheme="minorBidi"/>
+              <w:noProof/>
+              <w:kern w:val="2"/>
+              <w:lang w:val="en-CA"/>
+              <w14:ligatures w14:val="standardContextual"/>
+            </w:rPr>
+          </w:pPr>
+          <w:hyperlink w:anchor="_Toc223885718" w:history="1">
+            <w:r>
+              <w:rPr>
+                <w:rStyle w:val="Hyperlink"/>
+                <w:noProof/>
+              </w:rPr>
+              <w:t>7.1</w:t>
+            </w:r>
+            <w:r>
+              <w:rPr>
+                <w:rFonts w:asciiTheme="minorHAnsi" w:eastAsiaTheme="minorEastAsia" w:hAnsiTheme="minorHAnsi" w:cstheme="minorBidi"/>
+                <w:noProof/>
+                <w:kern w:val="2"/>
+                <w:lang w:val="en-CA"/>
+                <w14:ligatures w14:val="standardContextual"/>
+              </w:rPr>
+              <w:tab/>
+            </w:r>
+            <w:r>
+              <w:rPr>
+                <w:rStyle w:val="Hyperlink"/>
+                <w:noProof/>
+              </w:rPr>
+              <w:t>Repository Link:</w:t>
+            </w:r>
+            <w:r>
+              <w:rPr>
+                <w:noProof/>
+                <w:webHidden/>
+              </w:rPr>
+              <w:tab/>
+            </w:r>
+            <w:r>
+              <w:rPr>
+                <w:noProof/>
+                <w:webHidden/>
+              </w:rPr>
+              <w:fldChar w:fldCharType="begin"/>
+            </w:r>
+            <w:r>
+              <w:rPr>
+                <w:noProof/>
+                <w:webHidden/>
+              </w:rPr>
+              <w:instrText xml:space="preserve"> PAGEREF _Toc223885718 \h </w:instrText>
+            </w:r>
+            <w:r>
+              <w:rPr>
+                <w:noProof/>
+                <w:webHidden/>
+              </w:rPr>
+            </w:r>
+            <w:r>
+              <w:rPr>
+                <w:noProof/>
+                <w:webHidden/>
+              </w:rPr>
+              <w:fldChar w:fldCharType="separate"/>
+            </w:r>
+            <w:r>
+              <w:rPr>
+                <w:noProof/>
+                <w:webHidden/>
+              </w:rPr>
+              <w:t>11</w:t>
+            </w:r>
+            <w:r>
+              <w:rPr>
+                <w:noProof/>
+                <w:webHidden/>
+              </w:rPr>
+              <w:fldChar w:fldCharType="end"/>
+            </w:r>
+          </w:hyperlink>
+        </w:p>
+        <w:p>
+          <w:pPr>
+            <w:pStyle w:val="TOC2"/>
+            <w:tabs>
+              <w:tab w:val="left" w:pos="1440"/>
+              <w:tab w:val="right" w:leader="dot" w:pos="9019"/>
+            </w:tabs>
+            <w:rPr>
+              <w:rFonts w:asciiTheme="minorHAnsi" w:eastAsiaTheme="minorEastAsia" w:hAnsiTheme="minorHAnsi" w:cstheme="minorBidi"/>
+              <w:noProof/>
+              <w:kern w:val="2"/>
+              <w:lang w:val="en-CA"/>
+              <w14:ligatures w14:val="standardContextual"/>
+            </w:rPr>
+          </w:pPr>
+          <w:hyperlink w:anchor="_Toc223885719" w:history="1">
+            <w:r>
+              <w:rPr>
+                <w:rStyle w:val="Hyperlink"/>
+                <w:noProof/>
+              </w:rPr>
+              <w:t>7.2</w:t>
+            </w:r>
+            <w:r>
+              <w:rPr>
+                <w:rFonts w:asciiTheme="minorHAnsi" w:eastAsiaTheme="minorEastAsia" w:hAnsiTheme="minorHAnsi" w:cstheme="minorBidi"/>
+                <w:noProof/>
+                <w:kern w:val="2"/>
+                <w:lang w:val="en-CA"/>
+                <w14:ligatures w14:val="standardContextual"/>
+              </w:rPr>
+              <w:tab/>
+            </w:r>
+            <w:r>
+              <w:rPr>
+                <w:rStyle w:val="Hyperlink"/>
+                <w:noProof/>
+              </w:rPr>
+              <w:t>Submission Tag</w:t>
+            </w:r>
+            <w:r>
+              <w:rPr>
+                <w:noProof/>
+                <w:webHidden/>
+              </w:rPr>
+              <w:tab/>
+            </w:r>
+            <w:r>
+              <w:rPr>
+                <w:noProof/>
+                <w:webHidden/>
+              </w:rPr>
+              <w:fldChar w:fldCharType="begin"/>
+            </w:r>
+            <w:r>
+              <w:rPr>
+                <w:noProof/>
+                <w:webHidden/>
+              </w:rPr>
+              <w:instrText xml:space="preserve"> PAGEREF _Toc223885719 \h </w:instrText>
+            </w:r>
+            <w:r>
+              <w:rPr>
+                <w:noProof/>
+                <w:webHidden/>
+              </w:rPr>
+            </w:r>
+            <w:r>
+              <w:rPr>
+                <w:noProof/>
+                <w:webHidden/>
+              </w:rPr>
+              <w:fldChar w:fldCharType="separate"/>
+            </w:r>
+            <w:r>
+              <w:rPr>
+                <w:noProof/>
+                <w:webHidden/>
+              </w:rPr>
+              <w:t>11</w:t>
+            </w:r>
+            <w:r>
+              <w:rPr>
+                <w:noProof/>
+                <w:webHidden/>
+              </w:rPr>
+              <w:fldChar w:fldCharType="end"/>
+            </w:r>
+          </w:hyperlink>
+        </w:p>
+        <w:p>
+          <w:pPr>
+            <w:pStyle w:val="TOC1"/>
+            <w:tabs>
+              <w:tab w:val="left" w:pos="960"/>
+              <w:tab w:val="right" w:leader="dot" w:pos="9019"/>
+            </w:tabs>
+            <w:rPr>
+              <w:rFonts w:asciiTheme="minorHAnsi" w:eastAsiaTheme="minorEastAsia" w:hAnsiTheme="minorHAnsi" w:cstheme="minorBidi"/>
+              <w:noProof/>
+              <w:kern w:val="2"/>
+              <w:lang w:val="en-CA"/>
+              <w14:ligatures w14:val="standardContextual"/>
+            </w:rPr>
+          </w:pPr>
+          <w:hyperlink w:anchor="_Toc223885720" w:history="1">
+            <w:r>
+              <w:rPr>
+                <w:rStyle w:val="Hyperlink"/>
+                <w:noProof/>
+              </w:rPr>
+              <w:t>8</w:t>
+            </w:r>
+            <w:r>
+              <w:rPr>
+                <w:rFonts w:asciiTheme="minorHAnsi" w:eastAsiaTheme="minorEastAsia" w:hAnsiTheme="minorHAnsi" w:cstheme="minorBidi"/>
+                <w:noProof/>
+                <w:kern w:val="2"/>
+                <w:lang w:val="en-CA"/>
+                <w14:ligatures w14:val="standardContextual"/>
+              </w:rPr>
+              <w:tab/>
+            </w:r>
+            <w:r>
+              <w:rPr>
+                <w:rStyle w:val="Hyperlink"/>
+                <w:noProof/>
+              </w:rPr>
               <w:t>Conclusion</w:t>
             </w:r>
             <w:r>
@@ -650,7 +3514,7 @@
                 <w:noProof/>
                 <w:webHidden/>
               </w:rPr>
-              <w:instrText xml:space="preserve"> PAGEREF _Toc222073314 \h </w:instrText>
+              <w:instrText xml:space="preserve"> PAGEREF _Toc223885720 \h </w:instrText>
             </w:r>
             <w:r>
               <w:rPr>
@@ -670,7 +3534,7 @@
                 <w:noProof/>
                 <w:webHidden/>
               </w:rPr>
-              <w:t>35</w:t>
+              <w:t>12</w:t>
             </w:r>
             <w:r>
               <w:rPr>
@@ -716,23 +3580,12 @@
           <w:numId w:val="1"/>
         </w:numPr>
       </w:pPr>
-      <w:bookmarkStart w:id="0" w:name="_Toc222073260"/>
+      <w:bookmarkStart w:id="0" w:name="_Toc223885685"/>
       <w:r>
         <w:lastRenderedPageBreak/>
         <w:t>Introduction</w:t>
       </w:r>
       <w:bookmarkEnd w:id="0"/>
-    </w:p>
-    <w:p/>
-    <w:p>
-      <w:pPr>
-        <w:pStyle w:val="Heading3"/>
-      </w:pPr>
-    </w:p>
-    <w:p>
-      <w:pPr>
-        <w:pStyle w:val="Heading3"/>
-      </w:pPr>
     </w:p>
     <w:p>
       <w:bookmarkStart w:id="1" w:name="_heading=h.eh2mv956rqcp" w:colFirst="0" w:colLast="0"/>
@@ -756,7 +3609,15 @@
       </w:r>
       <w:proofErr w:type="spellEnd"/>
       <w:r>
-        <w:t xml:space="preserve"> project. The main purpose of this iteration is to complete and strengthen the implementation by refactoring the existing codebase, finishing important backlog items from Deliverable 3.1, and carrying out more complete testing and validation. In particular, this report focuses on codebase improvements for better structure and maintainability, the addition of remaining features such as persistence and loading saved data on startup, and the testing work needed to confirm that the system functions correctly after integration. These areas match the main requirements of the Deliverable 3.2, which emphasizes refactoring, final implementation of core features, and full testing and validation. </w:t>
+        <w:t xml:space="preserve"> project. The main purpose of this iteration is to complete and strengthen the implementation by refactoring the existing codebase, finishing important backlog items from Deliverable 3.1, and carrying out more complete testing and validation. </w:t>
+      </w:r>
+      <w:proofErr w:type="gramStart"/>
+      <w:r>
+        <w:t>In particular, this</w:t>
+      </w:r>
+      <w:proofErr w:type="gramEnd"/>
+      <w:r>
+        <w:t xml:space="preserve"> report focuses on codebase improvements for better structure and maintainability, the addition of remaining features such as persistence and loading saved data on startup, and the testing work needed to confirm that the system functions correctly after integration. These areas match the main requirements of the Deliverable 3.2, which emphasizes refactoring, final implementation of core features, and full testing and validation. </w:t>
       </w:r>
     </w:p>
     <w:p>
@@ -766,11 +3627,7 @@
     </w:p>
     <w:p>
       <w:r>
-        <w:t xml:space="preserve">This report is organized to reflect the main goals of the iteration. It begins with the refactoring and codebase improvements completed by the team, followed by the final implementation of the remaining core features, and then presents the testing and validation carried out to verify correctness, integration, and system stability. Together, these sections </w:t>
-      </w:r>
-      <w:r>
-        <w:lastRenderedPageBreak/>
-        <w:t>show the progress made in this stage of the project and prepare the system for the final review and submission.</w:t>
+        <w:t>This report is organized to reflect the main goals of the iteration. It begins with the refactoring and codebase improvements completed by the team, followed by the final implementation of the remaining core features, and then presents the testing and validation carried out to verify correctness, integration, and system stability. Together, these sections show the progress made in this stage of the project and prepare the system for the final review and submission.</w:t>
       </w:r>
     </w:p>
     <w:p>
@@ -782,9 +3639,12 @@
         </w:numPr>
       </w:pPr>
       <w:bookmarkStart w:id="2" w:name="_Toc222073285"/>
-      <w:r>
+      <w:bookmarkStart w:id="3" w:name="_Toc223885686"/>
+      <w:r>
+        <w:lastRenderedPageBreak/>
         <w:t>Starting Point from Deliverable 3.1</w:t>
       </w:r>
+      <w:bookmarkEnd w:id="3"/>
     </w:p>
     <w:p>
       <w:r>
@@ -814,16 +3674,20 @@
     </w:p>
     <w:p>
       <w:r>
-        <w:t xml:space="preserve">At the same time, Deliverable 3.1 clearly identified the main work that still remained for the next cycle. The most important limitation was that data persistence had not yet been finalized, which meant that transactions and budgets were not saved after the application closed. The preliminary testing and coverage review also showed that some important areas still needed stronger automated testing, especially alert logic, report generation, and the persistence-related workflows planned for the next stage. In addition, a few small GUI refinements were still listed in the backlog. </w:t>
-      </w:r>
-    </w:p>
-    <w:p>
-      <w:r>
-        <w:t xml:space="preserve">For this reason, Deliverable 3.2 begins from a project state that is already stable in terms of design and core functionality, but still needs completion in terms of persistence, broader testing, and final code quality improvements. The updated backlog in Deliverable 3.1 also confirms this direction by showing that most major design and implementation stories were already done, while the remaining work focused mainly on persistence, missing test coverage, and a few usability improvements. Therefore, the purpose of this iteration is to build on the </w:t>
-      </w:r>
-      <w:r>
-        <w:lastRenderedPageBreak/>
-        <w:t>existing implementation, improve its internal quality through refactoring, complete the unfinished backlog items, and validate the system more thoroughly as a complete and integrated application.</w:t>
+        <w:t xml:space="preserve">At the same time, Deliverable 3.1 clearly identified the main work that </w:t>
+      </w:r>
+      <w:proofErr w:type="gramStart"/>
+      <w:r>
+        <w:t>still remained</w:t>
+      </w:r>
+      <w:proofErr w:type="gramEnd"/>
+      <w:r>
+        <w:t xml:space="preserve"> for the next cycle. The most important limitation was that data persistence had not yet been finalized, which meant that transactions and budgets were not saved after the application closed. The preliminary testing and coverage review also showed that some important areas still needed stronger automated testing, especially alert logic, report generation, and the persistence-related workflows planned for the next stage. In addition, a few small GUI refinements were still listed in the backlog. </w:t>
+      </w:r>
+    </w:p>
+    <w:p>
+      <w:r>
+        <w:t>For this reason, Deliverable 3.2 begins from a project state that is already stable in terms of design and core functionality, but still needs completion in terms of persistence, broader testing, and final code quality improvements. The updated backlog in Deliverable 3.1 also confirms this direction by showing that most major design and implementation stories were already done, while the remaining work focused mainly on persistence, missing test coverage, and a few usability improvements. Therefore, the purpose of this iteration is to build on the existing implementation, improve its internal quality through refactoring, complete the unfinished backlog items, and validate the system more thoroughly as a complete and integrated application.</w:t>
       </w:r>
     </w:p>
     <w:p>
@@ -834,13 +3698,30 @@
           <w:numId w:val="1"/>
         </w:numPr>
       </w:pPr>
-      <w:r>
+      <w:bookmarkStart w:id="4" w:name="_Toc223885687"/>
+      <w:r>
+        <w:lastRenderedPageBreak/>
         <w:t>Refactoring and Codebase Improvements</w:t>
       </w:r>
-    </w:p>
-    <w:p>
-      <w:r>
-        <w:t xml:space="preserve">In Deliverable 3.2, our main focus was to strengthen the existing </w:t>
+      <w:bookmarkEnd w:id="4"/>
+    </w:p>
+    <w:p>
+      <w:r>
+        <w:t xml:space="preserve">In Deliverable 3.2, our </w:t>
+      </w:r>
+      <w:proofErr w:type="gramStart"/>
+      <w:r>
+        <w:t>main</w:t>
+      </w:r>
+      <w:r>
+        <w:t xml:space="preserve"> </w:t>
+      </w:r>
+      <w:r>
+        <w:t>focus</w:t>
+      </w:r>
+      <w:proofErr w:type="gramEnd"/>
+      <w:r>
+        <w:t xml:space="preserve"> was to strengthen the existing </w:t>
       </w:r>
       <w:proofErr w:type="spellStart"/>
       <w:r>
@@ -859,9 +3740,11 @@
           <w:numId w:val="1"/>
         </w:numPr>
       </w:pPr>
+      <w:bookmarkStart w:id="5" w:name="_Toc223885688"/>
       <w:r>
         <w:t>Refactoring Goals</w:t>
       </w:r>
+      <w:bookmarkEnd w:id="5"/>
     </w:p>
     <w:p>
       <w:pPr>
@@ -1006,9 +3889,11 @@
           <w:numId w:val="1"/>
         </w:numPr>
       </w:pPr>
+      <w:bookmarkStart w:id="6" w:name="_Toc223885689"/>
       <w:r>
         <w:t>Major Refactoring Actions</w:t>
       </w:r>
+      <w:bookmarkEnd w:id="6"/>
     </w:p>
     <w:p>
       <w:r>
@@ -1031,10 +3916,11 @@
           <w:numId w:val="1"/>
         </w:numPr>
       </w:pPr>
-      <w:r>
-        <w:lastRenderedPageBreak/>
+      <w:bookmarkStart w:id="7" w:name="_Toc223885690"/>
+      <w:r>
         <w:t>Service and Controller cleanup</w:t>
       </w:r>
+      <w:bookmarkEnd w:id="7"/>
     </w:p>
     <w:p>
       <w:pPr>
@@ -1059,9 +3945,12 @@
           <w:numId w:val="1"/>
         </w:numPr>
       </w:pPr>
-      <w:r>
+      <w:bookmarkStart w:id="8" w:name="_Toc223885691"/>
+      <w:r>
+        <w:lastRenderedPageBreak/>
         <w:t>Reducing duplication and improving validation flow</w:t>
       </w:r>
+      <w:bookmarkEnd w:id="8"/>
     </w:p>
     <w:p>
       <w:pPr>
@@ -1084,9 +3973,11 @@
           <w:numId w:val="1"/>
         </w:numPr>
       </w:pPr>
+      <w:bookmarkStart w:id="9" w:name="_Toc223885692"/>
       <w:r>
         <w:t>Improving separation of concerns for persistence readiness</w:t>
       </w:r>
+      <w:bookmarkEnd w:id="9"/>
     </w:p>
     <w:p>
       <w:pPr>
@@ -1109,9 +4000,11 @@
           <w:numId w:val="1"/>
         </w:numPr>
       </w:pPr>
+      <w:bookmarkStart w:id="10" w:name="_Toc223885693"/>
       <w:r>
         <w:t>Small structural improvements for testability</w:t>
       </w:r>
+      <w:bookmarkEnd w:id="10"/>
     </w:p>
     <w:p>
       <w:pPr>
@@ -1134,9 +4027,11 @@
           <w:numId w:val="1"/>
         </w:numPr>
       </w:pPr>
+      <w:bookmarkStart w:id="11" w:name="_Toc223885694"/>
       <w:r>
         <w:t>Impact of Refactoring</w:t>
       </w:r>
+      <w:bookmarkEnd w:id="11"/>
     </w:p>
     <w:p>
       <w:pPr>
@@ -1159,9 +4054,11 @@
           <w:numId w:val="1"/>
         </w:numPr>
       </w:pPr>
+      <w:bookmarkStart w:id="12" w:name="_Toc223885695"/>
       <w:r>
         <w:t>Improved maintainability and readability</w:t>
       </w:r>
+      <w:bookmarkEnd w:id="12"/>
     </w:p>
     <w:p>
       <w:pPr>
@@ -1184,9 +4081,11 @@
           <w:numId w:val="1"/>
         </w:numPr>
       </w:pPr>
+      <w:bookmarkStart w:id="13" w:name="_Toc223885696"/>
       <w:r>
         <w:t>Better consistency and fewer logic errors</w:t>
       </w:r>
+      <w:bookmarkEnd w:id="13"/>
     </w:p>
     <w:p>
       <w:pPr>
@@ -1209,9 +4108,11 @@
           <w:numId w:val="1"/>
         </w:numPr>
       </w:pPr>
+      <w:bookmarkStart w:id="14" w:name="_Toc223885697"/>
       <w:r>
         <w:t>Easier testing and stronger validation</w:t>
       </w:r>
+      <w:bookmarkEnd w:id="14"/>
     </w:p>
     <w:p>
       <w:pPr>
@@ -1223,7 +4124,6 @@
         <w:rPr>
           <w:lang w:val="en-CA"/>
         </w:rPr>
-        <w:lastRenderedPageBreak/>
         <w:t xml:space="preserve">Refactoring supported broader </w:t>
       </w:r>
       <w:r>
@@ -1247,9 +4147,12 @@
           <w:numId w:val="1"/>
         </w:numPr>
       </w:pPr>
-      <w:r>
+      <w:bookmarkStart w:id="15" w:name="_Toc223885698"/>
+      <w:r>
+        <w:lastRenderedPageBreak/>
         <w:t>Final Implementation of Core Features</w:t>
       </w:r>
+      <w:bookmarkEnd w:id="15"/>
     </w:p>
     <w:p>
       <w:r>
@@ -1272,9 +4175,11 @@
           <w:numId w:val="1"/>
         </w:numPr>
       </w:pPr>
+      <w:bookmarkStart w:id="16" w:name="_Toc223885699"/>
       <w:r>
         <w:t>Core functionality already completed in Deliverable 3.1</w:t>
       </w:r>
+      <w:bookmarkEnd w:id="16"/>
     </w:p>
     <w:p>
       <w:r>
@@ -1302,13 +4207,31 @@
           <w:numId w:val="1"/>
         </w:numPr>
       </w:pPr>
+      <w:bookmarkStart w:id="17" w:name="_Toc223885700"/>
       <w:r>
         <w:t>Key core features completed in Deliverable 3.2</w:t>
       </w:r>
-    </w:p>
-    <w:p>
-      <w:r>
-        <w:t xml:space="preserve">The main implementation focus in Deliverable 3.2 was to finish the remaining “must-have” items from the project backlog that were required to make </w:t>
+      <w:bookmarkEnd w:id="17"/>
+    </w:p>
+    <w:p>
+      <w:r>
+        <w:t xml:space="preserve">The main implementation </w:t>
+      </w:r>
+      <w:proofErr w:type="gramStart"/>
+      <w:r>
+        <w:t>focus</w:t>
+      </w:r>
+      <w:proofErr w:type="gramEnd"/>
+      <w:r>
+        <w:t xml:space="preserve"> </w:t>
+      </w:r>
+      <w:proofErr w:type="gramStart"/>
+      <w:r>
+        <w:t>in</w:t>
+      </w:r>
+      <w:proofErr w:type="gramEnd"/>
+      <w:r>
+        <w:t xml:space="preserve"> Deliverable 3.2 was to finish the remaining “must-have” items from the project backlog that were required to make </w:t>
       </w:r>
       <w:proofErr w:type="spellStart"/>
       <w:r>
@@ -1328,7 +4251,6 @@
         </w:numPr>
       </w:pPr>
       <w:r>
-        <w:lastRenderedPageBreak/>
         <w:t>implementing the persistence layer (Storage abstraction + JSON save/load integration),</w:t>
       </w:r>
     </w:p>
@@ -1366,6 +4288,7 @@
     </w:p>
     <w:p>
       <w:r>
+        <w:lastRenderedPageBreak/>
         <w:t xml:space="preserve">These changes complete an essential part of the system’s original functional requirements, since persistence was always expected to be part of </w:t>
       </w:r>
       <w:proofErr w:type="spellStart"/>
@@ -1390,9 +4313,11 @@
           <w:numId w:val="1"/>
         </w:numPr>
       </w:pPr>
+      <w:bookmarkStart w:id="18" w:name="_Toc223885701"/>
       <w:r>
         <w:t>Integration and consistency across the system</w:t>
       </w:r>
+      <w:bookmarkEnd w:id="18"/>
     </w:p>
     <w:p>
       <w:r>
@@ -1407,9 +4332,11 @@
           <w:numId w:val="1"/>
         </w:numPr>
       </w:pPr>
+      <w:bookmarkStart w:id="19" w:name="_Toc223885702"/>
       <w:r>
         <w:t>Testing and Validation</w:t>
       </w:r>
+      <w:bookmarkEnd w:id="19"/>
     </w:p>
     <w:p>
       <w:r>
@@ -1421,11 +4348,7 @@
       </w:r>
       <w:proofErr w:type="spellEnd"/>
       <w:r>
-        <w:t xml:space="preserve"> is stable, correct, and ready for final review as a complete system. In this iteration, testing focuses on two major areas. First, we validate that each core feature meets its functional requirements through comprehensive functional testing, including edge cases and error conditions. Second, we perform system and integration testing to confirm that the full workflow works end-to-end and </w:t>
-      </w:r>
-      <w:r>
-        <w:lastRenderedPageBreak/>
-        <w:t xml:space="preserve">that modules interact correctly, especially after persistence and startup loading were implemented. </w:t>
+        <w:t xml:space="preserve"> is stable, correct, and ready for final review as a complete system. In this iteration, testing focuses on two major areas. First, we validate that each core feature meets its functional requirements through comprehensive functional testing, including edge cases and error conditions. Second, we perform system and integration testing to confirm that the full workflow works end-to-end and that modules interact correctly, especially after persistence and startup loading were implemented. </w:t>
       </w:r>
     </w:p>
     <w:p>
@@ -1436,13 +4359,24 @@
           <w:numId w:val="1"/>
         </w:numPr>
       </w:pPr>
-      <w:r>
+      <w:bookmarkStart w:id="20" w:name="_Toc223885703"/>
+      <w:r>
+        <w:lastRenderedPageBreak/>
         <w:t>Testing Strategy and Approach</w:t>
       </w:r>
-    </w:p>
-    <w:p>
-      <w:r>
-        <w:t>Our testing strategy combines automated unit tests with functional workflow testing. Automated tests are used to validate business rules in the domain/service layers (independent from the GUI), while functional and integration testing validate that real user workflows behave correctly through the application interface. This approach builds on our earlier testing direction from Deliverable 3.1, where we used JUnit unit tests for core logic and manual GUI smoke tests for workflow validation, and also addresses the coverage gaps identified for alerts, reporting, and persistence.</w:t>
+      <w:bookmarkEnd w:id="20"/>
+    </w:p>
+    <w:p>
+      <w:r>
+        <w:t xml:space="preserve">Our testing strategy combines automated unit tests with functional workflow testing. Automated tests are used to validate business rules in the domain/service layers (independent from the GUI), while functional and integration testing validate that real user workflows behave correctly through the application interface. This approach builds on our earlier testing direction from Deliverable 3.1, where we used JUnit unit tests for core logic and manual GUI smoke tests for workflow validation, </w:t>
+      </w:r>
+      <w:proofErr w:type="gramStart"/>
+      <w:r>
+        <w:t>and also</w:t>
+      </w:r>
+      <w:proofErr w:type="gramEnd"/>
+      <w:r>
+        <w:t xml:space="preserve"> addresses the coverage gaps identified for alerts, reporting, and persistence.</w:t>
       </w:r>
     </w:p>
     <w:p>
@@ -1453,9 +4387,11 @@
           <w:numId w:val="1"/>
         </w:numPr>
       </w:pPr>
+      <w:bookmarkStart w:id="21" w:name="_Toc223885704"/>
       <w:r>
         <w:t>Functional Testing</w:t>
       </w:r>
+      <w:bookmarkEnd w:id="21"/>
     </w:p>
     <w:p>
       <w:r>
@@ -1486,9 +4422,11 @@
           <w:numId w:val="1"/>
         </w:numPr>
       </w:pPr>
+      <w:bookmarkStart w:id="22" w:name="_Toc223885705"/>
       <w:r>
         <w:t>Transactions (Record/Edit/Delete)</w:t>
       </w:r>
+      <w:bookmarkEnd w:id="22"/>
     </w:p>
     <w:p>
       <w:pPr>
@@ -1578,9 +4516,11 @@
           <w:numId w:val="1"/>
         </w:numPr>
       </w:pPr>
+      <w:bookmarkStart w:id="23" w:name="_Toc223885706"/>
       <w:r>
         <w:t>View &amp; Filter Transactions</w:t>
       </w:r>
+      <w:bookmarkEnd w:id="23"/>
     </w:p>
     <w:p>
       <w:pPr>
@@ -1670,9 +4610,11 @@
           <w:numId w:val="1"/>
         </w:numPr>
       </w:pPr>
+      <w:bookmarkStart w:id="24" w:name="_Toc223885707"/>
       <w:r>
         <w:t>Budgets and Overspending Alerts</w:t>
       </w:r>
+      <w:bookmarkEnd w:id="24"/>
     </w:p>
     <w:p>
       <w:pPr>
@@ -1691,7 +4633,6 @@
           <w:highlight w:val="yellow"/>
           <w:lang w:val="en-CA"/>
         </w:rPr>
-        <w:lastRenderedPageBreak/>
         <w:t>Create/edit/delete budget</w:t>
       </w:r>
     </w:p>
@@ -1722,9 +4663,11 @@
           <w:numId w:val="1"/>
         </w:numPr>
       </w:pPr>
+      <w:bookmarkStart w:id="25" w:name="_Toc223885708"/>
       <w:r>
         <w:t>Reports (Summary + Category Breakdown)</w:t>
       </w:r>
+      <w:bookmarkEnd w:id="25"/>
     </w:p>
     <w:p>
       <w:pPr>
@@ -1743,6 +4686,7 @@
           <w:highlight w:val="yellow"/>
           <w:lang w:val="en-CA"/>
         </w:rPr>
+        <w:lastRenderedPageBreak/>
         <w:t>Generate report for a valid period</w:t>
       </w:r>
     </w:p>
@@ -1813,6 +4757,7 @@
           <w:numId w:val="1"/>
         </w:numPr>
       </w:pPr>
+      <w:bookmarkStart w:id="26" w:name="_Toc223885709"/>
       <w:r>
         <w:t xml:space="preserve">Persistence </w:t>
       </w:r>
@@ -1824,6 +4769,7 @@
       <w:r>
         <w:t xml:space="preserve"> (Save/Load)</w:t>
       </w:r>
+      <w:bookmarkEnd w:id="26"/>
     </w:p>
     <w:p>
       <w:pPr>
@@ -1946,9 +4892,11 @@
           <w:numId w:val="1"/>
         </w:numPr>
       </w:pPr>
+      <w:bookmarkStart w:id="27" w:name="_Toc223885710"/>
       <w:r>
         <w:t>System and Integration Testing</w:t>
       </w:r>
+      <w:bookmarkEnd w:id="27"/>
     </w:p>
     <w:p>
       <w:proofErr w:type="spellStart"/>
@@ -2070,7 +5018,6 @@
           <w:highlight w:val="yellow"/>
           <w:lang w:val="en-CA"/>
         </w:rPr>
-        <w:lastRenderedPageBreak/>
         <w:t>Save data → restart app → budgets still present → alerts still work with loaded transactions</w:t>
       </w:r>
     </w:p>
@@ -2165,6 +5112,7 @@
                 <w:highlight w:val="yellow"/>
                 <w:lang w:val="en-CA"/>
               </w:rPr>
+              <w:lastRenderedPageBreak/>
               <w:t>Workflow ID</w:t>
             </w:r>
           </w:p>
@@ -2309,9 +5257,11 @@
           <w:numId w:val="1"/>
         </w:numPr>
       </w:pPr>
+      <w:bookmarkStart w:id="28" w:name="_Toc223885711"/>
       <w:r>
         <w:t>Edge Cases and Error Handling</w:t>
       </w:r>
+      <w:bookmarkEnd w:id="28"/>
     </w:p>
     <w:p>
       <w:r>
@@ -2432,9 +5382,11 @@
           <w:numId w:val="1"/>
         </w:numPr>
       </w:pPr>
+      <w:bookmarkStart w:id="29" w:name="_Toc223885712"/>
       <w:r>
         <w:t>Defects Found, Fixes, and Retesting</w:t>
       </w:r>
+      <w:bookmarkEnd w:id="29"/>
     </w:p>
     <w:p>
       <w:r>
@@ -2449,10 +5401,12 @@
           <w:numId w:val="1"/>
         </w:numPr>
       </w:pPr>
+      <w:bookmarkStart w:id="30" w:name="_Toc223885713"/>
       <w:r>
         <w:t>Updated Backlog</w:t>
       </w:r>
       <w:bookmarkEnd w:id="2"/>
+      <w:bookmarkEnd w:id="30"/>
     </w:p>
     <w:p>
       <w:r>
@@ -2461,7 +5415,6 @@
     </w:p>
     <w:p>
       <w:r>
-        <w:lastRenderedPageBreak/>
         <w:t>During this iteration, the focus of development was on completing the persistence functionality and integrating it with the existing modules of the system. This work allows the application to store and restore user data across sessions, which was identified as the main missing capability in the previous iteration.</w:t>
       </w:r>
     </w:p>
@@ -2473,16 +5426,19 @@
           <w:numId w:val="1"/>
         </w:numPr>
       </w:pPr>
-      <w:r>
+      <w:bookmarkStart w:id="31" w:name="_Toc223885714"/>
+      <w:r>
+        <w:lastRenderedPageBreak/>
         <w:t>Completed Backlog Items</w:t>
       </w:r>
-    </w:p>
-    <w:p>
-      <w:bookmarkStart w:id="3" w:name="_Toc222073287"/>
+      <w:bookmarkEnd w:id="31"/>
+    </w:p>
+    <w:p>
+      <w:bookmarkStart w:id="32" w:name="_Toc222073287"/>
       <w:r>
         <w:t>The following backlog items were completed during this iteration:</w:t>
       </w:r>
-      <w:bookmarkEnd w:id="3"/>
+      <w:bookmarkEnd w:id="32"/>
     </w:p>
     <w:p>
       <w:pPr>
@@ -3261,15 +6217,22 @@
     </w:p>
     <w:p>
       <w:pPr>
+        <w:ind w:firstLine="0"/>
+      </w:pPr>
+    </w:p>
+    <w:p>
+      <w:pPr>
         <w:pStyle w:val="Heading2"/>
         <w:numPr>
           <w:ilvl w:val="1"/>
           <w:numId w:val="1"/>
         </w:numPr>
       </w:pPr>
+      <w:bookmarkStart w:id="33" w:name="_Toc223885715"/>
       <w:r>
         <w:t>Remaining Backlog Items (Next Iteration)</w:t>
       </w:r>
+      <w:bookmarkEnd w:id="33"/>
     </w:p>
     <w:p>
       <w:r>
@@ -3329,7 +6292,7 @@
         <w:rPr>
           <w:noProof/>
         </w:rPr>
-        <w:t>1</w:t>
+        <w:t>2</w:t>
       </w:r>
       <w:r>
         <w:rPr>
@@ -3344,7 +6307,15 @@
         <w:t xml:space="preserve"> - </w:t>
       </w:r>
       <w:r>
-        <w:t>Items To Do Next Report</w:t>
+        <w:t xml:space="preserve">Items </w:t>
+      </w:r>
+      <w:proofErr w:type="gramStart"/>
+      <w:r>
+        <w:t>To</w:t>
+      </w:r>
+      <w:proofErr w:type="gramEnd"/>
+      <w:r>
+        <w:t xml:space="preserve"> Do Next Report</w:t>
       </w:r>
     </w:p>
     <w:tbl>
@@ -3592,15 +6563,7 @@
                 <w:sz w:val="20"/>
                 <w:szCs w:val="20"/>
               </w:rPr>
-              <w:t xml:space="preserve"> so that overspending alert </w:t>
-            </w:r>
-            <w:r>
-              <w:rPr>
-                <w:sz w:val="20"/>
-                <w:szCs w:val="20"/>
-              </w:rPr>
-              <w:lastRenderedPageBreak/>
-              <w:t>rules (including boundary cases) are verified and UC-6 is validated.</w:t>
+              <w:t xml:space="preserve"> so that overspending alert rules (including boundary cases) are verified and UC-6 is validated.</w:t>
             </w:r>
           </w:p>
         </w:tc>
@@ -3622,7 +6585,6 @@
                 <w:sz w:val="20"/>
                 <w:szCs w:val="20"/>
               </w:rPr>
-              <w:lastRenderedPageBreak/>
               <w:t>US-5</w:t>
             </w:r>
           </w:p>
@@ -3939,6 +6901,7 @@
                 <w:sz w:val="20"/>
                 <w:szCs w:val="20"/>
               </w:rPr>
+              <w:lastRenderedPageBreak/>
               <w:t>DS-17</w:t>
             </w:r>
           </w:p>
@@ -4085,9 +7048,11 @@
           <w:numId w:val="1"/>
         </w:numPr>
       </w:pPr>
+      <w:bookmarkStart w:id="34" w:name="_Toc223885716"/>
       <w:r>
         <w:t>Remaining Backlog Items (Next Iteration)</w:t>
       </w:r>
+      <w:bookmarkEnd w:id="34"/>
     </w:p>
     <w:p>
       <w:r>
@@ -4115,11 +7080,11 @@
           <w:numId w:val="1"/>
         </w:numPr>
       </w:pPr>
-      <w:bookmarkStart w:id="4" w:name="_Toc222073312"/>
+      <w:bookmarkStart w:id="35" w:name="_Toc223885717"/>
       <w:r>
         <w:t>Code Repository</w:t>
       </w:r>
-      <w:bookmarkEnd w:id="4"/>
+      <w:bookmarkEnd w:id="35"/>
       <w:r>
         <w:t xml:space="preserve"> </w:t>
       </w:r>
@@ -4145,11 +7110,16 @@
           <w:numId w:val="1"/>
         </w:numPr>
       </w:pPr>
-      <w:bookmarkStart w:id="5" w:name="_Toc222073313"/>
+      <w:bookmarkStart w:id="36" w:name="_Toc223885718"/>
       <w:r>
         <w:t>Repository Link:</w:t>
       </w:r>
-      <w:bookmarkEnd w:id="5"/>
+      <w:bookmarkEnd w:id="36"/>
+    </w:p>
+    <w:p>
+      <w:r>
+        <w:t>The full project repository can be accessed at:</w:t>
+      </w:r>
     </w:p>
     <w:p>
       <w:hyperlink r:id="rId11">
@@ -4162,6 +7132,52 @@
         </w:r>
       </w:hyperlink>
     </w:p>
+    <w:p/>
+    <w:p>
+      <w:r>
+        <w:t>All project updates, including the final implementation, refactored code, and updated tests for this iteration, have been pushed to this repository.</w:t>
+      </w:r>
+    </w:p>
+    <w:p>
+      <w:pPr>
+        <w:pStyle w:val="Heading2"/>
+        <w:numPr>
+          <w:ilvl w:val="1"/>
+          <w:numId w:val="1"/>
+        </w:numPr>
+      </w:pPr>
+      <w:bookmarkStart w:id="37" w:name="_Toc223885719"/>
+      <w:r>
+        <w:t>Submission Tag</w:t>
+      </w:r>
+      <w:bookmarkEnd w:id="37"/>
+    </w:p>
+    <w:p>
+      <w:pPr>
+        <w:rPr>
+          <w:b/>
+          <w:bCs/>
+        </w:rPr>
+      </w:pPr>
+      <w:r>
+        <w:t>To mark the submission for this deliverable, the current version of the repository has been tagged as:</w:t>
+      </w:r>
+      <w:r>
+        <w:t xml:space="preserve"> </w:t>
+      </w:r>
+      <w:r>
+        <w:rPr>
+          <w:b/>
+          <w:bCs/>
+        </w:rPr>
+        <w:t>ITR3.2</w:t>
+      </w:r>
+    </w:p>
+    <w:p>
+      <w:r>
+        <w:t>This tag identifies the exact commit corresponding to the Iteration 3.2 submission and allows the instructor and TA to review the specific version of the codebase associated with this deliverable.</w:t>
+      </w:r>
+    </w:p>
     <w:p>
       <w:pPr>
         <w:pStyle w:val="Heading1"/>
@@ -4170,13 +7186,68 @@
           <w:numId w:val="1"/>
         </w:numPr>
       </w:pPr>
-      <w:bookmarkStart w:id="6" w:name="_Toc222073314"/>
-      <w:r>
+      <w:bookmarkStart w:id="38" w:name="_Toc223885720"/>
+      <w:r>
+        <w:lastRenderedPageBreak/>
         <w:t>Conclusion</w:t>
       </w:r>
-      <w:bookmarkEnd w:id="6"/>
-    </w:p>
-    <w:p/>
+      <w:bookmarkEnd w:id="38"/>
+    </w:p>
+    <w:p>
+      <w:r>
+        <w:t>I</w:t>
+      </w:r>
+      <w:r>
+        <w:t xml:space="preserve">n this deliverable, the </w:t>
+      </w:r>
+      <w:proofErr w:type="spellStart"/>
+      <w:r>
+        <w:t>SmartBudget</w:t>
+      </w:r>
+      <w:proofErr w:type="spellEnd"/>
+      <w:r>
+        <w:t xml:space="preserve"> project was advanced from an initial functional prototype into a </w:t>
+      </w:r>
+      <w:proofErr w:type="gramStart"/>
+      <w:r>
+        <w:t>more complete and stable</w:t>
+      </w:r>
+      <w:proofErr w:type="gramEnd"/>
+      <w:r>
+        <w:t xml:space="preserve"> implementation. Building on the design and GUI work completed in Deliverable 3.1, this iteration focused on strengthening the system through refactoring, completing the remaining core functionality, and improving the overall reliability of the application. The project now supports the main workflows of recording transactions, managing budgets, generating reports, and preserving data across sessions through the newly completed persistence layer. </w:t>
+      </w:r>
+    </w:p>
+    <w:p>
+      <w:r>
+        <w:t xml:space="preserve">A major part of this iteration was the implementation of persistence and startup loading, which addressed the main limitation identified in the previous deliverable, where application data was not saved after the program closed. With this improvement, </w:t>
+      </w:r>
+      <w:proofErr w:type="spellStart"/>
+      <w:r>
+        <w:t>SmartBudget</w:t>
+      </w:r>
+      <w:proofErr w:type="spellEnd"/>
+      <w:r>
+        <w:t xml:space="preserve"> now provides a more complete user experience, since transactions and budgets can be stored and restored correctly. In addition, the codebase was further refined to support maintainability and consistency with the layered architecture defined earlier, keeping the separation between UI, service, domain, and persistence responsibilities clear. </w:t>
+      </w:r>
+    </w:p>
+    <w:p>
+      <w:r>
+        <w:t xml:space="preserve">This deliverable also included continued testing and validation of the implemented system. Along with the previously established GUI workflows and service-layer functionality, the completed implementation for this iteration improves confidence that the system behaves correctly as an integrated application. The backlog status for Iteration 3.2 shows that the persistence-related stories were completed successfully, while the remaining work has now been narrowed mainly to additional testing coverage and a few interface refinements. </w:t>
+      </w:r>
+    </w:p>
+    <w:p>
+      <w:r>
+        <w:t xml:space="preserve">Overall, </w:t>
+      </w:r>
+      <w:proofErr w:type="spellStart"/>
+      <w:r>
+        <w:t>SmartBudget</w:t>
+      </w:r>
+      <w:proofErr w:type="spellEnd"/>
+      <w:r>
+        <w:t xml:space="preserve"> has now reached a strong stage of development and reflects steady progress across all project iterations. The system is functionally much closer to the final expected version, and the remaining work is focused more on refinement than on missing core functionality. This provides a solid foundation for the next deliverable, where the team can concentrate on final improvements, broader validation, and preparing the project for final submission.</w:t>
+      </w:r>
+    </w:p>
     <w:sectPr>
       <w:footerReference w:type="default" r:id="rId12"/>
       <w:pgSz w:w="11909" w:h="16834"/>

</xml_diff>

<commit_message>
Add test results for Reports and Persistence
</commit_message>
<xml_diff>
--- a/docs/deliverables/3.2/Deliverable 3-2 Implementation - Submission.docx
+++ b/docs/deliverables/3.2/Deliverable 3-2 Implementation - Submission.docx
@@ -364,7 +364,7 @@
     </w:p>
     <w:sdt>
       <w:sdtPr>
-        <w:id w:val="-1316394394"/>
+        <w:id w:val="258945412"/>
         <w:docPartObj>
           <w:docPartGallery w:val="Table of Contents"/>
           <w:docPartUnique w:val="1"/>
@@ -5534,12 +5534,17 @@
               <w:spacing w:after="240" w:before="240" w:line="276" w:lineRule="auto"/>
               <w:ind w:firstLine="720"/>
               <w:jc w:val="left"/>
-              <w:rPr/>
+              <w:rPr>
+                <w:sz w:val="26"/>
+                <w:szCs w:val="26"/>
+              </w:rPr>
             </w:pPr>
             <w:r>
               <w:rPr>
                 <w:b w:val="1"/>
                 <w:bCs w:val="1"/>
+                <w:sz w:val="26"/>
+                <w:szCs w:val="26"/>
                 <w:rtl w:val="0"/>
               </w:rPr>
               <w:t xml:space="preserve">Test Description</w:t>
@@ -5572,12 +5577,17 @@
               <w:spacing w:after="240" w:before="240" w:line="276" w:lineRule="auto"/>
               <w:ind w:firstLine="720"/>
               <w:jc w:val="left"/>
-              <w:rPr/>
+              <w:rPr>
+                <w:sz w:val="26"/>
+                <w:szCs w:val="26"/>
+              </w:rPr>
             </w:pPr>
             <w:r>
               <w:rPr>
                 <w:b w:val="1"/>
                 <w:bCs w:val="1"/>
+                <w:sz w:val="26"/>
+                <w:szCs w:val="26"/>
                 <w:rtl w:val="0"/>
               </w:rPr>
               <w:t xml:space="preserve">Status</w:t>
@@ -6169,7 +6179,7 @@
     <w:sdt>
       <w:sdtPr>
         <w:lock w:val="contentLocked"/>
-        <w:id w:val="1643957612"/>
+        <w:id w:val="1141334731"/>
         <w:tag w:val="goog_rdk_0"/>
       </w:sdtPr>
       <w:sdtContent>
@@ -6225,12 +6235,17 @@
                 <w:pPr>
                   <w:ind w:firstLine="0"/>
                   <w:jc w:val="center"/>
-                  <w:rPr/>
+                  <w:rPr>
+                    <w:sz w:val="26"/>
+                    <w:szCs w:val="26"/>
+                  </w:rPr>
                 </w:pPr>
                 <w:r>
                   <w:rPr>
                     <w:b w:val="1"/>
                     <w:bCs w:val="1"/>
+                    <w:sz w:val="26"/>
+                    <w:szCs w:val="26"/>
                     <w:rtl w:val="0"/>
                   </w:rPr>
                   <w:t xml:space="preserve">Test Description</w:t>
@@ -6262,12 +6277,17 @@
                 <w:pPr>
                   <w:ind w:firstLine="0"/>
                   <w:jc w:val="center"/>
-                  <w:rPr/>
+                  <w:rPr>
+                    <w:sz w:val="26"/>
+                    <w:szCs w:val="26"/>
+                  </w:rPr>
                 </w:pPr>
                 <w:r>
                   <w:rPr>
                     <w:b w:val="1"/>
                     <w:bCs w:val="1"/>
+                    <w:sz w:val="26"/>
+                    <w:szCs w:val="26"/>
                     <w:rtl w:val="0"/>
                   </w:rPr>
                   <w:t xml:space="preserve">Status</w:t>
@@ -6837,7 +6857,7 @@
     <w:sdt>
       <w:sdtPr>
         <w:lock w:val="contentLocked"/>
-        <w:id w:val="-344798400"/>
+        <w:id w:val="1565695188"/>
         <w:tag w:val="goog_rdk_1"/>
       </w:sdtPr>
       <w:sdtContent>
@@ -6894,12 +6914,17 @@
                   <w:spacing w:after="240" w:before="240" w:line="276" w:lineRule="auto"/>
                   <w:ind w:firstLine="0"/>
                   <w:jc w:val="center"/>
-                  <w:rPr/>
+                  <w:rPr>
+                    <w:sz w:val="26"/>
+                    <w:szCs w:val="26"/>
+                  </w:rPr>
                 </w:pPr>
                 <w:r>
                   <w:rPr>
                     <w:b w:val="1"/>
                     <w:bCs w:val="1"/>
+                    <w:sz w:val="26"/>
+                    <w:szCs w:val="26"/>
                     <w:rtl w:val="0"/>
                   </w:rPr>
                   <w:t xml:space="preserve">Test Description</w:t>
@@ -6932,12 +6957,17 @@
                   <w:spacing w:after="240" w:before="240" w:line="276" w:lineRule="auto"/>
                   <w:ind w:firstLine="0"/>
                   <w:jc w:val="center"/>
-                  <w:rPr/>
+                  <w:rPr>
+                    <w:sz w:val="26"/>
+                    <w:szCs w:val="26"/>
+                  </w:rPr>
                 </w:pPr>
                 <w:r>
                   <w:rPr>
                     <w:b w:val="1"/>
                     <w:bCs w:val="1"/>
+                    <w:sz w:val="26"/>
+                    <w:szCs w:val="26"/>
                     <w:rtl w:val="0"/>
                   </w:rPr>
                   <w:t xml:space="preserve">Status</w:t>
@@ -7380,6 +7410,455 @@
     </w:p>
     <w:p>
       <w:pPr>
+        <w:spacing w:after="240" w:before="240" w:line="360" w:lineRule="auto"/>
+        <w:ind w:firstLine="720"/>
+        <w:jc w:val="left"/>
+        <w:rPr/>
+      </w:pPr>
+      <w:r>
+        <w:rPr>
+          <w:rtl w:val="0"/>
+        </w:rPr>
+        <w:t xml:space="preserve">Generating financial reports for valid periods was tested, including verification of correct date range handling, especially when start dates are after end dates. Reports for empty periods (no transactions) were tested to ensure they display zero values. Calculations of income totals, expense totals, balances, and category breakdowns were validated.</w:t>
+      </w:r>
+    </w:p>
+    <w:p>
+      <w:pPr>
+        <w:spacing w:after="240" w:before="240" w:line="360" w:lineRule="auto"/>
+        <w:ind w:firstLine="720"/>
+        <w:jc w:val="left"/>
+        <w:rPr/>
+      </w:pPr>
+      <w:r>
+        <w:rPr>
+          <w:rtl w:val="0"/>
+        </w:rPr>
+      </w:r>
+    </w:p>
+    <w:p>
+      <w:pPr>
+        <w:spacing w:after="240" w:before="240" w:lineRule="auto"/>
+        <w:ind w:firstLine="720"/>
+        <w:jc w:val="left"/>
+        <w:rPr/>
+      </w:pPr>
+      <w:r>
+        <w:rPr>
+          <w:rtl w:val="0"/>
+        </w:rPr>
+      </w:r>
+    </w:p>
+    <w:tbl>
+      <w:tblPr>
+        <w:tblStyle w:val="Table4"/>
+        <w:tblW w:w="9030.0" w:type="dxa"/>
+        <w:jc w:val="left"/>
+        <w:tblBorders>
+          <w:top w:color="000000" w:space="0" w:sz="0" w:val="nil"/>
+          <w:left w:color="000000" w:space="0" w:sz="0" w:val="nil"/>
+          <w:bottom w:color="000000" w:space="0" w:sz="0" w:val="nil"/>
+          <w:right w:color="000000" w:space="0" w:sz="0" w:val="nil"/>
+          <w:insideH w:color="000000" w:space="0" w:sz="0" w:val="nil"/>
+          <w:insideV w:color="000000" w:space="0" w:sz="0" w:val="nil"/>
+        </w:tblBorders>
+        <w:tblLayout w:type="fixed"/>
+        <w:tblLook w:val="0600"/>
+      </w:tblPr>
+      <w:tblGrid>
+        <w:gridCol w:w="6780"/>
+        <w:gridCol w:w="2250"/>
+        <w:tblGridChange w:id="0">
+          <w:tblGrid>
+            <w:gridCol w:w="6780"/>
+            <w:gridCol w:w="2250"/>
+          </w:tblGrid>
+        </w:tblGridChange>
+      </w:tblGrid>
+      <w:tr>
+        <w:trPr>
+          <w:cantSplit w:val="0"/>
+          <w:trHeight w:val="500" w:hRule="atLeast"/>
+          <w:tblHeader w:val="0"/>
+        </w:trPr>
+        <w:tc>
+          <w:tcPr>
+            <w:tcBorders>
+              <w:top w:color="000000" w:space="0" w:sz="8" w:val="single"/>
+              <w:left w:color="000000" w:space="0" w:sz="8" w:val="single"/>
+              <w:bottom w:color="000000" w:space="0" w:sz="8" w:val="single"/>
+              <w:right w:color="000000" w:space="0" w:sz="8" w:val="single"/>
+            </w:tcBorders>
+            <w:tcMar>
+              <w:top w:w="100.0" w:type="dxa"/>
+              <w:left w:w="100.0" w:type="dxa"/>
+              <w:bottom w:w="100.0" w:type="dxa"/>
+              <w:right w:w="100.0" w:type="dxa"/>
+            </w:tcMar>
+            <w:vAlign w:val="top"/>
+          </w:tcPr>
+          <w:p>
+            <w:pPr>
+              <w:spacing w:after="240" w:before="240" w:line="276" w:lineRule="auto"/>
+              <w:ind w:left="0" w:firstLine="0"/>
+              <w:jc w:val="center"/>
+              <w:rPr>
+                <w:sz w:val="26"/>
+                <w:szCs w:val="26"/>
+              </w:rPr>
+            </w:pPr>
+            <w:r>
+              <w:rPr>
+                <w:b w:val="1"/>
+                <w:bCs w:val="1"/>
+                <w:sz w:val="26"/>
+                <w:szCs w:val="26"/>
+                <w:rtl w:val="0"/>
+              </w:rPr>
+              <w:t xml:space="preserve">Test Description</w:t>
+            </w:r>
+            <w:r>
+              <w:rPr>
+                <w:rtl w:val="0"/>
+              </w:rPr>
+            </w:r>
+          </w:p>
+        </w:tc>
+        <w:tc>
+          <w:tcPr>
+            <w:tcBorders>
+              <w:top w:color="000000" w:space="0" w:sz="8" w:val="single"/>
+              <w:left w:color="000000" w:space="0" w:sz="8" w:val="single"/>
+              <w:bottom w:color="000000" w:space="0" w:sz="8" w:val="single"/>
+              <w:right w:color="000000" w:space="0" w:sz="8" w:val="single"/>
+            </w:tcBorders>
+            <w:tcMar>
+              <w:top w:w="100.0" w:type="dxa"/>
+              <w:left w:w="100.0" w:type="dxa"/>
+              <w:bottom w:w="100.0" w:type="dxa"/>
+              <w:right w:w="100.0" w:type="dxa"/>
+            </w:tcMar>
+            <w:vAlign w:val="top"/>
+          </w:tcPr>
+          <w:p>
+            <w:pPr>
+              <w:spacing w:after="240" w:before="240" w:line="276" w:lineRule="auto"/>
+              <w:ind w:left="0" w:firstLine="0"/>
+              <w:jc w:val="center"/>
+              <w:rPr>
+                <w:sz w:val="26"/>
+                <w:szCs w:val="26"/>
+              </w:rPr>
+            </w:pPr>
+            <w:r>
+              <w:rPr>
+                <w:b w:val="1"/>
+                <w:bCs w:val="1"/>
+                <w:sz w:val="26"/>
+                <w:szCs w:val="26"/>
+                <w:rtl w:val="0"/>
+              </w:rPr>
+              <w:t xml:space="preserve">Status</w:t>
+            </w:r>
+            <w:r>
+              <w:rPr>
+                <w:rtl w:val="0"/>
+              </w:rPr>
+            </w:r>
+          </w:p>
+        </w:tc>
+      </w:tr>
+      <w:tr>
+        <w:trPr>
+          <w:cantSplit w:val="0"/>
+          <w:trHeight w:val="770" w:hRule="atLeast"/>
+          <w:tblHeader w:val="0"/>
+        </w:trPr>
+        <w:tc>
+          <w:tcPr>
+            <w:tcBorders>
+              <w:top w:color="000000" w:space="0" w:sz="8" w:val="single"/>
+              <w:left w:color="000000" w:space="0" w:sz="8" w:val="single"/>
+              <w:bottom w:color="000000" w:space="0" w:sz="8" w:val="single"/>
+              <w:right w:color="000000" w:space="0" w:sz="8" w:val="single"/>
+            </w:tcBorders>
+            <w:tcMar>
+              <w:top w:w="100.0" w:type="dxa"/>
+              <w:left w:w="100.0" w:type="dxa"/>
+              <w:bottom w:w="100.0" w:type="dxa"/>
+              <w:right w:w="100.0" w:type="dxa"/>
+            </w:tcMar>
+            <w:vAlign w:val="top"/>
+          </w:tcPr>
+          <w:p>
+            <w:pPr>
+              <w:spacing w:after="240" w:before="240" w:line="276" w:lineRule="auto"/>
+              <w:ind w:left="0" w:firstLine="0"/>
+              <w:jc w:val="left"/>
+              <w:rPr/>
+            </w:pPr>
+            <w:r>
+              <w:rPr>
+                <w:rtl w:val="0"/>
+              </w:rPr>
+              <w:t xml:space="preserve">Generate a report for a valid period and verify totals for income, expenses, and balance</w:t>
+            </w:r>
+          </w:p>
+        </w:tc>
+        <w:tc>
+          <w:tcPr>
+            <w:tcBorders>
+              <w:top w:color="000000" w:space="0" w:sz="8" w:val="single"/>
+              <w:left w:color="000000" w:space="0" w:sz="8" w:val="single"/>
+              <w:bottom w:color="000000" w:space="0" w:sz="8" w:val="single"/>
+              <w:right w:color="000000" w:space="0" w:sz="8" w:val="single"/>
+            </w:tcBorders>
+            <w:tcMar>
+              <w:top w:w="100.0" w:type="dxa"/>
+              <w:left w:w="100.0" w:type="dxa"/>
+              <w:bottom w:w="100.0" w:type="dxa"/>
+              <w:right w:w="100.0" w:type="dxa"/>
+            </w:tcMar>
+            <w:vAlign w:val="top"/>
+          </w:tcPr>
+          <w:p>
+            <w:pPr>
+              <w:spacing w:after="240" w:before="240" w:line="276" w:lineRule="auto"/>
+              <w:ind w:firstLine="720"/>
+              <w:jc w:val="left"/>
+              <w:rPr/>
+            </w:pPr>
+            <w:r>
+              <w:rPr>
+                <w:rtl w:val="0"/>
+              </w:rPr>
+              <w:t xml:space="preserve">Pass</w:t>
+            </w:r>
+          </w:p>
+        </w:tc>
+      </w:tr>
+      <w:tr>
+        <w:trPr>
+          <w:cantSplit w:val="0"/>
+          <w:trHeight w:val="500" w:hRule="atLeast"/>
+          <w:tblHeader w:val="0"/>
+        </w:trPr>
+        <w:tc>
+          <w:tcPr>
+            <w:tcBorders>
+              <w:top w:color="000000" w:space="0" w:sz="8" w:val="single"/>
+              <w:left w:color="000000" w:space="0" w:sz="8" w:val="single"/>
+              <w:bottom w:color="000000" w:space="0" w:sz="8" w:val="single"/>
+              <w:right w:color="000000" w:space="0" w:sz="8" w:val="single"/>
+            </w:tcBorders>
+            <w:tcMar>
+              <w:top w:w="100.0" w:type="dxa"/>
+              <w:left w:w="100.0" w:type="dxa"/>
+              <w:bottom w:w="100.0" w:type="dxa"/>
+              <w:right w:w="100.0" w:type="dxa"/>
+            </w:tcMar>
+            <w:vAlign w:val="top"/>
+          </w:tcPr>
+          <w:p>
+            <w:pPr>
+              <w:spacing w:after="240" w:before="240" w:line="276" w:lineRule="auto"/>
+              <w:ind w:left="0" w:firstLine="0"/>
+              <w:jc w:val="left"/>
+              <w:rPr/>
+            </w:pPr>
+            <w:r>
+              <w:rPr>
+                <w:rtl w:val="0"/>
+              </w:rPr>
+              <w:t xml:space="preserve">Test report generation with date range boundaries and ensure correct ordering</w:t>
+            </w:r>
+          </w:p>
+        </w:tc>
+        <w:tc>
+          <w:tcPr>
+            <w:tcBorders>
+              <w:top w:color="000000" w:space="0" w:sz="8" w:val="single"/>
+              <w:left w:color="000000" w:space="0" w:sz="8" w:val="single"/>
+              <w:bottom w:color="000000" w:space="0" w:sz="8" w:val="single"/>
+              <w:right w:color="000000" w:space="0" w:sz="8" w:val="single"/>
+            </w:tcBorders>
+            <w:tcMar>
+              <w:top w:w="100.0" w:type="dxa"/>
+              <w:left w:w="100.0" w:type="dxa"/>
+              <w:bottom w:w="100.0" w:type="dxa"/>
+              <w:right w:w="100.0" w:type="dxa"/>
+            </w:tcMar>
+            <w:vAlign w:val="top"/>
+          </w:tcPr>
+          <w:p>
+            <w:pPr>
+              <w:spacing w:after="240" w:before="240" w:line="276" w:lineRule="auto"/>
+              <w:ind w:firstLine="720"/>
+              <w:jc w:val="left"/>
+              <w:rPr/>
+            </w:pPr>
+            <w:r>
+              <w:rPr>
+                <w:rtl w:val="0"/>
+              </w:rPr>
+              <w:t xml:space="preserve">Pass</w:t>
+            </w:r>
+          </w:p>
+        </w:tc>
+      </w:tr>
+      <w:tr>
+        <w:trPr>
+          <w:cantSplit w:val="0"/>
+          <w:trHeight w:val="770" w:hRule="atLeast"/>
+          <w:tblHeader w:val="0"/>
+        </w:trPr>
+        <w:tc>
+          <w:tcPr>
+            <w:tcBorders>
+              <w:top w:color="000000" w:space="0" w:sz="8" w:val="single"/>
+              <w:left w:color="000000" w:space="0" w:sz="8" w:val="single"/>
+              <w:bottom w:color="000000" w:space="0" w:sz="8" w:val="single"/>
+              <w:right w:color="000000" w:space="0" w:sz="8" w:val="single"/>
+            </w:tcBorders>
+            <w:tcMar>
+              <w:top w:w="100.0" w:type="dxa"/>
+              <w:left w:w="100.0" w:type="dxa"/>
+              <w:bottom w:w="100.0" w:type="dxa"/>
+              <w:right w:w="100.0" w:type="dxa"/>
+            </w:tcMar>
+            <w:vAlign w:val="top"/>
+          </w:tcPr>
+          <w:p>
+            <w:pPr>
+              <w:spacing w:after="240" w:before="240" w:line="276" w:lineRule="auto"/>
+              <w:ind w:left="0" w:firstLine="0"/>
+              <w:jc w:val="left"/>
+              <w:rPr/>
+            </w:pPr>
+            <w:r>
+              <w:rPr>
+                <w:rtl w:val="0"/>
+              </w:rPr>
+              <w:t xml:space="preserve">Generate a report for a period with no transactions and verify zero values are displayed</w:t>
+            </w:r>
+          </w:p>
+        </w:tc>
+        <w:tc>
+          <w:tcPr>
+            <w:tcBorders>
+              <w:top w:color="000000" w:space="0" w:sz="8" w:val="single"/>
+              <w:left w:color="000000" w:space="0" w:sz="8" w:val="single"/>
+              <w:bottom w:color="000000" w:space="0" w:sz="8" w:val="single"/>
+              <w:right w:color="000000" w:space="0" w:sz="8" w:val="single"/>
+            </w:tcBorders>
+            <w:tcMar>
+              <w:top w:w="100.0" w:type="dxa"/>
+              <w:left w:w="100.0" w:type="dxa"/>
+              <w:bottom w:w="100.0" w:type="dxa"/>
+              <w:right w:w="100.0" w:type="dxa"/>
+            </w:tcMar>
+            <w:vAlign w:val="top"/>
+          </w:tcPr>
+          <w:p>
+            <w:pPr>
+              <w:spacing w:after="240" w:before="240" w:line="276" w:lineRule="auto"/>
+              <w:ind w:firstLine="720"/>
+              <w:jc w:val="left"/>
+              <w:rPr/>
+            </w:pPr>
+            <w:r>
+              <w:rPr>
+                <w:rtl w:val="0"/>
+              </w:rPr>
+              <w:t xml:space="preserve">Pass</w:t>
+            </w:r>
+          </w:p>
+        </w:tc>
+      </w:tr>
+      <w:tr>
+        <w:trPr>
+          <w:cantSplit w:val="0"/>
+          <w:trHeight w:val="770" w:hRule="atLeast"/>
+          <w:tblHeader w:val="0"/>
+        </w:trPr>
+        <w:tc>
+          <w:tcPr>
+            <w:tcBorders>
+              <w:top w:color="000000" w:space="0" w:sz="8" w:val="single"/>
+              <w:left w:color="000000" w:space="0" w:sz="8" w:val="single"/>
+              <w:bottom w:color="000000" w:space="0" w:sz="8" w:val="single"/>
+              <w:right w:color="000000" w:space="0" w:sz="8" w:val="single"/>
+            </w:tcBorders>
+            <w:tcMar>
+              <w:top w:w="100.0" w:type="dxa"/>
+              <w:left w:w="100.0" w:type="dxa"/>
+              <w:bottom w:w="100.0" w:type="dxa"/>
+              <w:right w:w="100.0" w:type="dxa"/>
+            </w:tcMar>
+            <w:vAlign w:val="top"/>
+          </w:tcPr>
+          <w:p>
+            <w:pPr>
+              <w:spacing w:after="240" w:before="240" w:line="276" w:lineRule="auto"/>
+              <w:ind w:left="0" w:firstLine="0"/>
+              <w:jc w:val="left"/>
+              <w:rPr/>
+            </w:pPr>
+            <w:r>
+              <w:rPr>
+                <w:rtl w:val="0"/>
+              </w:rPr>
+              <w:t xml:space="preserve">Verify all calculations including category totals, income total, expense total, and overall balance</w:t>
+            </w:r>
+          </w:p>
+        </w:tc>
+        <w:tc>
+          <w:tcPr>
+            <w:tcBorders>
+              <w:top w:color="000000" w:space="0" w:sz="8" w:val="single"/>
+              <w:left w:color="000000" w:space="0" w:sz="8" w:val="single"/>
+              <w:bottom w:color="000000" w:space="0" w:sz="8" w:val="single"/>
+              <w:right w:color="000000" w:space="0" w:sz="8" w:val="single"/>
+            </w:tcBorders>
+            <w:tcMar>
+              <w:top w:w="100.0" w:type="dxa"/>
+              <w:left w:w="100.0" w:type="dxa"/>
+              <w:bottom w:w="100.0" w:type="dxa"/>
+              <w:right w:w="100.0" w:type="dxa"/>
+            </w:tcMar>
+            <w:vAlign w:val="top"/>
+          </w:tcPr>
+          <w:p>
+            <w:pPr>
+              <w:spacing w:after="240" w:before="240" w:line="276" w:lineRule="auto"/>
+              <w:ind w:firstLine="720"/>
+              <w:jc w:val="left"/>
+              <w:rPr/>
+            </w:pPr>
+            <w:r>
+              <w:rPr>
+                <w:rtl w:val="0"/>
+              </w:rPr>
+              <w:t xml:space="preserve">Pass</w:t>
+            </w:r>
+          </w:p>
+        </w:tc>
+      </w:tr>
+    </w:tbl>
+    <w:p>
+      <w:pPr>
+        <w:spacing w:after="240" w:before="240" w:line="360" w:lineRule="auto"/>
+        <w:ind w:firstLine="720"/>
+        <w:jc w:val="left"/>
+        <w:rPr/>
+      </w:pPr>
+      <w:r>
+        <w:rPr>
+          <w:rtl w:val="0"/>
+        </w:rPr>
+      </w:r>
+    </w:p>
+    <w:p>
+      <w:pPr>
         <w:keepNext w:val="0"/>
         <w:keepLines w:val="0"/>
         <w:pageBreakBefore w:val="0"/>
@@ -7643,6 +8122,364 @@
     </w:p>
     <w:p>
       <w:pPr>
+        <w:rPr/>
+      </w:pPr>
+      <w:r>
+        <w:rPr>
+          <w:rtl w:val="0"/>
+        </w:rPr>
+      </w:r>
+    </w:p>
+    <w:p>
+      <w:pPr>
+        <w:rPr/>
+      </w:pPr>
+      <w:r>
+        <w:rPr>
+          <w:rtl w:val="0"/>
+        </w:rPr>
+      </w:r>
+    </w:p>
+    <w:tbl>
+      <w:tblPr>
+        <w:tblStyle w:val="Table5"/>
+        <w:tblW w:w="9030.0" w:type="dxa"/>
+        <w:jc w:val="left"/>
+        <w:tblBorders>
+          <w:top w:color="000000" w:space="0" w:sz="0" w:val="nil"/>
+          <w:left w:color="000000" w:space="0" w:sz="0" w:val="nil"/>
+          <w:bottom w:color="000000" w:space="0" w:sz="0" w:val="nil"/>
+          <w:right w:color="000000" w:space="0" w:sz="0" w:val="nil"/>
+          <w:insideH w:color="000000" w:space="0" w:sz="0" w:val="nil"/>
+          <w:insideV w:color="000000" w:space="0" w:sz="0" w:val="nil"/>
+        </w:tblBorders>
+        <w:tblLayout w:type="fixed"/>
+        <w:tblLook w:val="0600"/>
+      </w:tblPr>
+      <w:tblGrid>
+        <w:gridCol w:w="7410"/>
+        <w:gridCol w:w="1620"/>
+        <w:tblGridChange w:id="0">
+          <w:tblGrid>
+            <w:gridCol w:w="7410"/>
+            <w:gridCol w:w="1620"/>
+          </w:tblGrid>
+        </w:tblGridChange>
+      </w:tblGrid>
+      <w:tr>
+        <w:trPr>
+          <w:cantSplit w:val="0"/>
+          <w:trHeight w:val="500" w:hRule="atLeast"/>
+          <w:tblHeader w:val="0"/>
+        </w:trPr>
+        <w:tc>
+          <w:tcPr>
+            <w:tcBorders>
+              <w:top w:color="000000" w:space="0" w:sz="8" w:val="single"/>
+              <w:left w:color="000000" w:space="0" w:sz="8" w:val="single"/>
+              <w:bottom w:color="000000" w:space="0" w:sz="8" w:val="single"/>
+              <w:right w:color="000000" w:space="0" w:sz="8" w:val="single"/>
+            </w:tcBorders>
+            <w:tcMar>
+              <w:top w:w="100.0" w:type="dxa"/>
+              <w:left w:w="100.0" w:type="dxa"/>
+              <w:bottom w:w="100.0" w:type="dxa"/>
+              <w:right w:w="100.0" w:type="dxa"/>
+            </w:tcMar>
+            <w:vAlign w:val="top"/>
+          </w:tcPr>
+          <w:p>
+            <w:pPr>
+              <w:spacing w:line="276" w:lineRule="auto"/>
+              <w:ind w:left="0" w:firstLine="0"/>
+              <w:jc w:val="center"/>
+              <w:rPr>
+                <w:sz w:val="26"/>
+                <w:szCs w:val="26"/>
+              </w:rPr>
+            </w:pPr>
+            <w:r>
+              <w:rPr>
+                <w:b w:val="1"/>
+                <w:bCs w:val="1"/>
+                <w:sz w:val="26"/>
+                <w:szCs w:val="26"/>
+                <w:rtl w:val="0"/>
+              </w:rPr>
+              <w:t xml:space="preserve">Test Description</w:t>
+            </w:r>
+            <w:r>
+              <w:rPr>
+                <w:rtl w:val="0"/>
+              </w:rPr>
+            </w:r>
+          </w:p>
+        </w:tc>
+        <w:tc>
+          <w:tcPr>
+            <w:tcBorders>
+              <w:top w:color="000000" w:space="0" w:sz="8" w:val="single"/>
+              <w:left w:color="000000" w:space="0" w:sz="8" w:val="single"/>
+              <w:bottom w:color="000000" w:space="0" w:sz="8" w:val="single"/>
+              <w:right w:color="000000" w:space="0" w:sz="8" w:val="single"/>
+            </w:tcBorders>
+            <w:tcMar>
+              <w:top w:w="100.0" w:type="dxa"/>
+              <w:left w:w="100.0" w:type="dxa"/>
+              <w:bottom w:w="100.0" w:type="dxa"/>
+              <w:right w:w="100.0" w:type="dxa"/>
+            </w:tcMar>
+            <w:vAlign w:val="top"/>
+          </w:tcPr>
+          <w:p>
+            <w:pPr>
+              <w:spacing w:line="276" w:lineRule="auto"/>
+              <w:ind w:left="0" w:firstLine="0"/>
+              <w:jc w:val="center"/>
+              <w:rPr>
+                <w:sz w:val="26"/>
+                <w:szCs w:val="26"/>
+              </w:rPr>
+            </w:pPr>
+            <w:r>
+              <w:rPr>
+                <w:b w:val="1"/>
+                <w:bCs w:val="1"/>
+                <w:sz w:val="26"/>
+                <w:szCs w:val="26"/>
+                <w:rtl w:val="0"/>
+              </w:rPr>
+              <w:t xml:space="preserve">Status</w:t>
+            </w:r>
+            <w:r>
+              <w:rPr>
+                <w:rtl w:val="0"/>
+              </w:rPr>
+            </w:r>
+          </w:p>
+        </w:tc>
+      </w:tr>
+      <w:tr>
+        <w:trPr>
+          <w:cantSplit w:val="0"/>
+          <w:trHeight w:val="500" w:hRule="atLeast"/>
+          <w:tblHeader w:val="0"/>
+        </w:trPr>
+        <w:tc>
+          <w:tcPr>
+            <w:tcBorders>
+              <w:top w:color="000000" w:space="0" w:sz="8" w:val="single"/>
+              <w:left w:color="000000" w:space="0" w:sz="8" w:val="single"/>
+              <w:bottom w:color="000000" w:space="0" w:sz="8" w:val="single"/>
+              <w:right w:color="000000" w:space="0" w:sz="8" w:val="single"/>
+            </w:tcBorders>
+            <w:tcMar>
+              <w:top w:w="100.0" w:type="dxa"/>
+              <w:left w:w="100.0" w:type="dxa"/>
+              <w:bottom w:w="100.0" w:type="dxa"/>
+              <w:right w:w="100.0" w:type="dxa"/>
+            </w:tcMar>
+            <w:vAlign w:val="top"/>
+          </w:tcPr>
+          <w:p>
+            <w:pPr>
+              <w:spacing w:line="276" w:lineRule="auto"/>
+              <w:ind w:left="0" w:firstLine="0"/>
+              <w:jc w:val="left"/>
+              <w:rPr/>
+            </w:pPr>
+            <w:r>
+              <w:rPr>
+                <w:rtl w:val="0"/>
+              </w:rPr>
+              <w:t xml:space="preserve">Save data after adding, editing, or deleting a transaction and confirm persistence</w:t>
+            </w:r>
+          </w:p>
+        </w:tc>
+        <w:tc>
+          <w:tcPr>
+            <w:tcBorders>
+              <w:top w:color="000000" w:space="0" w:sz="8" w:val="single"/>
+              <w:left w:color="000000" w:space="0" w:sz="8" w:val="single"/>
+              <w:bottom w:color="000000" w:space="0" w:sz="8" w:val="single"/>
+              <w:right w:color="000000" w:space="0" w:sz="8" w:val="single"/>
+            </w:tcBorders>
+            <w:tcMar>
+              <w:top w:w="100.0" w:type="dxa"/>
+              <w:left w:w="100.0" w:type="dxa"/>
+              <w:bottom w:w="100.0" w:type="dxa"/>
+              <w:right w:w="100.0" w:type="dxa"/>
+            </w:tcMar>
+            <w:vAlign w:val="top"/>
+          </w:tcPr>
+          <w:p>
+            <w:pPr>
+              <w:spacing w:line="276" w:lineRule="auto"/>
+              <w:ind w:left="0" w:firstLine="0"/>
+              <w:jc w:val="center"/>
+              <w:rPr/>
+            </w:pPr>
+            <w:r>
+              <w:rPr>
+                <w:rtl w:val="0"/>
+              </w:rPr>
+              <w:t xml:space="preserve">Pass</w:t>
+            </w:r>
+          </w:p>
+        </w:tc>
+      </w:tr>
+      <w:tr>
+        <w:trPr>
+          <w:cantSplit w:val="0"/>
+          <w:trHeight w:val="500" w:hRule="atLeast"/>
+          <w:tblHeader w:val="0"/>
+        </w:trPr>
+        <w:tc>
+          <w:tcPr>
+            <w:tcBorders>
+              <w:top w:color="000000" w:space="0" w:sz="8" w:val="single"/>
+              <w:left w:color="000000" w:space="0" w:sz="8" w:val="single"/>
+              <w:bottom w:color="000000" w:space="0" w:sz="8" w:val="single"/>
+              <w:right w:color="000000" w:space="0" w:sz="8" w:val="single"/>
+            </w:tcBorders>
+            <w:tcMar>
+              <w:top w:w="100.0" w:type="dxa"/>
+              <w:left w:w="100.0" w:type="dxa"/>
+              <w:bottom w:w="100.0" w:type="dxa"/>
+              <w:right w:w="100.0" w:type="dxa"/>
+            </w:tcMar>
+            <w:vAlign w:val="top"/>
+          </w:tcPr>
+          <w:p>
+            <w:pPr>
+              <w:spacing w:line="276" w:lineRule="auto"/>
+              <w:ind w:left="0" w:firstLine="0"/>
+              <w:jc w:val="left"/>
+              <w:rPr/>
+            </w:pPr>
+            <w:r>
+              <w:rPr>
+                <w:rtl w:val="0"/>
+              </w:rPr>
+              <w:t xml:space="preserve">Save data after adding, editing, or deleting a budget and confirm persistence</w:t>
+            </w:r>
+          </w:p>
+        </w:tc>
+        <w:tc>
+          <w:tcPr>
+            <w:tcBorders>
+              <w:top w:color="000000" w:space="0" w:sz="8" w:val="single"/>
+              <w:left w:color="000000" w:space="0" w:sz="8" w:val="single"/>
+              <w:bottom w:color="000000" w:space="0" w:sz="8" w:val="single"/>
+              <w:right w:color="000000" w:space="0" w:sz="8" w:val="single"/>
+            </w:tcBorders>
+            <w:tcMar>
+              <w:top w:w="100.0" w:type="dxa"/>
+              <w:left w:w="100.0" w:type="dxa"/>
+              <w:bottom w:w="100.0" w:type="dxa"/>
+              <w:right w:w="100.0" w:type="dxa"/>
+            </w:tcMar>
+            <w:vAlign w:val="top"/>
+          </w:tcPr>
+          <w:p>
+            <w:pPr>
+              <w:spacing w:line="276" w:lineRule="auto"/>
+              <w:ind w:left="0" w:firstLine="0"/>
+              <w:jc w:val="center"/>
+              <w:rPr/>
+            </w:pPr>
+            <w:r>
+              <w:rPr>
+                <w:rtl w:val="0"/>
+              </w:rPr>
+              <w:t xml:space="preserve">Pass</w:t>
+            </w:r>
+          </w:p>
+        </w:tc>
+      </w:tr>
+      <w:tr>
+        <w:trPr>
+          <w:cantSplit w:val="0"/>
+          <w:trHeight w:val="770" w:hRule="atLeast"/>
+          <w:tblHeader w:val="0"/>
+        </w:trPr>
+        <w:tc>
+          <w:tcPr>
+            <w:tcBorders>
+              <w:top w:color="000000" w:space="0" w:sz="8" w:val="single"/>
+              <w:left w:color="000000" w:space="0" w:sz="8" w:val="single"/>
+              <w:bottom w:color="000000" w:space="0" w:sz="8" w:val="single"/>
+              <w:right w:color="000000" w:space="0" w:sz="8" w:val="single"/>
+            </w:tcBorders>
+            <w:tcMar>
+              <w:top w:w="100.0" w:type="dxa"/>
+              <w:left w:w="100.0" w:type="dxa"/>
+              <w:bottom w:w="100.0" w:type="dxa"/>
+              <w:right w:w="100.0" w:type="dxa"/>
+            </w:tcMar>
+            <w:vAlign w:val="top"/>
+          </w:tcPr>
+          <w:p>
+            <w:pPr>
+              <w:spacing w:line="276" w:lineRule="auto"/>
+              <w:ind w:left="0" w:firstLine="0"/>
+              <w:jc w:val="left"/>
+              <w:rPr/>
+            </w:pPr>
+            <w:r>
+              <w:rPr>
+                <w:rtl w:val="0"/>
+              </w:rPr>
+              <w:t xml:space="preserve">Restart the application and confirm all saved data (transactions and budgets) are restored correctly</w:t>
+            </w:r>
+          </w:p>
+        </w:tc>
+        <w:tc>
+          <w:tcPr>
+            <w:tcBorders>
+              <w:top w:color="000000" w:space="0" w:sz="8" w:val="single"/>
+              <w:left w:color="000000" w:space="0" w:sz="8" w:val="single"/>
+              <w:bottom w:color="000000" w:space="0" w:sz="8" w:val="single"/>
+              <w:right w:color="000000" w:space="0" w:sz="8" w:val="single"/>
+            </w:tcBorders>
+            <w:tcMar>
+              <w:top w:w="100.0" w:type="dxa"/>
+              <w:left w:w="100.0" w:type="dxa"/>
+              <w:bottom w:w="100.0" w:type="dxa"/>
+              <w:right w:w="100.0" w:type="dxa"/>
+            </w:tcMar>
+            <w:vAlign w:val="top"/>
+          </w:tcPr>
+          <w:p>
+            <w:pPr>
+              <w:spacing w:line="276" w:lineRule="auto"/>
+              <w:ind w:left="0" w:firstLine="0"/>
+              <w:jc w:val="center"/>
+              <w:rPr/>
+            </w:pPr>
+            <w:r>
+              <w:rPr>
+                <w:rtl w:val="0"/>
+              </w:rPr>
+              <w:t xml:space="preserve">Pass</w:t>
+            </w:r>
+          </w:p>
+        </w:tc>
+      </w:tr>
+    </w:tbl>
+    <w:p>
+      <w:pPr>
+        <w:spacing w:line="276" w:lineRule="auto"/>
+        <w:rPr/>
+      </w:pPr>
+      <w:r>
+        <w:rPr>
+          <w:rtl w:val="0"/>
+        </w:rPr>
+      </w:r>
+    </w:p>
+    <w:p>
+      <w:pPr>
         <w:keepNext w:val="0"/>
         <w:keepLines w:val="0"/>
         <w:pageBreakBefore w:val="0"/>
@@ -7794,7 +8631,7 @@
       </w:pPr>
       <w:sdt>
         <w:sdtPr>
-          <w:id w:val="-161196666"/>
+          <w:id w:val="-311013466"/>
           <w:tag w:val="goog_rdk_2"/>
         </w:sdtPr>
         <w:sdtContent>
@@ -7959,7 +8796,7 @@
       </w:pPr>
       <w:sdt>
         <w:sdtPr>
-          <w:id w:val="928642690"/>
+          <w:id w:val="-995439900"/>
           <w:tag w:val="goog_rdk_3"/>
         </w:sdtPr>
         <w:sdtContent>
@@ -8017,7 +8854,7 @@
       </w:pPr>
       <w:sdt>
         <w:sdtPr>
-          <w:id w:val="-932053397"/>
+          <w:id w:val="1493280177"/>
           <w:tag w:val="goog_rdk_4"/>
         </w:sdtPr>
         <w:sdtContent>
@@ -8045,7 +8882,7 @@
       </w:pPr>
       <w:sdt>
         <w:sdtPr>
-          <w:id w:val="1701896355"/>
+          <w:id w:val="1914987574"/>
           <w:tag w:val="goog_rdk_5"/>
         </w:sdtPr>
         <w:sdtContent>
@@ -8073,7 +8910,7 @@
       </w:pPr>
       <w:sdt>
         <w:sdtPr>
-          <w:id w:val="2135099444"/>
+          <w:id w:val="499711668"/>
           <w:tag w:val="goog_rdk_6"/>
         </w:sdtPr>
         <w:sdtContent>
@@ -8101,7 +8938,7 @@
       </w:pPr>
       <w:sdt>
         <w:sdtPr>
-          <w:id w:val="765093426"/>
+          <w:id w:val="-1244679484"/>
           <w:tag w:val="goog_rdk_7"/>
         </w:sdtPr>
         <w:sdtContent>
@@ -8129,7 +8966,7 @@
       </w:pPr>
       <w:sdt>
         <w:sdtPr>
-          <w:id w:val="1678161003"/>
+          <w:id w:val="1832025115"/>
           <w:tag w:val="goog_rdk_8"/>
         </w:sdtPr>
         <w:sdtContent>
@@ -8186,7 +9023,7 @@
     </w:p>
     <w:tbl>
       <w:tblPr>
-        <w:tblStyle w:val="Table4"/>
+        <w:tblStyle w:val="Table6"/>
         <w:tblW w:w="9019.0" w:type="dxa"/>
         <w:jc w:val="left"/>
         <w:tblBorders>
@@ -8872,7 +9709,7 @@
     </w:p>
     <w:tbl>
       <w:tblPr>
-        <w:tblStyle w:val="Table5"/>
+        <w:tblStyle w:val="Table7"/>
         <w:tblW w:w="9019.0" w:type="dxa"/>
         <w:jc w:val="left"/>
         <w:tblBorders>
@@ -9633,7 +10470,7 @@
     </w:p>
     <w:tbl>
       <w:tblPr>
-        <w:tblStyle w:val="Table6"/>
+        <w:tblStyle w:val="Table8"/>
         <w:tblW w:w="9019.0" w:type="dxa"/>
         <w:jc w:val="left"/>
         <w:tblBorders>
@@ -13265,6 +14102,22 @@
     <w:tblPr>
       <w:tblStyleRowBandSize w:val="1"/>
       <w:tblStyleColBandSize w:val="1"/>
+      <w:tblCellMar/>
+    </w:tblPr>
+  </w:style>
+  <w:style w:type="table" w:styleId="Table5">
+    <w:basedOn w:val="TableNormal"/>
+    <w:tblPr>
+      <w:tblStyleRowBandSize w:val="1"/>
+      <w:tblStyleColBandSize w:val="1"/>
+      <w:tblCellMar/>
+    </w:tblPr>
+  </w:style>
+  <w:style w:type="table" w:styleId="Table6">
+    <w:basedOn w:val="TableNormal"/>
+    <w:tblPr>
+      <w:tblStyleRowBandSize w:val="1"/>
+      <w:tblStyleColBandSize w:val="1"/>
       <w:tblCellMar>
         <w:top w:w="15.0" w:type="dxa"/>
         <w:left w:w="15.0" w:type="dxa"/>
@@ -13273,7 +14126,7 @@
       </w:tblCellMar>
     </w:tblPr>
   </w:style>
-  <w:style w:type="table" w:styleId="Table5">
+  <w:style w:type="table" w:styleId="Table7">
     <w:basedOn w:val="TableNormal"/>
     <w:pPr>
       <w:spacing w:line="240" w:lineRule="auto"/>
@@ -13323,7 +14176,7 @@
       </w:tcPr>
     </w:tblStylePr>
   </w:style>
-  <w:style w:type="table" w:styleId="Table6">
+  <w:style w:type="table" w:styleId="Table8">
     <w:basedOn w:val="TableNormal"/>
     <w:pPr>
       <w:spacing w:line="240" w:lineRule="auto"/>

</xml_diff>

<commit_message>
Add test results for System Workflows and Edge Cases
</commit_message>
<xml_diff>
--- a/docs/deliverables/3.2/Deliverable 3-2 Implementation - Submission.docx
+++ b/docs/deliverables/3.2/Deliverable 3-2 Implementation - Submission.docx
@@ -364,7 +364,7 @@
     </w:p>
     <w:sdt>
       <w:sdtPr>
-        <w:id w:val="258945412"/>
+        <w:id w:val="1797605073"/>
         <w:docPartObj>
           <w:docPartGallery w:val="Table of Contents"/>
           <w:docPartUnique w:val="1"/>
@@ -6179,7 +6179,7 @@
     <w:sdt>
       <w:sdtPr>
         <w:lock w:val="contentLocked"/>
-        <w:id w:val="1141334731"/>
+        <w:id w:val="-501352935"/>
         <w:tag w:val="goog_rdk_0"/>
       </w:sdtPr>
       <w:sdtContent>
@@ -6857,7 +6857,7 @@
     <w:sdt>
       <w:sdtPr>
         <w:lock w:val="contentLocked"/>
-        <w:id w:val="1565695188"/>
+        <w:id w:val="-1363053295"/>
         <w:tag w:val="goog_rdk_1"/>
       </w:sdtPr>
       <w:sdtContent>
@@ -8262,7 +8262,7 @@
       <w:tr>
         <w:trPr>
           <w:cantSplit w:val="0"/>
-          <w:trHeight w:val="500" w:hRule="atLeast"/>
+          <w:trHeight w:val="1099.74609375" w:hRule="atLeast"/>
           <w:tblHeader w:val="0"/>
         </w:trPr>
         <w:tc>
@@ -8331,7 +8331,7 @@
       <w:tr>
         <w:trPr>
           <w:cantSplit w:val="0"/>
-          <w:trHeight w:val="500" w:hRule="atLeast"/>
+          <w:trHeight w:val="1035" w:hRule="atLeast"/>
           <w:tblHeader w:val="0"/>
         </w:trPr>
         <w:tc>
@@ -8400,7 +8400,7 @@
       <w:tr>
         <w:trPr>
           <w:cantSplit w:val="0"/>
-          <w:trHeight w:val="770" w:hRule="atLeast"/>
+          <w:trHeight w:val="1009.74609375" w:hRule="atLeast"/>
           <w:tblHeader w:val="0"/>
         </w:trPr>
         <w:tc>
@@ -8631,7 +8631,7 @@
       </w:pPr>
       <w:sdt>
         <w:sdtPr>
-          <w:id w:val="-311013466"/>
+          <w:id w:val="1591369882"/>
           <w:tag w:val="goog_rdk_2"/>
         </w:sdtPr>
         <w:sdtContent>
@@ -8796,7 +8796,7 @@
       </w:pPr>
       <w:sdt>
         <w:sdtPr>
-          <w:id w:val="-995439900"/>
+          <w:id w:val="1301401885"/>
           <w:tag w:val="goog_rdk_3"/>
         </w:sdtPr>
         <w:sdtContent>
@@ -8854,7 +8854,7 @@
       </w:pPr>
       <w:sdt>
         <w:sdtPr>
-          <w:id w:val="1493280177"/>
+          <w:id w:val="-840289798"/>
           <w:tag w:val="goog_rdk_4"/>
         </w:sdtPr>
         <w:sdtContent>
@@ -8882,7 +8882,7 @@
       </w:pPr>
       <w:sdt>
         <w:sdtPr>
-          <w:id w:val="1914987574"/>
+          <w:id w:val="-2061409508"/>
           <w:tag w:val="goog_rdk_5"/>
         </w:sdtPr>
         <w:sdtContent>
@@ -8910,7 +8910,7 @@
       </w:pPr>
       <w:sdt>
         <w:sdtPr>
-          <w:id w:val="499711668"/>
+          <w:id w:val="860277927"/>
           <w:tag w:val="goog_rdk_6"/>
         </w:sdtPr>
         <w:sdtContent>
@@ -8938,7 +8938,7 @@
       </w:pPr>
       <w:sdt>
         <w:sdtPr>
-          <w:id w:val="-1244679484"/>
+          <w:id w:val="-187101319"/>
           <w:tag w:val="goog_rdk_7"/>
         </w:sdtPr>
         <w:sdtContent>
@@ -8966,7 +8966,7 @@
       </w:pPr>
       <w:sdt>
         <w:sdtPr>
-          <w:id w:val="1832025115"/>
+          <w:id w:val="-904033477"/>
           <w:tag w:val="goog_rdk_8"/>
         </w:sdtPr>
         <w:sdtContent>
@@ -9212,6 +9212,1252 @@
         <w:rPr>
           <w:rtl w:val="0"/>
         </w:rPr>
+        <w:br w:type="textWrapping"/>
+      </w:r>
+    </w:p>
+    <w:tbl>
+      <w:tblPr>
+        <w:tblStyle w:val="Table7"/>
+        <w:tblW w:w="9030.0" w:type="dxa"/>
+        <w:jc w:val="left"/>
+        <w:tblBorders>
+          <w:top w:color="000000" w:space="0" w:sz="0" w:val="nil"/>
+          <w:left w:color="000000" w:space="0" w:sz="0" w:val="nil"/>
+          <w:bottom w:color="000000" w:space="0" w:sz="0" w:val="nil"/>
+          <w:right w:color="000000" w:space="0" w:sz="0" w:val="nil"/>
+          <w:insideH w:color="000000" w:space="0" w:sz="0" w:val="nil"/>
+          <w:insideV w:color="000000" w:space="0" w:sz="0" w:val="nil"/>
+        </w:tblBorders>
+        <w:tblLayout w:type="fixed"/>
+        <w:tblLook w:val="0600"/>
+      </w:tblPr>
+      <w:tblGrid>
+        <w:gridCol w:w="1155"/>
+        <w:gridCol w:w="2295"/>
+        <w:gridCol w:w="2025"/>
+        <w:gridCol w:w="1665"/>
+        <w:gridCol w:w="960"/>
+        <w:gridCol w:w="930"/>
+        <w:tblGridChange w:id="0">
+          <w:tblGrid>
+            <w:gridCol w:w="1155"/>
+            <w:gridCol w:w="2295"/>
+            <w:gridCol w:w="2025"/>
+            <w:gridCol w:w="1665"/>
+            <w:gridCol w:w="960"/>
+            <w:gridCol w:w="930"/>
+          </w:tblGrid>
+        </w:tblGridChange>
+      </w:tblGrid>
+      <w:tr>
+        <w:trPr>
+          <w:cantSplit w:val="0"/>
+          <w:trHeight w:val="829.74609375" w:hRule="atLeast"/>
+          <w:tblHeader w:val="0"/>
+        </w:trPr>
+        <w:tc>
+          <w:tcPr>
+            <w:tcBorders>
+              <w:top w:color="000000" w:space="0" w:sz="8" w:val="single"/>
+              <w:left w:color="000000" w:space="0" w:sz="8" w:val="single"/>
+              <w:bottom w:color="000000" w:space="0" w:sz="8" w:val="single"/>
+              <w:right w:color="000000" w:space="0" w:sz="8" w:val="single"/>
+            </w:tcBorders>
+            <w:tcMar>
+              <w:top w:w="100.0" w:type="dxa"/>
+              <w:left w:w="100.0" w:type="dxa"/>
+              <w:bottom w:w="100.0" w:type="dxa"/>
+              <w:right w:w="100.0" w:type="dxa"/>
+            </w:tcMar>
+            <w:vAlign w:val="top"/>
+          </w:tcPr>
+          <w:p>
+            <w:pPr>
+              <w:spacing w:line="276" w:lineRule="auto"/>
+              <w:ind w:left="0" w:firstLine="0"/>
+              <w:jc w:val="center"/>
+              <w:rPr/>
+            </w:pPr>
+            <w:r>
+              <w:rPr>
+                <w:b w:val="1"/>
+                <w:bCs w:val="1"/>
+                <w:rtl w:val="0"/>
+              </w:rPr>
+              <w:t xml:space="preserve">Workflow ID</w:t>
+            </w:r>
+            <w:r>
+              <w:rPr>
+                <w:rtl w:val="0"/>
+              </w:rPr>
+            </w:r>
+          </w:p>
+        </w:tc>
+        <w:tc>
+          <w:tcPr>
+            <w:tcBorders>
+              <w:top w:color="000000" w:space="0" w:sz="8" w:val="single"/>
+              <w:left w:color="000000" w:space="0" w:sz="8" w:val="single"/>
+              <w:bottom w:color="000000" w:space="0" w:sz="8" w:val="single"/>
+              <w:right w:color="000000" w:space="0" w:sz="8" w:val="single"/>
+            </w:tcBorders>
+            <w:tcMar>
+              <w:top w:w="100.0" w:type="dxa"/>
+              <w:left w:w="100.0" w:type="dxa"/>
+              <w:bottom w:w="100.0" w:type="dxa"/>
+              <w:right w:w="100.0" w:type="dxa"/>
+            </w:tcMar>
+            <w:vAlign w:val="top"/>
+          </w:tcPr>
+          <w:p>
+            <w:pPr>
+              <w:spacing w:line="276" w:lineRule="auto"/>
+              <w:ind w:left="0" w:firstLine="0"/>
+              <w:jc w:val="center"/>
+              <w:rPr/>
+            </w:pPr>
+            <w:r>
+              <w:rPr>
+                <w:b w:val="1"/>
+                <w:bCs w:val="1"/>
+                <w:rtl w:val="0"/>
+              </w:rPr>
+              <w:t xml:space="preserve">Scenario</w:t>
+            </w:r>
+            <w:r>
+              <w:rPr>
+                <w:rtl w:val="0"/>
+              </w:rPr>
+            </w:r>
+          </w:p>
+        </w:tc>
+        <w:tc>
+          <w:tcPr>
+            <w:tcBorders>
+              <w:top w:color="000000" w:space="0" w:sz="8" w:val="single"/>
+              <w:left w:color="000000" w:space="0" w:sz="8" w:val="single"/>
+              <w:bottom w:color="000000" w:space="0" w:sz="8" w:val="single"/>
+              <w:right w:color="000000" w:space="0" w:sz="8" w:val="single"/>
+            </w:tcBorders>
+            <w:tcMar>
+              <w:top w:w="100.0" w:type="dxa"/>
+              <w:left w:w="100.0" w:type="dxa"/>
+              <w:bottom w:w="100.0" w:type="dxa"/>
+              <w:right w:w="100.0" w:type="dxa"/>
+            </w:tcMar>
+            <w:vAlign w:val="top"/>
+          </w:tcPr>
+          <w:p>
+            <w:pPr>
+              <w:spacing w:line="276" w:lineRule="auto"/>
+              <w:ind w:left="0" w:firstLine="0"/>
+              <w:jc w:val="center"/>
+              <w:rPr/>
+            </w:pPr>
+            <w:r>
+              <w:rPr>
+                <w:b w:val="1"/>
+                <w:bCs w:val="1"/>
+                <w:rtl w:val="0"/>
+              </w:rPr>
+              <w:t xml:space="preserve">Expected Result</w:t>
+            </w:r>
+            <w:r>
+              <w:rPr>
+                <w:rtl w:val="0"/>
+              </w:rPr>
+            </w:r>
+          </w:p>
+        </w:tc>
+        <w:tc>
+          <w:tcPr>
+            <w:tcBorders>
+              <w:top w:color="000000" w:space="0" w:sz="8" w:val="single"/>
+              <w:left w:color="000000" w:space="0" w:sz="8" w:val="single"/>
+              <w:bottom w:color="000000" w:space="0" w:sz="8" w:val="single"/>
+              <w:right w:color="000000" w:space="0" w:sz="8" w:val="single"/>
+            </w:tcBorders>
+            <w:tcMar>
+              <w:top w:w="100.0" w:type="dxa"/>
+              <w:left w:w="100.0" w:type="dxa"/>
+              <w:bottom w:w="100.0" w:type="dxa"/>
+              <w:right w:w="100.0" w:type="dxa"/>
+            </w:tcMar>
+            <w:vAlign w:val="top"/>
+          </w:tcPr>
+          <w:p>
+            <w:pPr>
+              <w:spacing w:line="276" w:lineRule="auto"/>
+              <w:ind w:left="0" w:firstLine="0"/>
+              <w:jc w:val="center"/>
+              <w:rPr/>
+            </w:pPr>
+            <w:r>
+              <w:rPr>
+                <w:b w:val="1"/>
+                <w:bCs w:val="1"/>
+                <w:rtl w:val="0"/>
+              </w:rPr>
+              <w:t xml:space="preserve">Actual Result</w:t>
+            </w:r>
+            <w:r>
+              <w:rPr>
+                <w:rtl w:val="0"/>
+              </w:rPr>
+            </w:r>
+          </w:p>
+        </w:tc>
+        <w:tc>
+          <w:tcPr>
+            <w:tcBorders>
+              <w:top w:color="000000" w:space="0" w:sz="8" w:val="single"/>
+              <w:left w:color="000000" w:space="0" w:sz="8" w:val="single"/>
+              <w:bottom w:color="000000" w:space="0" w:sz="8" w:val="single"/>
+              <w:right w:color="000000" w:space="0" w:sz="8" w:val="single"/>
+            </w:tcBorders>
+            <w:tcMar>
+              <w:top w:w="100.0" w:type="dxa"/>
+              <w:left w:w="100.0" w:type="dxa"/>
+              <w:bottom w:w="100.0" w:type="dxa"/>
+              <w:right w:w="100.0" w:type="dxa"/>
+            </w:tcMar>
+            <w:vAlign w:val="top"/>
+          </w:tcPr>
+          <w:p>
+            <w:pPr>
+              <w:spacing w:line="276" w:lineRule="auto"/>
+              <w:ind w:left="0" w:firstLine="0"/>
+              <w:jc w:val="center"/>
+              <w:rPr/>
+            </w:pPr>
+            <w:r>
+              <w:rPr>
+                <w:b w:val="1"/>
+                <w:bCs w:val="1"/>
+                <w:rtl w:val="0"/>
+              </w:rPr>
+              <w:t xml:space="preserve">Status</w:t>
+            </w:r>
+            <w:r>
+              <w:rPr>
+                <w:rtl w:val="0"/>
+              </w:rPr>
+            </w:r>
+          </w:p>
+        </w:tc>
+        <w:tc>
+          <w:tcPr>
+            <w:tcBorders>
+              <w:top w:color="000000" w:space="0" w:sz="8" w:val="single"/>
+              <w:left w:color="000000" w:space="0" w:sz="8" w:val="single"/>
+              <w:bottom w:color="000000" w:space="0" w:sz="8" w:val="single"/>
+              <w:right w:color="000000" w:space="0" w:sz="8" w:val="single"/>
+            </w:tcBorders>
+            <w:tcMar>
+              <w:top w:w="100.0" w:type="dxa"/>
+              <w:left w:w="100.0" w:type="dxa"/>
+              <w:bottom w:w="100.0" w:type="dxa"/>
+              <w:right w:w="100.0" w:type="dxa"/>
+            </w:tcMar>
+            <w:vAlign w:val="top"/>
+          </w:tcPr>
+          <w:p>
+            <w:pPr>
+              <w:spacing w:line="276" w:lineRule="auto"/>
+              <w:ind w:left="0" w:firstLine="0"/>
+              <w:jc w:val="center"/>
+              <w:rPr/>
+            </w:pPr>
+            <w:r>
+              <w:rPr>
+                <w:b w:val="1"/>
+                <w:bCs w:val="1"/>
+                <w:rtl w:val="0"/>
+              </w:rPr>
+              <w:t xml:space="preserve">Notes</w:t>
+            </w:r>
+            <w:r>
+              <w:rPr>
+                <w:rtl w:val="0"/>
+              </w:rPr>
+            </w:r>
+          </w:p>
+        </w:tc>
+      </w:tr>
+      <w:tr>
+        <w:trPr>
+          <w:cantSplit w:val="0"/>
+          <w:trHeight w:val="1325" w:hRule="atLeast"/>
+          <w:tblHeader w:val="0"/>
+        </w:trPr>
+        <w:tc>
+          <w:tcPr>
+            <w:tcBorders>
+              <w:top w:color="000000" w:space="0" w:sz="8" w:val="single"/>
+              <w:left w:color="000000" w:space="0" w:sz="8" w:val="single"/>
+              <w:bottom w:color="000000" w:space="0" w:sz="8" w:val="single"/>
+              <w:right w:color="000000" w:space="0" w:sz="8" w:val="single"/>
+            </w:tcBorders>
+            <w:tcMar>
+              <w:top w:w="100.0" w:type="dxa"/>
+              <w:left w:w="100.0" w:type="dxa"/>
+              <w:bottom w:w="100.0" w:type="dxa"/>
+              <w:right w:w="100.0" w:type="dxa"/>
+            </w:tcMar>
+            <w:vAlign w:val="top"/>
+          </w:tcPr>
+          <w:p>
+            <w:pPr>
+              <w:spacing w:line="276" w:lineRule="auto"/>
+              <w:ind w:left="0" w:firstLine="0"/>
+              <w:jc w:val="left"/>
+              <w:rPr/>
+            </w:pPr>
+            <w:r>
+              <w:rPr>
+                <w:rtl w:val="0"/>
+              </w:rPr>
+              <w:t xml:space="preserve">WF-001</w:t>
+            </w:r>
+          </w:p>
+        </w:tc>
+        <w:tc>
+          <w:tcPr>
+            <w:tcBorders>
+              <w:top w:color="000000" w:space="0" w:sz="8" w:val="single"/>
+              <w:left w:color="000000" w:space="0" w:sz="8" w:val="single"/>
+              <w:bottom w:color="000000" w:space="0" w:sz="8" w:val="single"/>
+              <w:right w:color="000000" w:space="0" w:sz="8" w:val="single"/>
+            </w:tcBorders>
+            <w:tcMar>
+              <w:top w:w="100.0" w:type="dxa"/>
+              <w:left w:w="100.0" w:type="dxa"/>
+              <w:bottom w:w="100.0" w:type="dxa"/>
+              <w:right w:w="100.0" w:type="dxa"/>
+            </w:tcMar>
+            <w:vAlign w:val="top"/>
+          </w:tcPr>
+          <w:p>
+            <w:pPr>
+              <w:spacing w:line="276" w:lineRule="auto"/>
+              <w:ind w:left="0" w:firstLine="0"/>
+              <w:jc w:val="left"/>
+              <w:rPr/>
+            </w:pPr>
+            <w:r>
+              <w:rPr>
+                <w:rtl w:val="0"/>
+              </w:rPr>
+              <w:t xml:space="preserve">Add transactions, set a budget, and trigger overspending alert</w:t>
+            </w:r>
+          </w:p>
+        </w:tc>
+        <w:tc>
+          <w:tcPr>
+            <w:tcBorders>
+              <w:top w:color="000000" w:space="0" w:sz="8" w:val="single"/>
+              <w:left w:color="000000" w:space="0" w:sz="8" w:val="single"/>
+              <w:bottom w:color="000000" w:space="0" w:sz="8" w:val="single"/>
+              <w:right w:color="000000" w:space="0" w:sz="8" w:val="single"/>
+            </w:tcBorders>
+            <w:tcMar>
+              <w:top w:w="100.0" w:type="dxa"/>
+              <w:left w:w="100.0" w:type="dxa"/>
+              <w:bottom w:w="100.0" w:type="dxa"/>
+              <w:right w:w="100.0" w:type="dxa"/>
+            </w:tcMar>
+            <w:vAlign w:val="top"/>
+          </w:tcPr>
+          <w:p>
+            <w:pPr>
+              <w:spacing w:line="276" w:lineRule="auto"/>
+              <w:ind w:left="0" w:firstLine="0"/>
+              <w:jc w:val="left"/>
+              <w:rPr/>
+            </w:pPr>
+            <w:r>
+              <w:rPr>
+                <w:rtl w:val="0"/>
+              </w:rPr>
+              <w:t xml:space="preserve">Overspending alert displays when spending exceeds budget</w:t>
+            </w:r>
+          </w:p>
+        </w:tc>
+        <w:tc>
+          <w:tcPr>
+            <w:tcBorders>
+              <w:top w:color="000000" w:space="0" w:sz="8" w:val="single"/>
+              <w:left w:color="000000" w:space="0" w:sz="8" w:val="single"/>
+              <w:bottom w:color="000000" w:space="0" w:sz="8" w:val="single"/>
+              <w:right w:color="000000" w:space="0" w:sz="8" w:val="single"/>
+            </w:tcBorders>
+            <w:tcMar>
+              <w:top w:w="100.0" w:type="dxa"/>
+              <w:left w:w="100.0" w:type="dxa"/>
+              <w:bottom w:w="100.0" w:type="dxa"/>
+              <w:right w:w="100.0" w:type="dxa"/>
+            </w:tcMar>
+            <w:vAlign w:val="top"/>
+          </w:tcPr>
+          <w:p>
+            <w:pPr>
+              <w:spacing w:line="276" w:lineRule="auto"/>
+              <w:ind w:left="0" w:firstLine="0"/>
+              <w:jc w:val="left"/>
+              <w:rPr/>
+            </w:pPr>
+            <w:r>
+              <w:rPr>
+                <w:rtl w:val="0"/>
+              </w:rPr>
+              <w:t xml:space="preserve">Overspending alert displayed correctly</w:t>
+            </w:r>
+          </w:p>
+        </w:tc>
+        <w:tc>
+          <w:tcPr>
+            <w:tcBorders>
+              <w:top w:color="000000" w:space="0" w:sz="8" w:val="single"/>
+              <w:left w:color="000000" w:space="0" w:sz="8" w:val="single"/>
+              <w:bottom w:color="000000" w:space="0" w:sz="8" w:val="single"/>
+              <w:right w:color="000000" w:space="0" w:sz="8" w:val="single"/>
+            </w:tcBorders>
+            <w:tcMar>
+              <w:top w:w="100.0" w:type="dxa"/>
+              <w:left w:w="100.0" w:type="dxa"/>
+              <w:bottom w:w="100.0" w:type="dxa"/>
+              <w:right w:w="100.0" w:type="dxa"/>
+            </w:tcMar>
+            <w:vAlign w:val="top"/>
+          </w:tcPr>
+          <w:p>
+            <w:pPr>
+              <w:spacing w:line="276" w:lineRule="auto"/>
+              <w:ind w:left="0" w:firstLine="0"/>
+              <w:jc w:val="center"/>
+              <w:rPr/>
+            </w:pPr>
+            <w:r>
+              <w:rPr>
+                <w:rtl w:val="0"/>
+              </w:rPr>
+              <w:t xml:space="preserve">Pass</w:t>
+            </w:r>
+          </w:p>
+        </w:tc>
+        <w:tc>
+          <w:tcPr>
+            <w:tcBorders>
+              <w:top w:color="000000" w:space="0" w:sz="8" w:val="single"/>
+              <w:left w:color="000000" w:space="0" w:sz="8" w:val="single"/>
+              <w:bottom w:color="000000" w:space="0" w:sz="8" w:val="single"/>
+              <w:right w:color="000000" w:space="0" w:sz="8" w:val="single"/>
+            </w:tcBorders>
+            <w:tcMar>
+              <w:top w:w="100.0" w:type="dxa"/>
+              <w:left w:w="100.0" w:type="dxa"/>
+              <w:bottom w:w="100.0" w:type="dxa"/>
+              <w:right w:w="100.0" w:type="dxa"/>
+            </w:tcMar>
+            <w:vAlign w:val="top"/>
+          </w:tcPr>
+          <w:p>
+            <w:pPr>
+              <w:spacing w:line="276" w:lineRule="auto"/>
+              <w:ind w:left="0" w:firstLine="0"/>
+              <w:jc w:val="center"/>
+              <w:rPr/>
+            </w:pPr>
+            <w:r>
+              <w:rPr>
+                <w:rtl w:val="0"/>
+              </w:rPr>
+              <w:t xml:space="preserve">N/A</w:t>
+            </w:r>
+          </w:p>
+        </w:tc>
+      </w:tr>
+      <w:tr>
+        <w:trPr>
+          <w:cantSplit w:val="0"/>
+          <w:trHeight w:val="1055" w:hRule="atLeast"/>
+          <w:tblHeader w:val="0"/>
+        </w:trPr>
+        <w:tc>
+          <w:tcPr>
+            <w:tcBorders>
+              <w:top w:color="000000" w:space="0" w:sz="8" w:val="single"/>
+              <w:left w:color="000000" w:space="0" w:sz="8" w:val="single"/>
+              <w:bottom w:color="000000" w:space="0" w:sz="8" w:val="single"/>
+              <w:right w:color="000000" w:space="0" w:sz="8" w:val="single"/>
+            </w:tcBorders>
+            <w:tcMar>
+              <w:top w:w="100.0" w:type="dxa"/>
+              <w:left w:w="100.0" w:type="dxa"/>
+              <w:bottom w:w="100.0" w:type="dxa"/>
+              <w:right w:w="100.0" w:type="dxa"/>
+            </w:tcMar>
+            <w:vAlign w:val="top"/>
+          </w:tcPr>
+          <w:p>
+            <w:pPr>
+              <w:spacing w:line="276" w:lineRule="auto"/>
+              <w:ind w:left="0" w:firstLine="0"/>
+              <w:jc w:val="left"/>
+              <w:rPr/>
+            </w:pPr>
+            <w:r>
+              <w:rPr>
+                <w:rtl w:val="0"/>
+              </w:rPr>
+              <w:t xml:space="preserve">WF-002</w:t>
+            </w:r>
+          </w:p>
+        </w:tc>
+        <w:tc>
+          <w:tcPr>
+            <w:tcBorders>
+              <w:top w:color="000000" w:space="0" w:sz="8" w:val="single"/>
+              <w:left w:color="000000" w:space="0" w:sz="8" w:val="single"/>
+              <w:bottom w:color="000000" w:space="0" w:sz="8" w:val="single"/>
+              <w:right w:color="000000" w:space="0" w:sz="8" w:val="single"/>
+            </w:tcBorders>
+            <w:tcMar>
+              <w:top w:w="100.0" w:type="dxa"/>
+              <w:left w:w="100.0" w:type="dxa"/>
+              <w:bottom w:w="100.0" w:type="dxa"/>
+              <w:right w:w="100.0" w:type="dxa"/>
+            </w:tcMar>
+            <w:vAlign w:val="top"/>
+          </w:tcPr>
+          <w:p>
+            <w:pPr>
+              <w:spacing w:line="276" w:lineRule="auto"/>
+              <w:ind w:left="0" w:firstLine="0"/>
+              <w:jc w:val="left"/>
+              <w:rPr/>
+            </w:pPr>
+            <w:r>
+              <w:rPr>
+                <w:rtl w:val="0"/>
+              </w:rPr>
+              <w:t xml:space="preserve">Add transactions, generate report, and verify totals and category breakdown</w:t>
+            </w:r>
+          </w:p>
+        </w:tc>
+        <w:tc>
+          <w:tcPr>
+            <w:tcBorders>
+              <w:top w:color="000000" w:space="0" w:sz="8" w:val="single"/>
+              <w:left w:color="000000" w:space="0" w:sz="8" w:val="single"/>
+              <w:bottom w:color="000000" w:space="0" w:sz="8" w:val="single"/>
+              <w:right w:color="000000" w:space="0" w:sz="8" w:val="single"/>
+            </w:tcBorders>
+            <w:tcMar>
+              <w:top w:w="100.0" w:type="dxa"/>
+              <w:left w:w="100.0" w:type="dxa"/>
+              <w:bottom w:w="100.0" w:type="dxa"/>
+              <w:right w:w="100.0" w:type="dxa"/>
+            </w:tcMar>
+            <w:vAlign w:val="top"/>
+          </w:tcPr>
+          <w:p>
+            <w:pPr>
+              <w:spacing w:line="276" w:lineRule="auto"/>
+              <w:ind w:left="0" w:firstLine="0"/>
+              <w:jc w:val="left"/>
+              <w:rPr/>
+            </w:pPr>
+            <w:r>
+              <w:rPr>
+                <w:rtl w:val="0"/>
+              </w:rPr>
+              <w:t xml:space="preserve">Report totals and category breakdown are accurate</w:t>
+            </w:r>
+          </w:p>
+        </w:tc>
+        <w:tc>
+          <w:tcPr>
+            <w:tcBorders>
+              <w:top w:color="000000" w:space="0" w:sz="8" w:val="single"/>
+              <w:left w:color="000000" w:space="0" w:sz="8" w:val="single"/>
+              <w:bottom w:color="000000" w:space="0" w:sz="8" w:val="single"/>
+              <w:right w:color="000000" w:space="0" w:sz="8" w:val="single"/>
+            </w:tcBorders>
+            <w:tcMar>
+              <w:top w:w="100.0" w:type="dxa"/>
+              <w:left w:w="100.0" w:type="dxa"/>
+              <w:bottom w:w="100.0" w:type="dxa"/>
+              <w:right w:w="100.0" w:type="dxa"/>
+            </w:tcMar>
+            <w:vAlign w:val="top"/>
+          </w:tcPr>
+          <w:p>
+            <w:pPr>
+              <w:spacing w:line="276" w:lineRule="auto"/>
+              <w:ind w:left="0" w:firstLine="0"/>
+              <w:jc w:val="left"/>
+              <w:rPr/>
+            </w:pPr>
+            <w:r>
+              <w:rPr>
+                <w:rtl w:val="0"/>
+              </w:rPr>
+              <w:t xml:space="preserve">Report generated correctly</w:t>
+            </w:r>
+          </w:p>
+        </w:tc>
+        <w:tc>
+          <w:tcPr>
+            <w:tcBorders>
+              <w:top w:color="000000" w:space="0" w:sz="8" w:val="single"/>
+              <w:left w:color="000000" w:space="0" w:sz="8" w:val="single"/>
+              <w:bottom w:color="000000" w:space="0" w:sz="8" w:val="single"/>
+              <w:right w:color="000000" w:space="0" w:sz="8" w:val="single"/>
+            </w:tcBorders>
+            <w:tcMar>
+              <w:top w:w="100.0" w:type="dxa"/>
+              <w:left w:w="100.0" w:type="dxa"/>
+              <w:bottom w:w="100.0" w:type="dxa"/>
+              <w:right w:w="100.0" w:type="dxa"/>
+            </w:tcMar>
+            <w:vAlign w:val="top"/>
+          </w:tcPr>
+          <w:p>
+            <w:pPr>
+              <w:spacing w:line="276" w:lineRule="auto"/>
+              <w:ind w:left="0" w:firstLine="0"/>
+              <w:jc w:val="center"/>
+              <w:rPr/>
+            </w:pPr>
+            <w:r>
+              <w:rPr>
+                <w:rtl w:val="0"/>
+              </w:rPr>
+              <w:t xml:space="preserve">Pass</w:t>
+            </w:r>
+          </w:p>
+        </w:tc>
+        <w:tc>
+          <w:tcPr>
+            <w:tcBorders>
+              <w:top w:color="000000" w:space="0" w:sz="8" w:val="single"/>
+              <w:left w:color="000000" w:space="0" w:sz="8" w:val="single"/>
+              <w:bottom w:color="000000" w:space="0" w:sz="8" w:val="single"/>
+              <w:right w:color="000000" w:space="0" w:sz="8" w:val="single"/>
+            </w:tcBorders>
+            <w:tcMar>
+              <w:top w:w="100.0" w:type="dxa"/>
+              <w:left w:w="100.0" w:type="dxa"/>
+              <w:bottom w:w="100.0" w:type="dxa"/>
+              <w:right w:w="100.0" w:type="dxa"/>
+            </w:tcMar>
+            <w:vAlign w:val="top"/>
+          </w:tcPr>
+          <w:p>
+            <w:pPr>
+              <w:spacing w:line="276" w:lineRule="auto"/>
+              <w:ind w:left="0" w:firstLine="0"/>
+              <w:jc w:val="center"/>
+              <w:rPr/>
+            </w:pPr>
+            <w:r>
+              <w:rPr>
+                <w:rtl w:val="0"/>
+              </w:rPr>
+              <w:t xml:space="preserve">N/A</w:t>
+            </w:r>
+          </w:p>
+        </w:tc>
+      </w:tr>
+      <w:tr>
+        <w:trPr>
+          <w:cantSplit w:val="0"/>
+          <w:trHeight w:val="1325" w:hRule="atLeast"/>
+          <w:tblHeader w:val="0"/>
+        </w:trPr>
+        <w:tc>
+          <w:tcPr>
+            <w:tcBorders>
+              <w:top w:color="000000" w:space="0" w:sz="8" w:val="single"/>
+              <w:left w:color="000000" w:space="0" w:sz="8" w:val="single"/>
+              <w:bottom w:color="000000" w:space="0" w:sz="8" w:val="single"/>
+              <w:right w:color="000000" w:space="0" w:sz="8" w:val="single"/>
+            </w:tcBorders>
+            <w:tcMar>
+              <w:top w:w="100.0" w:type="dxa"/>
+              <w:left w:w="100.0" w:type="dxa"/>
+              <w:bottom w:w="100.0" w:type="dxa"/>
+              <w:right w:w="100.0" w:type="dxa"/>
+            </w:tcMar>
+            <w:vAlign w:val="top"/>
+          </w:tcPr>
+          <w:p>
+            <w:pPr>
+              <w:spacing w:line="276" w:lineRule="auto"/>
+              <w:ind w:left="0" w:firstLine="0"/>
+              <w:jc w:val="left"/>
+              <w:rPr/>
+            </w:pPr>
+            <w:r>
+              <w:rPr>
+                <w:rtl w:val="0"/>
+              </w:rPr>
+              <w:t xml:space="preserve">WF-003</w:t>
+            </w:r>
+          </w:p>
+        </w:tc>
+        <w:tc>
+          <w:tcPr>
+            <w:tcBorders>
+              <w:top w:color="000000" w:space="0" w:sz="8" w:val="single"/>
+              <w:left w:color="000000" w:space="0" w:sz="8" w:val="single"/>
+              <w:bottom w:color="000000" w:space="0" w:sz="8" w:val="single"/>
+              <w:right w:color="000000" w:space="0" w:sz="8" w:val="single"/>
+            </w:tcBorders>
+            <w:tcMar>
+              <w:top w:w="100.0" w:type="dxa"/>
+              <w:left w:w="100.0" w:type="dxa"/>
+              <w:bottom w:w="100.0" w:type="dxa"/>
+              <w:right w:w="100.0" w:type="dxa"/>
+            </w:tcMar>
+            <w:vAlign w:val="top"/>
+          </w:tcPr>
+          <w:p>
+            <w:pPr>
+              <w:spacing w:line="276" w:lineRule="auto"/>
+              <w:ind w:left="0" w:firstLine="0"/>
+              <w:jc w:val="left"/>
+              <w:rPr/>
+            </w:pPr>
+            <w:r>
+              <w:rPr>
+                <w:rtl w:val="0"/>
+              </w:rPr>
+              <w:t xml:space="preserve">Save data, restart the app, load data, and generate report from restored data</w:t>
+            </w:r>
+          </w:p>
+        </w:tc>
+        <w:tc>
+          <w:tcPr>
+            <w:tcBorders>
+              <w:top w:color="000000" w:space="0" w:sz="8" w:val="single"/>
+              <w:left w:color="000000" w:space="0" w:sz="8" w:val="single"/>
+              <w:bottom w:color="000000" w:space="0" w:sz="8" w:val="single"/>
+              <w:right w:color="000000" w:space="0" w:sz="8" w:val="single"/>
+            </w:tcBorders>
+            <w:tcMar>
+              <w:top w:w="100.0" w:type="dxa"/>
+              <w:left w:w="100.0" w:type="dxa"/>
+              <w:bottom w:w="100.0" w:type="dxa"/>
+              <w:right w:w="100.0" w:type="dxa"/>
+            </w:tcMar>
+            <w:vAlign w:val="top"/>
+          </w:tcPr>
+          <w:p>
+            <w:pPr>
+              <w:spacing w:line="276" w:lineRule="auto"/>
+              <w:ind w:left="0" w:firstLine="0"/>
+              <w:jc w:val="left"/>
+              <w:rPr/>
+            </w:pPr>
+            <w:r>
+              <w:rPr>
+                <w:rtl w:val="0"/>
+              </w:rPr>
+              <w:t xml:space="preserve">Report generated correctly from restored transactions and budgets</w:t>
+            </w:r>
+          </w:p>
+        </w:tc>
+        <w:tc>
+          <w:tcPr>
+            <w:tcBorders>
+              <w:top w:color="000000" w:space="0" w:sz="8" w:val="single"/>
+              <w:left w:color="000000" w:space="0" w:sz="8" w:val="single"/>
+              <w:bottom w:color="000000" w:space="0" w:sz="8" w:val="single"/>
+              <w:right w:color="000000" w:space="0" w:sz="8" w:val="single"/>
+            </w:tcBorders>
+            <w:tcMar>
+              <w:top w:w="100.0" w:type="dxa"/>
+              <w:left w:w="100.0" w:type="dxa"/>
+              <w:bottom w:w="100.0" w:type="dxa"/>
+              <w:right w:w="100.0" w:type="dxa"/>
+            </w:tcMar>
+            <w:vAlign w:val="top"/>
+          </w:tcPr>
+          <w:p>
+            <w:pPr>
+              <w:spacing w:line="276" w:lineRule="auto"/>
+              <w:ind w:left="0" w:firstLine="0"/>
+              <w:jc w:val="left"/>
+              <w:rPr/>
+            </w:pPr>
+            <w:r>
+              <w:rPr>
+                <w:rtl w:val="0"/>
+              </w:rPr>
+              <w:t xml:space="preserve">Report generated correctly</w:t>
+            </w:r>
+          </w:p>
+        </w:tc>
+        <w:tc>
+          <w:tcPr>
+            <w:tcBorders>
+              <w:top w:color="000000" w:space="0" w:sz="8" w:val="single"/>
+              <w:left w:color="000000" w:space="0" w:sz="8" w:val="single"/>
+              <w:bottom w:color="000000" w:space="0" w:sz="8" w:val="single"/>
+              <w:right w:color="000000" w:space="0" w:sz="8" w:val="single"/>
+            </w:tcBorders>
+            <w:tcMar>
+              <w:top w:w="100.0" w:type="dxa"/>
+              <w:left w:w="100.0" w:type="dxa"/>
+              <w:bottom w:w="100.0" w:type="dxa"/>
+              <w:right w:w="100.0" w:type="dxa"/>
+            </w:tcMar>
+            <w:vAlign w:val="top"/>
+          </w:tcPr>
+          <w:p>
+            <w:pPr>
+              <w:spacing w:line="276" w:lineRule="auto"/>
+              <w:ind w:left="0" w:firstLine="0"/>
+              <w:jc w:val="center"/>
+              <w:rPr/>
+            </w:pPr>
+            <w:r>
+              <w:rPr>
+                <w:rtl w:val="0"/>
+              </w:rPr>
+              <w:t xml:space="preserve">Pass</w:t>
+            </w:r>
+          </w:p>
+        </w:tc>
+        <w:tc>
+          <w:tcPr>
+            <w:tcBorders>
+              <w:top w:color="000000" w:space="0" w:sz="8" w:val="single"/>
+              <w:left w:color="000000" w:space="0" w:sz="8" w:val="single"/>
+              <w:bottom w:color="000000" w:space="0" w:sz="8" w:val="single"/>
+              <w:right w:color="000000" w:space="0" w:sz="8" w:val="single"/>
+            </w:tcBorders>
+            <w:tcMar>
+              <w:top w:w="100.0" w:type="dxa"/>
+              <w:left w:w="100.0" w:type="dxa"/>
+              <w:bottom w:w="100.0" w:type="dxa"/>
+              <w:right w:w="100.0" w:type="dxa"/>
+            </w:tcMar>
+            <w:vAlign w:val="top"/>
+          </w:tcPr>
+          <w:p>
+            <w:pPr>
+              <w:spacing w:line="276" w:lineRule="auto"/>
+              <w:ind w:left="0" w:firstLine="0"/>
+              <w:jc w:val="center"/>
+              <w:rPr/>
+            </w:pPr>
+            <w:r>
+              <w:rPr>
+                <w:rtl w:val="0"/>
+              </w:rPr>
+              <w:t xml:space="preserve">N/A</w:t>
+            </w:r>
+          </w:p>
+        </w:tc>
+      </w:tr>
+      <w:tr>
+        <w:trPr>
+          <w:cantSplit w:val="0"/>
+          <w:trHeight w:val="1325" w:hRule="atLeast"/>
+          <w:tblHeader w:val="0"/>
+        </w:trPr>
+        <w:tc>
+          <w:tcPr>
+            <w:tcBorders>
+              <w:top w:color="000000" w:space="0" w:sz="8" w:val="single"/>
+              <w:left w:color="000000" w:space="0" w:sz="8" w:val="single"/>
+              <w:bottom w:color="000000" w:space="0" w:sz="8" w:val="single"/>
+              <w:right w:color="000000" w:space="0" w:sz="8" w:val="single"/>
+            </w:tcBorders>
+            <w:tcMar>
+              <w:top w:w="100.0" w:type="dxa"/>
+              <w:left w:w="100.0" w:type="dxa"/>
+              <w:bottom w:w="100.0" w:type="dxa"/>
+              <w:right w:w="100.0" w:type="dxa"/>
+            </w:tcMar>
+            <w:vAlign w:val="top"/>
+          </w:tcPr>
+          <w:p>
+            <w:pPr>
+              <w:spacing w:line="276" w:lineRule="auto"/>
+              <w:ind w:left="0" w:firstLine="0"/>
+              <w:jc w:val="left"/>
+              <w:rPr/>
+            </w:pPr>
+            <w:r>
+              <w:rPr>
+                <w:rtl w:val="0"/>
+              </w:rPr>
+              <w:t xml:space="preserve">WF-004</w:t>
+            </w:r>
+          </w:p>
+        </w:tc>
+        <w:tc>
+          <w:tcPr>
+            <w:tcBorders>
+              <w:top w:color="000000" w:space="0" w:sz="8" w:val="single"/>
+              <w:left w:color="000000" w:space="0" w:sz="8" w:val="single"/>
+              <w:bottom w:color="000000" w:space="0" w:sz="8" w:val="single"/>
+              <w:right w:color="000000" w:space="0" w:sz="8" w:val="single"/>
+            </w:tcBorders>
+            <w:tcMar>
+              <w:top w:w="100.0" w:type="dxa"/>
+              <w:left w:w="100.0" w:type="dxa"/>
+              <w:bottom w:w="100.0" w:type="dxa"/>
+              <w:right w:w="100.0" w:type="dxa"/>
+            </w:tcMar>
+            <w:vAlign w:val="top"/>
+          </w:tcPr>
+          <w:p>
+            <w:pPr>
+              <w:spacing w:line="276" w:lineRule="auto"/>
+              <w:ind w:left="0" w:firstLine="0"/>
+              <w:jc w:val="left"/>
+              <w:rPr/>
+            </w:pPr>
+            <w:r>
+              <w:rPr>
+                <w:rtl w:val="0"/>
+              </w:rPr>
+              <w:t xml:space="preserve">Save data, restart the app, edit or delete a loaded transaction, and confirm persistence updates</w:t>
+            </w:r>
+          </w:p>
+        </w:tc>
+        <w:tc>
+          <w:tcPr>
+            <w:tcBorders>
+              <w:top w:color="000000" w:space="0" w:sz="8" w:val="single"/>
+              <w:left w:color="000000" w:space="0" w:sz="8" w:val="single"/>
+              <w:bottom w:color="000000" w:space="0" w:sz="8" w:val="single"/>
+              <w:right w:color="000000" w:space="0" w:sz="8" w:val="single"/>
+            </w:tcBorders>
+            <w:tcMar>
+              <w:top w:w="100.0" w:type="dxa"/>
+              <w:left w:w="100.0" w:type="dxa"/>
+              <w:bottom w:w="100.0" w:type="dxa"/>
+              <w:right w:w="100.0" w:type="dxa"/>
+            </w:tcMar>
+            <w:vAlign w:val="top"/>
+          </w:tcPr>
+          <w:p>
+            <w:pPr>
+              <w:spacing w:line="276" w:lineRule="auto"/>
+              <w:ind w:left="0" w:firstLine="0"/>
+              <w:jc w:val="left"/>
+              <w:rPr/>
+            </w:pPr>
+            <w:r>
+              <w:rPr>
+                <w:rtl w:val="0"/>
+              </w:rPr>
+              <w:t xml:space="preserve">Edited/deleted transaction updates are saved and reflected</w:t>
+            </w:r>
+          </w:p>
+        </w:tc>
+        <w:tc>
+          <w:tcPr>
+            <w:tcBorders>
+              <w:top w:color="000000" w:space="0" w:sz="8" w:val="single"/>
+              <w:left w:color="000000" w:space="0" w:sz="8" w:val="single"/>
+              <w:bottom w:color="000000" w:space="0" w:sz="8" w:val="single"/>
+              <w:right w:color="000000" w:space="0" w:sz="8" w:val="single"/>
+            </w:tcBorders>
+            <w:tcMar>
+              <w:top w:w="100.0" w:type="dxa"/>
+              <w:left w:w="100.0" w:type="dxa"/>
+              <w:bottom w:w="100.0" w:type="dxa"/>
+              <w:right w:w="100.0" w:type="dxa"/>
+            </w:tcMar>
+            <w:vAlign w:val="top"/>
+          </w:tcPr>
+          <w:p>
+            <w:pPr>
+              <w:spacing w:line="276" w:lineRule="auto"/>
+              <w:ind w:left="0" w:firstLine="0"/>
+              <w:jc w:val="left"/>
+              <w:rPr/>
+            </w:pPr>
+            <w:r>
+              <w:rPr>
+                <w:rtl w:val="0"/>
+              </w:rPr>
+              <w:t xml:space="preserve">Changes persisted correctly</w:t>
+            </w:r>
+          </w:p>
+        </w:tc>
+        <w:tc>
+          <w:tcPr>
+            <w:tcBorders>
+              <w:top w:color="000000" w:space="0" w:sz="8" w:val="single"/>
+              <w:left w:color="000000" w:space="0" w:sz="8" w:val="single"/>
+              <w:bottom w:color="000000" w:space="0" w:sz="8" w:val="single"/>
+              <w:right w:color="000000" w:space="0" w:sz="8" w:val="single"/>
+            </w:tcBorders>
+            <w:tcMar>
+              <w:top w:w="100.0" w:type="dxa"/>
+              <w:left w:w="100.0" w:type="dxa"/>
+              <w:bottom w:w="100.0" w:type="dxa"/>
+              <w:right w:w="100.0" w:type="dxa"/>
+            </w:tcMar>
+            <w:vAlign w:val="top"/>
+          </w:tcPr>
+          <w:p>
+            <w:pPr>
+              <w:spacing w:line="276" w:lineRule="auto"/>
+              <w:ind w:left="0" w:firstLine="0"/>
+              <w:jc w:val="center"/>
+              <w:rPr/>
+            </w:pPr>
+            <w:r>
+              <w:rPr>
+                <w:rtl w:val="0"/>
+              </w:rPr>
+              <w:t xml:space="preserve">Pass</w:t>
+            </w:r>
+          </w:p>
+        </w:tc>
+        <w:tc>
+          <w:tcPr>
+            <w:tcBorders>
+              <w:top w:color="000000" w:space="0" w:sz="8" w:val="single"/>
+              <w:left w:color="000000" w:space="0" w:sz="8" w:val="single"/>
+              <w:bottom w:color="000000" w:space="0" w:sz="8" w:val="single"/>
+              <w:right w:color="000000" w:space="0" w:sz="8" w:val="single"/>
+            </w:tcBorders>
+            <w:tcMar>
+              <w:top w:w="100.0" w:type="dxa"/>
+              <w:left w:w="100.0" w:type="dxa"/>
+              <w:bottom w:w="100.0" w:type="dxa"/>
+              <w:right w:w="100.0" w:type="dxa"/>
+            </w:tcMar>
+            <w:vAlign w:val="top"/>
+          </w:tcPr>
+          <w:p>
+            <w:pPr>
+              <w:spacing w:line="276" w:lineRule="auto"/>
+              <w:ind w:left="0" w:firstLine="0"/>
+              <w:jc w:val="center"/>
+              <w:rPr/>
+            </w:pPr>
+            <w:r>
+              <w:rPr>
+                <w:rtl w:val="0"/>
+              </w:rPr>
+              <w:t xml:space="preserve">N/A</w:t>
+            </w:r>
+          </w:p>
+        </w:tc>
+      </w:tr>
+      <w:tr>
+        <w:trPr>
+          <w:cantSplit w:val="0"/>
+          <w:trHeight w:val="1325" w:hRule="atLeast"/>
+          <w:tblHeader w:val="0"/>
+        </w:trPr>
+        <w:tc>
+          <w:tcPr>
+            <w:tcBorders>
+              <w:top w:color="000000" w:space="0" w:sz="8" w:val="single"/>
+              <w:left w:color="000000" w:space="0" w:sz="8" w:val="single"/>
+              <w:bottom w:color="000000" w:space="0" w:sz="8" w:val="single"/>
+              <w:right w:color="000000" w:space="0" w:sz="8" w:val="single"/>
+            </w:tcBorders>
+            <w:tcMar>
+              <w:top w:w="100.0" w:type="dxa"/>
+              <w:left w:w="100.0" w:type="dxa"/>
+              <w:bottom w:w="100.0" w:type="dxa"/>
+              <w:right w:w="100.0" w:type="dxa"/>
+            </w:tcMar>
+            <w:vAlign w:val="top"/>
+          </w:tcPr>
+          <w:p>
+            <w:pPr>
+              <w:spacing w:line="276" w:lineRule="auto"/>
+              <w:ind w:left="0" w:firstLine="0"/>
+              <w:jc w:val="left"/>
+              <w:rPr/>
+            </w:pPr>
+            <w:r>
+              <w:rPr>
+                <w:rtl w:val="0"/>
+              </w:rPr>
+              <w:t xml:space="preserve">WF-005</w:t>
+            </w:r>
+          </w:p>
+        </w:tc>
+        <w:tc>
+          <w:tcPr>
+            <w:tcBorders>
+              <w:top w:color="000000" w:space="0" w:sz="8" w:val="single"/>
+              <w:left w:color="000000" w:space="0" w:sz="8" w:val="single"/>
+              <w:bottom w:color="000000" w:space="0" w:sz="8" w:val="single"/>
+              <w:right w:color="000000" w:space="0" w:sz="8" w:val="single"/>
+            </w:tcBorders>
+            <w:tcMar>
+              <w:top w:w="100.0" w:type="dxa"/>
+              <w:left w:w="100.0" w:type="dxa"/>
+              <w:bottom w:w="100.0" w:type="dxa"/>
+              <w:right w:w="100.0" w:type="dxa"/>
+            </w:tcMar>
+            <w:vAlign w:val="top"/>
+          </w:tcPr>
+          <w:p>
+            <w:pPr>
+              <w:spacing w:line="276" w:lineRule="auto"/>
+              <w:ind w:left="0" w:firstLine="0"/>
+              <w:jc w:val="left"/>
+              <w:rPr/>
+            </w:pPr>
+            <w:r>
+              <w:rPr>
+                <w:rtl w:val="0"/>
+              </w:rPr>
+              <w:t xml:space="preserve">Save data, restart the app, and confirm budgets and alerts still function with loaded transactions</w:t>
+            </w:r>
+          </w:p>
+        </w:tc>
+        <w:tc>
+          <w:tcPr>
+            <w:tcBorders>
+              <w:top w:color="000000" w:space="0" w:sz="8" w:val="single"/>
+              <w:left w:color="000000" w:space="0" w:sz="8" w:val="single"/>
+              <w:bottom w:color="000000" w:space="0" w:sz="8" w:val="single"/>
+              <w:right w:color="000000" w:space="0" w:sz="8" w:val="single"/>
+            </w:tcBorders>
+            <w:tcMar>
+              <w:top w:w="100.0" w:type="dxa"/>
+              <w:left w:w="100.0" w:type="dxa"/>
+              <w:bottom w:w="100.0" w:type="dxa"/>
+              <w:right w:w="100.0" w:type="dxa"/>
+            </w:tcMar>
+            <w:vAlign w:val="top"/>
+          </w:tcPr>
+          <w:p>
+            <w:pPr>
+              <w:spacing w:line="276" w:lineRule="auto"/>
+              <w:ind w:left="0" w:firstLine="0"/>
+              <w:jc w:val="left"/>
+              <w:rPr/>
+            </w:pPr>
+            <w:r>
+              <w:rPr>
+                <w:rtl w:val="0"/>
+              </w:rPr>
+              <w:t xml:space="preserve">Budgets and alerts function correctly after restart</w:t>
+            </w:r>
+          </w:p>
+        </w:tc>
+        <w:tc>
+          <w:tcPr>
+            <w:tcBorders>
+              <w:top w:color="000000" w:space="0" w:sz="8" w:val="single"/>
+              <w:left w:color="000000" w:space="0" w:sz="8" w:val="single"/>
+              <w:bottom w:color="000000" w:space="0" w:sz="8" w:val="single"/>
+              <w:right w:color="000000" w:space="0" w:sz="8" w:val="single"/>
+            </w:tcBorders>
+            <w:tcMar>
+              <w:top w:w="100.0" w:type="dxa"/>
+              <w:left w:w="100.0" w:type="dxa"/>
+              <w:bottom w:w="100.0" w:type="dxa"/>
+              <w:right w:w="100.0" w:type="dxa"/>
+            </w:tcMar>
+            <w:vAlign w:val="top"/>
+          </w:tcPr>
+          <w:p>
+            <w:pPr>
+              <w:spacing w:line="276" w:lineRule="auto"/>
+              <w:ind w:left="0" w:firstLine="0"/>
+              <w:jc w:val="left"/>
+              <w:rPr/>
+            </w:pPr>
+            <w:r>
+              <w:rPr>
+                <w:rtl w:val="0"/>
+              </w:rPr>
+              <w:t xml:space="preserve">Budgets and alerts worked correctly</w:t>
+            </w:r>
+          </w:p>
+        </w:tc>
+        <w:tc>
+          <w:tcPr>
+            <w:tcBorders>
+              <w:top w:color="000000" w:space="0" w:sz="8" w:val="single"/>
+              <w:left w:color="000000" w:space="0" w:sz="8" w:val="single"/>
+              <w:bottom w:color="000000" w:space="0" w:sz="8" w:val="single"/>
+              <w:right w:color="000000" w:space="0" w:sz="8" w:val="single"/>
+            </w:tcBorders>
+            <w:tcMar>
+              <w:top w:w="100.0" w:type="dxa"/>
+              <w:left w:w="100.0" w:type="dxa"/>
+              <w:bottom w:w="100.0" w:type="dxa"/>
+              <w:right w:w="100.0" w:type="dxa"/>
+            </w:tcMar>
+            <w:vAlign w:val="top"/>
+          </w:tcPr>
+          <w:p>
+            <w:pPr>
+              <w:spacing w:line="276" w:lineRule="auto"/>
+              <w:ind w:left="0" w:firstLine="0"/>
+              <w:jc w:val="center"/>
+              <w:rPr/>
+            </w:pPr>
+            <w:r>
+              <w:rPr>
+                <w:rtl w:val="0"/>
+              </w:rPr>
+              <w:t xml:space="preserve">Pass</w:t>
+            </w:r>
+          </w:p>
+        </w:tc>
+        <w:tc>
+          <w:tcPr>
+            <w:tcBorders>
+              <w:top w:color="000000" w:space="0" w:sz="8" w:val="single"/>
+              <w:left w:color="000000" w:space="0" w:sz="8" w:val="single"/>
+              <w:bottom w:color="000000" w:space="0" w:sz="8" w:val="single"/>
+              <w:right w:color="000000" w:space="0" w:sz="8" w:val="single"/>
+            </w:tcBorders>
+            <w:tcMar>
+              <w:top w:w="100.0" w:type="dxa"/>
+              <w:left w:w="100.0" w:type="dxa"/>
+              <w:bottom w:w="100.0" w:type="dxa"/>
+              <w:right w:w="100.0" w:type="dxa"/>
+            </w:tcMar>
+            <w:vAlign w:val="top"/>
+          </w:tcPr>
+          <w:p>
+            <w:pPr>
+              <w:spacing w:line="276" w:lineRule="auto"/>
+              <w:ind w:left="0" w:firstLine="0"/>
+              <w:jc w:val="center"/>
+              <w:rPr/>
+            </w:pPr>
+            <w:r>
+              <w:rPr>
+                <w:rtl w:val="0"/>
+              </w:rPr>
+              <w:t xml:space="preserve">N/A</w:t>
+            </w:r>
+          </w:p>
+        </w:tc>
+      </w:tr>
+    </w:tbl>
+    <w:p>
+      <w:pPr>
+        <w:rPr/>
+      </w:pPr>
+      <w:r>
+        <w:rPr>
+          <w:rtl w:val="0"/>
+        </w:rPr>
       </w:r>
     </w:p>
     <w:p>
@@ -9242,6 +10488,753 @@
           <w:rtl w:val="0"/>
         </w:rPr>
         <w:t xml:space="preserve">To ensure robustness, we tested edge cases and error conditions across core features. This includes invalid user inputs, empty datasets, boundary dates, and unusual sequences of actions (e.g., deleting items used in reports, editing items after loading saved data). The purpose is to verify the system behaves predictably and provides clear user feedback rather than crashing or producing incorrect results. </w:t>
+      </w:r>
+    </w:p>
+    <w:p>
+      <w:pPr>
+        <w:rPr/>
+      </w:pPr>
+      <w:r>
+        <w:rPr>
+          <w:rtl w:val="0"/>
+        </w:rPr>
+      </w:r>
+    </w:p>
+    <w:p>
+      <w:pPr>
+        <w:rPr/>
+      </w:pPr>
+      <w:r>
+        <w:rPr>
+          <w:rtl w:val="0"/>
+        </w:rPr>
+      </w:r>
+    </w:p>
+    <w:tbl>
+      <w:tblPr>
+        <w:tblStyle w:val="Table8"/>
+        <w:tblW w:w="9450.0" w:type="dxa"/>
+        <w:jc w:val="left"/>
+        <w:tblBorders>
+          <w:top w:color="000000" w:space="0" w:sz="0" w:val="nil"/>
+          <w:left w:color="000000" w:space="0" w:sz="0" w:val="nil"/>
+          <w:bottom w:color="000000" w:space="0" w:sz="0" w:val="nil"/>
+          <w:right w:color="000000" w:space="0" w:sz="0" w:val="nil"/>
+          <w:insideH w:color="000000" w:space="0" w:sz="0" w:val="nil"/>
+          <w:insideV w:color="000000" w:space="0" w:sz="0" w:val="nil"/>
+        </w:tblBorders>
+        <w:tblLayout w:type="fixed"/>
+        <w:tblLook w:val="0600"/>
+      </w:tblPr>
+      <w:tblGrid>
+        <w:gridCol w:w="975"/>
+        <w:gridCol w:w="2295"/>
+        <w:gridCol w:w="2805"/>
+        <w:gridCol w:w="1770"/>
+        <w:gridCol w:w="1605"/>
+        <w:tblGridChange w:id="0">
+          <w:tblGrid>
+            <w:gridCol w:w="975"/>
+            <w:gridCol w:w="2295"/>
+            <w:gridCol w:w="2805"/>
+            <w:gridCol w:w="1770"/>
+            <w:gridCol w:w="1605"/>
+          </w:tblGrid>
+        </w:tblGridChange>
+      </w:tblGrid>
+      <w:tr>
+        <w:trPr>
+          <w:cantSplit w:val="0"/>
+          <w:trHeight w:val="1055" w:hRule="atLeast"/>
+          <w:tblHeader w:val="0"/>
+        </w:trPr>
+        <w:tc>
+          <w:tcPr>
+            <w:tcBorders>
+              <w:top w:color="000000" w:space="0" w:sz="8" w:val="single"/>
+              <w:left w:color="000000" w:space="0" w:sz="8" w:val="single"/>
+              <w:bottom w:color="000000" w:space="0" w:sz="8" w:val="single"/>
+              <w:right w:color="000000" w:space="0" w:sz="8" w:val="single"/>
+            </w:tcBorders>
+            <w:tcMar>
+              <w:top w:w="100.0" w:type="dxa"/>
+              <w:left w:w="100.0" w:type="dxa"/>
+              <w:bottom w:w="100.0" w:type="dxa"/>
+              <w:right w:w="100.0" w:type="dxa"/>
+            </w:tcMar>
+            <w:vAlign w:val="top"/>
+          </w:tcPr>
+          <w:p>
+            <w:pPr>
+              <w:spacing w:line="276" w:lineRule="auto"/>
+              <w:ind w:left="0" w:firstLine="0"/>
+              <w:jc w:val="center"/>
+              <w:rPr/>
+            </w:pPr>
+            <w:r>
+              <w:rPr>
+                <w:b w:val="1"/>
+                <w:bCs w:val="1"/>
+                <w:rtl w:val="0"/>
+              </w:rPr>
+              <w:t xml:space="preserve">Edge Case ID</w:t>
+            </w:r>
+            <w:r>
+              <w:rPr>
+                <w:rtl w:val="0"/>
+              </w:rPr>
+            </w:r>
+          </w:p>
+        </w:tc>
+        <w:tc>
+          <w:tcPr>
+            <w:tcBorders>
+              <w:top w:color="000000" w:space="0" w:sz="8" w:val="single"/>
+              <w:left w:color="000000" w:space="0" w:sz="8" w:val="single"/>
+              <w:bottom w:color="000000" w:space="0" w:sz="8" w:val="single"/>
+              <w:right w:color="000000" w:space="0" w:sz="8" w:val="single"/>
+            </w:tcBorders>
+            <w:tcMar>
+              <w:top w:w="100.0" w:type="dxa"/>
+              <w:left w:w="100.0" w:type="dxa"/>
+              <w:bottom w:w="100.0" w:type="dxa"/>
+              <w:right w:w="100.0" w:type="dxa"/>
+            </w:tcMar>
+            <w:vAlign w:val="top"/>
+          </w:tcPr>
+          <w:p>
+            <w:pPr>
+              <w:spacing w:line="276" w:lineRule="auto"/>
+              <w:ind w:left="0" w:firstLine="0"/>
+              <w:jc w:val="center"/>
+              <w:rPr/>
+            </w:pPr>
+            <w:r>
+              <w:rPr>
+                <w:b w:val="1"/>
+                <w:bCs w:val="1"/>
+                <w:rtl w:val="0"/>
+              </w:rPr>
+              <w:t xml:space="preserve">Scenario</w:t>
+            </w:r>
+            <w:r>
+              <w:rPr>
+                <w:rtl w:val="0"/>
+              </w:rPr>
+            </w:r>
+          </w:p>
+        </w:tc>
+        <w:tc>
+          <w:tcPr>
+            <w:tcBorders>
+              <w:top w:color="000000" w:space="0" w:sz="8" w:val="single"/>
+              <w:left w:color="000000" w:space="0" w:sz="8" w:val="single"/>
+              <w:bottom w:color="000000" w:space="0" w:sz="8" w:val="single"/>
+              <w:right w:color="000000" w:space="0" w:sz="8" w:val="single"/>
+            </w:tcBorders>
+            <w:tcMar>
+              <w:top w:w="100.0" w:type="dxa"/>
+              <w:left w:w="100.0" w:type="dxa"/>
+              <w:bottom w:w="100.0" w:type="dxa"/>
+              <w:right w:w="100.0" w:type="dxa"/>
+            </w:tcMar>
+            <w:vAlign w:val="top"/>
+          </w:tcPr>
+          <w:p>
+            <w:pPr>
+              <w:spacing w:line="276" w:lineRule="auto"/>
+              <w:ind w:left="0" w:firstLine="0"/>
+              <w:jc w:val="center"/>
+              <w:rPr/>
+            </w:pPr>
+            <w:r>
+              <w:rPr>
+                <w:b w:val="1"/>
+                <w:bCs w:val="1"/>
+                <w:rtl w:val="0"/>
+              </w:rPr>
+              <w:t xml:space="preserve">Expected Result</w:t>
+            </w:r>
+            <w:r>
+              <w:rPr>
+                <w:rtl w:val="0"/>
+              </w:rPr>
+            </w:r>
+          </w:p>
+        </w:tc>
+        <w:tc>
+          <w:tcPr>
+            <w:tcBorders>
+              <w:top w:color="000000" w:space="0" w:sz="8" w:val="single"/>
+              <w:left w:color="000000" w:space="0" w:sz="8" w:val="single"/>
+              <w:bottom w:color="000000" w:space="0" w:sz="8" w:val="single"/>
+              <w:right w:color="000000" w:space="0" w:sz="8" w:val="single"/>
+            </w:tcBorders>
+            <w:tcMar>
+              <w:top w:w="100.0" w:type="dxa"/>
+              <w:left w:w="100.0" w:type="dxa"/>
+              <w:bottom w:w="100.0" w:type="dxa"/>
+              <w:right w:w="100.0" w:type="dxa"/>
+            </w:tcMar>
+            <w:vAlign w:val="top"/>
+          </w:tcPr>
+          <w:p>
+            <w:pPr>
+              <w:spacing w:line="276" w:lineRule="auto"/>
+              <w:ind w:left="0" w:firstLine="0"/>
+              <w:jc w:val="center"/>
+              <w:rPr/>
+            </w:pPr>
+            <w:r>
+              <w:rPr>
+                <w:b w:val="1"/>
+                <w:bCs w:val="1"/>
+                <w:rtl w:val="0"/>
+              </w:rPr>
+              <w:t xml:space="preserve">Actual Result</w:t>
+            </w:r>
+            <w:r>
+              <w:rPr>
+                <w:rtl w:val="0"/>
+              </w:rPr>
+            </w:r>
+          </w:p>
+        </w:tc>
+        <w:tc>
+          <w:tcPr>
+            <w:tcBorders>
+              <w:top w:color="000000" w:space="0" w:sz="8" w:val="single"/>
+              <w:left w:color="000000" w:space="0" w:sz="8" w:val="single"/>
+              <w:bottom w:color="000000" w:space="0" w:sz="8" w:val="single"/>
+              <w:right w:color="000000" w:space="0" w:sz="8" w:val="single"/>
+            </w:tcBorders>
+            <w:tcMar>
+              <w:top w:w="100.0" w:type="dxa"/>
+              <w:left w:w="100.0" w:type="dxa"/>
+              <w:bottom w:w="100.0" w:type="dxa"/>
+              <w:right w:w="100.0" w:type="dxa"/>
+            </w:tcMar>
+            <w:vAlign w:val="top"/>
+          </w:tcPr>
+          <w:p>
+            <w:pPr>
+              <w:spacing w:line="276" w:lineRule="auto"/>
+              <w:ind w:left="0" w:firstLine="0"/>
+              <w:jc w:val="center"/>
+              <w:rPr/>
+            </w:pPr>
+            <w:r>
+              <w:rPr>
+                <w:b w:val="1"/>
+                <w:bCs w:val="1"/>
+                <w:rtl w:val="0"/>
+              </w:rPr>
+              <w:t xml:space="preserve">Status</w:t>
+            </w:r>
+            <w:r>
+              <w:rPr>
+                <w:rtl w:val="0"/>
+              </w:rPr>
+            </w:r>
+          </w:p>
+        </w:tc>
+      </w:tr>
+      <w:tr>
+        <w:trPr>
+          <w:cantSplit w:val="0"/>
+          <w:trHeight w:val="1055" w:hRule="atLeast"/>
+          <w:tblHeader w:val="0"/>
+        </w:trPr>
+        <w:tc>
+          <w:tcPr>
+            <w:tcBorders>
+              <w:top w:color="000000" w:space="0" w:sz="8" w:val="single"/>
+              <w:left w:color="000000" w:space="0" w:sz="8" w:val="single"/>
+              <w:bottom w:color="000000" w:space="0" w:sz="8" w:val="single"/>
+              <w:right w:color="000000" w:space="0" w:sz="8" w:val="single"/>
+            </w:tcBorders>
+            <w:tcMar>
+              <w:top w:w="100.0" w:type="dxa"/>
+              <w:left w:w="100.0" w:type="dxa"/>
+              <w:bottom w:w="100.0" w:type="dxa"/>
+              <w:right w:w="100.0" w:type="dxa"/>
+            </w:tcMar>
+            <w:vAlign w:val="top"/>
+          </w:tcPr>
+          <w:p>
+            <w:pPr>
+              <w:spacing w:line="276" w:lineRule="auto"/>
+              <w:ind w:left="0" w:firstLine="0"/>
+              <w:jc w:val="left"/>
+              <w:rPr/>
+            </w:pPr>
+            <w:r>
+              <w:rPr>
+                <w:rtl w:val="0"/>
+              </w:rPr>
+              <w:t xml:space="preserve">EC-001</w:t>
+            </w:r>
+          </w:p>
+        </w:tc>
+        <w:tc>
+          <w:tcPr>
+            <w:tcBorders>
+              <w:top w:color="000000" w:space="0" w:sz="8" w:val="single"/>
+              <w:left w:color="000000" w:space="0" w:sz="8" w:val="single"/>
+              <w:bottom w:color="000000" w:space="0" w:sz="8" w:val="single"/>
+              <w:right w:color="000000" w:space="0" w:sz="8" w:val="single"/>
+            </w:tcBorders>
+            <w:tcMar>
+              <w:top w:w="100.0" w:type="dxa"/>
+              <w:left w:w="100.0" w:type="dxa"/>
+              <w:bottom w:w="100.0" w:type="dxa"/>
+              <w:right w:w="100.0" w:type="dxa"/>
+            </w:tcMar>
+            <w:vAlign w:val="top"/>
+          </w:tcPr>
+          <w:p>
+            <w:pPr>
+              <w:spacing w:line="276" w:lineRule="auto"/>
+              <w:ind w:left="0" w:firstLine="0"/>
+              <w:jc w:val="left"/>
+              <w:rPr/>
+            </w:pPr>
+            <w:r>
+              <w:rPr>
+                <w:rtl w:val="0"/>
+              </w:rPr>
+              <w:t xml:space="preserve">Enter invalid transaction amounts, including negative numbers or non-numeric values</w:t>
+            </w:r>
+          </w:p>
+        </w:tc>
+        <w:tc>
+          <w:tcPr>
+            <w:tcBorders>
+              <w:top w:color="000000" w:space="0" w:sz="8" w:val="single"/>
+              <w:left w:color="000000" w:space="0" w:sz="8" w:val="single"/>
+              <w:bottom w:color="000000" w:space="0" w:sz="8" w:val="single"/>
+              <w:right w:color="000000" w:space="0" w:sz="8" w:val="single"/>
+            </w:tcBorders>
+            <w:tcMar>
+              <w:top w:w="100.0" w:type="dxa"/>
+              <w:left w:w="100.0" w:type="dxa"/>
+              <w:bottom w:w="100.0" w:type="dxa"/>
+              <w:right w:w="100.0" w:type="dxa"/>
+            </w:tcMar>
+            <w:vAlign w:val="top"/>
+          </w:tcPr>
+          <w:p>
+            <w:pPr>
+              <w:spacing w:line="276" w:lineRule="auto"/>
+              <w:ind w:left="0" w:firstLine="0"/>
+              <w:jc w:val="left"/>
+              <w:rPr/>
+            </w:pPr>
+            <w:r>
+              <w:rPr>
+                <w:rtl w:val="0"/>
+              </w:rPr>
+              <w:t xml:space="preserve">Transaction rejected with an error message explaining the input is invalid</w:t>
+            </w:r>
+          </w:p>
+        </w:tc>
+        <w:tc>
+          <w:tcPr>
+            <w:tcBorders>
+              <w:top w:color="000000" w:space="0" w:sz="8" w:val="single"/>
+              <w:left w:color="000000" w:space="0" w:sz="8" w:val="single"/>
+              <w:bottom w:color="000000" w:space="0" w:sz="8" w:val="single"/>
+              <w:right w:color="000000" w:space="0" w:sz="8" w:val="single"/>
+            </w:tcBorders>
+            <w:tcMar>
+              <w:top w:w="100.0" w:type="dxa"/>
+              <w:left w:w="100.0" w:type="dxa"/>
+              <w:bottom w:w="100.0" w:type="dxa"/>
+              <w:right w:w="100.0" w:type="dxa"/>
+            </w:tcMar>
+            <w:vAlign w:val="top"/>
+          </w:tcPr>
+          <w:p>
+            <w:pPr>
+              <w:spacing w:line="276" w:lineRule="auto"/>
+              <w:ind w:left="0" w:firstLine="0"/>
+              <w:jc w:val="left"/>
+              <w:rPr/>
+            </w:pPr>
+            <w:r>
+              <w:rPr>
+                <w:rtl w:val="0"/>
+              </w:rPr>
+              <w:t xml:space="preserve">Error message displayed</w:t>
+            </w:r>
+          </w:p>
+        </w:tc>
+        <w:tc>
+          <w:tcPr>
+            <w:tcBorders>
+              <w:top w:color="000000" w:space="0" w:sz="8" w:val="single"/>
+              <w:left w:color="000000" w:space="0" w:sz="8" w:val="single"/>
+              <w:bottom w:color="000000" w:space="0" w:sz="8" w:val="single"/>
+              <w:right w:color="000000" w:space="0" w:sz="8" w:val="single"/>
+            </w:tcBorders>
+            <w:tcMar>
+              <w:top w:w="100.0" w:type="dxa"/>
+              <w:left w:w="100.0" w:type="dxa"/>
+              <w:bottom w:w="100.0" w:type="dxa"/>
+              <w:right w:w="100.0" w:type="dxa"/>
+            </w:tcMar>
+            <w:vAlign w:val="top"/>
+          </w:tcPr>
+          <w:p>
+            <w:pPr>
+              <w:spacing w:line="276" w:lineRule="auto"/>
+              <w:ind w:left="0" w:firstLine="0"/>
+              <w:jc w:val="center"/>
+              <w:rPr/>
+            </w:pPr>
+            <w:r>
+              <w:rPr>
+                <w:rtl w:val="0"/>
+              </w:rPr>
+              <w:t xml:space="preserve">Pass</w:t>
+            </w:r>
+          </w:p>
+        </w:tc>
+      </w:tr>
+      <w:tr>
+        <w:trPr>
+          <w:cantSplit w:val="0"/>
+          <w:trHeight w:val="1055" w:hRule="atLeast"/>
+          <w:tblHeader w:val="0"/>
+        </w:trPr>
+        <w:tc>
+          <w:tcPr>
+            <w:tcBorders>
+              <w:top w:color="000000" w:space="0" w:sz="8" w:val="single"/>
+              <w:left w:color="000000" w:space="0" w:sz="8" w:val="single"/>
+              <w:bottom w:color="000000" w:space="0" w:sz="8" w:val="single"/>
+              <w:right w:color="000000" w:space="0" w:sz="8" w:val="single"/>
+            </w:tcBorders>
+            <w:tcMar>
+              <w:top w:w="100.0" w:type="dxa"/>
+              <w:left w:w="100.0" w:type="dxa"/>
+              <w:bottom w:w="100.0" w:type="dxa"/>
+              <w:right w:w="100.0" w:type="dxa"/>
+            </w:tcMar>
+            <w:vAlign w:val="top"/>
+          </w:tcPr>
+          <w:p>
+            <w:pPr>
+              <w:spacing w:line="276" w:lineRule="auto"/>
+              <w:ind w:left="0" w:firstLine="0"/>
+              <w:jc w:val="left"/>
+              <w:rPr/>
+            </w:pPr>
+            <w:r>
+              <w:rPr>
+                <w:rtl w:val="0"/>
+              </w:rPr>
+              <w:t xml:space="preserve">EC-002</w:t>
+            </w:r>
+          </w:p>
+        </w:tc>
+        <w:tc>
+          <w:tcPr>
+            <w:tcBorders>
+              <w:top w:color="000000" w:space="0" w:sz="8" w:val="single"/>
+              <w:left w:color="000000" w:space="0" w:sz="8" w:val="single"/>
+              <w:bottom w:color="000000" w:space="0" w:sz="8" w:val="single"/>
+              <w:right w:color="000000" w:space="0" w:sz="8" w:val="single"/>
+            </w:tcBorders>
+            <w:tcMar>
+              <w:top w:w="100.0" w:type="dxa"/>
+              <w:left w:w="100.0" w:type="dxa"/>
+              <w:bottom w:w="100.0" w:type="dxa"/>
+              <w:right w:w="100.0" w:type="dxa"/>
+            </w:tcMar>
+            <w:vAlign w:val="top"/>
+          </w:tcPr>
+          <w:p>
+            <w:pPr>
+              <w:spacing w:line="276" w:lineRule="auto"/>
+              <w:ind w:left="0" w:firstLine="0"/>
+              <w:jc w:val="left"/>
+              <w:rPr/>
+            </w:pPr>
+            <w:r>
+              <w:rPr>
+                <w:rtl w:val="0"/>
+              </w:rPr>
+              <w:t xml:space="preserve">Generate a report using a date range where the start date is after the end date</w:t>
+            </w:r>
+          </w:p>
+        </w:tc>
+        <w:tc>
+          <w:tcPr>
+            <w:tcBorders>
+              <w:top w:color="000000" w:space="0" w:sz="8" w:val="single"/>
+              <w:left w:color="000000" w:space="0" w:sz="8" w:val="single"/>
+              <w:bottom w:color="000000" w:space="0" w:sz="8" w:val="single"/>
+              <w:right w:color="000000" w:space="0" w:sz="8" w:val="single"/>
+            </w:tcBorders>
+            <w:tcMar>
+              <w:top w:w="100.0" w:type="dxa"/>
+              <w:left w:w="100.0" w:type="dxa"/>
+              <w:bottom w:w="100.0" w:type="dxa"/>
+              <w:right w:w="100.0" w:type="dxa"/>
+            </w:tcMar>
+            <w:vAlign w:val="top"/>
+          </w:tcPr>
+          <w:p>
+            <w:pPr>
+              <w:spacing w:line="276" w:lineRule="auto"/>
+              <w:ind w:left="0" w:firstLine="0"/>
+              <w:jc w:val="left"/>
+              <w:rPr/>
+            </w:pPr>
+            <w:r>
+              <w:rPr>
+                <w:rtl w:val="0"/>
+              </w:rPr>
+              <w:t xml:space="preserve">Validation message displayed indicating the date range is incorrect</w:t>
+            </w:r>
+          </w:p>
+        </w:tc>
+        <w:tc>
+          <w:tcPr>
+            <w:tcBorders>
+              <w:top w:color="000000" w:space="0" w:sz="8" w:val="single"/>
+              <w:left w:color="000000" w:space="0" w:sz="8" w:val="single"/>
+              <w:bottom w:color="000000" w:space="0" w:sz="8" w:val="single"/>
+              <w:right w:color="000000" w:space="0" w:sz="8" w:val="single"/>
+            </w:tcBorders>
+            <w:tcMar>
+              <w:top w:w="100.0" w:type="dxa"/>
+              <w:left w:w="100.0" w:type="dxa"/>
+              <w:bottom w:w="100.0" w:type="dxa"/>
+              <w:right w:w="100.0" w:type="dxa"/>
+            </w:tcMar>
+            <w:vAlign w:val="top"/>
+          </w:tcPr>
+          <w:p>
+            <w:pPr>
+              <w:spacing w:line="276" w:lineRule="auto"/>
+              <w:ind w:left="0" w:firstLine="0"/>
+              <w:jc w:val="left"/>
+              <w:rPr/>
+            </w:pPr>
+            <w:r>
+              <w:rPr>
+                <w:rtl w:val="0"/>
+              </w:rPr>
+              <w:t xml:space="preserve">Correct validation message shown</w:t>
+            </w:r>
+          </w:p>
+        </w:tc>
+        <w:tc>
+          <w:tcPr>
+            <w:tcBorders>
+              <w:top w:color="000000" w:space="0" w:sz="8" w:val="single"/>
+              <w:left w:color="000000" w:space="0" w:sz="8" w:val="single"/>
+              <w:bottom w:color="000000" w:space="0" w:sz="8" w:val="single"/>
+              <w:right w:color="000000" w:space="0" w:sz="8" w:val="single"/>
+            </w:tcBorders>
+            <w:tcMar>
+              <w:top w:w="100.0" w:type="dxa"/>
+              <w:left w:w="100.0" w:type="dxa"/>
+              <w:bottom w:w="100.0" w:type="dxa"/>
+              <w:right w:w="100.0" w:type="dxa"/>
+            </w:tcMar>
+            <w:vAlign w:val="top"/>
+          </w:tcPr>
+          <w:p>
+            <w:pPr>
+              <w:spacing w:line="276" w:lineRule="auto"/>
+              <w:ind w:left="0" w:firstLine="0"/>
+              <w:jc w:val="center"/>
+              <w:rPr/>
+            </w:pPr>
+            <w:r>
+              <w:rPr>
+                <w:rtl w:val="0"/>
+              </w:rPr>
+              <w:t xml:space="preserve">Pass</w:t>
+            </w:r>
+          </w:p>
+        </w:tc>
+      </w:tr>
+      <w:tr>
+        <w:trPr>
+          <w:cantSplit w:val="0"/>
+          <w:trHeight w:val="1055" w:hRule="atLeast"/>
+          <w:tblHeader w:val="0"/>
+        </w:trPr>
+        <w:tc>
+          <w:tcPr>
+            <w:tcBorders>
+              <w:top w:color="000000" w:space="0" w:sz="8" w:val="single"/>
+              <w:left w:color="000000" w:space="0" w:sz="8" w:val="single"/>
+              <w:bottom w:color="000000" w:space="0" w:sz="8" w:val="single"/>
+              <w:right w:color="000000" w:space="0" w:sz="8" w:val="single"/>
+            </w:tcBorders>
+            <w:tcMar>
+              <w:top w:w="100.0" w:type="dxa"/>
+              <w:left w:w="100.0" w:type="dxa"/>
+              <w:bottom w:w="100.0" w:type="dxa"/>
+              <w:right w:w="100.0" w:type="dxa"/>
+            </w:tcMar>
+            <w:vAlign w:val="top"/>
+          </w:tcPr>
+          <w:p>
+            <w:pPr>
+              <w:spacing w:line="276" w:lineRule="auto"/>
+              <w:ind w:left="0" w:firstLine="0"/>
+              <w:jc w:val="left"/>
+              <w:rPr/>
+            </w:pPr>
+            <w:r>
+              <w:rPr>
+                <w:rtl w:val="0"/>
+              </w:rPr>
+              <w:t xml:space="preserve">EC-003</w:t>
+            </w:r>
+          </w:p>
+        </w:tc>
+        <w:tc>
+          <w:tcPr>
+            <w:tcBorders>
+              <w:top w:color="000000" w:space="0" w:sz="8" w:val="single"/>
+              <w:left w:color="000000" w:space="0" w:sz="8" w:val="single"/>
+              <w:bottom w:color="000000" w:space="0" w:sz="8" w:val="single"/>
+              <w:right w:color="000000" w:space="0" w:sz="8" w:val="single"/>
+            </w:tcBorders>
+            <w:tcMar>
+              <w:top w:w="100.0" w:type="dxa"/>
+              <w:left w:w="100.0" w:type="dxa"/>
+              <w:bottom w:w="100.0" w:type="dxa"/>
+              <w:right w:w="100.0" w:type="dxa"/>
+            </w:tcMar>
+            <w:vAlign w:val="top"/>
+          </w:tcPr>
+          <w:p>
+            <w:pPr>
+              <w:spacing w:line="276" w:lineRule="auto"/>
+              <w:ind w:left="0" w:firstLine="0"/>
+              <w:jc w:val="left"/>
+              <w:rPr/>
+            </w:pPr>
+            <w:r>
+              <w:rPr>
+                <w:rtl w:val="0"/>
+              </w:rPr>
+              <w:t xml:space="preserve">Generate a report for a period that has no transactions recorded</w:t>
+            </w:r>
+          </w:p>
+        </w:tc>
+        <w:tc>
+          <w:tcPr>
+            <w:tcBorders>
+              <w:top w:color="000000" w:space="0" w:sz="8" w:val="single"/>
+              <w:left w:color="000000" w:space="0" w:sz="8" w:val="single"/>
+              <w:bottom w:color="000000" w:space="0" w:sz="8" w:val="single"/>
+              <w:right w:color="000000" w:space="0" w:sz="8" w:val="single"/>
+            </w:tcBorders>
+            <w:tcMar>
+              <w:top w:w="100.0" w:type="dxa"/>
+              <w:left w:w="100.0" w:type="dxa"/>
+              <w:bottom w:w="100.0" w:type="dxa"/>
+              <w:right w:w="100.0" w:type="dxa"/>
+            </w:tcMar>
+            <w:vAlign w:val="top"/>
+          </w:tcPr>
+          <w:p>
+            <w:pPr>
+              <w:spacing w:line="276" w:lineRule="auto"/>
+              <w:ind w:left="0" w:firstLine="0"/>
+              <w:jc w:val="left"/>
+              <w:rPr/>
+            </w:pPr>
+            <w:r>
+              <w:rPr>
+                <w:rtl w:val="0"/>
+              </w:rPr>
+              <w:t xml:space="preserve">Report shows zero values for income, expenses, and balance</w:t>
+            </w:r>
+          </w:p>
+        </w:tc>
+        <w:tc>
+          <w:tcPr>
+            <w:tcBorders>
+              <w:top w:color="000000" w:space="0" w:sz="8" w:val="single"/>
+              <w:left w:color="000000" w:space="0" w:sz="8" w:val="single"/>
+              <w:bottom w:color="000000" w:space="0" w:sz="8" w:val="single"/>
+              <w:right w:color="000000" w:space="0" w:sz="8" w:val="single"/>
+            </w:tcBorders>
+            <w:tcMar>
+              <w:top w:w="100.0" w:type="dxa"/>
+              <w:left w:w="100.0" w:type="dxa"/>
+              <w:bottom w:w="100.0" w:type="dxa"/>
+              <w:right w:w="100.0" w:type="dxa"/>
+            </w:tcMar>
+            <w:vAlign w:val="top"/>
+          </w:tcPr>
+          <w:p>
+            <w:pPr>
+              <w:spacing w:line="276" w:lineRule="auto"/>
+              <w:ind w:left="0" w:firstLine="0"/>
+              <w:jc w:val="left"/>
+              <w:rPr/>
+            </w:pPr>
+            <w:r>
+              <w:rPr>
+                <w:rtl w:val="0"/>
+              </w:rPr>
+              <w:t xml:space="preserve">Report displayed correctly</w:t>
+            </w:r>
+          </w:p>
+        </w:tc>
+        <w:tc>
+          <w:tcPr>
+            <w:tcBorders>
+              <w:top w:color="000000" w:space="0" w:sz="8" w:val="single"/>
+              <w:left w:color="000000" w:space="0" w:sz="8" w:val="single"/>
+              <w:bottom w:color="000000" w:space="0" w:sz="8" w:val="single"/>
+              <w:right w:color="000000" w:space="0" w:sz="8" w:val="single"/>
+            </w:tcBorders>
+            <w:tcMar>
+              <w:top w:w="100.0" w:type="dxa"/>
+              <w:left w:w="100.0" w:type="dxa"/>
+              <w:bottom w:w="100.0" w:type="dxa"/>
+              <w:right w:w="100.0" w:type="dxa"/>
+            </w:tcMar>
+            <w:vAlign w:val="top"/>
+          </w:tcPr>
+          <w:p>
+            <w:pPr>
+              <w:spacing w:line="276" w:lineRule="auto"/>
+              <w:ind w:left="0" w:firstLine="0"/>
+              <w:jc w:val="center"/>
+              <w:rPr/>
+            </w:pPr>
+            <w:r>
+              <w:rPr>
+                <w:rtl w:val="0"/>
+              </w:rPr>
+              <w:t xml:space="preserve">Pass</w:t>
+            </w:r>
+          </w:p>
+        </w:tc>
+      </w:tr>
+    </w:tbl>
+    <w:p>
+      <w:pPr>
+        <w:ind w:left="0" w:firstLine="0"/>
+        <w:rPr/>
+      </w:pPr>
+      <w:r>
+        <w:rPr>
+          <w:rtl w:val="0"/>
+        </w:rPr>
       </w:r>
     </w:p>
     <w:p>
@@ -9709,7 +11702,7 @@
     </w:p>
     <w:tbl>
       <w:tblPr>
-        <w:tblStyle w:val="Table7"/>
+        <w:tblStyle w:val="Table9"/>
         <w:tblW w:w="9019.0" w:type="dxa"/>
         <w:jc w:val="left"/>
         <w:tblBorders>
@@ -10470,7 +12463,7 @@
     </w:p>
     <w:tbl>
       <w:tblPr>
-        <w:tblStyle w:val="Table8"/>
+        <w:tblStyle w:val="Table10"/>
         <w:tblW w:w="9019.0" w:type="dxa"/>
         <w:jc w:val="left"/>
         <w:tblBorders>
@@ -14128,6 +16121,22 @@
   </w:style>
   <w:style w:type="table" w:styleId="Table7">
     <w:basedOn w:val="TableNormal"/>
+    <w:tblPr>
+      <w:tblStyleRowBandSize w:val="1"/>
+      <w:tblStyleColBandSize w:val="1"/>
+      <w:tblCellMar/>
+    </w:tblPr>
+  </w:style>
+  <w:style w:type="table" w:styleId="Table8">
+    <w:basedOn w:val="TableNormal"/>
+    <w:tblPr>
+      <w:tblStyleRowBandSize w:val="1"/>
+      <w:tblStyleColBandSize w:val="1"/>
+      <w:tblCellMar/>
+    </w:tblPr>
+  </w:style>
+  <w:style w:type="table" w:styleId="Table9">
+    <w:basedOn w:val="TableNormal"/>
     <w:pPr>
       <w:spacing w:line="240" w:lineRule="auto"/>
     </w:pPr>
@@ -14176,7 +16185,7 @@
       </w:tcPr>
     </w:tblStylePr>
   </w:style>
-  <w:style w:type="table" w:styleId="Table8">
+  <w:style w:type="table" w:styleId="Table10">
     <w:basedOn w:val="TableNormal"/>
     <w:pPr>
       <w:spacing w:line="240" w:lineRule="auto"/>

</xml_diff>

<commit_message>
Add Paragraphs for testing and expand on Defects Found
</commit_message>
<xml_diff>
--- a/docs/deliverables/3.2/Deliverable 3-2 Implementation - Submission.docx
+++ b/docs/deliverables/3.2/Deliverable 3-2 Implementation - Submission.docx
@@ -364,7 +364,7 @@
     </w:p>
     <w:sdt>
       <w:sdtPr>
-        <w:id w:val="1797605073"/>
+        <w:id w:val="176024029"/>
         <w:docPartObj>
           <w:docPartGallery w:val="Table of Contents"/>
           <w:docPartUnique w:val="1"/>
@@ -6179,7 +6179,7 @@
     <w:sdt>
       <w:sdtPr>
         <w:lock w:val="contentLocked"/>
-        <w:id w:val="-501352935"/>
+        <w:id w:val="851259919"/>
         <w:tag w:val="goog_rdk_0"/>
       </w:sdtPr>
       <w:sdtContent>
@@ -6857,7 +6857,7 @@
     <w:sdt>
       <w:sdtPr>
         <w:lock w:val="contentLocked"/>
-        <w:id w:val="-1363053295"/>
+        <w:id w:val="-910223099"/>
         <w:tag w:val="goog_rdk_1"/>
       </w:sdtPr>
       <w:sdtContent>
@@ -8631,7 +8631,7 @@
       </w:pPr>
       <w:sdt>
         <w:sdtPr>
-          <w:id w:val="1591369882"/>
+          <w:id w:val="849475511"/>
           <w:tag w:val="goog_rdk_2"/>
         </w:sdtPr>
         <w:sdtContent>
@@ -8796,7 +8796,7 @@
       </w:pPr>
       <w:sdt>
         <w:sdtPr>
-          <w:id w:val="1301401885"/>
+          <w:id w:val="212992288"/>
           <w:tag w:val="goog_rdk_3"/>
         </w:sdtPr>
         <w:sdtContent>
@@ -8805,7 +8805,7 @@
               <w:rFonts w:ascii="Cardo" w:cs="Cardo" w:eastAsia="Cardo" w:hAnsi="Cardo"/>
               <w:rtl w:val="0"/>
             </w:rPr>
-            <w:t xml:space="preserve">ystem and integration testing validates that the full application works end-to-end and that features interact correctly, especially after persistence and refactoring changes. These tests focus on workflow completion, data consistency, and communication between modules (Transactions ↔ Budgets/Alerts ↔ Reports) as required by the 3.2</w:t>
+            <w:t xml:space="preserve">System and integration testing validates that the full application works end-to-end and that features interact correctly, especially after persistence and refactoring changes. These tests focus on workflow completion, data consistency, and communication between modules (Transactions ↔ Budgets/Alerts ↔ Reports) as required by the 3.2 Deliverable.</w:t>
           </w:r>
         </w:sdtContent>
       </w:sdt>
@@ -8854,7 +8854,7 @@
       </w:pPr>
       <w:sdt>
         <w:sdtPr>
-          <w:id w:val="-840289798"/>
+          <w:id w:val="-1369967142"/>
           <w:tag w:val="goog_rdk_4"/>
         </w:sdtPr>
         <w:sdtContent>
@@ -8882,7 +8882,7 @@
       </w:pPr>
       <w:sdt>
         <w:sdtPr>
-          <w:id w:val="-2061409508"/>
+          <w:id w:val="-1637639360"/>
           <w:tag w:val="goog_rdk_5"/>
         </w:sdtPr>
         <w:sdtContent>
@@ -8910,7 +8910,7 @@
       </w:pPr>
       <w:sdt>
         <w:sdtPr>
-          <w:id w:val="860277927"/>
+          <w:id w:val="-359355751"/>
           <w:tag w:val="goog_rdk_6"/>
         </w:sdtPr>
         <w:sdtContent>
@@ -8938,7 +8938,7 @@
       </w:pPr>
       <w:sdt>
         <w:sdtPr>
-          <w:id w:val="-187101319"/>
+          <w:id w:val="1950477717"/>
           <w:tag w:val="goog_rdk_7"/>
         </w:sdtPr>
         <w:sdtContent>
@@ -8966,7 +8966,7 @@
       </w:pPr>
       <w:sdt>
         <w:sdtPr>
-          <w:id w:val="-904033477"/>
+          <w:id w:val="-1357989458"/>
           <w:tag w:val="goog_rdk_8"/>
         </w:sdtPr>
         <w:sdtContent>
@@ -11571,7 +11571,7 @@
         <w:rPr>
           <w:rtl w:val="0"/>
         </w:rPr>
-        <w:t xml:space="preserve">During testing, any discovered defects were recorded, fixed, and retested to confirm the fix. This follows the deliverable requirement that bugs found during testing should be addressed and then validated again.</w:t>
+        <w:t xml:space="preserve">During testing, any discovered defects were carefully documented, including a description of the issue, steps to reproduce it, and its impact on system functionality. After each fix, the affected test cases were re-executed to confirm that the defect was resolved and that the system continued to function correctly. This iterative process ensured that all critical and high-priority issues were resolved before final submission, maintaining system stability and reliability. Additionally, regression testing was performed to verify that previously tested features continued to operate as expected following each change.</w:t>
       </w:r>
     </w:p>
     <w:p>

</xml_diff>